<commit_message>
manje promjene u izvjestaju
</commit_message>
<xml_diff>
--- a/Izvjestaj_projekta_-_Radna_verzija.docx
+++ b/Izvjestaj_projekta_-_Radna_verzija.docx
@@ -335,7 +335,231 @@
         <w:t>—</w:t>
       </w:r>
       <w:r>
-        <w:t>Rak dojke je bolest koja se manifestira u prekomjernom rastu abnormalnih stanica dojke. Značajna dijagnostička metoda za rak dojke je ultrazvuk, što je neinvazivna medicinska pretraga koja snima ljudsko tijelo pomoću zvučnih valova visoke frekvencije.</w:t>
+        <w:t xml:space="preserve">Rak </w:t>
+      </w:r>
+      <w:proofErr w:type="spellStart"/>
+      <w:r>
+        <w:t>dojke</w:t>
+      </w:r>
+      <w:proofErr w:type="spellEnd"/>
+      <w:r>
+        <w:t xml:space="preserve"> je </w:t>
+      </w:r>
+      <w:proofErr w:type="spellStart"/>
+      <w:r>
+        <w:t>bolest</w:t>
+      </w:r>
+      <w:proofErr w:type="spellEnd"/>
+      <w:r>
+        <w:t xml:space="preserve"> </w:t>
+      </w:r>
+      <w:proofErr w:type="spellStart"/>
+      <w:r>
+        <w:t>koja</w:t>
+      </w:r>
+      <w:proofErr w:type="spellEnd"/>
+      <w:r>
+        <w:t xml:space="preserve"> se </w:t>
+      </w:r>
+      <w:proofErr w:type="spellStart"/>
+      <w:r>
+        <w:t>manifestira</w:t>
+      </w:r>
+      <w:proofErr w:type="spellEnd"/>
+      <w:r>
+        <w:t xml:space="preserve"> u </w:t>
+      </w:r>
+      <w:proofErr w:type="spellStart"/>
+      <w:r>
+        <w:t>prekomjernom</w:t>
+      </w:r>
+      <w:proofErr w:type="spellEnd"/>
+      <w:r>
+        <w:t xml:space="preserve"> </w:t>
+      </w:r>
+      <w:proofErr w:type="spellStart"/>
+      <w:r>
+        <w:t>rastu</w:t>
+      </w:r>
+      <w:proofErr w:type="spellEnd"/>
+      <w:r>
+        <w:t xml:space="preserve"> </w:t>
+      </w:r>
+      <w:proofErr w:type="spellStart"/>
+      <w:r>
+        <w:t>abnormalnih</w:t>
+      </w:r>
+      <w:proofErr w:type="spellEnd"/>
+      <w:r>
+        <w:t xml:space="preserve"> </w:t>
+      </w:r>
+      <w:proofErr w:type="spellStart"/>
+      <w:r>
+        <w:t>stanica</w:t>
+      </w:r>
+      <w:proofErr w:type="spellEnd"/>
+      <w:r>
+        <w:t xml:space="preserve"> </w:t>
+      </w:r>
+      <w:proofErr w:type="spellStart"/>
+      <w:r>
+        <w:t>dojke</w:t>
+      </w:r>
+      <w:proofErr w:type="spellEnd"/>
+      <w:r>
+        <w:t xml:space="preserve">. </w:t>
+      </w:r>
+      <w:proofErr w:type="spellStart"/>
+      <w:r>
+        <w:t>Značajna</w:t>
+      </w:r>
+      <w:proofErr w:type="spellEnd"/>
+      <w:r>
+        <w:t xml:space="preserve"> </w:t>
+      </w:r>
+      <w:proofErr w:type="spellStart"/>
+      <w:r>
+        <w:t>dijagnostička</w:t>
+      </w:r>
+      <w:proofErr w:type="spellEnd"/>
+      <w:r>
+        <w:t xml:space="preserve"> </w:t>
+      </w:r>
+      <w:proofErr w:type="spellStart"/>
+      <w:r>
+        <w:t>metoda</w:t>
+      </w:r>
+      <w:proofErr w:type="spellEnd"/>
+      <w:r>
+        <w:t xml:space="preserve"> za </w:t>
+      </w:r>
+      <w:proofErr w:type="spellStart"/>
+      <w:r>
+        <w:t>rak</w:t>
+      </w:r>
+      <w:proofErr w:type="spellEnd"/>
+      <w:r>
+        <w:t xml:space="preserve"> </w:t>
+      </w:r>
+      <w:proofErr w:type="spellStart"/>
+      <w:r>
+        <w:t>dojke</w:t>
+      </w:r>
+      <w:proofErr w:type="spellEnd"/>
+      <w:r>
+        <w:t xml:space="preserve"> je </w:t>
+      </w:r>
+      <w:proofErr w:type="spellStart"/>
+      <w:r>
+        <w:t>ultrazvuk</w:t>
+      </w:r>
+      <w:proofErr w:type="spellEnd"/>
+      <w:r>
+        <w:t xml:space="preserve">, </w:t>
+      </w:r>
+      <w:proofErr w:type="spellStart"/>
+      <w:r>
+        <w:t>što</w:t>
+      </w:r>
+      <w:proofErr w:type="spellEnd"/>
+      <w:r>
+        <w:t xml:space="preserve"> je </w:t>
+      </w:r>
+      <w:proofErr w:type="spellStart"/>
+      <w:r>
+        <w:t>neinvazivna</w:t>
+      </w:r>
+      <w:proofErr w:type="spellEnd"/>
+      <w:r>
+        <w:t xml:space="preserve"> </w:t>
+      </w:r>
+      <w:proofErr w:type="spellStart"/>
+      <w:r>
+        <w:t>medicinska</w:t>
+      </w:r>
+      <w:proofErr w:type="spellEnd"/>
+      <w:r>
+        <w:t xml:space="preserve"> </w:t>
+      </w:r>
+      <w:proofErr w:type="spellStart"/>
+      <w:r>
+        <w:t>pretraga</w:t>
+      </w:r>
+      <w:proofErr w:type="spellEnd"/>
+      <w:r>
+        <w:t xml:space="preserve"> </w:t>
+      </w:r>
+      <w:proofErr w:type="spellStart"/>
+      <w:r>
+        <w:t>koja</w:t>
+      </w:r>
+      <w:proofErr w:type="spellEnd"/>
+      <w:r>
+        <w:t xml:space="preserve"> </w:t>
+      </w:r>
+      <w:proofErr w:type="spellStart"/>
+      <w:r>
+        <w:t>snima</w:t>
+      </w:r>
+      <w:proofErr w:type="spellEnd"/>
+      <w:r>
+        <w:t xml:space="preserve"> </w:t>
+      </w:r>
+      <w:proofErr w:type="spellStart"/>
+      <w:r>
+        <w:t>ljudsko</w:t>
+      </w:r>
+      <w:proofErr w:type="spellEnd"/>
+      <w:r>
+        <w:t xml:space="preserve"> </w:t>
+      </w:r>
+      <w:proofErr w:type="spellStart"/>
+      <w:r>
+        <w:t>tijelo</w:t>
+      </w:r>
+      <w:proofErr w:type="spellEnd"/>
+      <w:r>
+        <w:t xml:space="preserve"> </w:t>
+      </w:r>
+      <w:proofErr w:type="spellStart"/>
+      <w:r>
+        <w:t>pomoću</w:t>
+      </w:r>
+      <w:proofErr w:type="spellEnd"/>
+      <w:r>
+        <w:t xml:space="preserve"> </w:t>
+      </w:r>
+      <w:proofErr w:type="spellStart"/>
+      <w:r>
+        <w:t>zvučnih</w:t>
+      </w:r>
+      <w:proofErr w:type="spellEnd"/>
+      <w:r>
+        <w:t xml:space="preserve"> </w:t>
+      </w:r>
+      <w:proofErr w:type="spellStart"/>
+      <w:r>
+        <w:t>valova</w:t>
+      </w:r>
+      <w:proofErr w:type="spellEnd"/>
+      <w:r>
+        <w:t xml:space="preserve"> </w:t>
+      </w:r>
+      <w:proofErr w:type="spellStart"/>
+      <w:r>
+        <w:t>visoke</w:t>
+      </w:r>
+      <w:proofErr w:type="spellEnd"/>
+      <w:r>
+        <w:t xml:space="preserve"> </w:t>
+      </w:r>
+      <w:proofErr w:type="spellStart"/>
+      <w:r>
+        <w:t>frekvencije</w:t>
+      </w:r>
+      <w:proofErr w:type="spellEnd"/>
+      <w:r>
+        <w:t>.</w:t>
       </w:r>
     </w:p>
     <w:p>
@@ -345,8 +569,85 @@
       <w:r>
         <w:t>Keywords—</w:t>
       </w:r>
-      <w:r>
-        <w:t>rak dojke, ultrazvuk, duboko učenje, neuronske mreže, programski jezik Python, Jupyter Notebooks</w:t>
+      <w:proofErr w:type="spellStart"/>
+      <w:r>
+        <w:t>rak</w:t>
+      </w:r>
+      <w:proofErr w:type="spellEnd"/>
+      <w:r>
+        <w:t xml:space="preserve"> </w:t>
+      </w:r>
+      <w:proofErr w:type="spellStart"/>
+      <w:r>
+        <w:t>dojke</w:t>
+      </w:r>
+      <w:proofErr w:type="spellEnd"/>
+      <w:r>
+        <w:t xml:space="preserve">, </w:t>
+      </w:r>
+      <w:proofErr w:type="spellStart"/>
+      <w:r>
+        <w:t>ultrazvuk</w:t>
+      </w:r>
+      <w:proofErr w:type="spellEnd"/>
+      <w:r>
+        <w:t xml:space="preserve">, </w:t>
+      </w:r>
+      <w:proofErr w:type="spellStart"/>
+      <w:r>
+        <w:t>duboko</w:t>
+      </w:r>
+      <w:proofErr w:type="spellEnd"/>
+      <w:r>
+        <w:t xml:space="preserve"> </w:t>
+      </w:r>
+      <w:proofErr w:type="spellStart"/>
+      <w:r>
+        <w:t>učenje</w:t>
+      </w:r>
+      <w:proofErr w:type="spellEnd"/>
+      <w:r>
+        <w:t xml:space="preserve">, </w:t>
+      </w:r>
+      <w:proofErr w:type="spellStart"/>
+      <w:r>
+        <w:t>neuronske</w:t>
+      </w:r>
+      <w:proofErr w:type="spellEnd"/>
+      <w:r>
+        <w:t xml:space="preserve"> </w:t>
+      </w:r>
+      <w:proofErr w:type="spellStart"/>
+      <w:r>
+        <w:t>mreže</w:t>
+      </w:r>
+      <w:proofErr w:type="spellEnd"/>
+      <w:r>
+        <w:t xml:space="preserve">, </w:t>
+      </w:r>
+      <w:proofErr w:type="spellStart"/>
+      <w:r>
+        <w:t>programski</w:t>
+      </w:r>
+      <w:proofErr w:type="spellEnd"/>
+      <w:r>
+        <w:t xml:space="preserve"> </w:t>
+      </w:r>
+      <w:proofErr w:type="spellStart"/>
+      <w:r>
+        <w:t>jezik</w:t>
+      </w:r>
+      <w:proofErr w:type="spellEnd"/>
+      <w:r>
+        <w:t xml:space="preserve"> Python, </w:t>
+      </w:r>
+      <w:proofErr w:type="spellStart"/>
+      <w:r>
+        <w:t>Jupyter</w:t>
+      </w:r>
+      <w:proofErr w:type="spellEnd"/>
+      <w:r>
+        <w:t xml:space="preserve"> Notebooks</w:t>
       </w:r>
     </w:p>
     <w:p>
@@ -362,46 +663,923 @@
         <w:pStyle w:val="BodyText"/>
       </w:pPr>
       <w:r>
-        <w:t xml:space="preserve">Rak dojke je </w:t>
-      </w:r>
-      <w:r>
-        <w:t xml:space="preserve">tip bolesti pri kojoj abnormalne stanice dojke nekontrolirano rastu i stvaraju tumore. Ako se ne kontroliraju, tumori se mogu proširiti po ostatku tijela i, s vremenom, biti fatalni [1]. </w:t>
+        <w:t xml:space="preserve">Rak </w:t>
+      </w:r>
+      <w:proofErr w:type="spellStart"/>
+      <w:r>
+        <w:t>dojke</w:t>
+      </w:r>
+      <w:proofErr w:type="spellEnd"/>
+      <w:r>
+        <w:t xml:space="preserve"> je </w:t>
+      </w:r>
+      <w:r>
+        <w:t xml:space="preserve">tip </w:t>
+      </w:r>
+      <w:proofErr w:type="spellStart"/>
+      <w:r>
+        <w:t>bolesti</w:t>
+      </w:r>
+      <w:proofErr w:type="spellEnd"/>
+      <w:r>
+        <w:t xml:space="preserve"> </w:t>
+      </w:r>
+      <w:proofErr w:type="spellStart"/>
+      <w:r>
+        <w:t>pri</w:t>
+      </w:r>
+      <w:proofErr w:type="spellEnd"/>
+      <w:r>
+        <w:t xml:space="preserve"> </w:t>
+      </w:r>
+      <w:proofErr w:type="spellStart"/>
+      <w:r>
+        <w:t>kojoj</w:t>
+      </w:r>
+      <w:proofErr w:type="spellEnd"/>
+      <w:r>
+        <w:t xml:space="preserve"> </w:t>
+      </w:r>
+      <w:proofErr w:type="spellStart"/>
+      <w:r>
+        <w:t>abnormalne</w:t>
+      </w:r>
+      <w:proofErr w:type="spellEnd"/>
+      <w:r>
+        <w:t xml:space="preserve"> </w:t>
+      </w:r>
+      <w:proofErr w:type="spellStart"/>
+      <w:r>
+        <w:t>stanice</w:t>
+      </w:r>
+      <w:proofErr w:type="spellEnd"/>
+      <w:r>
+        <w:t xml:space="preserve"> </w:t>
+      </w:r>
+      <w:proofErr w:type="spellStart"/>
+      <w:r>
+        <w:t>dojke</w:t>
+      </w:r>
+      <w:proofErr w:type="spellEnd"/>
+      <w:r>
+        <w:t xml:space="preserve"> </w:t>
+      </w:r>
+      <w:proofErr w:type="spellStart"/>
+      <w:r>
+        <w:t>nekontrolirano</w:t>
+      </w:r>
+      <w:proofErr w:type="spellEnd"/>
+      <w:r>
+        <w:t xml:space="preserve"> </w:t>
+      </w:r>
+      <w:proofErr w:type="spellStart"/>
+      <w:r>
+        <w:t>rastu</w:t>
+      </w:r>
+      <w:proofErr w:type="spellEnd"/>
+      <w:r>
+        <w:t xml:space="preserve"> </w:t>
+      </w:r>
+      <w:proofErr w:type="spellStart"/>
+      <w:r>
+        <w:t>i</w:t>
+      </w:r>
+      <w:proofErr w:type="spellEnd"/>
+      <w:r>
+        <w:t xml:space="preserve"> </w:t>
+      </w:r>
+      <w:proofErr w:type="spellStart"/>
+      <w:r>
+        <w:t>stvaraju</w:t>
+      </w:r>
+      <w:proofErr w:type="spellEnd"/>
+      <w:r>
+        <w:t xml:space="preserve"> </w:t>
+      </w:r>
+      <w:proofErr w:type="spellStart"/>
+      <w:r>
+        <w:t>tumore</w:t>
+      </w:r>
+      <w:proofErr w:type="spellEnd"/>
+      <w:r>
+        <w:t xml:space="preserve">. Ako se ne </w:t>
+      </w:r>
+      <w:proofErr w:type="spellStart"/>
+      <w:r>
+        <w:t>kontroliraju</w:t>
+      </w:r>
+      <w:proofErr w:type="spellEnd"/>
+      <w:r>
+        <w:t xml:space="preserve">, </w:t>
+      </w:r>
+      <w:proofErr w:type="spellStart"/>
+      <w:r>
+        <w:t>tumori</w:t>
+      </w:r>
+      <w:proofErr w:type="spellEnd"/>
+      <w:r>
+        <w:t xml:space="preserve"> se </w:t>
+      </w:r>
+      <w:proofErr w:type="spellStart"/>
+      <w:r>
+        <w:t>mogu</w:t>
+      </w:r>
+      <w:proofErr w:type="spellEnd"/>
+      <w:r>
+        <w:t xml:space="preserve"> </w:t>
+      </w:r>
+      <w:proofErr w:type="spellStart"/>
+      <w:r>
+        <w:t>proširiti</w:t>
+      </w:r>
+      <w:proofErr w:type="spellEnd"/>
+      <w:r>
+        <w:t xml:space="preserve"> po </w:t>
+      </w:r>
+      <w:proofErr w:type="spellStart"/>
+      <w:r>
+        <w:t>ostatku</w:t>
+      </w:r>
+      <w:proofErr w:type="spellEnd"/>
+      <w:r>
+        <w:t xml:space="preserve"> </w:t>
+      </w:r>
+      <w:proofErr w:type="spellStart"/>
+      <w:r>
+        <w:t>tijela</w:t>
+      </w:r>
+      <w:proofErr w:type="spellEnd"/>
+      <w:r>
+        <w:t xml:space="preserve"> </w:t>
+      </w:r>
+      <w:proofErr w:type="spellStart"/>
+      <w:r>
+        <w:t>i</w:t>
+      </w:r>
+      <w:proofErr w:type="spellEnd"/>
+      <w:r>
+        <w:t xml:space="preserve">, s </w:t>
+      </w:r>
+      <w:proofErr w:type="spellStart"/>
+      <w:r>
+        <w:t>vremenom</w:t>
+      </w:r>
+      <w:proofErr w:type="spellEnd"/>
+      <w:r>
+        <w:t xml:space="preserve">, </w:t>
+      </w:r>
+      <w:proofErr w:type="spellStart"/>
+      <w:r>
+        <w:t>biti</w:t>
+      </w:r>
+      <w:proofErr w:type="spellEnd"/>
+      <w:r>
+        <w:t xml:space="preserve"> </w:t>
+      </w:r>
+      <w:proofErr w:type="spellStart"/>
+      <w:r>
+        <w:t>fatalni</w:t>
+      </w:r>
+      <w:proofErr w:type="spellEnd"/>
+      <w:r>
+        <w:t xml:space="preserve"> [1]. </w:t>
       </w:r>
     </w:p>
     <w:p>
       <w:pPr>
         <w:pStyle w:val="BodyText"/>
       </w:pPr>
-      <w:r>
-        <w:t xml:space="preserve">Uzrok nastanka raka dojke uglavnom je nepoznat. Od </w:t>
-      </w:r>
-      <w:r>
-        <w:t>njega n</w:t>
-      </w:r>
-      <w:r>
-        <w:t>ajčešće obolijevaju žene iznad pedesete godine života, a muškarci također mogu oboljeti od raka dojke, ali znatno rjeđe nego žene</w:t>
-      </w:r>
-      <w:r>
-        <w:t>. Najznačajniji čimbenici koji povećavaju rizik nastanka raka dojke su: dob, prva menstruacija prije 12-te godine života, menopauza nakon 50-te godine života, nerađanje ili rađanje poslije 30-te godine života, pojavnost raka dojk</w:t>
+      <w:proofErr w:type="spellStart"/>
+      <w:r>
+        <w:t>Uzrok</w:t>
+      </w:r>
+      <w:proofErr w:type="spellEnd"/>
+      <w:r>
+        <w:t xml:space="preserve"> </w:t>
+      </w:r>
+      <w:proofErr w:type="spellStart"/>
+      <w:r>
+        <w:t>nastanka</w:t>
+      </w:r>
+      <w:proofErr w:type="spellEnd"/>
+      <w:r>
+        <w:t xml:space="preserve"> </w:t>
+      </w:r>
+      <w:proofErr w:type="spellStart"/>
+      <w:r>
+        <w:t>raka</w:t>
+      </w:r>
+      <w:proofErr w:type="spellEnd"/>
+      <w:r>
+        <w:t xml:space="preserve"> </w:t>
+      </w:r>
+      <w:proofErr w:type="spellStart"/>
+      <w:r>
+        <w:t>dojke</w:t>
+      </w:r>
+      <w:proofErr w:type="spellEnd"/>
+      <w:r>
+        <w:t xml:space="preserve"> </w:t>
+      </w:r>
+      <w:proofErr w:type="spellStart"/>
+      <w:r>
+        <w:t>uglavnom</w:t>
+      </w:r>
+      <w:proofErr w:type="spellEnd"/>
+      <w:r>
+        <w:t xml:space="preserve"> je </w:t>
+      </w:r>
+      <w:proofErr w:type="spellStart"/>
+      <w:r>
+        <w:t>nepoznat</w:t>
+      </w:r>
+      <w:proofErr w:type="spellEnd"/>
+      <w:r>
+        <w:t xml:space="preserve">. Od </w:t>
+      </w:r>
+      <w:proofErr w:type="spellStart"/>
+      <w:r>
+        <w:t>njega</w:t>
+      </w:r>
+      <w:proofErr w:type="spellEnd"/>
+      <w:r>
+        <w:t xml:space="preserve"> </w:t>
+      </w:r>
+      <w:proofErr w:type="spellStart"/>
+      <w:r>
+        <w:t>n</w:t>
+      </w:r>
+      <w:r>
+        <w:t>ajčešće</w:t>
+      </w:r>
+      <w:proofErr w:type="spellEnd"/>
+      <w:r>
+        <w:t xml:space="preserve"> </w:t>
+      </w:r>
+      <w:proofErr w:type="spellStart"/>
+      <w:r>
+        <w:t>obolijevaju</w:t>
+      </w:r>
+      <w:proofErr w:type="spellEnd"/>
+      <w:r>
+        <w:t xml:space="preserve"> </w:t>
+      </w:r>
+      <w:proofErr w:type="spellStart"/>
+      <w:r>
+        <w:t>žene</w:t>
+      </w:r>
+      <w:proofErr w:type="spellEnd"/>
+      <w:r>
+        <w:t xml:space="preserve"> </w:t>
+      </w:r>
+      <w:proofErr w:type="spellStart"/>
+      <w:r>
+        <w:t>iznad</w:t>
+      </w:r>
+      <w:proofErr w:type="spellEnd"/>
+      <w:r>
+        <w:t xml:space="preserve"> </w:t>
+      </w:r>
+      <w:proofErr w:type="spellStart"/>
+      <w:r>
+        <w:t>pedesete</w:t>
+      </w:r>
+      <w:proofErr w:type="spellEnd"/>
+      <w:r>
+        <w:t xml:space="preserve"> </w:t>
+      </w:r>
+      <w:proofErr w:type="spellStart"/>
+      <w:r>
+        <w:t>godine</w:t>
+      </w:r>
+      <w:proofErr w:type="spellEnd"/>
+      <w:r>
+        <w:t xml:space="preserve"> </w:t>
+      </w:r>
+      <w:proofErr w:type="spellStart"/>
+      <w:r>
+        <w:t>života</w:t>
+      </w:r>
+      <w:proofErr w:type="spellEnd"/>
+      <w:r>
+        <w:t xml:space="preserve">, a </w:t>
+      </w:r>
+      <w:proofErr w:type="spellStart"/>
+      <w:r>
+        <w:t>muškarci</w:t>
+      </w:r>
+      <w:proofErr w:type="spellEnd"/>
+      <w:r>
+        <w:t xml:space="preserve"> </w:t>
+      </w:r>
+      <w:proofErr w:type="spellStart"/>
+      <w:r>
+        <w:t>također</w:t>
+      </w:r>
+      <w:proofErr w:type="spellEnd"/>
+      <w:r>
+        <w:t xml:space="preserve"> </w:t>
+      </w:r>
+      <w:proofErr w:type="spellStart"/>
+      <w:r>
+        <w:t>mogu</w:t>
+      </w:r>
+      <w:proofErr w:type="spellEnd"/>
+      <w:r>
+        <w:t xml:space="preserve"> </w:t>
+      </w:r>
+      <w:proofErr w:type="spellStart"/>
+      <w:r>
+        <w:t>oboljeti</w:t>
+      </w:r>
+      <w:proofErr w:type="spellEnd"/>
+      <w:r>
+        <w:t xml:space="preserve"> od </w:t>
+      </w:r>
+      <w:proofErr w:type="spellStart"/>
+      <w:r>
+        <w:t>raka</w:t>
+      </w:r>
+      <w:proofErr w:type="spellEnd"/>
+      <w:r>
+        <w:t xml:space="preserve"> </w:t>
+      </w:r>
+      <w:proofErr w:type="spellStart"/>
+      <w:r>
+        <w:t>dojke</w:t>
+      </w:r>
+      <w:proofErr w:type="spellEnd"/>
+      <w:r>
+        <w:t xml:space="preserve">, </w:t>
+      </w:r>
+      <w:proofErr w:type="spellStart"/>
+      <w:r>
+        <w:t>ali</w:t>
+      </w:r>
+      <w:proofErr w:type="spellEnd"/>
+      <w:r>
+        <w:t xml:space="preserve"> </w:t>
+      </w:r>
+      <w:proofErr w:type="spellStart"/>
+      <w:r>
+        <w:t>znatno</w:t>
+      </w:r>
+      <w:proofErr w:type="spellEnd"/>
+      <w:r>
+        <w:t xml:space="preserve"> </w:t>
+      </w:r>
+      <w:proofErr w:type="spellStart"/>
+      <w:r>
+        <w:t>rjeđe</w:t>
+      </w:r>
+      <w:proofErr w:type="spellEnd"/>
+      <w:r>
+        <w:t xml:space="preserve"> </w:t>
+      </w:r>
+      <w:proofErr w:type="spellStart"/>
+      <w:r>
+        <w:t>nego</w:t>
+      </w:r>
+      <w:proofErr w:type="spellEnd"/>
+      <w:r>
+        <w:t xml:space="preserve"> </w:t>
+      </w:r>
+      <w:proofErr w:type="spellStart"/>
+      <w:r>
+        <w:t>žene</w:t>
+      </w:r>
+      <w:proofErr w:type="spellEnd"/>
+      <w:r>
+        <w:t xml:space="preserve">. </w:t>
+      </w:r>
+      <w:proofErr w:type="spellStart"/>
+      <w:r>
+        <w:t>Najznačajniji</w:t>
+      </w:r>
+      <w:proofErr w:type="spellEnd"/>
+      <w:r>
+        <w:t xml:space="preserve"> </w:t>
+      </w:r>
+      <w:proofErr w:type="spellStart"/>
+      <w:r>
+        <w:t>čimbenici</w:t>
+      </w:r>
+      <w:proofErr w:type="spellEnd"/>
+      <w:r>
+        <w:t xml:space="preserve"> koji </w:t>
+      </w:r>
+      <w:proofErr w:type="spellStart"/>
+      <w:r>
+        <w:t>povećavaju</w:t>
+      </w:r>
+      <w:proofErr w:type="spellEnd"/>
+      <w:r>
+        <w:t xml:space="preserve"> </w:t>
+      </w:r>
+      <w:proofErr w:type="spellStart"/>
+      <w:r>
+        <w:t>rizik</w:t>
+      </w:r>
+      <w:proofErr w:type="spellEnd"/>
+      <w:r>
+        <w:t xml:space="preserve"> </w:t>
+      </w:r>
+      <w:proofErr w:type="spellStart"/>
+      <w:r>
+        <w:t>nastanka</w:t>
+      </w:r>
+      <w:proofErr w:type="spellEnd"/>
+      <w:r>
+        <w:t xml:space="preserve"> </w:t>
+      </w:r>
+      <w:proofErr w:type="spellStart"/>
+      <w:r>
+        <w:t>raka</w:t>
+      </w:r>
+      <w:proofErr w:type="spellEnd"/>
+      <w:r>
+        <w:t xml:space="preserve"> </w:t>
+      </w:r>
+      <w:proofErr w:type="spellStart"/>
+      <w:r>
+        <w:t>dojke</w:t>
+      </w:r>
+      <w:proofErr w:type="spellEnd"/>
+      <w:r>
+        <w:t xml:space="preserve"> </w:t>
+      </w:r>
+      <w:proofErr w:type="spellStart"/>
+      <w:r>
+        <w:t>su</w:t>
+      </w:r>
+      <w:proofErr w:type="spellEnd"/>
+      <w:r>
+        <w:t xml:space="preserve">: dob, </w:t>
+      </w:r>
+      <w:proofErr w:type="spellStart"/>
+      <w:r>
+        <w:t>prva</w:t>
+      </w:r>
+      <w:proofErr w:type="spellEnd"/>
+      <w:r>
+        <w:t xml:space="preserve"> </w:t>
+      </w:r>
+      <w:proofErr w:type="spellStart"/>
+      <w:r>
+        <w:t>menstruacija</w:t>
+      </w:r>
+      <w:proofErr w:type="spellEnd"/>
+      <w:r>
+        <w:t xml:space="preserve"> </w:t>
+      </w:r>
+      <w:proofErr w:type="spellStart"/>
+      <w:r>
+        <w:t>prije</w:t>
+      </w:r>
+      <w:proofErr w:type="spellEnd"/>
+      <w:r>
+        <w:t xml:space="preserve"> 12-te </w:t>
+      </w:r>
+      <w:proofErr w:type="spellStart"/>
+      <w:r>
+        <w:t>godine</w:t>
+      </w:r>
+      <w:proofErr w:type="spellEnd"/>
+      <w:r>
+        <w:t xml:space="preserve"> </w:t>
+      </w:r>
+      <w:proofErr w:type="spellStart"/>
+      <w:r>
+        <w:t>života</w:t>
+      </w:r>
+      <w:proofErr w:type="spellEnd"/>
+      <w:r>
+        <w:t xml:space="preserve">, </w:t>
+      </w:r>
+      <w:proofErr w:type="spellStart"/>
+      <w:r>
+        <w:t>menopauza</w:t>
+      </w:r>
+      <w:proofErr w:type="spellEnd"/>
+      <w:r>
+        <w:t xml:space="preserve"> </w:t>
+      </w:r>
+      <w:proofErr w:type="spellStart"/>
+      <w:r>
+        <w:t>nakon</w:t>
+      </w:r>
+      <w:proofErr w:type="spellEnd"/>
+      <w:r>
+        <w:t xml:space="preserve"> 50-te </w:t>
+      </w:r>
+      <w:proofErr w:type="spellStart"/>
+      <w:r>
+        <w:t>godine</w:t>
+      </w:r>
+      <w:proofErr w:type="spellEnd"/>
+      <w:r>
+        <w:t xml:space="preserve"> </w:t>
+      </w:r>
+      <w:proofErr w:type="spellStart"/>
+      <w:r>
+        <w:t>života</w:t>
+      </w:r>
+      <w:proofErr w:type="spellEnd"/>
+      <w:r>
+        <w:t xml:space="preserve">, </w:t>
+      </w:r>
+      <w:proofErr w:type="spellStart"/>
+      <w:r>
+        <w:t>nerađanje</w:t>
+      </w:r>
+      <w:proofErr w:type="spellEnd"/>
+      <w:r>
+        <w:t xml:space="preserve"> </w:t>
+      </w:r>
+      <w:proofErr w:type="spellStart"/>
+      <w:r>
+        <w:t>ili</w:t>
+      </w:r>
+      <w:proofErr w:type="spellEnd"/>
+      <w:r>
+        <w:t xml:space="preserve"> </w:t>
+      </w:r>
+      <w:proofErr w:type="spellStart"/>
+      <w:r>
+        <w:t>rađanje</w:t>
+      </w:r>
+      <w:proofErr w:type="spellEnd"/>
+      <w:r>
+        <w:t xml:space="preserve"> </w:t>
+      </w:r>
+      <w:proofErr w:type="spellStart"/>
+      <w:r>
+        <w:t>poslije</w:t>
+      </w:r>
+      <w:proofErr w:type="spellEnd"/>
+      <w:r>
+        <w:t xml:space="preserve"> 30-te </w:t>
+      </w:r>
+      <w:proofErr w:type="spellStart"/>
+      <w:r>
+        <w:t>godine</w:t>
+      </w:r>
+      <w:proofErr w:type="spellEnd"/>
+      <w:r>
+        <w:t xml:space="preserve"> </w:t>
+      </w:r>
+      <w:proofErr w:type="spellStart"/>
+      <w:r>
+        <w:t>života</w:t>
+      </w:r>
+      <w:proofErr w:type="spellEnd"/>
+      <w:r>
+        <w:t xml:space="preserve">, </w:t>
+      </w:r>
+      <w:proofErr w:type="spellStart"/>
+      <w:r>
+        <w:t>pojavnost</w:t>
+      </w:r>
+      <w:proofErr w:type="spellEnd"/>
+      <w:r>
+        <w:t xml:space="preserve"> </w:t>
+      </w:r>
+      <w:proofErr w:type="spellStart"/>
+      <w:r>
+        <w:t>raka</w:t>
+      </w:r>
+      <w:proofErr w:type="spellEnd"/>
+      <w:r>
+        <w:t xml:space="preserve"> </w:t>
+      </w:r>
+      <w:proofErr w:type="spellStart"/>
+      <w:r>
+        <w:t>dojk</w:t>
       </w:r>
       <w:r>
         <w:t>e</w:t>
       </w:r>
-      <w:r>
-        <w:t xml:space="preserve"> i/ili raka jajnika kod bližih srodnika</w:t>
-      </w:r>
-      <w:r>
-        <w:t xml:space="preserve"> te</w:t>
-      </w:r>
-      <w:r>
-        <w:t xml:space="preserve"> prethodna bolest dojke. Također, povećani rizik za rak dojke vezan je i uz određene životne navike i stil života koji se smatraju nezdravim: prehrana bogata masnoćama i šećerima, pretilost, povećana konzumacija alkohola, pušenje</w:t>
-      </w:r>
-      <w:r>
-        <w:t xml:space="preserve"> te</w:t>
-      </w:r>
-      <w:r>
-        <w:t xml:space="preserve"> izloženost radioaktivnom zračenju</w:t>
-      </w:r>
+      <w:proofErr w:type="spellEnd"/>
+      <w:r>
+        <w:t xml:space="preserve"> </w:t>
+      </w:r>
+      <w:proofErr w:type="spellStart"/>
+      <w:r>
+        <w:t>i</w:t>
+      </w:r>
+      <w:proofErr w:type="spellEnd"/>
+      <w:r>
+        <w:t>/</w:t>
+      </w:r>
+      <w:proofErr w:type="spellStart"/>
+      <w:r>
+        <w:t>ili</w:t>
+      </w:r>
+      <w:proofErr w:type="spellEnd"/>
+      <w:r>
+        <w:t xml:space="preserve"> </w:t>
+      </w:r>
+      <w:proofErr w:type="spellStart"/>
+      <w:r>
+        <w:t>raka</w:t>
+      </w:r>
+      <w:proofErr w:type="spellEnd"/>
+      <w:r>
+        <w:t xml:space="preserve"> </w:t>
+      </w:r>
+      <w:proofErr w:type="spellStart"/>
+      <w:r>
+        <w:t>jajnika</w:t>
+      </w:r>
+      <w:proofErr w:type="spellEnd"/>
+      <w:r>
+        <w:t xml:space="preserve"> </w:t>
+      </w:r>
+      <w:proofErr w:type="spellStart"/>
+      <w:r>
+        <w:t>kod</w:t>
+      </w:r>
+      <w:proofErr w:type="spellEnd"/>
+      <w:r>
+        <w:t xml:space="preserve"> </w:t>
+      </w:r>
+      <w:proofErr w:type="spellStart"/>
+      <w:r>
+        <w:t>bližih</w:t>
+      </w:r>
+      <w:proofErr w:type="spellEnd"/>
+      <w:r>
+        <w:t xml:space="preserve"> </w:t>
+      </w:r>
+      <w:proofErr w:type="spellStart"/>
+      <w:r>
+        <w:t>srodnika</w:t>
+      </w:r>
+      <w:proofErr w:type="spellEnd"/>
+      <w:r>
+        <w:t xml:space="preserve"> </w:t>
+      </w:r>
+      <w:proofErr w:type="spellStart"/>
+      <w:r>
+        <w:t>te</w:t>
+      </w:r>
+      <w:proofErr w:type="spellEnd"/>
+      <w:r>
+        <w:t xml:space="preserve"> </w:t>
+      </w:r>
+      <w:proofErr w:type="spellStart"/>
+      <w:r>
+        <w:t>prethodna</w:t>
+      </w:r>
+      <w:proofErr w:type="spellEnd"/>
+      <w:r>
+        <w:t xml:space="preserve"> </w:t>
+      </w:r>
+      <w:proofErr w:type="spellStart"/>
+      <w:r>
+        <w:t>bolest</w:t>
+      </w:r>
+      <w:proofErr w:type="spellEnd"/>
+      <w:r>
+        <w:t xml:space="preserve"> </w:t>
+      </w:r>
+      <w:proofErr w:type="spellStart"/>
+      <w:r>
+        <w:t>dojke</w:t>
+      </w:r>
+      <w:proofErr w:type="spellEnd"/>
+      <w:r>
+        <w:t xml:space="preserve">. Također, </w:t>
+      </w:r>
+      <w:proofErr w:type="spellStart"/>
+      <w:r>
+        <w:t>povećani</w:t>
+      </w:r>
+      <w:proofErr w:type="spellEnd"/>
+      <w:r>
+        <w:t xml:space="preserve"> </w:t>
+      </w:r>
+      <w:proofErr w:type="spellStart"/>
+      <w:r>
+        <w:t>rizik</w:t>
+      </w:r>
+      <w:proofErr w:type="spellEnd"/>
+      <w:r>
+        <w:t xml:space="preserve"> za </w:t>
+      </w:r>
+      <w:proofErr w:type="spellStart"/>
+      <w:r>
+        <w:t>rak</w:t>
+      </w:r>
+      <w:proofErr w:type="spellEnd"/>
+      <w:r>
+        <w:t xml:space="preserve"> </w:t>
+      </w:r>
+      <w:proofErr w:type="spellStart"/>
+      <w:r>
+        <w:t>dojke</w:t>
+      </w:r>
+      <w:proofErr w:type="spellEnd"/>
+      <w:r>
+        <w:t xml:space="preserve"> </w:t>
+      </w:r>
+      <w:proofErr w:type="spellStart"/>
+      <w:r>
+        <w:t>vezan</w:t>
+      </w:r>
+      <w:proofErr w:type="spellEnd"/>
+      <w:r>
+        <w:t xml:space="preserve"> je </w:t>
+      </w:r>
+      <w:proofErr w:type="spellStart"/>
+      <w:r>
+        <w:t>i</w:t>
+      </w:r>
+      <w:proofErr w:type="spellEnd"/>
+      <w:r>
+        <w:t xml:space="preserve"> </w:t>
+      </w:r>
+      <w:proofErr w:type="spellStart"/>
+      <w:r>
+        <w:t>uz</w:t>
+      </w:r>
+      <w:proofErr w:type="spellEnd"/>
+      <w:r>
+        <w:t xml:space="preserve"> </w:t>
+      </w:r>
+      <w:proofErr w:type="spellStart"/>
+      <w:r>
+        <w:t>određene</w:t>
+      </w:r>
+      <w:proofErr w:type="spellEnd"/>
+      <w:r>
+        <w:t xml:space="preserve"> </w:t>
+      </w:r>
+      <w:proofErr w:type="spellStart"/>
+      <w:r>
+        <w:t>životne</w:t>
+      </w:r>
+      <w:proofErr w:type="spellEnd"/>
+      <w:r>
+        <w:t xml:space="preserve"> </w:t>
+      </w:r>
+      <w:proofErr w:type="spellStart"/>
+      <w:r>
+        <w:t>navike</w:t>
+      </w:r>
+      <w:proofErr w:type="spellEnd"/>
+      <w:r>
+        <w:t xml:space="preserve"> </w:t>
+      </w:r>
+      <w:proofErr w:type="spellStart"/>
+      <w:r>
+        <w:t>i</w:t>
+      </w:r>
+      <w:proofErr w:type="spellEnd"/>
+      <w:r>
+        <w:t xml:space="preserve"> </w:t>
+      </w:r>
+      <w:proofErr w:type="spellStart"/>
+      <w:r>
+        <w:t>stil</w:t>
+      </w:r>
+      <w:proofErr w:type="spellEnd"/>
+      <w:r>
+        <w:t xml:space="preserve"> </w:t>
+      </w:r>
+      <w:proofErr w:type="spellStart"/>
+      <w:r>
+        <w:t>života</w:t>
+      </w:r>
+      <w:proofErr w:type="spellEnd"/>
+      <w:r>
+        <w:t xml:space="preserve"> koji se </w:t>
+      </w:r>
+      <w:proofErr w:type="spellStart"/>
+      <w:r>
+        <w:t>smatraju</w:t>
+      </w:r>
+      <w:proofErr w:type="spellEnd"/>
+      <w:r>
+        <w:t xml:space="preserve"> </w:t>
+      </w:r>
+      <w:proofErr w:type="spellStart"/>
+      <w:r>
+        <w:t>nezdravim</w:t>
+      </w:r>
+      <w:proofErr w:type="spellEnd"/>
+      <w:r>
+        <w:t xml:space="preserve">: </w:t>
+      </w:r>
+      <w:proofErr w:type="spellStart"/>
+      <w:r>
+        <w:t>prehrana</w:t>
+      </w:r>
+      <w:proofErr w:type="spellEnd"/>
+      <w:r>
+        <w:t xml:space="preserve"> </w:t>
+      </w:r>
+      <w:proofErr w:type="spellStart"/>
+      <w:r>
+        <w:t>bogata</w:t>
+      </w:r>
+      <w:proofErr w:type="spellEnd"/>
+      <w:r>
+        <w:t xml:space="preserve"> </w:t>
+      </w:r>
+      <w:proofErr w:type="spellStart"/>
+      <w:r>
+        <w:t>masnoćama</w:t>
+      </w:r>
+      <w:proofErr w:type="spellEnd"/>
+      <w:r>
+        <w:t xml:space="preserve"> </w:t>
+      </w:r>
+      <w:proofErr w:type="spellStart"/>
+      <w:r>
+        <w:t>i</w:t>
+      </w:r>
+      <w:proofErr w:type="spellEnd"/>
+      <w:r>
+        <w:t xml:space="preserve"> </w:t>
+      </w:r>
+      <w:proofErr w:type="spellStart"/>
+      <w:r>
+        <w:t>šećerima</w:t>
+      </w:r>
+      <w:proofErr w:type="spellEnd"/>
+      <w:r>
+        <w:t xml:space="preserve">, </w:t>
+      </w:r>
+      <w:proofErr w:type="spellStart"/>
+      <w:r>
+        <w:t>pretilost</w:t>
+      </w:r>
+      <w:proofErr w:type="spellEnd"/>
+      <w:r>
+        <w:t xml:space="preserve">, </w:t>
+      </w:r>
+      <w:proofErr w:type="spellStart"/>
+      <w:r>
+        <w:t>povećana</w:t>
+      </w:r>
+      <w:proofErr w:type="spellEnd"/>
+      <w:r>
+        <w:t xml:space="preserve"> </w:t>
+      </w:r>
+      <w:proofErr w:type="spellStart"/>
+      <w:r>
+        <w:t>konzumacija</w:t>
+      </w:r>
+      <w:proofErr w:type="spellEnd"/>
+      <w:r>
+        <w:t xml:space="preserve"> </w:t>
+      </w:r>
+      <w:proofErr w:type="spellStart"/>
+      <w:r>
+        <w:t>alkohola</w:t>
+      </w:r>
+      <w:proofErr w:type="spellEnd"/>
+      <w:r>
+        <w:t xml:space="preserve">, </w:t>
+      </w:r>
+      <w:proofErr w:type="spellStart"/>
+      <w:r>
+        <w:t>pušenje</w:t>
+      </w:r>
+      <w:proofErr w:type="spellEnd"/>
+      <w:r>
+        <w:t xml:space="preserve"> </w:t>
+      </w:r>
+      <w:proofErr w:type="spellStart"/>
+      <w:r>
+        <w:t>te</w:t>
+      </w:r>
+      <w:proofErr w:type="spellEnd"/>
+      <w:r>
+        <w:t xml:space="preserve"> </w:t>
+      </w:r>
+      <w:proofErr w:type="spellStart"/>
+      <w:r>
+        <w:t>izloženost</w:t>
+      </w:r>
+      <w:proofErr w:type="spellEnd"/>
+      <w:r>
+        <w:t xml:space="preserve"> </w:t>
+      </w:r>
+      <w:proofErr w:type="spellStart"/>
+      <w:r>
+        <w:t>radioaktivnom</w:t>
+      </w:r>
+      <w:proofErr w:type="spellEnd"/>
+      <w:r>
+        <w:t xml:space="preserve"> </w:t>
+      </w:r>
+      <w:proofErr w:type="spellStart"/>
+      <w:r>
+        <w:t>zračenju</w:t>
+      </w:r>
+      <w:proofErr w:type="spellEnd"/>
       <w:r>
         <w:t xml:space="preserve"> </w:t>
       </w:r>
@@ -413,60 +1591,1421 @@
       <w:pPr>
         <w:pStyle w:val="BodyText"/>
       </w:pPr>
-      <w:r>
-        <w:t xml:space="preserve">Mnogi pacijenti oboljeli od raka dojke ne </w:t>
-      </w:r>
+      <w:proofErr w:type="spellStart"/>
+      <w:r>
+        <w:t>Mnogi</w:t>
+      </w:r>
+      <w:proofErr w:type="spellEnd"/>
+      <w:r>
+        <w:t xml:space="preserve"> </w:t>
+      </w:r>
+      <w:proofErr w:type="spellStart"/>
+      <w:r>
+        <w:t>pacijenti</w:t>
+      </w:r>
+      <w:proofErr w:type="spellEnd"/>
+      <w:r>
+        <w:t xml:space="preserve"> </w:t>
+      </w:r>
+      <w:proofErr w:type="spellStart"/>
+      <w:r>
+        <w:t>oboljeli</w:t>
+      </w:r>
+      <w:proofErr w:type="spellEnd"/>
+      <w:r>
+        <w:t xml:space="preserve"> od </w:t>
+      </w:r>
+      <w:proofErr w:type="spellStart"/>
+      <w:r>
+        <w:t>raka</w:t>
+      </w:r>
+      <w:proofErr w:type="spellEnd"/>
+      <w:r>
+        <w:t xml:space="preserve"> </w:t>
+      </w:r>
+      <w:proofErr w:type="spellStart"/>
+      <w:r>
+        <w:t>dojke</w:t>
+      </w:r>
+      <w:proofErr w:type="spellEnd"/>
+      <w:r>
+        <w:t xml:space="preserve"> ne </w:t>
+      </w:r>
+      <w:proofErr w:type="spellStart"/>
       <w:r>
         <w:t>primijete</w:t>
       </w:r>
-      <w:r>
-        <w:t xml:space="preserve"> ikakve simptome u ranijim stadijima bolesti, zbog čega je bitno rano otkrivanje bolesti. Simptomi raka dojke mogu uključivati: </w:t>
-      </w:r>
-      <w:r>
-        <w:t xml:space="preserve">bezbolnu kvržicu na grudima, promjenu oblika ili izgleda dojke, stvaranje udubljenja, crvenila ili drugih promjena na koži, promjene u izgledu bradavice (areole) ili kože oko nje te abnormalni ili krvavi iscjedak iz bradavice [1]. </w:t>
+      <w:proofErr w:type="spellEnd"/>
+      <w:r>
+        <w:t xml:space="preserve"> </w:t>
+      </w:r>
+      <w:proofErr w:type="spellStart"/>
+      <w:r>
+        <w:t>ikakve</w:t>
+      </w:r>
+      <w:proofErr w:type="spellEnd"/>
+      <w:r>
+        <w:t xml:space="preserve"> </w:t>
+      </w:r>
+      <w:proofErr w:type="spellStart"/>
+      <w:r>
+        <w:t>simptome</w:t>
+      </w:r>
+      <w:proofErr w:type="spellEnd"/>
+      <w:r>
+        <w:t xml:space="preserve"> u </w:t>
+      </w:r>
+      <w:proofErr w:type="spellStart"/>
+      <w:r>
+        <w:t>ranijim</w:t>
+      </w:r>
+      <w:proofErr w:type="spellEnd"/>
+      <w:r>
+        <w:t xml:space="preserve"> </w:t>
+      </w:r>
+      <w:proofErr w:type="spellStart"/>
+      <w:r>
+        <w:t>stadijima</w:t>
+      </w:r>
+      <w:proofErr w:type="spellEnd"/>
+      <w:r>
+        <w:t xml:space="preserve"> </w:t>
+      </w:r>
+      <w:proofErr w:type="spellStart"/>
+      <w:r>
+        <w:t>bolesti</w:t>
+      </w:r>
+      <w:proofErr w:type="spellEnd"/>
+      <w:r>
+        <w:t xml:space="preserve">, </w:t>
+      </w:r>
+      <w:proofErr w:type="spellStart"/>
+      <w:r>
+        <w:t>zbog</w:t>
+      </w:r>
+      <w:proofErr w:type="spellEnd"/>
+      <w:r>
+        <w:t xml:space="preserve"> </w:t>
+      </w:r>
+      <w:proofErr w:type="spellStart"/>
+      <w:r>
+        <w:t>čega</w:t>
+      </w:r>
+      <w:proofErr w:type="spellEnd"/>
+      <w:r>
+        <w:t xml:space="preserve"> je </w:t>
+      </w:r>
+      <w:proofErr w:type="spellStart"/>
+      <w:r>
+        <w:t>bitno</w:t>
+      </w:r>
+      <w:proofErr w:type="spellEnd"/>
+      <w:r>
+        <w:t xml:space="preserve"> </w:t>
+      </w:r>
+      <w:proofErr w:type="spellStart"/>
+      <w:r>
+        <w:t>rano</w:t>
+      </w:r>
+      <w:proofErr w:type="spellEnd"/>
+      <w:r>
+        <w:t xml:space="preserve"> </w:t>
+      </w:r>
+      <w:proofErr w:type="spellStart"/>
+      <w:r>
+        <w:t>otkrivanje</w:t>
+      </w:r>
+      <w:proofErr w:type="spellEnd"/>
+      <w:r>
+        <w:t xml:space="preserve"> </w:t>
+      </w:r>
+      <w:proofErr w:type="spellStart"/>
+      <w:r>
+        <w:t>bolesti</w:t>
+      </w:r>
+      <w:proofErr w:type="spellEnd"/>
+      <w:r>
+        <w:t xml:space="preserve">. </w:t>
+      </w:r>
+      <w:proofErr w:type="spellStart"/>
+      <w:r>
+        <w:t>Simptomi</w:t>
+      </w:r>
+      <w:proofErr w:type="spellEnd"/>
+      <w:r>
+        <w:t xml:space="preserve"> </w:t>
+      </w:r>
+      <w:proofErr w:type="spellStart"/>
+      <w:r>
+        <w:t>raka</w:t>
+      </w:r>
+      <w:proofErr w:type="spellEnd"/>
+      <w:r>
+        <w:t xml:space="preserve"> </w:t>
+      </w:r>
+      <w:proofErr w:type="spellStart"/>
+      <w:r>
+        <w:t>dojke</w:t>
+      </w:r>
+      <w:proofErr w:type="spellEnd"/>
+      <w:r>
+        <w:t xml:space="preserve"> </w:t>
+      </w:r>
+      <w:proofErr w:type="spellStart"/>
+      <w:r>
+        <w:t>mogu</w:t>
+      </w:r>
+      <w:proofErr w:type="spellEnd"/>
+      <w:r>
+        <w:t xml:space="preserve"> </w:t>
+      </w:r>
+      <w:proofErr w:type="spellStart"/>
+      <w:r>
+        <w:t>uključivati</w:t>
+      </w:r>
+      <w:proofErr w:type="spellEnd"/>
+      <w:r>
+        <w:t xml:space="preserve">: </w:t>
+      </w:r>
+      <w:proofErr w:type="spellStart"/>
+      <w:r>
+        <w:t>bezbolnu</w:t>
+      </w:r>
+      <w:proofErr w:type="spellEnd"/>
+      <w:r>
+        <w:t xml:space="preserve"> </w:t>
+      </w:r>
+      <w:proofErr w:type="spellStart"/>
+      <w:r>
+        <w:t>kvržicu</w:t>
+      </w:r>
+      <w:proofErr w:type="spellEnd"/>
+      <w:r>
+        <w:t xml:space="preserve"> </w:t>
+      </w:r>
+      <w:proofErr w:type="spellStart"/>
+      <w:r>
+        <w:t>na</w:t>
+      </w:r>
+      <w:proofErr w:type="spellEnd"/>
+      <w:r>
+        <w:t xml:space="preserve"> </w:t>
+      </w:r>
+      <w:proofErr w:type="spellStart"/>
+      <w:r>
+        <w:t>grudima</w:t>
+      </w:r>
+      <w:proofErr w:type="spellEnd"/>
+      <w:r>
+        <w:t xml:space="preserve">, </w:t>
+      </w:r>
+      <w:proofErr w:type="spellStart"/>
+      <w:r>
+        <w:t>promjenu</w:t>
+      </w:r>
+      <w:proofErr w:type="spellEnd"/>
+      <w:r>
+        <w:t xml:space="preserve"> </w:t>
+      </w:r>
+      <w:proofErr w:type="spellStart"/>
+      <w:r>
+        <w:t>oblika</w:t>
+      </w:r>
+      <w:proofErr w:type="spellEnd"/>
+      <w:r>
+        <w:t xml:space="preserve"> </w:t>
+      </w:r>
+      <w:proofErr w:type="spellStart"/>
+      <w:r>
+        <w:t>ili</w:t>
+      </w:r>
+      <w:proofErr w:type="spellEnd"/>
+      <w:r>
+        <w:t xml:space="preserve"> </w:t>
+      </w:r>
+      <w:proofErr w:type="spellStart"/>
+      <w:r>
+        <w:t>izgleda</w:t>
+      </w:r>
+      <w:proofErr w:type="spellEnd"/>
+      <w:r>
+        <w:t xml:space="preserve"> </w:t>
+      </w:r>
+      <w:proofErr w:type="spellStart"/>
+      <w:r>
+        <w:t>dojke</w:t>
+      </w:r>
+      <w:proofErr w:type="spellEnd"/>
+      <w:r>
+        <w:t xml:space="preserve">, </w:t>
+      </w:r>
+      <w:proofErr w:type="spellStart"/>
+      <w:r>
+        <w:t>stvaranje</w:t>
+      </w:r>
+      <w:proofErr w:type="spellEnd"/>
+      <w:r>
+        <w:t xml:space="preserve"> </w:t>
+      </w:r>
+      <w:proofErr w:type="spellStart"/>
+      <w:r>
+        <w:t>udubljenja</w:t>
+      </w:r>
+      <w:proofErr w:type="spellEnd"/>
+      <w:r>
+        <w:t xml:space="preserve">, </w:t>
+      </w:r>
+      <w:proofErr w:type="spellStart"/>
+      <w:r>
+        <w:t>crvenila</w:t>
+      </w:r>
+      <w:proofErr w:type="spellEnd"/>
+      <w:r>
+        <w:t xml:space="preserve"> </w:t>
+      </w:r>
+      <w:proofErr w:type="spellStart"/>
+      <w:r>
+        <w:t>ili</w:t>
+      </w:r>
+      <w:proofErr w:type="spellEnd"/>
+      <w:r>
+        <w:t xml:space="preserve"> </w:t>
+      </w:r>
+      <w:proofErr w:type="spellStart"/>
+      <w:r>
+        <w:t>drugih</w:t>
+      </w:r>
+      <w:proofErr w:type="spellEnd"/>
+      <w:r>
+        <w:t xml:space="preserve"> </w:t>
+      </w:r>
+      <w:proofErr w:type="spellStart"/>
+      <w:r>
+        <w:t>promjena</w:t>
+      </w:r>
+      <w:proofErr w:type="spellEnd"/>
+      <w:r>
+        <w:t xml:space="preserve"> </w:t>
+      </w:r>
+      <w:proofErr w:type="spellStart"/>
+      <w:r>
+        <w:t>na</w:t>
+      </w:r>
+      <w:proofErr w:type="spellEnd"/>
+      <w:r>
+        <w:t xml:space="preserve"> </w:t>
+      </w:r>
+      <w:proofErr w:type="spellStart"/>
+      <w:r>
+        <w:t>koži</w:t>
+      </w:r>
+      <w:proofErr w:type="spellEnd"/>
+      <w:r>
+        <w:t xml:space="preserve">, </w:t>
+      </w:r>
+      <w:proofErr w:type="spellStart"/>
+      <w:r>
+        <w:t>promjene</w:t>
+      </w:r>
+      <w:proofErr w:type="spellEnd"/>
+      <w:r>
+        <w:t xml:space="preserve"> u </w:t>
+      </w:r>
+      <w:proofErr w:type="spellStart"/>
+      <w:r>
+        <w:t>izgledu</w:t>
+      </w:r>
+      <w:proofErr w:type="spellEnd"/>
+      <w:r>
+        <w:t xml:space="preserve"> </w:t>
+      </w:r>
+      <w:proofErr w:type="spellStart"/>
+      <w:r>
+        <w:t>bradavice</w:t>
+      </w:r>
+      <w:proofErr w:type="spellEnd"/>
+      <w:r>
+        <w:t xml:space="preserve"> (areole) </w:t>
+      </w:r>
+      <w:proofErr w:type="spellStart"/>
+      <w:r>
+        <w:t>ili</w:t>
+      </w:r>
+      <w:proofErr w:type="spellEnd"/>
+      <w:r>
+        <w:t xml:space="preserve"> </w:t>
+      </w:r>
+      <w:proofErr w:type="spellStart"/>
+      <w:r>
+        <w:t>kože</w:t>
+      </w:r>
+      <w:proofErr w:type="spellEnd"/>
+      <w:r>
+        <w:t xml:space="preserve"> </w:t>
+      </w:r>
+      <w:proofErr w:type="spellStart"/>
+      <w:r>
+        <w:t>oko</w:t>
+      </w:r>
+      <w:proofErr w:type="spellEnd"/>
+      <w:r>
+        <w:t xml:space="preserve"> </w:t>
+      </w:r>
+      <w:proofErr w:type="spellStart"/>
+      <w:r>
+        <w:t>nje</w:t>
+      </w:r>
+      <w:proofErr w:type="spellEnd"/>
+      <w:r>
+        <w:t xml:space="preserve"> </w:t>
+      </w:r>
+      <w:proofErr w:type="spellStart"/>
+      <w:r>
+        <w:t>te</w:t>
+      </w:r>
+      <w:proofErr w:type="spellEnd"/>
+      <w:r>
+        <w:t xml:space="preserve"> </w:t>
+      </w:r>
+      <w:proofErr w:type="spellStart"/>
+      <w:r>
+        <w:t>abnormalni</w:t>
+      </w:r>
+      <w:proofErr w:type="spellEnd"/>
+      <w:r>
+        <w:t xml:space="preserve"> </w:t>
+      </w:r>
+      <w:proofErr w:type="spellStart"/>
+      <w:r>
+        <w:t>ili</w:t>
+      </w:r>
+      <w:proofErr w:type="spellEnd"/>
+      <w:r>
+        <w:t xml:space="preserve"> </w:t>
+      </w:r>
+      <w:proofErr w:type="spellStart"/>
+      <w:r>
+        <w:t>krvavi</w:t>
+      </w:r>
+      <w:proofErr w:type="spellEnd"/>
+      <w:r>
+        <w:t xml:space="preserve"> </w:t>
+      </w:r>
+      <w:proofErr w:type="spellStart"/>
+      <w:r>
+        <w:t>iscjedak</w:t>
+      </w:r>
+      <w:proofErr w:type="spellEnd"/>
+      <w:r>
+        <w:t xml:space="preserve"> </w:t>
+      </w:r>
+      <w:proofErr w:type="spellStart"/>
+      <w:r>
+        <w:t>iz</w:t>
+      </w:r>
+      <w:proofErr w:type="spellEnd"/>
+      <w:r>
+        <w:t xml:space="preserve"> </w:t>
+      </w:r>
+      <w:proofErr w:type="spellStart"/>
+      <w:r>
+        <w:t>bradavice</w:t>
+      </w:r>
+      <w:proofErr w:type="spellEnd"/>
+      <w:r>
+        <w:t xml:space="preserve"> [1]. </w:t>
       </w:r>
     </w:p>
     <w:p>
       <w:pPr>
         <w:pStyle w:val="BodyText"/>
       </w:pPr>
-      <w:r>
-        <w:t>Postoje dva najčešća načina dijagnosticiranja raka dojke: mamografija i ultrazvuk dojke. Mamografija je rendgenski pregled dojki kojim se otkrivaju tumori i druge promjene dojke koje su premalene da bi se mogle napipati.</w:t>
-      </w:r>
-      <w:r>
-        <w:t xml:space="preserve"> Ultrazvuk je radiološka dijagnostička metoda koja za snimanja koristi zvuk visoke frekvencije</w:t>
-      </w:r>
-      <w:r>
-        <w:t>. Smatra se potpuno ne</w:t>
+      <w:proofErr w:type="spellStart"/>
+      <w:r>
+        <w:t>Postoje</w:t>
+      </w:r>
+      <w:proofErr w:type="spellEnd"/>
+      <w:r>
+        <w:t xml:space="preserve"> </w:t>
+      </w:r>
+      <w:proofErr w:type="spellStart"/>
+      <w:r>
+        <w:t>dva</w:t>
+      </w:r>
+      <w:proofErr w:type="spellEnd"/>
+      <w:r>
+        <w:t xml:space="preserve"> </w:t>
+      </w:r>
+      <w:proofErr w:type="spellStart"/>
+      <w:r>
+        <w:t>najčešća</w:t>
+      </w:r>
+      <w:proofErr w:type="spellEnd"/>
+      <w:r>
+        <w:t xml:space="preserve"> </w:t>
+      </w:r>
+      <w:proofErr w:type="spellStart"/>
+      <w:r>
+        <w:t>načina</w:t>
+      </w:r>
+      <w:proofErr w:type="spellEnd"/>
+      <w:r>
+        <w:t xml:space="preserve"> </w:t>
+      </w:r>
+      <w:proofErr w:type="spellStart"/>
+      <w:r>
+        <w:t>dijagnosticiranja</w:t>
+      </w:r>
+      <w:proofErr w:type="spellEnd"/>
+      <w:r>
+        <w:t xml:space="preserve"> </w:t>
+      </w:r>
+      <w:proofErr w:type="spellStart"/>
+      <w:r>
+        <w:t>raka</w:t>
+      </w:r>
+      <w:proofErr w:type="spellEnd"/>
+      <w:r>
+        <w:t xml:space="preserve"> </w:t>
+      </w:r>
+      <w:proofErr w:type="spellStart"/>
+      <w:r>
+        <w:t>dojke</w:t>
+      </w:r>
+      <w:proofErr w:type="spellEnd"/>
+      <w:r>
+        <w:t xml:space="preserve">: </w:t>
+      </w:r>
+      <w:proofErr w:type="spellStart"/>
+      <w:r>
+        <w:t>mamografija</w:t>
+      </w:r>
+      <w:proofErr w:type="spellEnd"/>
+      <w:r>
+        <w:t xml:space="preserve"> </w:t>
+      </w:r>
+      <w:proofErr w:type="spellStart"/>
+      <w:r>
+        <w:t>i</w:t>
+      </w:r>
+      <w:proofErr w:type="spellEnd"/>
+      <w:r>
+        <w:t xml:space="preserve"> </w:t>
+      </w:r>
+      <w:proofErr w:type="spellStart"/>
+      <w:r>
+        <w:t>ultrazvuk</w:t>
+      </w:r>
+      <w:proofErr w:type="spellEnd"/>
+      <w:r>
+        <w:t xml:space="preserve"> </w:t>
+      </w:r>
+      <w:proofErr w:type="spellStart"/>
+      <w:r>
+        <w:t>dojke</w:t>
+      </w:r>
+      <w:proofErr w:type="spellEnd"/>
+      <w:r>
+        <w:t xml:space="preserve">. </w:t>
+      </w:r>
+      <w:proofErr w:type="spellStart"/>
+      <w:r>
+        <w:t>Mamografija</w:t>
+      </w:r>
+      <w:proofErr w:type="spellEnd"/>
+      <w:r>
+        <w:t xml:space="preserve"> je </w:t>
+      </w:r>
+      <w:proofErr w:type="spellStart"/>
+      <w:r>
+        <w:t>rendgenski</w:t>
+      </w:r>
+      <w:proofErr w:type="spellEnd"/>
+      <w:r>
+        <w:t xml:space="preserve"> </w:t>
+      </w:r>
+      <w:proofErr w:type="spellStart"/>
+      <w:r>
+        <w:t>pregled</w:t>
+      </w:r>
+      <w:proofErr w:type="spellEnd"/>
+      <w:r>
+        <w:t xml:space="preserve"> </w:t>
+      </w:r>
+      <w:proofErr w:type="spellStart"/>
+      <w:r>
+        <w:t>dojki</w:t>
+      </w:r>
+      <w:proofErr w:type="spellEnd"/>
+      <w:r>
+        <w:t xml:space="preserve"> </w:t>
+      </w:r>
+      <w:proofErr w:type="spellStart"/>
+      <w:r>
+        <w:t>kojim</w:t>
+      </w:r>
+      <w:proofErr w:type="spellEnd"/>
+      <w:r>
+        <w:t xml:space="preserve"> se </w:t>
+      </w:r>
+      <w:proofErr w:type="spellStart"/>
+      <w:r>
+        <w:t>otkrivaju</w:t>
+      </w:r>
+      <w:proofErr w:type="spellEnd"/>
+      <w:r>
+        <w:t xml:space="preserve"> </w:t>
+      </w:r>
+      <w:proofErr w:type="spellStart"/>
+      <w:r>
+        <w:t>tumori</w:t>
+      </w:r>
+      <w:proofErr w:type="spellEnd"/>
+      <w:r>
+        <w:t xml:space="preserve"> </w:t>
+      </w:r>
+      <w:proofErr w:type="spellStart"/>
+      <w:r>
+        <w:t>i</w:t>
+      </w:r>
+      <w:proofErr w:type="spellEnd"/>
+      <w:r>
+        <w:t xml:space="preserve"> </w:t>
+      </w:r>
+      <w:proofErr w:type="spellStart"/>
+      <w:r>
+        <w:t>druge</w:t>
+      </w:r>
+      <w:proofErr w:type="spellEnd"/>
+      <w:r>
+        <w:t xml:space="preserve"> </w:t>
+      </w:r>
+      <w:proofErr w:type="spellStart"/>
+      <w:r>
+        <w:t>promjene</w:t>
+      </w:r>
+      <w:proofErr w:type="spellEnd"/>
+      <w:r>
+        <w:t xml:space="preserve"> </w:t>
+      </w:r>
+      <w:proofErr w:type="spellStart"/>
+      <w:r>
+        <w:t>dojke</w:t>
+      </w:r>
+      <w:proofErr w:type="spellEnd"/>
+      <w:r>
+        <w:t xml:space="preserve"> </w:t>
+      </w:r>
+      <w:proofErr w:type="spellStart"/>
+      <w:r>
+        <w:t>koje</w:t>
+      </w:r>
+      <w:proofErr w:type="spellEnd"/>
+      <w:r>
+        <w:t xml:space="preserve"> </w:t>
+      </w:r>
+      <w:proofErr w:type="spellStart"/>
+      <w:r>
+        <w:t>su</w:t>
+      </w:r>
+      <w:proofErr w:type="spellEnd"/>
+      <w:r>
+        <w:t xml:space="preserve"> </w:t>
+      </w:r>
+      <w:proofErr w:type="spellStart"/>
+      <w:r>
+        <w:t>premalene</w:t>
+      </w:r>
+      <w:proofErr w:type="spellEnd"/>
+      <w:r>
+        <w:t xml:space="preserve"> da bi se </w:t>
+      </w:r>
+      <w:proofErr w:type="spellStart"/>
+      <w:r>
+        <w:t>mogle</w:t>
+      </w:r>
+      <w:proofErr w:type="spellEnd"/>
+      <w:r>
+        <w:t xml:space="preserve"> </w:t>
+      </w:r>
+      <w:proofErr w:type="spellStart"/>
+      <w:r>
+        <w:t>napipati</w:t>
+      </w:r>
+      <w:proofErr w:type="spellEnd"/>
+      <w:r>
+        <w:t>.</w:t>
+      </w:r>
+      <w:r>
+        <w:t xml:space="preserve"> </w:t>
+      </w:r>
+      <w:proofErr w:type="spellStart"/>
+      <w:r>
+        <w:t>Ultrazvuk</w:t>
+      </w:r>
+      <w:proofErr w:type="spellEnd"/>
+      <w:r>
+        <w:t xml:space="preserve"> je </w:t>
+      </w:r>
+      <w:proofErr w:type="spellStart"/>
+      <w:r>
+        <w:t>radiološka</w:t>
+      </w:r>
+      <w:proofErr w:type="spellEnd"/>
+      <w:r>
+        <w:t xml:space="preserve"> </w:t>
+      </w:r>
+      <w:proofErr w:type="spellStart"/>
+      <w:r>
+        <w:t>dijagnostička</w:t>
+      </w:r>
+      <w:proofErr w:type="spellEnd"/>
+      <w:r>
+        <w:t xml:space="preserve"> </w:t>
+      </w:r>
+      <w:proofErr w:type="spellStart"/>
+      <w:r>
+        <w:t>metoda</w:t>
+      </w:r>
+      <w:proofErr w:type="spellEnd"/>
+      <w:r>
+        <w:t xml:space="preserve"> </w:t>
+      </w:r>
+      <w:proofErr w:type="spellStart"/>
+      <w:r>
+        <w:t>koja</w:t>
+      </w:r>
+      <w:proofErr w:type="spellEnd"/>
+      <w:r>
+        <w:t xml:space="preserve"> za </w:t>
+      </w:r>
+      <w:proofErr w:type="spellStart"/>
+      <w:r>
+        <w:t>snimanja</w:t>
+      </w:r>
+      <w:proofErr w:type="spellEnd"/>
+      <w:r>
+        <w:t xml:space="preserve"> </w:t>
+      </w:r>
+      <w:proofErr w:type="spellStart"/>
+      <w:r>
+        <w:t>koristi</w:t>
+      </w:r>
+      <w:proofErr w:type="spellEnd"/>
+      <w:r>
+        <w:t xml:space="preserve"> </w:t>
+      </w:r>
+      <w:proofErr w:type="spellStart"/>
+      <w:r>
+        <w:t>zvuk</w:t>
+      </w:r>
+      <w:proofErr w:type="spellEnd"/>
+      <w:r>
+        <w:t xml:space="preserve"> </w:t>
+      </w:r>
+      <w:proofErr w:type="spellStart"/>
+      <w:r>
+        <w:t>visoke</w:t>
+      </w:r>
+      <w:proofErr w:type="spellEnd"/>
+      <w:r>
+        <w:t xml:space="preserve"> </w:t>
+      </w:r>
+      <w:proofErr w:type="spellStart"/>
+      <w:r>
+        <w:t>frekvencije</w:t>
+      </w:r>
+      <w:proofErr w:type="spellEnd"/>
+      <w:r>
+        <w:t xml:space="preserve">. </w:t>
+      </w:r>
+      <w:proofErr w:type="spellStart"/>
+      <w:r>
+        <w:t>Smatra</w:t>
+      </w:r>
+      <w:proofErr w:type="spellEnd"/>
+      <w:r>
+        <w:t xml:space="preserve"> se </w:t>
+      </w:r>
+      <w:proofErr w:type="spellStart"/>
+      <w:r>
+        <w:t>potpuno</w:t>
+      </w:r>
+      <w:proofErr w:type="spellEnd"/>
+      <w:r>
+        <w:t xml:space="preserve"> </w:t>
+      </w:r>
+      <w:proofErr w:type="spellStart"/>
+      <w:r>
+        <w:t>ne</w:t>
       </w:r>
       <w:r>
         <w:t>škodljivom</w:t>
       </w:r>
-      <w:r>
-        <w:t xml:space="preserve"> metodom, pri čemu nema izlaganja ionizirajućim zračenjima</w:t>
-      </w:r>
-      <w:r>
-        <w:t xml:space="preserve"> [2]. U medicinskom ultrazvuku koriste se longitudinalni</w:t>
-      </w:r>
-      <w:r>
-        <w:t xml:space="preserve"> </w:t>
-      </w:r>
-      <w:r>
-        <w:t xml:space="preserve">valovi frekvencija većih od 2,5 MHz [3]. </w:t>
-      </w:r>
-      <w:r>
-        <w:t>Ultrazvuk, uz mamografiju, znatno povećava točnost dijagnosticiranja dobroćudnih i zloćudnih bolesti dojke [2].</w:t>
+      <w:proofErr w:type="spellEnd"/>
+      <w:r>
+        <w:t xml:space="preserve"> </w:t>
+      </w:r>
+      <w:proofErr w:type="spellStart"/>
+      <w:r>
+        <w:t>metodom</w:t>
+      </w:r>
+      <w:proofErr w:type="spellEnd"/>
+      <w:r>
+        <w:t xml:space="preserve">, </w:t>
+      </w:r>
+      <w:proofErr w:type="spellStart"/>
+      <w:r>
+        <w:t>pri</w:t>
+      </w:r>
+      <w:proofErr w:type="spellEnd"/>
+      <w:r>
+        <w:t xml:space="preserve"> </w:t>
+      </w:r>
+      <w:proofErr w:type="spellStart"/>
+      <w:r>
+        <w:t>čemu</w:t>
+      </w:r>
+      <w:proofErr w:type="spellEnd"/>
+      <w:r>
+        <w:t xml:space="preserve"> </w:t>
+      </w:r>
+      <w:proofErr w:type="spellStart"/>
+      <w:r>
+        <w:t>nema</w:t>
+      </w:r>
+      <w:proofErr w:type="spellEnd"/>
+      <w:r>
+        <w:t xml:space="preserve"> </w:t>
+      </w:r>
+      <w:proofErr w:type="spellStart"/>
+      <w:r>
+        <w:t>izlaganja</w:t>
+      </w:r>
+      <w:proofErr w:type="spellEnd"/>
+      <w:r>
+        <w:t xml:space="preserve"> </w:t>
+      </w:r>
+      <w:proofErr w:type="spellStart"/>
+      <w:r>
+        <w:t>ionizirajućim</w:t>
+      </w:r>
+      <w:proofErr w:type="spellEnd"/>
+      <w:r>
+        <w:t xml:space="preserve"> </w:t>
+      </w:r>
+      <w:proofErr w:type="spellStart"/>
+      <w:r>
+        <w:t>zračenjima</w:t>
+      </w:r>
+      <w:proofErr w:type="spellEnd"/>
+      <w:r>
+        <w:t xml:space="preserve"> [2]. U </w:t>
+      </w:r>
+      <w:proofErr w:type="spellStart"/>
+      <w:r>
+        <w:t>medicinskom</w:t>
+      </w:r>
+      <w:proofErr w:type="spellEnd"/>
+      <w:r>
+        <w:t xml:space="preserve"> </w:t>
+      </w:r>
+      <w:proofErr w:type="spellStart"/>
+      <w:r>
+        <w:t>ultrazvuku</w:t>
+      </w:r>
+      <w:proofErr w:type="spellEnd"/>
+      <w:r>
+        <w:t xml:space="preserve"> </w:t>
+      </w:r>
+      <w:proofErr w:type="spellStart"/>
+      <w:r>
+        <w:t>koriste</w:t>
+      </w:r>
+      <w:proofErr w:type="spellEnd"/>
+      <w:r>
+        <w:t xml:space="preserve"> se </w:t>
+      </w:r>
+      <w:proofErr w:type="spellStart"/>
+      <w:r>
+        <w:t>longitudinalni</w:t>
+      </w:r>
+      <w:proofErr w:type="spellEnd"/>
+      <w:r>
+        <w:t xml:space="preserve"> </w:t>
+      </w:r>
+      <w:proofErr w:type="spellStart"/>
+      <w:r>
+        <w:t>valovi</w:t>
+      </w:r>
+      <w:proofErr w:type="spellEnd"/>
+      <w:r>
+        <w:t xml:space="preserve"> </w:t>
+      </w:r>
+      <w:proofErr w:type="spellStart"/>
+      <w:r>
+        <w:t>frekvencija</w:t>
+      </w:r>
+      <w:proofErr w:type="spellEnd"/>
+      <w:r>
+        <w:t xml:space="preserve"> </w:t>
+      </w:r>
+      <w:proofErr w:type="spellStart"/>
+      <w:r>
+        <w:t>većih</w:t>
+      </w:r>
+      <w:proofErr w:type="spellEnd"/>
+      <w:r>
+        <w:t xml:space="preserve"> od 2,5 MHz [3]. </w:t>
+      </w:r>
+      <w:proofErr w:type="spellStart"/>
+      <w:r>
+        <w:t>Ultrazvuk</w:t>
+      </w:r>
+      <w:proofErr w:type="spellEnd"/>
+      <w:r>
+        <w:t xml:space="preserve">, </w:t>
+      </w:r>
+      <w:proofErr w:type="spellStart"/>
+      <w:r>
+        <w:t>uz</w:t>
+      </w:r>
+      <w:proofErr w:type="spellEnd"/>
+      <w:r>
+        <w:t xml:space="preserve"> </w:t>
+      </w:r>
+      <w:proofErr w:type="spellStart"/>
+      <w:r>
+        <w:t>mamografiju</w:t>
+      </w:r>
+      <w:proofErr w:type="spellEnd"/>
+      <w:r>
+        <w:t xml:space="preserve">, </w:t>
+      </w:r>
+      <w:proofErr w:type="spellStart"/>
+      <w:r>
+        <w:t>znatno</w:t>
+      </w:r>
+      <w:proofErr w:type="spellEnd"/>
+      <w:r>
+        <w:t xml:space="preserve"> </w:t>
+      </w:r>
+      <w:proofErr w:type="spellStart"/>
+      <w:r>
+        <w:t>povećava</w:t>
+      </w:r>
+      <w:proofErr w:type="spellEnd"/>
+      <w:r>
+        <w:t xml:space="preserve"> </w:t>
+      </w:r>
+      <w:proofErr w:type="spellStart"/>
+      <w:r>
+        <w:t>točnost</w:t>
+      </w:r>
+      <w:proofErr w:type="spellEnd"/>
+      <w:r>
+        <w:t xml:space="preserve"> </w:t>
+      </w:r>
+      <w:proofErr w:type="spellStart"/>
+      <w:r>
+        <w:t>dijagnosticiranja</w:t>
+      </w:r>
+      <w:proofErr w:type="spellEnd"/>
+      <w:r>
+        <w:t xml:space="preserve"> </w:t>
+      </w:r>
+      <w:proofErr w:type="spellStart"/>
+      <w:r>
+        <w:t>dobroćudnih</w:t>
+      </w:r>
+      <w:proofErr w:type="spellEnd"/>
+      <w:r>
+        <w:t xml:space="preserve"> </w:t>
+      </w:r>
+      <w:proofErr w:type="spellStart"/>
+      <w:r>
+        <w:t>i</w:t>
+      </w:r>
+      <w:proofErr w:type="spellEnd"/>
+      <w:r>
+        <w:t xml:space="preserve"> </w:t>
+      </w:r>
+      <w:proofErr w:type="spellStart"/>
+      <w:r>
+        <w:t>zloćudnih</w:t>
+      </w:r>
+      <w:proofErr w:type="spellEnd"/>
+      <w:r>
+        <w:t xml:space="preserve"> </w:t>
+      </w:r>
+      <w:proofErr w:type="spellStart"/>
+      <w:r>
+        <w:t>bolesti</w:t>
+      </w:r>
+      <w:proofErr w:type="spellEnd"/>
+      <w:r>
+        <w:t xml:space="preserve"> </w:t>
+      </w:r>
+      <w:proofErr w:type="spellStart"/>
+      <w:r>
+        <w:t>dojke</w:t>
+      </w:r>
+      <w:proofErr w:type="spellEnd"/>
+      <w:r>
+        <w:t xml:space="preserve"> [2].</w:t>
       </w:r>
     </w:p>
     <w:p>
       <w:pPr>
         <w:pStyle w:val="BodyText"/>
       </w:pPr>
-      <w:r>
-        <w:t xml:space="preserve">Ultrazvuk može procijeniti morfologiju, orijentaciju, unutarnju strukturu i rubove lezije iz više ravnina s visokom rezolucijom, kako u dojkama koje se sastoje od pretežno masnog tkiva, tako i u gustim žljezdanim strukturama. Opći kriteriji za otkrivanje raka dojke ultrazvukom navedeni su u </w:t>
-      </w:r>
-      <w:r>
-        <w:t>tablici 1. Među tim značajkama, najbitniji faktori pri klasificiranju lezija su: okolno tkivo, oblik, kontura ruba, granica lezije i posteriorne akustičke značajke [4].</w:t>
+      <w:proofErr w:type="spellStart"/>
+      <w:r>
+        <w:t>Ultrazvuk</w:t>
+      </w:r>
+      <w:proofErr w:type="spellEnd"/>
+      <w:r>
+        <w:t xml:space="preserve"> </w:t>
+      </w:r>
+      <w:proofErr w:type="spellStart"/>
+      <w:r>
+        <w:t>može</w:t>
+      </w:r>
+      <w:proofErr w:type="spellEnd"/>
+      <w:r>
+        <w:t xml:space="preserve"> </w:t>
+      </w:r>
+      <w:proofErr w:type="spellStart"/>
+      <w:r>
+        <w:t>procijeniti</w:t>
+      </w:r>
+      <w:proofErr w:type="spellEnd"/>
+      <w:r>
+        <w:t xml:space="preserve"> </w:t>
+      </w:r>
+      <w:proofErr w:type="spellStart"/>
+      <w:r>
+        <w:t>morfologiju</w:t>
+      </w:r>
+      <w:proofErr w:type="spellEnd"/>
+      <w:r>
+        <w:t xml:space="preserve">, </w:t>
+      </w:r>
+      <w:proofErr w:type="spellStart"/>
+      <w:r>
+        <w:t>orijentaciju</w:t>
+      </w:r>
+      <w:proofErr w:type="spellEnd"/>
+      <w:r>
+        <w:t xml:space="preserve">, </w:t>
+      </w:r>
+      <w:proofErr w:type="spellStart"/>
+      <w:r>
+        <w:t>unutarnju</w:t>
+      </w:r>
+      <w:proofErr w:type="spellEnd"/>
+      <w:r>
+        <w:t xml:space="preserve"> </w:t>
+      </w:r>
+      <w:proofErr w:type="spellStart"/>
+      <w:r>
+        <w:t>strukturu</w:t>
+      </w:r>
+      <w:proofErr w:type="spellEnd"/>
+      <w:r>
+        <w:t xml:space="preserve"> </w:t>
+      </w:r>
+      <w:proofErr w:type="spellStart"/>
+      <w:r>
+        <w:t>i</w:t>
+      </w:r>
+      <w:proofErr w:type="spellEnd"/>
+      <w:r>
+        <w:t xml:space="preserve"> </w:t>
+      </w:r>
+      <w:proofErr w:type="spellStart"/>
+      <w:r>
+        <w:t>rubove</w:t>
+      </w:r>
+      <w:proofErr w:type="spellEnd"/>
+      <w:r>
+        <w:t xml:space="preserve"> </w:t>
+      </w:r>
+      <w:proofErr w:type="spellStart"/>
+      <w:r>
+        <w:t>lezije</w:t>
+      </w:r>
+      <w:proofErr w:type="spellEnd"/>
+      <w:r>
+        <w:t xml:space="preserve"> </w:t>
+      </w:r>
+      <w:proofErr w:type="spellStart"/>
+      <w:r>
+        <w:t>iz</w:t>
+      </w:r>
+      <w:proofErr w:type="spellEnd"/>
+      <w:r>
+        <w:t xml:space="preserve"> </w:t>
+      </w:r>
+      <w:proofErr w:type="spellStart"/>
+      <w:r>
+        <w:t>više</w:t>
+      </w:r>
+      <w:proofErr w:type="spellEnd"/>
+      <w:r>
+        <w:t xml:space="preserve"> </w:t>
+      </w:r>
+      <w:proofErr w:type="spellStart"/>
+      <w:r>
+        <w:t>ravnina</w:t>
+      </w:r>
+      <w:proofErr w:type="spellEnd"/>
+      <w:r>
+        <w:t xml:space="preserve"> s </w:t>
+      </w:r>
+      <w:proofErr w:type="spellStart"/>
+      <w:r>
+        <w:t>visokom</w:t>
+      </w:r>
+      <w:proofErr w:type="spellEnd"/>
+      <w:r>
+        <w:t xml:space="preserve"> </w:t>
+      </w:r>
+      <w:proofErr w:type="spellStart"/>
+      <w:r>
+        <w:t>rezolucijom</w:t>
+      </w:r>
+      <w:proofErr w:type="spellEnd"/>
+      <w:r>
+        <w:t xml:space="preserve">, </w:t>
+      </w:r>
+      <w:proofErr w:type="spellStart"/>
+      <w:r>
+        <w:t>kako</w:t>
+      </w:r>
+      <w:proofErr w:type="spellEnd"/>
+      <w:r>
+        <w:t xml:space="preserve"> u </w:t>
+      </w:r>
+      <w:proofErr w:type="spellStart"/>
+      <w:r>
+        <w:t>dojkama</w:t>
+      </w:r>
+      <w:proofErr w:type="spellEnd"/>
+      <w:r>
+        <w:t xml:space="preserve"> </w:t>
+      </w:r>
+      <w:proofErr w:type="spellStart"/>
+      <w:r>
+        <w:t>koje</w:t>
+      </w:r>
+      <w:proofErr w:type="spellEnd"/>
+      <w:r>
+        <w:t xml:space="preserve"> se </w:t>
+      </w:r>
+      <w:proofErr w:type="spellStart"/>
+      <w:r>
+        <w:t>sastoje</w:t>
+      </w:r>
+      <w:proofErr w:type="spellEnd"/>
+      <w:r>
+        <w:t xml:space="preserve"> od </w:t>
+      </w:r>
+      <w:proofErr w:type="spellStart"/>
+      <w:r>
+        <w:t>pretežno</w:t>
+      </w:r>
+      <w:proofErr w:type="spellEnd"/>
+      <w:r>
+        <w:t xml:space="preserve"> </w:t>
+      </w:r>
+      <w:proofErr w:type="spellStart"/>
+      <w:r>
+        <w:t>masnog</w:t>
+      </w:r>
+      <w:proofErr w:type="spellEnd"/>
+      <w:r>
+        <w:t xml:space="preserve"> </w:t>
+      </w:r>
+      <w:proofErr w:type="spellStart"/>
+      <w:r>
+        <w:t>tkiva</w:t>
+      </w:r>
+      <w:proofErr w:type="spellEnd"/>
+      <w:r>
+        <w:t xml:space="preserve">, </w:t>
+      </w:r>
+      <w:proofErr w:type="spellStart"/>
+      <w:r>
+        <w:t>tako</w:t>
+      </w:r>
+      <w:proofErr w:type="spellEnd"/>
+      <w:r>
+        <w:t xml:space="preserve"> </w:t>
+      </w:r>
+      <w:proofErr w:type="spellStart"/>
+      <w:r>
+        <w:t>i</w:t>
+      </w:r>
+      <w:proofErr w:type="spellEnd"/>
+      <w:r>
+        <w:t xml:space="preserve"> u </w:t>
+      </w:r>
+      <w:proofErr w:type="spellStart"/>
+      <w:r>
+        <w:t>gustim</w:t>
+      </w:r>
+      <w:proofErr w:type="spellEnd"/>
+      <w:r>
+        <w:t xml:space="preserve"> </w:t>
+      </w:r>
+      <w:proofErr w:type="spellStart"/>
+      <w:r>
+        <w:t>žljezdanim</w:t>
+      </w:r>
+      <w:proofErr w:type="spellEnd"/>
+      <w:r>
+        <w:t xml:space="preserve"> </w:t>
+      </w:r>
+      <w:proofErr w:type="spellStart"/>
+      <w:r>
+        <w:t>strukturama</w:t>
+      </w:r>
+      <w:proofErr w:type="spellEnd"/>
+      <w:r>
+        <w:t xml:space="preserve">. </w:t>
+      </w:r>
+      <w:proofErr w:type="spellStart"/>
+      <w:r>
+        <w:t>Opći</w:t>
+      </w:r>
+      <w:proofErr w:type="spellEnd"/>
+      <w:r>
+        <w:t xml:space="preserve"> </w:t>
+      </w:r>
+      <w:proofErr w:type="spellStart"/>
+      <w:r>
+        <w:t>kriteriji</w:t>
+      </w:r>
+      <w:proofErr w:type="spellEnd"/>
+      <w:r>
+        <w:t xml:space="preserve"> za </w:t>
+      </w:r>
+      <w:proofErr w:type="spellStart"/>
+      <w:r>
+        <w:t>otkrivanje</w:t>
+      </w:r>
+      <w:proofErr w:type="spellEnd"/>
+      <w:r>
+        <w:t xml:space="preserve"> </w:t>
+      </w:r>
+      <w:proofErr w:type="spellStart"/>
+      <w:r>
+        <w:t>raka</w:t>
+      </w:r>
+      <w:proofErr w:type="spellEnd"/>
+      <w:r>
+        <w:t xml:space="preserve"> </w:t>
+      </w:r>
+      <w:proofErr w:type="spellStart"/>
+      <w:r>
+        <w:t>dojke</w:t>
+      </w:r>
+      <w:proofErr w:type="spellEnd"/>
+      <w:r>
+        <w:t xml:space="preserve"> </w:t>
+      </w:r>
+      <w:proofErr w:type="spellStart"/>
+      <w:r>
+        <w:t>ultrazvukom</w:t>
+      </w:r>
+      <w:proofErr w:type="spellEnd"/>
+      <w:r>
+        <w:t xml:space="preserve"> </w:t>
+      </w:r>
+      <w:proofErr w:type="spellStart"/>
+      <w:r>
+        <w:t>navedeni</w:t>
+      </w:r>
+      <w:proofErr w:type="spellEnd"/>
+      <w:r>
+        <w:t xml:space="preserve"> </w:t>
+      </w:r>
+      <w:proofErr w:type="spellStart"/>
+      <w:r>
+        <w:t>su</w:t>
+      </w:r>
+      <w:proofErr w:type="spellEnd"/>
+      <w:r>
+        <w:t xml:space="preserve"> u </w:t>
+      </w:r>
+      <w:proofErr w:type="spellStart"/>
+      <w:r>
+        <w:t>tablici</w:t>
+      </w:r>
+      <w:proofErr w:type="spellEnd"/>
+      <w:r>
+        <w:t xml:space="preserve"> 1. </w:t>
+      </w:r>
+      <w:proofErr w:type="spellStart"/>
+      <w:r>
+        <w:t>Među</w:t>
+      </w:r>
+      <w:proofErr w:type="spellEnd"/>
+      <w:r>
+        <w:t xml:space="preserve"> </w:t>
+      </w:r>
+      <w:proofErr w:type="spellStart"/>
+      <w:r>
+        <w:t>tim</w:t>
+      </w:r>
+      <w:proofErr w:type="spellEnd"/>
+      <w:r>
+        <w:t xml:space="preserve"> </w:t>
+      </w:r>
+      <w:proofErr w:type="spellStart"/>
+      <w:r>
+        <w:t>značajkama</w:t>
+      </w:r>
+      <w:proofErr w:type="spellEnd"/>
+      <w:r>
+        <w:t xml:space="preserve">, </w:t>
+      </w:r>
+      <w:proofErr w:type="spellStart"/>
+      <w:r>
+        <w:t>najbitniji</w:t>
+      </w:r>
+      <w:proofErr w:type="spellEnd"/>
+      <w:r>
+        <w:t xml:space="preserve"> </w:t>
+      </w:r>
+      <w:proofErr w:type="spellStart"/>
+      <w:r>
+        <w:t>faktori</w:t>
+      </w:r>
+      <w:proofErr w:type="spellEnd"/>
+      <w:r>
+        <w:t xml:space="preserve"> </w:t>
+      </w:r>
+      <w:proofErr w:type="spellStart"/>
+      <w:r>
+        <w:t>pri</w:t>
+      </w:r>
+      <w:proofErr w:type="spellEnd"/>
+      <w:r>
+        <w:t xml:space="preserve"> </w:t>
+      </w:r>
+      <w:proofErr w:type="spellStart"/>
+      <w:r>
+        <w:t>klasificiranju</w:t>
+      </w:r>
+      <w:proofErr w:type="spellEnd"/>
+      <w:r>
+        <w:t xml:space="preserve"> </w:t>
+      </w:r>
+      <w:proofErr w:type="spellStart"/>
+      <w:r>
+        <w:t>lezija</w:t>
+      </w:r>
+      <w:proofErr w:type="spellEnd"/>
+      <w:r>
+        <w:t xml:space="preserve"> </w:t>
+      </w:r>
+      <w:proofErr w:type="spellStart"/>
+      <w:r>
+        <w:t>su</w:t>
+      </w:r>
+      <w:proofErr w:type="spellEnd"/>
+      <w:r>
+        <w:t xml:space="preserve">: </w:t>
+      </w:r>
+      <w:proofErr w:type="spellStart"/>
+      <w:r>
+        <w:t>okolno</w:t>
+      </w:r>
+      <w:proofErr w:type="spellEnd"/>
+      <w:r>
+        <w:t xml:space="preserve"> </w:t>
+      </w:r>
+      <w:proofErr w:type="spellStart"/>
+      <w:r>
+        <w:t>tkivo</w:t>
+      </w:r>
+      <w:proofErr w:type="spellEnd"/>
+      <w:r>
+        <w:t xml:space="preserve">, </w:t>
+      </w:r>
+      <w:proofErr w:type="spellStart"/>
+      <w:r>
+        <w:t>oblik</w:t>
+      </w:r>
+      <w:proofErr w:type="spellEnd"/>
+      <w:r>
+        <w:t xml:space="preserve">, </w:t>
+      </w:r>
+      <w:proofErr w:type="spellStart"/>
+      <w:r>
+        <w:t>kontura</w:t>
+      </w:r>
+      <w:proofErr w:type="spellEnd"/>
+      <w:r>
+        <w:t xml:space="preserve"> </w:t>
+      </w:r>
+      <w:proofErr w:type="spellStart"/>
+      <w:r>
+        <w:t>ruba</w:t>
+      </w:r>
+      <w:proofErr w:type="spellEnd"/>
+      <w:r>
+        <w:t xml:space="preserve">, </w:t>
+      </w:r>
+      <w:proofErr w:type="spellStart"/>
+      <w:r>
+        <w:t>granica</w:t>
+      </w:r>
+      <w:proofErr w:type="spellEnd"/>
+      <w:r>
+        <w:t xml:space="preserve"> </w:t>
+      </w:r>
+      <w:proofErr w:type="spellStart"/>
+      <w:r>
+        <w:t>lezije</w:t>
+      </w:r>
+      <w:proofErr w:type="spellEnd"/>
+      <w:r>
+        <w:t xml:space="preserve"> </w:t>
+      </w:r>
+      <w:proofErr w:type="spellStart"/>
+      <w:r>
+        <w:t>i</w:t>
+      </w:r>
+      <w:proofErr w:type="spellEnd"/>
+      <w:r>
+        <w:t xml:space="preserve"> </w:t>
+      </w:r>
+      <w:proofErr w:type="spellStart"/>
+      <w:r>
+        <w:t>posteriorne</w:t>
+      </w:r>
+      <w:proofErr w:type="spellEnd"/>
+      <w:r>
+        <w:t xml:space="preserve"> </w:t>
+      </w:r>
+      <w:proofErr w:type="spellStart"/>
+      <w:r>
+        <w:t>akustičke</w:t>
+      </w:r>
+      <w:proofErr w:type="spellEnd"/>
+      <w:r>
+        <w:t xml:space="preserve"> </w:t>
+      </w:r>
+      <w:proofErr w:type="spellStart"/>
+      <w:r>
+        <w:t>značajke</w:t>
+      </w:r>
+      <w:proofErr w:type="spellEnd"/>
+      <w:r>
+        <w:t xml:space="preserve"> [4].</w:t>
       </w:r>
     </w:p>
     <w:p>
@@ -479,7 +3018,7 @@
           <w:noProof/>
         </w:rPr>
         <w:drawing>
-          <wp:inline distT="0" distB="0" distL="0" distR="0" wp14:anchorId="7FB9EBF8" wp14:editId="3AB01A9B">
+          <wp:inline distT="0" distB="0" distL="0" distR="0" wp14:anchorId="7FB9EBF8" wp14:editId="59799E34">
             <wp:extent cx="3089910" cy="2246630"/>
             <wp:effectExtent l="0" t="0" r="0" b="1270"/>
             <wp:docPr id="1016865219" name="Picture 2" descr="A screenshot of a medical chart&#10;&#10;Description automatically generated"/>
@@ -525,9 +3064,107 @@
       <w:pPr>
         <w:pStyle w:val="Caption"/>
       </w:pPr>
-      <w:r>
-        <w:t>Slika 1. Usporedba karakteristika malignih i benignih tumora prema karakteristikama vidljivim na slikama ultrazvuka</w:t>
-      </w:r>
+      <w:proofErr w:type="spellStart"/>
+      <w:r>
+        <w:t>Slika</w:t>
+      </w:r>
+      <w:proofErr w:type="spellEnd"/>
+      <w:r>
+        <w:t xml:space="preserve"> 1. </w:t>
+      </w:r>
+      <w:proofErr w:type="spellStart"/>
+      <w:r>
+        <w:t>Usporedba</w:t>
+      </w:r>
+      <w:proofErr w:type="spellEnd"/>
+      <w:r>
+        <w:t xml:space="preserve"> </w:t>
+      </w:r>
+      <w:proofErr w:type="spellStart"/>
+      <w:r>
+        <w:t>karakteristika</w:t>
+      </w:r>
+      <w:proofErr w:type="spellEnd"/>
+      <w:r>
+        <w:t xml:space="preserve"> </w:t>
+      </w:r>
+      <w:proofErr w:type="spellStart"/>
+      <w:r>
+        <w:t>malignih</w:t>
+      </w:r>
+      <w:proofErr w:type="spellEnd"/>
+      <w:r>
+        <w:t xml:space="preserve"> </w:t>
+      </w:r>
+      <w:proofErr w:type="spellStart"/>
+      <w:r>
+        <w:t>i</w:t>
+      </w:r>
+      <w:proofErr w:type="spellEnd"/>
+      <w:r>
+        <w:t xml:space="preserve"> </w:t>
+      </w:r>
+      <w:proofErr w:type="spellStart"/>
+      <w:r>
+        <w:t>benignih</w:t>
+      </w:r>
+      <w:proofErr w:type="spellEnd"/>
+      <w:r>
+        <w:t xml:space="preserve"> </w:t>
+      </w:r>
+      <w:proofErr w:type="spellStart"/>
+      <w:r>
+        <w:t>tumora</w:t>
+      </w:r>
+      <w:proofErr w:type="spellEnd"/>
+      <w:r>
+        <w:t xml:space="preserve"> </w:t>
+      </w:r>
+      <w:proofErr w:type="spellStart"/>
+      <w:r>
+        <w:t>prema</w:t>
+      </w:r>
+      <w:proofErr w:type="spellEnd"/>
+      <w:r>
+        <w:t xml:space="preserve"> </w:t>
+      </w:r>
+      <w:proofErr w:type="spellStart"/>
+      <w:r>
+        <w:t>karakteristikama</w:t>
+      </w:r>
+      <w:proofErr w:type="spellEnd"/>
+      <w:r>
+        <w:t xml:space="preserve"> </w:t>
+      </w:r>
+      <w:proofErr w:type="spellStart"/>
+      <w:r>
+        <w:t>vidljivim</w:t>
+      </w:r>
+      <w:proofErr w:type="spellEnd"/>
+      <w:r>
+        <w:t xml:space="preserve"> </w:t>
+      </w:r>
+      <w:proofErr w:type="spellStart"/>
+      <w:r>
+        <w:t>na</w:t>
+      </w:r>
+      <w:proofErr w:type="spellEnd"/>
+      <w:r>
+        <w:t xml:space="preserve"> </w:t>
+      </w:r>
+      <w:proofErr w:type="spellStart"/>
+      <w:r>
+        <w:t>slikama</w:t>
+      </w:r>
+      <w:proofErr w:type="spellEnd"/>
+      <w:r>
+        <w:t xml:space="preserve"> </w:t>
+      </w:r>
+      <w:proofErr w:type="spellStart"/>
+      <w:r>
+        <w:t>ultrazvuka</w:t>
+      </w:r>
+      <w:proofErr w:type="spellEnd"/>
       <w:r>
         <w:t xml:space="preserve"> [4]</w:t>
       </w:r>
@@ -587,8 +3224,16 @@
         <w:rPr>
           <w:lang w:val="hr-HR"/>
         </w:rPr>
-        <w:t>odabrati podatkovni skup koji će se koristiti za treniranje i testiranje modela. Odlučili smo se za javno dostupan skup podataka koji je dostupan na stranici Kaggle</w:t>
-      </w:r>
+        <w:t xml:space="preserve">odabrati podatkovni skup koji će se koristiti za treniranje i testiranje modela. Odlučili smo se za javno dostupan skup podataka koji je dostupan na stranici </w:t>
+      </w:r>
+      <w:proofErr w:type="spellStart"/>
+      <w:r>
+        <w:rPr>
+          <w:lang w:val="hr-HR"/>
+        </w:rPr>
+        <w:t>Kaggle</w:t>
+      </w:r>
+      <w:proofErr w:type="spellEnd"/>
       <w:r>
         <w:rPr>
           <w:lang w:val="hr-HR"/>
@@ -607,61 +3252,175 @@
         </w:rPr>
         <w:t>. U skupu je 1566 pacijenata. Za svakog pacijenta može postojati nekoliko slika s mamografije iz različitih pozicija, a u skupu podataka se također nalaze izrezane slike manjih dimenzija koje fokusiraju određen dio rendgenske slike (</w:t>
       </w:r>
+      <w:proofErr w:type="spellStart"/>
       <w:r>
         <w:rPr>
           <w:i/>
           <w:iCs/>
           <w:lang w:val="hr-HR"/>
         </w:rPr>
-        <w:t>cropped images</w:t>
-      </w:r>
-      <w:r>
-        <w:rPr>
-          <w:lang w:val="hr-HR"/>
-        </w:rPr>
-        <w:t>) koji možda sadrži oblik raka te ROI (</w:t>
-      </w:r>
+        <w:t>cropped</w:t>
+      </w:r>
+      <w:proofErr w:type="spellEnd"/>
       <w:r>
         <w:rPr>
           <w:i/>
           <w:iCs/>
           <w:lang w:val="hr-HR"/>
         </w:rPr>
-        <w:t>region of interest</w:t>
-      </w:r>
-      <w:r>
-        <w:rPr>
-          <w:lang w:val="hr-HR"/>
-        </w:rPr>
-        <w:t>) masku koja označava iz kojeg je dijela originalne slike napravljena izrezana slika.</w:t>
-      </w:r>
-    </w:p>
-    <w:p>
-      <w:pPr>
-        <w:pStyle w:val="BodyText"/>
-        <w:rPr>
-          <w:lang w:val="hr-HR"/>
-        </w:rPr>
-      </w:pPr>
-      <w:r>
-        <w:rPr>
-          <w:lang w:val="hr-HR"/>
-        </w:rPr>
-        <w:t>Originalni skup podataka je bio podijeljen u 2 direktorija, „csv“</w:t>
-      </w:r>
+        <w:t xml:space="preserve"> </w:t>
+      </w:r>
+      <w:proofErr w:type="spellStart"/>
       <w:r>
         <w:rPr>
           <w:i/>
           <w:iCs/>
           <w:lang w:val="hr-HR"/>
         </w:rPr>
-        <w:t xml:space="preserve"> </w:t>
-      </w:r>
-      <w:r>
-        <w:rPr>
-          <w:lang w:val="hr-HR"/>
-        </w:rPr>
-        <w:t xml:space="preserve">i „jpeg“. U „csv“ direktoriju se nalazi nekoliko .csv datoteka koje sadrže informacije kao što su ID pacijenta, </w:t>
+        <w:t>images</w:t>
+      </w:r>
+      <w:proofErr w:type="spellEnd"/>
+      <w:r>
+        <w:rPr>
+          <w:lang w:val="hr-HR"/>
+        </w:rPr>
+        <w:t>) koji možda sadrži oblik raka te ROI (</w:t>
+      </w:r>
+      <w:proofErr w:type="spellStart"/>
+      <w:r>
+        <w:rPr>
+          <w:i/>
+          <w:iCs/>
+          <w:lang w:val="hr-HR"/>
+        </w:rPr>
+        <w:t>region</w:t>
+      </w:r>
+      <w:proofErr w:type="spellEnd"/>
+      <w:r>
+        <w:rPr>
+          <w:i/>
+          <w:iCs/>
+          <w:lang w:val="hr-HR"/>
+        </w:rPr>
+        <w:t xml:space="preserve"> </w:t>
+      </w:r>
+      <w:proofErr w:type="spellStart"/>
+      <w:r>
+        <w:rPr>
+          <w:i/>
+          <w:iCs/>
+          <w:lang w:val="hr-HR"/>
+        </w:rPr>
+        <w:t>of</w:t>
+      </w:r>
+      <w:proofErr w:type="spellEnd"/>
+      <w:r>
+        <w:rPr>
+          <w:i/>
+          <w:iCs/>
+          <w:lang w:val="hr-HR"/>
+        </w:rPr>
+        <w:t xml:space="preserve"> </w:t>
+      </w:r>
+      <w:proofErr w:type="spellStart"/>
+      <w:r>
+        <w:rPr>
+          <w:i/>
+          <w:iCs/>
+          <w:lang w:val="hr-HR"/>
+        </w:rPr>
+        <w:t>interest</w:t>
+      </w:r>
+      <w:proofErr w:type="spellEnd"/>
+      <w:r>
+        <w:rPr>
+          <w:lang w:val="hr-HR"/>
+        </w:rPr>
+        <w:t>) masku koja označava iz kojeg je dijela originalne slike napravljena izrezana slika.</w:t>
+      </w:r>
+    </w:p>
+    <w:p>
+      <w:pPr>
+        <w:pStyle w:val="BodyText"/>
+        <w:rPr>
+          <w:lang w:val="hr-HR"/>
+        </w:rPr>
+      </w:pPr>
+      <w:r>
+        <w:rPr>
+          <w:lang w:val="hr-HR"/>
+        </w:rPr>
+        <w:t>Originalni skup podataka je bio podijeljen u 2 direktorija, „</w:t>
+      </w:r>
+      <w:proofErr w:type="spellStart"/>
+      <w:r>
+        <w:rPr>
+          <w:lang w:val="hr-HR"/>
+        </w:rPr>
+        <w:t>csv</w:t>
+      </w:r>
+      <w:proofErr w:type="spellEnd"/>
+      <w:r>
+        <w:rPr>
+          <w:lang w:val="hr-HR"/>
+        </w:rPr>
+        <w:t>“</w:t>
+      </w:r>
+      <w:r>
+        <w:rPr>
+          <w:i/>
+          <w:iCs/>
+          <w:lang w:val="hr-HR"/>
+        </w:rPr>
+        <w:t xml:space="preserve"> </w:t>
+      </w:r>
+      <w:r>
+        <w:rPr>
+          <w:lang w:val="hr-HR"/>
+        </w:rPr>
+        <w:t>i „</w:t>
+      </w:r>
+      <w:proofErr w:type="spellStart"/>
+      <w:r>
+        <w:rPr>
+          <w:lang w:val="hr-HR"/>
+        </w:rPr>
+        <w:t>jpeg</w:t>
+      </w:r>
+      <w:proofErr w:type="spellEnd"/>
+      <w:r>
+        <w:rPr>
+          <w:lang w:val="hr-HR"/>
+        </w:rPr>
+        <w:t>“. U „</w:t>
+      </w:r>
+      <w:proofErr w:type="spellStart"/>
+      <w:r>
+        <w:rPr>
+          <w:lang w:val="hr-HR"/>
+        </w:rPr>
+        <w:t>csv</w:t>
+      </w:r>
+      <w:proofErr w:type="spellEnd"/>
+      <w:r>
+        <w:rPr>
+          <w:lang w:val="hr-HR"/>
+        </w:rPr>
+        <w:t>“ direktoriju se nalazi nekoliko .</w:t>
+      </w:r>
+      <w:proofErr w:type="spellStart"/>
+      <w:r>
+        <w:rPr>
+          <w:lang w:val="hr-HR"/>
+        </w:rPr>
+        <w:t>csv</w:t>
+      </w:r>
+      <w:proofErr w:type="spellEnd"/>
+      <w:r>
+        <w:rPr>
+          <w:lang w:val="hr-HR"/>
+        </w:rPr>
+        <w:t xml:space="preserve"> datoteka koje sadrže informacije kao što su ID pacijenta, </w:t>
       </w:r>
       <w:r>
         <w:rPr>
@@ -675,7 +3434,7 @@
           <w:noProof/>
         </w:rPr>
         <w:drawing>
-          <wp:anchor distT="0" distB="0" distL="114300" distR="114300" simplePos="0" relativeHeight="251659776" behindDoc="0" locked="0" layoutInCell="1" allowOverlap="1" wp14:anchorId="736B4D69" wp14:editId="5CE0E4A3">
+          <wp:anchor distT="0" distB="0" distL="114300" distR="114300" simplePos="0" relativeHeight="251659776" behindDoc="0" locked="0" layoutInCell="1" allowOverlap="1" wp14:anchorId="736B4D69" wp14:editId="69BED837">
             <wp:simplePos x="0" y="0"/>
             <wp:positionH relativeFrom="column">
               <wp:posOffset>3213100</wp:posOffset>
@@ -742,6 +3501,7 @@
         </w:rPr>
         <w:t>like (</w:t>
       </w:r>
+      <w:proofErr w:type="spellStart"/>
       <w:r>
         <w:rPr>
           <w:lang w:val="en-US"/>
@@ -754,18 +3514,69 @@
         </w:rPr>
         <w:t>raniokaudalna</w:t>
       </w:r>
+      <w:proofErr w:type="spellEnd"/>
       <w:r>
         <w:rPr>
           <w:lang w:val="en-US"/>
         </w:rPr>
-        <w:t xml:space="preserve"> ili m</w:t>
-      </w:r>
+        <w:t xml:space="preserve"> </w:t>
+      </w:r>
+      <w:proofErr w:type="spellStart"/>
       <w:r>
         <w:rPr>
           <w:lang w:val="en-US"/>
         </w:rPr>
-        <w:t>edijalno-lateralna kosa projekcija</w:t>
-      </w:r>
+        <w:t>ili</w:t>
+      </w:r>
+      <w:proofErr w:type="spellEnd"/>
+      <w:r>
+        <w:rPr>
+          <w:lang w:val="en-US"/>
+        </w:rPr>
+        <w:t xml:space="preserve"> </w:t>
+      </w:r>
+      <w:proofErr w:type="spellStart"/>
+      <w:r>
+        <w:rPr>
+          <w:lang w:val="en-US"/>
+        </w:rPr>
+        <w:t>m</w:t>
+      </w:r>
+      <w:r>
+        <w:rPr>
+          <w:lang w:val="en-US"/>
+        </w:rPr>
+        <w:t>edijalno-lateralna</w:t>
+      </w:r>
+      <w:proofErr w:type="spellEnd"/>
+      <w:r>
+        <w:rPr>
+          <w:lang w:val="en-US"/>
+        </w:rPr>
+        <w:t xml:space="preserve"> </w:t>
+      </w:r>
+      <w:proofErr w:type="spellStart"/>
+      <w:r>
+        <w:rPr>
+          <w:lang w:val="en-US"/>
+        </w:rPr>
+        <w:t>kosa</w:t>
+      </w:r>
+      <w:proofErr w:type="spellEnd"/>
+      <w:r>
+        <w:rPr>
+          <w:lang w:val="en-US"/>
+        </w:rPr>
+        <w:t xml:space="preserve"> </w:t>
+      </w:r>
+      <w:proofErr w:type="spellStart"/>
+      <w:r>
+        <w:rPr>
+          <w:lang w:val="en-US"/>
+        </w:rPr>
+        <w:t>projekcija</w:t>
+      </w:r>
+      <w:proofErr w:type="spellEnd"/>
       <w:r>
         <w:rPr>
           <w:lang w:val="hr-HR"/>
@@ -836,7 +3647,21 @@
         <w:rPr>
           <w:lang w:val="hr-HR"/>
         </w:rPr>
-        <w:t xml:space="preserve">. U „jpeg“ direktoriju nalazilo se 6774 direktorija od kojih su neki sadržavali originalnu sliku rendgenske snimke s mamografije koja je velikih dimenzija, a neki direktoriji su sadržavali po dvije slike od kojih je jedna bila izrezani manji dio originalne slike, a druga ROI maska koja prikazuje fokusirano područje originalne slike. Jedna originalna rendgenska slika može biti povezana s više </w:t>
+        <w:t>. U „</w:t>
+      </w:r>
+      <w:proofErr w:type="spellStart"/>
+      <w:r>
+        <w:rPr>
+          <w:lang w:val="hr-HR"/>
+        </w:rPr>
+        <w:t>jpeg</w:t>
+      </w:r>
+      <w:proofErr w:type="spellEnd"/>
+      <w:r>
+        <w:rPr>
+          <w:lang w:val="hr-HR"/>
+        </w:rPr>
+        <w:t xml:space="preserve">“ direktoriju nalazilo se 6774 direktorija od kojih su neki sadržavali originalnu sliku rendgenske snimke s mamografije koja je velikih dimenzija, a neki direktoriji su sadržavali po dvije slike od kojih je jedna bila izrezani manji dio originalne slike, a druga ROI maska koja prikazuje fokusirano područje originalne slike. Jedna originalna rendgenska slika može biti povezana s više </w:t>
       </w:r>
       <w:r>
         <w:rPr>
@@ -848,7 +3673,21 @@
         <w:rPr>
           <w:lang w:val="hr-HR"/>
         </w:rPr>
-        <w:t xml:space="preserve"> što se da zaključiti analizom .csv datoteka. To ima smisla jer neke dojke mogu imati više područja za koja se sumnja da sadrže maligno tkivo.</w:t>
+        <w:t xml:space="preserve"> što se da zaključiti analizom .</w:t>
+      </w:r>
+      <w:proofErr w:type="spellStart"/>
+      <w:r>
+        <w:rPr>
+          <w:lang w:val="hr-HR"/>
+        </w:rPr>
+        <w:t>csv</w:t>
+      </w:r>
+      <w:proofErr w:type="spellEnd"/>
+      <w:r>
+        <w:rPr>
+          <w:lang w:val="hr-HR"/>
+        </w:rPr>
+        <w:t xml:space="preserve"> datoteka. To ima smisla jer neke dojke mogu imati više područja za koja se sumnja da sadrže maligno tkivo.</w:t>
       </w:r>
     </w:p>
     <w:p>
@@ -864,7 +3703,7 @@
           <w:lang w:val="hr-HR"/>
         </w:rPr>
         <w:drawing>
-          <wp:anchor distT="0" distB="0" distL="114300" distR="114300" simplePos="0" relativeHeight="251660800" behindDoc="0" locked="0" layoutInCell="1" allowOverlap="1" wp14:anchorId="49758A6F" wp14:editId="546C6163">
+          <wp:anchor distT="0" distB="0" distL="114300" distR="114300" simplePos="0" relativeHeight="251660800" behindDoc="0" locked="0" layoutInCell="1" allowOverlap="1" wp14:anchorId="49758A6F" wp14:editId="03A19ADE">
             <wp:simplePos x="0" y="0"/>
             <wp:positionH relativeFrom="column">
               <wp:posOffset>3538855</wp:posOffset>
@@ -925,7 +3764,7 @@
           <w:lang w:val="hr-HR"/>
         </w:rPr>
         <w:drawing>
-          <wp:anchor distT="0" distB="0" distL="114300" distR="114300" simplePos="0" relativeHeight="251658752" behindDoc="0" locked="0" layoutInCell="1" allowOverlap="1" wp14:anchorId="00A0AC88" wp14:editId="667C94FB">
+          <wp:anchor distT="0" distB="0" distL="114300" distR="114300" simplePos="0" relativeHeight="251658752" behindDoc="0" locked="0" layoutInCell="1" allowOverlap="1" wp14:anchorId="00A0AC88" wp14:editId="3DF88F63">
             <wp:simplePos x="0" y="0"/>
             <wp:positionH relativeFrom="column">
               <wp:align>right</wp:align>
@@ -996,7 +3835,21 @@
         <w:rPr>
           <w:lang w:val="hr-HR"/>
         </w:rPr>
-        <w:t>koristiti isključivo izrezane slike manjih dimenzija za model jer su na njima već izdvojena područja interesa i manjih su dimenzija, odnosno veličine što će znatno ubrzati učenje i olakšati izradu modela. Kada bismo koristili originalne rendgenske slike cijeli skup podataka bi imao preko 11 GB, a ovako je sveden na nešto više od 200 MB. ROI maske nam također nisu od interesa jer ne sadrže nikakvu korisnu informaciju o tome je li prikazano tkivo maligno, već samo imaju bijelu točku koja je okružena crnom pozadinom te predstavlja s kojeg je dijela originalne slike uzeta izrezana slika. Budući da se ROI maske i izrezane slike nalaze u istim direktorijima, bilo je potrebno pronaći način za automatizirano razlikovanje i preuzimanje samo izrezanih slika iz više od 3000 direktorija. U imenima .jpg datoteka nije specificirano radi li se o ROI maski ili izrezanoj slici</w:t>
+        <w:t>koristiti isključivo izrezane slike manjih dimenzija za model jer su na njima već izdvojena područja interesa i manjih su dimenzija, odnosno veličine što će znatno ubrzati učenje i olakšati izradu modela. Kada bismo koristili originalne rendgenske slike cijeli skup podataka bi imao preko 11 GB, a ovako je sveden na nešto više od 200 MB. ROI maske nam također nisu od interesa jer ne sadrže nikakvu korisnu informaciju o tome je li prikazano tkivo maligno, već samo imaju bijelu točku koja je okružena crnom pozadinom te predstavlja s kojeg je dijela originalne slike uzeta izrezana slika. Budući da se ROI maske i izrezane slike nalaze u istim direktorijima, bilo je potrebno pronaći način za automatizirano razlikovanje i preuzimanje samo izrezanih slika iz više od 3000 direktorija. U imenima .</w:t>
+      </w:r>
+      <w:proofErr w:type="spellStart"/>
+      <w:r>
+        <w:rPr>
+          <w:lang w:val="hr-HR"/>
+        </w:rPr>
+        <w:t>jpg</w:t>
+      </w:r>
+      <w:proofErr w:type="spellEnd"/>
+      <w:r>
+        <w:rPr>
+          <w:lang w:val="hr-HR"/>
+        </w:rPr>
+        <w:t xml:space="preserve"> datoteka nije specificirano radi li se o ROI maski ili izrezanoj slici</w:t>
       </w:r>
       <w:r>
         <w:rPr>
@@ -1008,7 +3861,21 @@
         <w:rPr>
           <w:lang w:val="hr-HR"/>
         </w:rPr>
-        <w:t>. Također u .csv datotekama isto nije specificirano koja je od dvije datoteke u direktoriju ROI maska, a koja izrezana slika.</w:t>
+        <w:t>. Također u .</w:t>
+      </w:r>
+      <w:proofErr w:type="spellStart"/>
+      <w:r>
+        <w:rPr>
+          <w:lang w:val="hr-HR"/>
+        </w:rPr>
+        <w:t>csv</w:t>
+      </w:r>
+      <w:proofErr w:type="spellEnd"/>
+      <w:r>
+        <w:rPr>
+          <w:lang w:val="hr-HR"/>
+        </w:rPr>
+        <w:t xml:space="preserve"> datotekama isto nije specificirano koja je od dvije datoteke u direktoriju ROI maska, a koja izrezana slika.</w:t>
       </w:r>
       <w:r>
         <w:rPr>
@@ -1093,6 +3960,7 @@
         </w:rPr>
         <w:t xml:space="preserve">Na skupu za treniranje koji ima po 1546 izrezanih slika i ROI maski, vidimo par </w:t>
       </w:r>
+      <w:proofErr w:type="spellStart"/>
       <w:r>
         <w:rPr>
           <w:i/>
@@ -1100,13 +3968,23 @@
           <w:spacing w:val="-1"/>
           <w:lang w:val="hr-HR" w:eastAsia="x-none"/>
         </w:rPr>
-        <w:t xml:space="preserve">outliera, </w:t>
-      </w:r>
-      <w:r>
-        <w:rPr>
+        <w:t>outliera</w:t>
+      </w:r>
+      <w:proofErr w:type="spellEnd"/>
+      <w:r>
+        <w:rPr>
+          <w:i/>
+          <w:iCs/>
           <w:spacing w:val="-1"/>
           <w:lang w:val="hr-HR" w:eastAsia="x-none"/>
         </w:rPr>
+        <w:t xml:space="preserve">, </w:t>
+      </w:r>
+      <w:r>
+        <w:rPr>
+          <w:spacing w:val="-1"/>
+          <w:lang w:val="hr-HR" w:eastAsia="x-none"/>
+        </w:rPr>
         <w:t>odnosno izrezanih slika (označene plavim točkama na grafu) koje su nešto većih dimenzija, što je za očekivati s obzirom na puno veći podatkovni skup. Bitno je da su te velike izrezane slike i dalje veće površine od ROI maske s kojom su u direktoriju, jer je to uvjet po kojem odvajamo izrezane slike. Budući da je uvjet zadovoljen, uspješno smo izolirali izrezane slike koje ćemo koristiti za testiranje i treniranje modela.</w:t>
       </w:r>
     </w:p>
@@ -1123,7 +4001,7 @@
           <w:lang w:val="hr-HR"/>
         </w:rPr>
         <w:drawing>
-          <wp:anchor distT="0" distB="0" distL="114300" distR="114300" simplePos="0" relativeHeight="251661824" behindDoc="0" locked="0" layoutInCell="1" allowOverlap="1" wp14:anchorId="10400D5B" wp14:editId="19DDA12A">
+          <wp:anchor distT="0" distB="0" distL="114300" distR="114300" simplePos="0" relativeHeight="251661824" behindDoc="0" locked="0" layoutInCell="1" allowOverlap="1" wp14:anchorId="10400D5B" wp14:editId="44D86DC9">
             <wp:simplePos x="0" y="0"/>
             <wp:positionH relativeFrom="column">
               <wp:posOffset>221615</wp:posOffset>
@@ -1200,7 +4078,21 @@
         <w:rPr>
           <w:lang w:val="hr-HR"/>
         </w:rPr>
-        <w:t>Razdioba vrijednosti značajke Pathology na skupu za treniranje</w:t>
+        <w:t xml:space="preserve">Razdioba vrijednosti značajke </w:t>
+      </w:r>
+      <w:proofErr w:type="spellStart"/>
+      <w:r>
+        <w:rPr>
+          <w:lang w:val="hr-HR"/>
+        </w:rPr>
+        <w:t>Pathology</w:t>
+      </w:r>
+      <w:proofErr w:type="spellEnd"/>
+      <w:r>
+        <w:rPr>
+          <w:lang w:val="hr-HR"/>
+        </w:rPr>
+        <w:t xml:space="preserve"> na skupu za treniranje</w:t>
       </w:r>
     </w:p>
     <w:p>
@@ -1238,7 +4130,21 @@
         <w:rPr>
           <w:lang w:val="hr-HR"/>
         </w:rPr>
-        <w:t>Razdioba vrijednosti značajke Pathology na testnom skupu</w:t>
+        <w:t xml:space="preserve">Razdioba vrijednosti značajke </w:t>
+      </w:r>
+      <w:proofErr w:type="spellStart"/>
+      <w:r>
+        <w:rPr>
+          <w:lang w:val="hr-HR"/>
+        </w:rPr>
+        <w:t>Pathology</w:t>
+      </w:r>
+      <w:proofErr w:type="spellEnd"/>
+      <w:r>
+        <w:rPr>
+          <w:lang w:val="hr-HR"/>
+        </w:rPr>
+        <w:t xml:space="preserve"> na testnom skupu</w:t>
       </w:r>
     </w:p>
     <w:p>
@@ -1269,6 +4175,7 @@
         <w:lastRenderedPageBreak/>
         <w:t>Sa Slike 4. je vidljivo da je frekvencija mogućih vrijednosti stručnih dijagnoza (</w:t>
       </w:r>
+      <w:proofErr w:type="spellStart"/>
       <w:r>
         <w:rPr>
           <w:i/>
@@ -1277,6 +4184,7 @@
         </w:rPr>
         <w:t>Pahtology</w:t>
       </w:r>
+      <w:proofErr w:type="spellEnd"/>
       <w:r>
         <w:rPr>
           <w:lang w:val="hr-HR"/>
@@ -1289,12 +4197,14 @@
         </w:rPr>
         <w:t xml:space="preserve">Zbog toga će biti potrebno da osim same preciznosti, kod evaluacije modela koristimo i druge metrike za performanse kao što su odziv, F1 </w:t>
       </w:r>
+      <w:proofErr w:type="spellStart"/>
       <w:r>
         <w:rPr>
           <w:lang w:val="hr-HR"/>
         </w:rPr>
         <w:t>score</w:t>
       </w:r>
+      <w:proofErr w:type="spellEnd"/>
       <w:r>
         <w:rPr>
           <w:lang w:val="hr-HR"/>
@@ -1305,7 +4215,15 @@
         <w:t>ROC-AUC</w:t>
       </w:r>
       <w:r>
-        <w:t xml:space="preserve"> krivulje.</w:t>
+        <w:t xml:space="preserve"> </w:t>
+      </w:r>
+      <w:proofErr w:type="spellStart"/>
+      <w:r>
+        <w:t>krivulje</w:t>
+      </w:r>
+      <w:proofErr w:type="spellEnd"/>
+      <w:r>
+        <w:t>.</w:t>
       </w:r>
       <w:r>
         <w:rPr>
@@ -1319,6 +4237,7 @@
         </w:rPr>
         <w:t xml:space="preserve">Osobe koje su napravile i objavile ovaj podatkovni skup te ga odvojile na skup za testiranje i treniranje su vjerojatno pazili na to da su podaci u skupu za treniranje balansirani s obzirom na značajku </w:t>
       </w:r>
+      <w:proofErr w:type="spellStart"/>
       <w:r>
         <w:rPr>
           <w:i/>
@@ -1327,11 +4246,26 @@
         </w:rPr>
         <w:t>Pathology</w:t>
       </w:r>
-      <w:r>
-        <w:rPr>
-          <w:lang w:val="hr-HR"/>
-        </w:rPr>
-        <w:t xml:space="preserve"> kako bi modeli bili jednako pouzdani za klasifikaciju sve tri značajke. Analizom kompletnog podatkovnog skupa je također utvrđeno da se slike svakog pojedinog pacijenta nalaze ili u skupu za treniranje ili u skupu za testiranje, dakle niti jednom pacijentu različite izrezane verzije slika nisu završile u oba podatkovna skupa. Time je osigurana konzistentnost i sprječavanje da se model prenaučenosti jer je poanta da model može dobro predviđati za nove pacijente na čijim slikama nije već treniran.</w:t>
+      <w:proofErr w:type="spellEnd"/>
+      <w:r>
+        <w:rPr>
+          <w:lang w:val="hr-HR"/>
+        </w:rPr>
+        <w:t xml:space="preserve"> kako bi modeli bili jednako pouzdani za klasifikaciju sve tri značajke. Analizom kompletnog podatkovnog skupa je također utvrđeno da se slike svakog pojedinog pacijenta nalaze ili u skupu za treniranje ili u skupu za testiranje, dakle niti jednom pacijentu različite izrezane verzije slika nisu završile u oba podatkovna skupa. Time je osigurana konzistentnost i sprječavanje da se model </w:t>
+      </w:r>
+      <w:proofErr w:type="spellStart"/>
+      <w:r>
+        <w:rPr>
+          <w:lang w:val="hr-HR"/>
+        </w:rPr>
+        <w:t>prenaučenosti</w:t>
+      </w:r>
+      <w:proofErr w:type="spellEnd"/>
+      <w:r>
+        <w:rPr>
+          <w:lang w:val="hr-HR"/>
+        </w:rPr>
+        <w:t xml:space="preserve"> jer je poanta da model može dobro predviđati za nove pacijente na čijim slikama nije već treniran.</w:t>
       </w:r>
     </w:p>
     <w:p>
@@ -1368,7 +4302,21 @@
         <w:rPr>
           <w:lang w:val="hr-HR"/>
         </w:rPr>
-        <w:t>Za implementaciju neuronskih mreža, korištena je biblioteka PyTorch stoga što omogućuje jednostavnu implementaciju prilagođenih modela, kao i integraciju unaprijed istreniranih modela. Osim toga, ova biblioteka sadrži alate za augmentaciju i normalizaciju slika te olakšava prijenos modela i podataka između CPU-a i GPU-a, čime ubrzavamo trening.</w:t>
+        <w:t xml:space="preserve">Za implementaciju neuronskih mreža, korištena je biblioteka </w:t>
+      </w:r>
+      <w:proofErr w:type="spellStart"/>
+      <w:r>
+        <w:rPr>
+          <w:lang w:val="hr-HR"/>
+        </w:rPr>
+        <w:t>PyTorch</w:t>
+      </w:r>
+      <w:proofErr w:type="spellEnd"/>
+      <w:r>
+        <w:rPr>
+          <w:lang w:val="hr-HR"/>
+        </w:rPr>
+        <w:t xml:space="preserve"> stoga što omogućuje jednostavnu implementaciju prilagođenih modela, kao i integraciju unaprijed istreniranih modela. Osim toga, ova biblioteka sadrži alate za augmentaciju i normalizaciju slika te olakšava prijenos modela i podataka između CPU-a i GPU-a, čime ubrzavamo trening.</w:t>
       </w:r>
     </w:p>
     <w:p>
@@ -1383,13 +4331,83 @@
         <w:rPr>
           <w:lang w:val="hr-HR"/>
         </w:rPr>
-        <w:t>Učitavanje podataka odrađeno je pomoću prilagođene klase BreastCancerDataset, koja nam omogućuje učitavanje i transformaciju slike, te povezivanje s pripadajućom klasifikacijom. Podaci su učitani iz CSV datoteka 'train_data' i 'test_data'</w:t>
-      </w:r>
-      <w:r>
-        <w:rPr>
-          <w:lang w:val="hr-HR"/>
-        </w:rPr>
-        <w:t xml:space="preserve"> pomoću biblioteke pandas, a klasifikacija je ručno tranformirana u brojčane vrijednosti unutar klase.</w:t>
+        <w:t xml:space="preserve">Učitavanje podataka odrađeno je pomoću prilagođene klase </w:t>
+      </w:r>
+      <w:proofErr w:type="spellStart"/>
+      <w:r>
+        <w:rPr>
+          <w:lang w:val="hr-HR"/>
+        </w:rPr>
+        <w:t>BreastCancerDataset</w:t>
+      </w:r>
+      <w:proofErr w:type="spellEnd"/>
+      <w:r>
+        <w:rPr>
+          <w:lang w:val="hr-HR"/>
+        </w:rPr>
+        <w:t>, koja nam omogućuje učitavanje i transformaciju slike, te povezivanje s pripadajućom klasifikacijom. Podaci su učitani iz CSV datoteka '</w:t>
+      </w:r>
+      <w:proofErr w:type="spellStart"/>
+      <w:r>
+        <w:rPr>
+          <w:lang w:val="hr-HR"/>
+        </w:rPr>
+        <w:t>train_data</w:t>
+      </w:r>
+      <w:proofErr w:type="spellEnd"/>
+      <w:r>
+        <w:rPr>
+          <w:lang w:val="hr-HR"/>
+        </w:rPr>
+        <w:t>' i '</w:t>
+      </w:r>
+      <w:proofErr w:type="spellStart"/>
+      <w:r>
+        <w:rPr>
+          <w:lang w:val="hr-HR"/>
+        </w:rPr>
+        <w:t>test_data</w:t>
+      </w:r>
+      <w:proofErr w:type="spellEnd"/>
+      <w:r>
+        <w:rPr>
+          <w:lang w:val="hr-HR"/>
+        </w:rPr>
+        <w:t>'</w:t>
+      </w:r>
+      <w:r>
+        <w:rPr>
+          <w:lang w:val="hr-HR"/>
+        </w:rPr>
+        <w:t xml:space="preserve"> pomoću biblioteke </w:t>
+      </w:r>
+      <w:proofErr w:type="spellStart"/>
+      <w:r>
+        <w:rPr>
+          <w:lang w:val="hr-HR"/>
+        </w:rPr>
+        <w:t>pandas</w:t>
+      </w:r>
+      <w:proofErr w:type="spellEnd"/>
+      <w:r>
+        <w:rPr>
+          <w:lang w:val="hr-HR"/>
+        </w:rPr>
+        <w:t xml:space="preserve">, a klasifikacija je ručno </w:t>
+      </w:r>
+      <w:proofErr w:type="spellStart"/>
+      <w:r>
+        <w:rPr>
+          <w:lang w:val="hr-HR"/>
+        </w:rPr>
+        <w:t>tranformirana</w:t>
+      </w:r>
+      <w:proofErr w:type="spellEnd"/>
+      <w:r>
+        <w:rPr>
+          <w:lang w:val="hr-HR"/>
+        </w:rPr>
+        <w:t xml:space="preserve"> u brojčane vrijednosti unutar klase.</w:t>
       </w:r>
     </w:p>
     <w:p>
@@ -1404,19 +4422,61 @@
         <w:rPr>
           <w:lang w:val="hr-HR"/>
         </w:rPr>
-        <w:t>Cilj istraživanja bio je usporediti dva pristupa: treniranje modela od nule i korištenje unaprijed istreniranih modela, poput ResNet-a, istreniranih na skupu podataka ImageNet.</w:t>
-      </w:r>
-      <w:r>
-        <w:rPr>
-          <w:lang w:val="hr-HR"/>
-        </w:rPr>
-        <w:t xml:space="preserve"> </w:t>
-      </w:r>
-      <w:r>
-        <w:rPr>
-          <w:lang w:val="hr-HR"/>
-        </w:rPr>
-        <w:t xml:space="preserve">Klasa CNN definira model kojeg ćemo trenirati od nule. Model je definiran pomoću biblioteke 'torch.nn', a </w:t>
+        <w:t xml:space="preserve">Cilj istraživanja bio je usporediti dva pristupa: treniranje modela od nule i korištenje unaprijed istreniranih modela, poput </w:t>
+      </w:r>
+      <w:proofErr w:type="spellStart"/>
+      <w:r>
+        <w:rPr>
+          <w:lang w:val="hr-HR"/>
+        </w:rPr>
+        <w:t>ResNet</w:t>
+      </w:r>
+      <w:proofErr w:type="spellEnd"/>
+      <w:r>
+        <w:rPr>
+          <w:lang w:val="hr-HR"/>
+        </w:rPr>
+        <w:t xml:space="preserve">-a, istreniranih na skupu podataka </w:t>
+      </w:r>
+      <w:proofErr w:type="spellStart"/>
+      <w:r>
+        <w:rPr>
+          <w:lang w:val="hr-HR"/>
+        </w:rPr>
+        <w:t>ImageNet</w:t>
+      </w:r>
+      <w:proofErr w:type="spellEnd"/>
+      <w:r>
+        <w:rPr>
+          <w:lang w:val="hr-HR"/>
+        </w:rPr>
+        <w:t>.</w:t>
+      </w:r>
+      <w:r>
+        <w:rPr>
+          <w:lang w:val="hr-HR"/>
+        </w:rPr>
+        <w:t xml:space="preserve"> </w:t>
+      </w:r>
+      <w:r>
+        <w:rPr>
+          <w:lang w:val="hr-HR"/>
+        </w:rPr>
+        <w:t>Klasa CNN definira model kojeg ćemo trenirati od nule. Model je definiran pomoću biblioteke '</w:t>
+      </w:r>
+      <w:proofErr w:type="spellStart"/>
+      <w:r>
+        <w:rPr>
+          <w:lang w:val="hr-HR"/>
+        </w:rPr>
+        <w:t>torch.nn</w:t>
+      </w:r>
+      <w:proofErr w:type="spellEnd"/>
+      <w:r>
+        <w:rPr>
+          <w:lang w:val="hr-HR"/>
+        </w:rPr>
+        <w:t xml:space="preserve">', a </w:t>
       </w:r>
       <w:r>
         <w:rPr>
@@ -1428,13 +4488,41 @@
         <w:rPr>
           <w:lang w:val="hr-HR"/>
         </w:rPr>
-        <w:t xml:space="preserve">dva bloka konvolucijskih slojeva. </w:t>
-      </w:r>
-      <w:r>
-        <w:rPr>
-          <w:lang w:val="hr-HR"/>
-        </w:rPr>
-        <w:t xml:space="preserve">Blokovi se sastoje od dva konvolucijska sloja </w:t>
+        <w:t xml:space="preserve">dva bloka </w:t>
+      </w:r>
+      <w:proofErr w:type="spellStart"/>
+      <w:r>
+        <w:rPr>
+          <w:lang w:val="hr-HR"/>
+        </w:rPr>
+        <w:t>konvolucijskih</w:t>
+      </w:r>
+      <w:proofErr w:type="spellEnd"/>
+      <w:r>
+        <w:rPr>
+          <w:lang w:val="hr-HR"/>
+        </w:rPr>
+        <w:t xml:space="preserve"> slojeva. </w:t>
+      </w:r>
+      <w:r>
+        <w:rPr>
+          <w:lang w:val="hr-HR"/>
+        </w:rPr>
+        <w:t xml:space="preserve">Blokovi se sastoje od dva </w:t>
+      </w:r>
+      <w:proofErr w:type="spellStart"/>
+      <w:r>
+        <w:rPr>
+          <w:lang w:val="hr-HR"/>
+        </w:rPr>
+        <w:t>konvolucijska</w:t>
+      </w:r>
+      <w:proofErr w:type="spellEnd"/>
+      <w:r>
+        <w:rPr>
+          <w:lang w:val="hr-HR"/>
+        </w:rPr>
+        <w:t xml:space="preserve"> sloja </w:t>
       </w:r>
       <w:r>
         <w:rPr>
@@ -1452,7 +4540,21 @@
         <w:rPr>
           <w:lang w:val="hr-HR"/>
         </w:rPr>
-        <w:t xml:space="preserve"> Kao aktivacijska funkcija za sve slojeve korištena je 'LeakyReLu' aktivacijska funkcija. </w:t>
+        <w:t xml:space="preserve"> Kao aktivacijska funkcija za sve slojeve korištena je '</w:t>
+      </w:r>
+      <w:proofErr w:type="spellStart"/>
+      <w:r>
+        <w:rPr>
+          <w:lang w:val="hr-HR"/>
+        </w:rPr>
+        <w:t>LeakyReLu</w:t>
+      </w:r>
+      <w:proofErr w:type="spellEnd"/>
+      <w:r>
+        <w:rPr>
+          <w:lang w:val="hr-HR"/>
+        </w:rPr>
+        <w:t xml:space="preserve">' aktivacijska funkcija. </w:t>
       </w:r>
       <w:r>
         <w:rPr>
@@ -1476,19 +4578,69 @@
         <w:rPr>
           <w:lang w:val="hr-HR"/>
         </w:rPr>
-        <w:t xml:space="preserve"> za smanjenje dimenzionalnosti</w:t>
-      </w:r>
-      <w:r>
-        <w:rPr>
-          <w:lang w:val="hr-HR"/>
-        </w:rPr>
-        <w:t xml:space="preserve"> ('MaxPool') dimenzija 2x2</w:t>
-      </w:r>
-      <w:r>
-        <w:rPr>
-          <w:lang w:val="hr-HR"/>
-        </w:rPr>
-        <w:t>, kao i slojevi 'Dropout' za regularizaciju modela</w:t>
+        <w:t xml:space="preserve"> za smanjenje </w:t>
+      </w:r>
+      <w:proofErr w:type="spellStart"/>
+      <w:r>
+        <w:rPr>
+          <w:lang w:val="hr-HR"/>
+        </w:rPr>
+        <w:t>dimenzionalnosti</w:t>
+      </w:r>
+      <w:proofErr w:type="spellEnd"/>
+      <w:r>
+        <w:rPr>
+          <w:lang w:val="hr-HR"/>
+        </w:rPr>
+        <w:t xml:space="preserve"> ('</w:t>
+      </w:r>
+      <w:proofErr w:type="spellStart"/>
+      <w:r>
+        <w:rPr>
+          <w:lang w:val="hr-HR"/>
+        </w:rPr>
+        <w:t>MaxPool</w:t>
+      </w:r>
+      <w:proofErr w:type="spellEnd"/>
+      <w:r>
+        <w:rPr>
+          <w:lang w:val="hr-HR"/>
+        </w:rPr>
+        <w:t>') dimenzija 2x2</w:t>
+      </w:r>
+      <w:r>
+        <w:rPr>
+          <w:lang w:val="hr-HR"/>
+        </w:rPr>
+        <w:t>, kao i slojevi '</w:t>
+      </w:r>
+      <w:proofErr w:type="spellStart"/>
+      <w:r>
+        <w:rPr>
+          <w:lang w:val="hr-HR"/>
+        </w:rPr>
+        <w:t>Dropout</w:t>
+      </w:r>
+      <w:proofErr w:type="spellEnd"/>
+      <w:r>
+        <w:rPr>
+          <w:lang w:val="hr-HR"/>
+        </w:rPr>
+        <w:t xml:space="preserve">' za </w:t>
+      </w:r>
+      <w:proofErr w:type="spellStart"/>
+      <w:r>
+        <w:rPr>
+          <w:lang w:val="hr-HR"/>
+        </w:rPr>
+        <w:t>regularizaciju</w:t>
+      </w:r>
+      <w:proofErr w:type="spellEnd"/>
+      <w:r>
+        <w:rPr>
+          <w:lang w:val="hr-HR"/>
+        </w:rPr>
+        <w:t xml:space="preserve"> modela</w:t>
       </w:r>
       <w:r>
         <w:rPr>
@@ -1506,7 +4658,21 @@
         <w:rPr>
           <w:lang w:val="hr-HR"/>
         </w:rPr>
-        <w:t xml:space="preserve">Kako bismo omogućili mapiranje na izlazne klase, izlazi iz konvolucijskih slojeva su </w:t>
+        <w:t xml:space="preserve">Kako bismo omogućili mapiranje na izlazne klase, izlazi iz </w:t>
+      </w:r>
+      <w:proofErr w:type="spellStart"/>
+      <w:r>
+        <w:rPr>
+          <w:lang w:val="hr-HR"/>
+        </w:rPr>
+        <w:t>konvolucijskih</w:t>
+      </w:r>
+      <w:proofErr w:type="spellEnd"/>
+      <w:r>
+        <w:rPr>
+          <w:lang w:val="hr-HR"/>
+        </w:rPr>
+        <w:t xml:space="preserve"> slojeva su </w:t>
       </w:r>
       <w:r>
         <w:rPr>
@@ -1530,7 +4696,35 @@
         <w:rPr>
           <w:lang w:val="hr-HR"/>
         </w:rPr>
-        <w:t xml:space="preserve"> Osim ovog modela, napravljen je i jednostavniji model 'SimpleCNN', kako bismo pokušali spriječiti prenaučenost modela. </w:t>
+        <w:t xml:space="preserve"> Osim ovog modela, napravljen je i jednostavniji model '</w:t>
+      </w:r>
+      <w:proofErr w:type="spellStart"/>
+      <w:r>
+        <w:rPr>
+          <w:lang w:val="hr-HR"/>
+        </w:rPr>
+        <w:t>SimpleCNN</w:t>
+      </w:r>
+      <w:proofErr w:type="spellEnd"/>
+      <w:r>
+        <w:rPr>
+          <w:lang w:val="hr-HR"/>
+        </w:rPr>
+        <w:t xml:space="preserve">', kako bismo pokušali spriječiti </w:t>
+      </w:r>
+      <w:proofErr w:type="spellStart"/>
+      <w:r>
+        <w:rPr>
+          <w:lang w:val="hr-HR"/>
+        </w:rPr>
+        <w:t>prenaučenost</w:t>
+      </w:r>
+      <w:proofErr w:type="spellEnd"/>
+      <w:r>
+        <w:rPr>
+          <w:lang w:val="hr-HR"/>
+        </w:rPr>
+        <w:t xml:space="preserve"> modela. </w:t>
       </w:r>
       <w:r>
         <w:rPr>
@@ -1542,7 +4736,21 @@
         <w:rPr>
           <w:lang w:val="hr-HR"/>
         </w:rPr>
-        <w:t xml:space="preserve"> građen od 4 konvolucijska sloja, a</w:t>
+        <w:t xml:space="preserve"> građen od 4 </w:t>
+      </w:r>
+      <w:proofErr w:type="spellStart"/>
+      <w:r>
+        <w:rPr>
+          <w:lang w:val="hr-HR"/>
+        </w:rPr>
+        <w:t>konvolucijska</w:t>
+      </w:r>
+      <w:proofErr w:type="spellEnd"/>
+      <w:r>
+        <w:rPr>
+          <w:lang w:val="hr-HR"/>
+        </w:rPr>
+        <w:t xml:space="preserve"> sloja, a</w:t>
       </w:r>
       <w:r>
         <w:rPr>
@@ -1566,8 +4774,16 @@
         <w:rPr>
           <w:lang w:val="hr-HR"/>
         </w:rPr>
-        <w:t>Optimizacija modela obavljala se pomoću algoritma `Adam`, uz definiranu stopu učenja i regularizaciju</w:t>
-      </w:r>
+        <w:t xml:space="preserve">Optimizacija modela obavljala se pomoću algoritma `Adam`, uz definiranu stopu učenja i </w:t>
+      </w:r>
+      <w:proofErr w:type="spellStart"/>
+      <w:r>
+        <w:rPr>
+          <w:lang w:val="hr-HR"/>
+        </w:rPr>
+        <w:t>regularizaciju</w:t>
+      </w:r>
+      <w:proofErr w:type="spellEnd"/>
       <w:r>
         <w:rPr>
           <w:lang w:val="hr-HR"/>
@@ -1578,7 +4794,21 @@
         <w:rPr>
           <w:lang w:val="hr-HR"/>
         </w:rPr>
-        <w:t xml:space="preserve">funkciju ReduceLROnPlateau kako bi se izbjegla stagnacija </w:t>
+        <w:t xml:space="preserve">funkciju </w:t>
+      </w:r>
+      <w:proofErr w:type="spellStart"/>
+      <w:r>
+        <w:rPr>
+          <w:lang w:val="hr-HR"/>
+        </w:rPr>
+        <w:t>ReduceLROnPlateau</w:t>
+      </w:r>
+      <w:proofErr w:type="spellEnd"/>
+      <w:r>
+        <w:rPr>
+          <w:lang w:val="hr-HR"/>
+        </w:rPr>
+        <w:t xml:space="preserve"> kako bi se izbjegla stagnacija </w:t>
       </w:r>
       <w:r>
         <w:rPr>
@@ -1590,7 +4820,21 @@
         <w:rPr>
           <w:lang w:val="hr-HR"/>
         </w:rPr>
-        <w:t>. Gubitak je računan korištenjem funkcije `CrossEntropyLoss`</w:t>
+        <w:t>. Gubitak je računan korištenjem funkcije `</w:t>
+      </w:r>
+      <w:proofErr w:type="spellStart"/>
+      <w:r>
+        <w:rPr>
+          <w:lang w:val="hr-HR"/>
+        </w:rPr>
+        <w:t>CrossEntropyLoss</w:t>
+      </w:r>
+      <w:proofErr w:type="spellEnd"/>
+      <w:r>
+        <w:rPr>
+          <w:lang w:val="hr-HR"/>
+        </w:rPr>
+        <w:t>`</w:t>
       </w:r>
       <w:r>
         <w:rPr>
@@ -1633,7 +4877,14 @@
         <w:rPr>
           <w:lang w:val="hr-HR"/>
         </w:rPr>
-        <w:t>'accuracy</w:t>
+        <w:t>'</w:t>
+      </w:r>
+      <w:proofErr w:type="spellStart"/>
+      <w:r>
+        <w:rPr>
+          <w:lang w:val="hr-HR"/>
+        </w:rPr>
+        <w:t>accuracy</w:t>
       </w:r>
       <w:bookmarkStart w:id="1" w:name="_Hlk187833837"/>
       <w:r>
@@ -1647,7 +4898,14 @@
         <w:rPr>
           <w:lang w:val="hr-HR"/>
         </w:rPr>
-        <w:t>score'</w:t>
+        <w:t>score</w:t>
+      </w:r>
+      <w:proofErr w:type="spellEnd"/>
+      <w:r>
+        <w:rPr>
+          <w:lang w:val="hr-HR"/>
+        </w:rPr>
+        <w:t>'</w:t>
       </w:r>
       <w:bookmarkEnd w:id="0"/>
       <w:r>
@@ -1668,19 +4926,119 @@
         <w:rPr>
           <w:lang w:val="hr-HR"/>
         </w:rPr>
-        <w:t xml:space="preserve">Drugi pristup se oslanjao na korištenje predtreniranih modela. Odlučili smo implementirati model 'ResNet' koji je dostupan unutar biblioteke PyTorch. Model je treniran na skupu slika ImageNet, što osigurava da model ima spososbnost prepoznavanja složenih značajki u slikama. </w:t>
-      </w:r>
-      <w:r>
-        <w:rPr>
-          <w:lang w:val="hr-HR"/>
-        </w:rPr>
-        <w:t xml:space="preserve">RezNet kao ulaz prima RGB slike dimenzija 224x224, u skladu s čime smo prilagodili dimenzije našeg skupa podataka te normalizirali transformaciju. Osim toga, promijenili smo dimenzionalnost ulaznog sloja kako bismo mogli raditi sa slikama u sivim tonovima. </w:t>
-      </w:r>
-      <w:r>
-        <w:rPr>
-          <w:lang w:val="hr-HR"/>
-        </w:rPr>
-        <w:t xml:space="preserve">ResNet modeli tipično imaju između 18 i 152 sloja, a mi smo odabrali onaj sa 18 slojeva. S obzirom da model </w:t>
+        <w:t xml:space="preserve">Drugi pristup se oslanjao na korištenje </w:t>
+      </w:r>
+      <w:proofErr w:type="spellStart"/>
+      <w:r>
+        <w:rPr>
+          <w:lang w:val="hr-HR"/>
+        </w:rPr>
+        <w:t>predtreniranih</w:t>
+      </w:r>
+      <w:proofErr w:type="spellEnd"/>
+      <w:r>
+        <w:rPr>
+          <w:lang w:val="hr-HR"/>
+        </w:rPr>
+        <w:t xml:space="preserve"> modela. Odlučili smo implementirati model '</w:t>
+      </w:r>
+      <w:proofErr w:type="spellStart"/>
+      <w:r>
+        <w:rPr>
+          <w:lang w:val="hr-HR"/>
+        </w:rPr>
+        <w:t>ResNet</w:t>
+      </w:r>
+      <w:proofErr w:type="spellEnd"/>
+      <w:r>
+        <w:rPr>
+          <w:lang w:val="hr-HR"/>
+        </w:rPr>
+        <w:t xml:space="preserve">' koji je dostupan unutar biblioteke </w:t>
+      </w:r>
+      <w:proofErr w:type="spellStart"/>
+      <w:r>
+        <w:rPr>
+          <w:lang w:val="hr-HR"/>
+        </w:rPr>
+        <w:t>PyTorch</w:t>
+      </w:r>
+      <w:proofErr w:type="spellEnd"/>
+      <w:r>
+        <w:rPr>
+          <w:lang w:val="hr-HR"/>
+        </w:rPr>
+        <w:t xml:space="preserve">. Model je treniran na skupu slika </w:t>
+      </w:r>
+      <w:proofErr w:type="spellStart"/>
+      <w:r>
+        <w:rPr>
+          <w:lang w:val="hr-HR"/>
+        </w:rPr>
+        <w:t>ImageNet</w:t>
+      </w:r>
+      <w:proofErr w:type="spellEnd"/>
+      <w:r>
+        <w:rPr>
+          <w:lang w:val="hr-HR"/>
+        </w:rPr>
+        <w:t xml:space="preserve">, što osigurava da model ima </w:t>
+      </w:r>
+      <w:proofErr w:type="spellStart"/>
+      <w:r>
+        <w:rPr>
+          <w:lang w:val="hr-HR"/>
+        </w:rPr>
+        <w:t>spososbnost</w:t>
+      </w:r>
+      <w:proofErr w:type="spellEnd"/>
+      <w:r>
+        <w:rPr>
+          <w:lang w:val="hr-HR"/>
+        </w:rPr>
+        <w:t xml:space="preserve"> prepoznavanja složenih značajki u slikama. </w:t>
+      </w:r>
+      <w:proofErr w:type="spellStart"/>
+      <w:r>
+        <w:rPr>
+          <w:lang w:val="hr-HR"/>
+        </w:rPr>
+        <w:t>RezNet</w:t>
+      </w:r>
+      <w:proofErr w:type="spellEnd"/>
+      <w:r>
+        <w:rPr>
+          <w:lang w:val="hr-HR"/>
+        </w:rPr>
+        <w:t xml:space="preserve"> kao ulaz prima RGB slike dimenzija 224x224, u skladu s čime smo prilagodili dimenzije našeg skupa podataka te normalizirali transformaciju. Osim toga, promijenili smo </w:t>
+      </w:r>
+      <w:proofErr w:type="spellStart"/>
+      <w:r>
+        <w:rPr>
+          <w:lang w:val="hr-HR"/>
+        </w:rPr>
+        <w:t>dimenzionalnost</w:t>
+      </w:r>
+      <w:proofErr w:type="spellEnd"/>
+      <w:r>
+        <w:rPr>
+          <w:lang w:val="hr-HR"/>
+        </w:rPr>
+        <w:t xml:space="preserve"> ulaznog sloja kako bismo mogli raditi sa slikama u sivim tonovima. </w:t>
+      </w:r>
+      <w:proofErr w:type="spellStart"/>
+      <w:r>
+        <w:rPr>
+          <w:lang w:val="hr-HR"/>
+        </w:rPr>
+        <w:t>ResNet</w:t>
+      </w:r>
+      <w:proofErr w:type="spellEnd"/>
+      <w:r>
+        <w:rPr>
+          <w:lang w:val="hr-HR"/>
+        </w:rPr>
+        <w:t xml:space="preserve"> modeli tipično imaju između 18 i 152 sloja, a mi smo odabrali onaj sa 18 slojeva. S obzirom da model </w:t>
       </w:r>
       <w:r>
         <w:rPr>
@@ -1710,7 +5068,21 @@
         <w:rPr>
           <w:lang w:val="hr-HR"/>
         </w:rPr>
-        <w:t>'accuracy_score'</w:t>
+        <w:t>'</w:t>
+      </w:r>
+      <w:proofErr w:type="spellStart"/>
+      <w:r>
+        <w:rPr>
+          <w:lang w:val="hr-HR"/>
+        </w:rPr>
+        <w:t>accuracy_score</w:t>
+      </w:r>
+      <w:proofErr w:type="spellEnd"/>
+      <w:r>
+        <w:rPr>
+          <w:lang w:val="hr-HR"/>
+        </w:rPr>
+        <w:t>'</w:t>
       </w:r>
       <w:r>
         <w:rPr>
@@ -2596,6 +5968,7 @@
       <w:r>
         <w:t>”. Avoid the stilted expression “</w:t>
       </w:r>
+      <w:proofErr w:type="spellStart"/>
       <w:r>
         <w:rPr>
           <w:lang w:val="en-US"/>
@@ -2603,7 +5976,11 @@
         <w:t>o</w:t>
       </w:r>
       <w:r>
-        <w:t xml:space="preserve">ne of us (R. B. G.) thanks </w:t>
+        <w:t>ne</w:t>
+      </w:r>
+      <w:proofErr w:type="spellEnd"/>
+      <w:r>
+        <w:t xml:space="preserve"> of us (R. B. G.) thanks </w:t>
       </w:r>
       <w:r>
         <w:t>...</w:t>
@@ -2641,9 +6018,22 @@
     </w:p>
     <w:p>
       <w:pPr>
+        <w:jc w:val="start"/>
+        <w:rPr>
+          <w:spacing w:val="-1"/>
+          <w:lang w:val="x-none" w:eastAsia="x-none"/>
+        </w:rPr>
+      </w:pPr>
+      <w:r>
+        <w:br w:type="page"/>
+      </w:r>
+    </w:p>
+    <w:p>
+      <w:pPr>
         <w:pStyle w:val="Heading5"/>
       </w:pPr>
       <w:r>
+        <w:lastRenderedPageBreak/>
         <w:t>References</w:t>
       </w:r>
     </w:p>
@@ -2652,11 +6042,7 @@
         <w:pStyle w:val="BodyText"/>
       </w:pPr>
       <w:r>
-        <w:t xml:space="preserve">The template will number citations consecutively within brackets [1]. The sentence punctuation follows the bracket [2]. Refer simply to the reference number, as in [3]—do not use </w:t>
-      </w:r>
-      <w:r>
-        <w:lastRenderedPageBreak/>
-        <w:t>“Ref. [3]” or “reference [3]” except at the beginning of a sentence: “Reference [3] was the first</w:t>
+        <w:t>The template will number citations consecutively within brackets [1]. The sentence punctuation follows the bracket [2]. Refer simply to the reference number, as in [3]—do not use “Ref. [3]” or “reference [3]” except at the beginning of a sentence: “Reference [3] was the first</w:t>
       </w:r>
       <w:r>
         <w:rPr>
@@ -2711,6 +6097,7 @@
     <w:p>
       <w:pPr>
         <w:pStyle w:val="BodyText"/>
+        <w:ind w:firstLine="0pt"/>
       </w:pPr>
       <w:r>
         <w:t xml:space="preserve">For </w:t>
@@ -2859,137 +6246,8 @@
           <w:docGrid w:linePitch="360"/>
         </w:sectPr>
       </w:pPr>
-      <w:r>
-        <w:rPr>
-          <w:rFonts w:eastAsia="SimSun"/>
-          <w:b/>
-          <w:noProof w:val="0"/>
-          <w:color w:val="FF0000"/>
-          <w:spacing w:val="-1"/>
-          <w:sz w:val="20"/>
-          <w:szCs w:val="20"/>
-          <w:lang w:val="x-none" w:eastAsia="x-none"/>
-        </w:rPr>
-        <w:t xml:space="preserve">IEEE conference templates contain guidance text for composing and formatting conference papers. Please ensure that all template text is removed from your conference paper prior to submission to the conference. Failure to remove template text from your paper </w:t>
-      </w:r>
-      <w:r>
-        <w:rPr>
-          <w:rFonts w:eastAsia="SimSun"/>
-          <w:b/>
-          <w:noProof w:val="0"/>
-          <w:color w:val="FF0000"/>
-          <w:spacing w:val="-1"/>
-          <w:sz w:val="20"/>
-          <w:szCs w:val="20"/>
-          <w:lang w:eastAsia="x-none"/>
-        </w:rPr>
-        <w:t>may</w:t>
-      </w:r>
-      <w:r>
-        <w:rPr>
-          <w:rFonts w:eastAsia="SimSun"/>
-          <w:b/>
-          <w:noProof w:val="0"/>
-          <w:color w:val="FF0000"/>
-          <w:spacing w:val="-1"/>
-          <w:sz w:val="20"/>
-          <w:szCs w:val="20"/>
-          <w:lang w:val="x-none" w:eastAsia="x-none"/>
-        </w:rPr>
-        <w:t xml:space="preserve"> result in your paper not being published.</w:t>
-      </w:r>
-    </w:p>
-    <w:p>
-      <w:r>
-        <w:rPr>
-          <w:noProof/>
-        </w:rPr>
-        <w:drawing>
-          <wp:anchor distT="0" distB="0" distL="114300" distR="114300" simplePos="0" relativeHeight="251657728" behindDoc="1" locked="0" layoutInCell="1" allowOverlap="1" wp14:anchorId="50A5432F" wp14:editId="6F0F41D4">
-            <wp:simplePos x="0" y="0"/>
-            <wp:positionH relativeFrom="margin">
-              <wp:align>left</wp:align>
-            </wp:positionH>
-            <wp:positionV relativeFrom="paragraph">
-              <wp:posOffset>251460</wp:posOffset>
-            </wp:positionV>
-            <wp:extent cx="3200400" cy="1143000"/>
-            <wp:effectExtent l="10795" t="5080" r="8255" b="13970"/>
-            <wp:wrapTight wrapText="bothSides">
-              <wp:wrapPolygon edited="0">
-                <wp:start x="-64" y="0"/>
-                <wp:lineTo x="-64" y="21600"/>
-                <wp:lineTo x="21664" y="21600"/>
-                <wp:lineTo x="21664" y="0"/>
-                <wp:lineTo x="-64" y="0"/>
-              </wp:wrapPolygon>
-            </wp:wrapTight>
-            <wp:docPr id="1" name="Text Box 8"/>
-            <wp:cNvGraphicFramePr>
-              <a:graphicFrameLocks xmlns:a="http://purl.oclc.org/ooxml/drawingml/main"/>
-            </wp:cNvGraphicFramePr>
-            <a:graphic xmlns:a="http://purl.oclc.org/ooxml/drawingml/main">
-              <a:graphicData uri="http://schemas.microsoft.com/office/word/2010/wordprocessingShape">
-                <wp:wsp>
-                  <wp:cNvSpPr txBox="1">
-                    <a:spLocks noChangeArrowheads="1"/>
-                  </wp:cNvSpPr>
-                  <wp:spPr bwMode="auto">
-                    <a:xfrm>
-                      <a:off x="0" y="0"/>
-                      <a:ext cx="3200400" cy="1143000"/>
-                    </a:xfrm>
-                    <a:prstGeom prst="rect">
-                      <a:avLst/>
-                    </a:prstGeom>
-                    <a:solidFill>
-                      <a:srgbClr val="FFFFFF"/>
-                    </a:solidFill>
-                    <a:ln w="9525">
-                      <a:solidFill>
-                        <a:srgbClr val="000000"/>
-                      </a:solidFill>
-                      <a:miter lim="800%"/>
-                      <a:headEnd/>
-                      <a:tailEnd/>
-                    </a:ln>
-                  </wp:spPr>
-                  <wp:txbx>
-                    <wne:txbxContent>
-                      <w:p>
-                        <w:pPr>
-                          <w:pStyle w:val="BodyText"/>
-                        </w:pPr>
-                        <w:r>
-                          <w:t>We suggest that you use a text box to insert a graphic (which is ideally a 300 dpi TIFF or EPS file, with all fonts embedded) because, in an MSW document, this method is somewhat more stable than directly inserting a picture.</w:t>
-                        </w:r>
-                      </w:p>
-                      <w:p>
-                        <w:pPr>
-                          <w:pStyle w:val="BodyText"/>
-                        </w:pPr>
-                        <w:r>
-                          <w:t>To have non-visible rules on your frame, use the MSWord “Format” pull-down menu, select Text Box &gt; Colors and Lines to choose No Fill and No Line.</w:t>
-                        </w:r>
-                      </w:p>
-                    </wne:txbxContent>
-                  </wp:txbx>
-                  <wp:bodyPr rot="0" vert="horz" wrap="square" lIns="91440" tIns="45720" rIns="91440" bIns="45720" anchor="t" anchorCtr="0" upright="1">
-                    <a:noAutofit/>
-                  </wp:bodyPr>
-                </wp:wsp>
-              </a:graphicData>
-            </a:graphic>
-            <wp14:sizeRelH relativeFrom="page">
-              <wp14:pctWidth>0%</wp14:pctWidth>
-            </wp14:sizeRelH>
-            <wp14:sizeRelV relativeFrom="page">
-              <wp14:pctHeight>0%</wp14:pctHeight>
-            </wp14:sizeRelV>
-          </wp:anchor>
-        </w:drawing>
-      </w:r>
-    </w:p>
+    </w:p>
+    <w:p/>
     <w:sectPr>
       <w:type w:val="continuous"/>
       <w:pgSz w:w="595.30pt" w:h="841.90pt" w:code="9"/>

</xml_diff>

<commit_message>
Dodana slika konfuzijske matrice
</commit_message>
<xml_diff>
--- a/Izvjestaj_projekta_-_Radna_verzija.docx
+++ b/Izvjestaj_projekta_-_Radna_verzija.docx
@@ -8,11 +8,13 @@
         <w:spacing w:before="5pt" w:beforeAutospacing="1" w:after="5pt" w:afterAutospacing="1"/>
         <w:rPr>
           <w:kern w:val="48"/>
+          <w:lang w:val="hr-HR"/>
         </w:rPr>
       </w:pPr>
       <w:r>
         <w:rPr>
           <w:kern w:val="48"/>
+          <w:lang w:val="hr-HR"/>
         </w:rPr>
         <w:t>Identifikacija raka dojke na slikama ultrazvuka</w:t>
       </w:r>
@@ -24,6 +26,7 @@
         <w:rPr>
           <w:sz w:val="16"/>
           <w:szCs w:val="16"/>
+          <w:lang w:val="hr-HR"/>
         </w:rPr>
       </w:pPr>
     </w:p>
@@ -34,6 +37,7 @@
         <w:rPr>
           <w:sz w:val="16"/>
           <w:szCs w:val="16"/>
+          <w:lang w:val="hr-HR"/>
         </w:rPr>
         <w:sectPr>
           <w:footerReference w:type="first" r:id="rId8"/>
@@ -52,12 +56,14 @@
         <w:rPr>
           <w:sz w:val="18"/>
           <w:szCs w:val="18"/>
+          <w:lang w:val="hr-HR"/>
         </w:rPr>
       </w:pPr>
       <w:r>
         <w:rPr>
           <w:sz w:val="18"/>
           <w:szCs w:val="18"/>
+          <w:lang w:val="hr-HR"/>
         </w:rPr>
         <w:t>Jakov Krčadinac</w:t>
       </w:r>
@@ -65,6 +71,7 @@
         <w:rPr>
           <w:sz w:val="18"/>
           <w:szCs w:val="18"/>
+          <w:lang w:val="hr-HR"/>
         </w:rPr>
         <w:br/>
       </w:r>
@@ -72,6 +79,7 @@
         <w:rPr>
           <w:sz w:val="18"/>
           <w:szCs w:val="18"/>
+          <w:lang w:val="hr-HR"/>
         </w:rPr>
         <w:t>Zagreb, Hrvatska</w:t>
       </w:r>
@@ -79,6 +87,7 @@
         <w:rPr>
           <w:sz w:val="18"/>
           <w:szCs w:val="18"/>
+          <w:lang w:val="hr-HR"/>
         </w:rPr>
         <w:br/>
       </w:r>
@@ -86,6 +95,7 @@
         <w:rPr>
           <w:sz w:val="18"/>
           <w:szCs w:val="18"/>
+          <w:lang w:val="hr-HR"/>
         </w:rPr>
         <w:t>jakov.krcadinac@fer.hr</w:t>
       </w:r>
@@ -97,12 +107,14 @@
         <w:rPr>
           <w:sz w:val="18"/>
           <w:szCs w:val="18"/>
+          <w:lang w:val="hr-HR"/>
         </w:rPr>
       </w:pPr>
       <w:r>
         <w:rPr>
           <w:sz w:val="18"/>
           <w:szCs w:val="18"/>
+          <w:lang w:val="hr-HR"/>
         </w:rPr>
         <w:t>Martina Šola</w:t>
       </w:r>
@@ -110,29 +122,64 @@
         <w:rPr>
           <w:sz w:val="18"/>
           <w:szCs w:val="18"/>
+          <w:lang w:val="hr-HR"/>
         </w:rPr>
         <w:br/>
+        <w:t>Zagreb, Hrvatska</w:t>
       </w:r>
       <w:r>
         <w:rPr>
           <w:sz w:val="18"/>
           <w:szCs w:val="18"/>
-        </w:rPr>
-        <w:t>Zagreb, Hrvatska</w:t>
-      </w:r>
-      <w:r>
+          <w:lang w:val="hr-HR"/>
+        </w:rPr>
+        <w:br/>
+        <w:t>martina.sola@fer.hr</w:t>
+      </w:r>
+    </w:p>
+    <w:p>
+      <w:pPr>
+        <w:pStyle w:val="Author"/>
+        <w:spacing w:before="5pt" w:beforeAutospacing="1"/>
         <w:rPr>
           <w:sz w:val="18"/>
           <w:szCs w:val="18"/>
-        </w:rPr>
-        <w:br/>
-      </w:r>
+          <w:lang w:val="hr-HR"/>
+        </w:rPr>
+      </w:pPr>
       <w:r>
         <w:rPr>
           <w:sz w:val="18"/>
           <w:szCs w:val="18"/>
-        </w:rPr>
-        <w:t>martina.sola@fer.hr</w:t>
+          <w:lang w:val="hr-HR"/>
+        </w:rPr>
+        <w:br w:type="column"/>
+      </w:r>
+      <w:r>
+        <w:rPr>
+          <w:sz w:val="18"/>
+          <w:szCs w:val="18"/>
+          <w:lang w:val="hr-HR"/>
+        </w:rPr>
+        <w:t>Tamara Ćorić</w:t>
+      </w:r>
+      <w:r>
+        <w:rPr>
+          <w:sz w:val="18"/>
+          <w:szCs w:val="18"/>
+          <w:lang w:val="hr-HR"/>
+        </w:rPr>
+        <w:br/>
+        <w:t>Zagreb, Hrvatska</w:t>
+      </w:r>
+      <w:r>
+        <w:rPr>
+          <w:sz w:val="18"/>
+          <w:szCs w:val="18"/>
+          <w:lang w:val="hr-HR"/>
+        </w:rPr>
+        <w:br/>
+        <w:t>tamara.coric@fer.hr</w:t>
       </w:r>
     </w:p>
     <w:p>
@@ -142,152 +189,78 @@
         <w:rPr>
           <w:sz w:val="18"/>
           <w:szCs w:val="18"/>
+          <w:lang w:val="hr-HR"/>
         </w:rPr>
       </w:pPr>
       <w:r>
         <w:rPr>
           <w:sz w:val="18"/>
           <w:szCs w:val="18"/>
-        </w:rPr>
-        <w:br w:type="column"/>
+          <w:lang w:val="hr-HR"/>
+        </w:rPr>
+        <w:t>Domagoj Marić</w:t>
       </w:r>
       <w:r>
         <w:rPr>
           <w:sz w:val="18"/>
           <w:szCs w:val="18"/>
-        </w:rPr>
-        <w:t>Tamara Ćorić</w:t>
+          <w:lang w:val="hr-HR"/>
+        </w:rPr>
+        <w:br/>
+        <w:t>Zagreb, Hrvatska</w:t>
       </w:r>
       <w:r>
         <w:rPr>
           <w:sz w:val="18"/>
           <w:szCs w:val="18"/>
+          <w:lang w:val="hr-HR"/>
         </w:rPr>
         <w:br/>
-      </w:r>
-      <w:r>
+        <w:t>domagoj.maric2@fer.hr</w:t>
+      </w:r>
+    </w:p>
+    <w:p>
+      <w:pPr>
+        <w:pStyle w:val="Author"/>
+        <w:spacing w:before="5pt" w:beforeAutospacing="1"/>
         <w:rPr>
           <w:sz w:val="18"/>
           <w:szCs w:val="18"/>
-        </w:rPr>
-        <w:t>Zagreb, Hrvatska</w:t>
-      </w:r>
+          <w:lang w:val="hr-HR"/>
+        </w:rPr>
+      </w:pPr>
       <w:r>
         <w:rPr>
           <w:sz w:val="18"/>
           <w:szCs w:val="18"/>
-        </w:rPr>
-        <w:br/>
+          <w:lang w:val="hr-HR"/>
+        </w:rPr>
+        <w:br w:type="column"/>
       </w:r>
       <w:r>
         <w:rPr>
           <w:sz w:val="18"/>
           <w:szCs w:val="18"/>
-        </w:rPr>
-        <w:t>tamara.coric@fer.hr</w:t>
-      </w:r>
-    </w:p>
-    <w:p>
-      <w:pPr>
-        <w:pStyle w:val="Author"/>
-        <w:spacing w:before="5pt" w:beforeAutospacing="1"/>
+          <w:lang w:val="hr-HR"/>
+        </w:rPr>
+        <w:t xml:space="preserve">Lucija Čorak </w:t>
+      </w:r>
+      <w:r>
         <w:rPr>
           <w:sz w:val="18"/>
           <w:szCs w:val="18"/>
-        </w:rPr>
-      </w:pPr>
+          <w:lang w:val="hr-HR"/>
+        </w:rPr>
+        <w:br/>
+        <w:t>Karlovac, Hrvatska</w:t>
+      </w:r>
       <w:r>
         <w:rPr>
           <w:sz w:val="18"/>
           <w:szCs w:val="18"/>
-        </w:rPr>
-        <w:t>Domagoj Marić</w:t>
-      </w:r>
-      <w:r>
-        <w:rPr>
-          <w:sz w:val="18"/>
-          <w:szCs w:val="18"/>
+          <w:lang w:val="hr-HR"/>
         </w:rPr>
         <w:br/>
-      </w:r>
-      <w:r>
-        <w:rPr>
-          <w:sz w:val="18"/>
-          <w:szCs w:val="18"/>
-        </w:rPr>
-        <w:t>Zagreb, Hrvatska</w:t>
-      </w:r>
-      <w:r>
-        <w:rPr>
-          <w:sz w:val="18"/>
-          <w:szCs w:val="18"/>
-        </w:rPr>
-        <w:br/>
-      </w:r>
-      <w:r>
-        <w:rPr>
-          <w:sz w:val="18"/>
-          <w:szCs w:val="18"/>
-        </w:rPr>
-        <w:t>domagoj.maric2@fer.hr</w:t>
-      </w:r>
-    </w:p>
-    <w:p>
-      <w:pPr>
-        <w:pStyle w:val="Author"/>
-        <w:spacing w:before="5pt" w:beforeAutospacing="1"/>
-        <w:rPr>
-          <w:sz w:val="18"/>
-          <w:szCs w:val="18"/>
-        </w:rPr>
-      </w:pPr>
-      <w:r>
-        <w:rPr>
-          <w:sz w:val="18"/>
-          <w:szCs w:val="18"/>
-        </w:rPr>
-        <w:br w:type="column"/>
-      </w:r>
-      <w:r>
-        <w:rPr>
-          <w:sz w:val="18"/>
-          <w:szCs w:val="18"/>
-        </w:rPr>
-        <w:t>Lucija Čorak</w:t>
-      </w:r>
-      <w:r>
-        <w:rPr>
-          <w:sz w:val="18"/>
-          <w:szCs w:val="18"/>
-        </w:rPr>
-        <w:t xml:space="preserve"> </w:t>
-      </w:r>
-      <w:r>
-        <w:rPr>
-          <w:sz w:val="18"/>
-          <w:szCs w:val="18"/>
-        </w:rPr>
-        <w:br/>
-      </w:r>
-      <w:r>
-        <w:rPr>
-          <w:sz w:val="18"/>
-          <w:szCs w:val="18"/>
-        </w:rPr>
-        <w:t>Karlovac, Hrvatska</w:t>
-      </w:r>
-      <w:r>
-        <w:rPr>
-          <w:sz w:val="18"/>
-          <w:szCs w:val="18"/>
-        </w:rPr>
-        <w:br/>
-      </w:r>
-      <w:r>
-        <w:rPr>
-          <w:sz w:val="18"/>
-          <w:szCs w:val="18"/>
-        </w:rPr>
         <w:t>lucija.corak@fer.hr</w:t>
       </w:r>
     </w:p>
@@ -322,30 +295,47 @@
         <w:rPr>
           <w:i/>
           <w:iCs/>
+          <w:lang w:val="hr-HR"/>
         </w:rPr>
       </w:pPr>
       <w:r>
         <w:rPr>
           <w:i/>
           <w:iCs/>
+          <w:lang w:val="hr-HR"/>
         </w:rPr>
         <w:t>Abstract</w:t>
       </w:r>
       <w:r>
+        <w:rPr>
+          <w:lang w:val="hr-HR"/>
+        </w:rPr>
         <w:t>—</w:t>
       </w:r>
       <w:r>
+        <w:rPr>
+          <w:lang w:val="hr-HR"/>
+        </w:rPr>
         <w:t>Rak dojke je bolest koja se manifestira u prekomjernom rastu abnormalnih stanica dojke. Značajna dijagnostička metoda za rak dojke je ultrazvuk, što je neinvazivna medicinska pretraga koja snima ljudsko tijelo pomoću zvučnih valova visoke frekvencije.</w:t>
       </w:r>
     </w:p>
     <w:p>
       <w:pPr>
         <w:pStyle w:val="Keywords"/>
-      </w:pPr>
-      <w:r>
+        <w:rPr>
+          <w:lang w:val="hr-HR"/>
+        </w:rPr>
+      </w:pPr>
+      <w:r>
+        <w:rPr>
+          <w:lang w:val="hr-HR"/>
+        </w:rPr>
         <w:t>Keywords—</w:t>
       </w:r>
       <w:r>
+        <w:rPr>
+          <w:lang w:val="hr-HR"/>
+        </w:rPr>
         <w:t>rak dojke, ultrazvuk, duboko učenje, neuronske mreže, programski jezik Python, Jupyter Notebooks</w:t>
       </w:r>
     </w:p>
@@ -360,112 +350,214 @@
     <w:p>
       <w:pPr>
         <w:pStyle w:val="BodyText"/>
-      </w:pPr>
-      <w:r>
+        <w:rPr>
+          <w:lang w:val="hr-HR"/>
+        </w:rPr>
+      </w:pPr>
+      <w:r>
+        <w:rPr>
+          <w:lang w:val="hr-HR"/>
+        </w:rPr>
         <w:t xml:space="preserve">Rak dojke je </w:t>
       </w:r>
       <w:r>
+        <w:rPr>
+          <w:lang w:val="hr-HR"/>
+        </w:rPr>
         <w:t xml:space="preserve">tip bolesti pri kojoj abnormalne stanice dojke nekontrolirano rastu i stvaraju tumore. Ako se ne kontroliraju, tumori se mogu proširiti po ostatku tijela i, s vremenom, biti fatalni [1]. </w:t>
       </w:r>
     </w:p>
     <w:p>
       <w:pPr>
         <w:pStyle w:val="BodyText"/>
-      </w:pPr>
-      <w:r>
+        <w:rPr>
+          <w:lang w:val="hr-HR"/>
+        </w:rPr>
+      </w:pPr>
+      <w:r>
+        <w:rPr>
+          <w:lang w:val="hr-HR"/>
+        </w:rPr>
         <w:t xml:space="preserve">Uzrok nastanka raka dojke uglavnom je nepoznat. Od </w:t>
       </w:r>
       <w:r>
+        <w:rPr>
+          <w:lang w:val="hr-HR"/>
+        </w:rPr>
         <w:t>njega n</w:t>
       </w:r>
       <w:r>
+        <w:rPr>
+          <w:lang w:val="hr-HR"/>
+        </w:rPr>
         <w:t>ajčešće obolijevaju žene iznad pedesete godine života, a muškarci također mogu oboljeti od raka dojke, ali znatno rjeđe nego žene</w:t>
       </w:r>
       <w:r>
+        <w:rPr>
+          <w:lang w:val="hr-HR"/>
+        </w:rPr>
         <w:t>. Najznačajniji čimbenici koji povećavaju rizik nastanka raka dojke su: dob, prva menstruacija prije 12-te godine života, menopauza nakon 50-te godine života, nerađanje ili rađanje poslije 30-te godine života, pojavnost raka dojk</w:t>
       </w:r>
       <w:r>
+        <w:rPr>
+          <w:lang w:val="hr-HR"/>
+        </w:rPr>
         <w:t>e</w:t>
       </w:r>
       <w:r>
+        <w:rPr>
+          <w:lang w:val="hr-HR"/>
+        </w:rPr>
         <w:t xml:space="preserve"> i/ili raka jajnika kod bližih srodnika</w:t>
       </w:r>
       <w:r>
+        <w:rPr>
+          <w:lang w:val="hr-HR"/>
+        </w:rPr>
         <w:t xml:space="preserve"> te</w:t>
       </w:r>
       <w:r>
+        <w:rPr>
+          <w:lang w:val="hr-HR"/>
+        </w:rPr>
         <w:t xml:space="preserve"> prethodna bolest dojke. Također, povećani rizik za rak dojke vezan je i uz određene životne navike i stil života koji se smatraju nezdravim: prehrana bogata masnoćama i šećerima, pretilost, povećana konzumacija alkohola, pušenje</w:t>
       </w:r>
       <w:r>
+        <w:rPr>
+          <w:lang w:val="hr-HR"/>
+        </w:rPr>
         <w:t xml:space="preserve"> te</w:t>
       </w:r>
       <w:r>
+        <w:rPr>
+          <w:lang w:val="hr-HR"/>
+        </w:rPr>
         <w:t xml:space="preserve"> izloženost radioaktivnom zračenju</w:t>
       </w:r>
       <w:r>
+        <w:rPr>
+          <w:lang w:val="hr-HR"/>
+        </w:rPr>
         <w:t xml:space="preserve"> </w:t>
       </w:r>
       <w:r>
+        <w:rPr>
+          <w:lang w:val="hr-HR"/>
+        </w:rPr>
         <w:t>[2].</w:t>
       </w:r>
     </w:p>
     <w:p>
       <w:pPr>
         <w:pStyle w:val="BodyText"/>
-      </w:pPr>
-      <w:r>
+        <w:rPr>
+          <w:lang w:val="hr-HR"/>
+        </w:rPr>
+      </w:pPr>
+      <w:r>
+        <w:rPr>
+          <w:lang w:val="hr-HR"/>
+        </w:rPr>
         <w:t xml:space="preserve">Mnogi pacijenti oboljeli od raka dojke ne </w:t>
       </w:r>
       <w:r>
+        <w:rPr>
+          <w:lang w:val="hr-HR"/>
+        </w:rPr>
         <w:t>primijete</w:t>
       </w:r>
       <w:r>
+        <w:rPr>
+          <w:lang w:val="hr-HR"/>
+        </w:rPr>
         <w:t xml:space="preserve"> ikakve simptome u ranijim stadijima bolesti, zbog čega je bitno rano otkrivanje bolesti. Simptomi raka dojke mogu uključivati: </w:t>
       </w:r>
       <w:r>
+        <w:rPr>
+          <w:lang w:val="hr-HR"/>
+        </w:rPr>
         <w:t xml:space="preserve">bezbolnu kvržicu na grudima, promjenu oblika ili izgleda dojke, stvaranje udubljenja, crvenila ili drugih promjena na koži, promjene u izgledu bradavice (areole) ili kože oko nje te abnormalni ili krvavi iscjedak iz bradavice [1]. </w:t>
       </w:r>
     </w:p>
     <w:p>
       <w:pPr>
         <w:pStyle w:val="BodyText"/>
-      </w:pPr>
-      <w:r>
+        <w:rPr>
+          <w:lang w:val="hr-HR"/>
+        </w:rPr>
+      </w:pPr>
+      <w:r>
+        <w:rPr>
+          <w:lang w:val="hr-HR"/>
+        </w:rPr>
         <w:t>Postoje dva najčešća načina dijagnosticiranja raka dojke: mamografija i ultrazvuk dojke. Mamografija je rendgenski pregled dojki kojim se otkrivaju tumori i druge promjene dojke koje su premalene da bi se mogle napipati.</w:t>
       </w:r>
       <w:r>
+        <w:rPr>
+          <w:lang w:val="hr-HR"/>
+        </w:rPr>
         <w:t xml:space="preserve"> Ultrazvuk je radiološka dijagnostička metoda koja za snimanja koristi zvuk visoke frekvencije</w:t>
       </w:r>
       <w:r>
+        <w:rPr>
+          <w:lang w:val="hr-HR"/>
+        </w:rPr>
         <w:t>. Smatra se potpuno ne</w:t>
       </w:r>
       <w:r>
+        <w:rPr>
+          <w:lang w:val="hr-HR"/>
+        </w:rPr>
         <w:t>škodljivom</w:t>
       </w:r>
       <w:r>
+        <w:rPr>
+          <w:lang w:val="hr-HR"/>
+        </w:rPr>
         <w:t xml:space="preserve"> metodom, pri čemu nema izlaganja ionizirajućim zračenjima</w:t>
       </w:r>
       <w:r>
+        <w:rPr>
+          <w:lang w:val="hr-HR"/>
+        </w:rPr>
         <w:t xml:space="preserve"> [2]. U medicinskom ultrazvuku koriste se longitudinalni</w:t>
       </w:r>
       <w:r>
+        <w:rPr>
+          <w:lang w:val="hr-HR"/>
+        </w:rPr>
         <w:t xml:space="preserve"> </w:t>
       </w:r>
       <w:r>
+        <w:rPr>
+          <w:lang w:val="hr-HR"/>
+        </w:rPr>
         <w:t xml:space="preserve">valovi frekvencija većih od 2,5 MHz [3]. </w:t>
       </w:r>
       <w:r>
+        <w:rPr>
+          <w:lang w:val="hr-HR"/>
+        </w:rPr>
         <w:t>Ultrazvuk, uz mamografiju, znatno povećava točnost dijagnosticiranja dobroćudnih i zloćudnih bolesti dojke [2].</w:t>
       </w:r>
     </w:p>
     <w:p>
       <w:pPr>
         <w:pStyle w:val="BodyText"/>
-      </w:pPr>
-      <w:r>
+        <w:rPr>
+          <w:lang w:val="hr-HR"/>
+        </w:rPr>
+      </w:pPr>
+      <w:r>
+        <w:rPr>
+          <w:lang w:val="hr-HR"/>
+        </w:rPr>
         <w:t xml:space="preserve">Ultrazvuk može procijeniti morfologiju, orijentaciju, unutarnju strukturu i rubove lezije iz više ravnina s visokom rezolucijom, kako u dojkama koje se sastoje od pretežno masnog tkiva, tako i u gustim žljezdanim strukturama. Opći kriteriji za otkrivanje raka dojke ultrazvukom navedeni su u </w:t>
       </w:r>
       <w:r>
+        <w:rPr>
+          <w:lang w:val="hr-HR"/>
+        </w:rPr>
         <w:t>tablici 1. Među tim značajkama, najbitniji faktori pri klasificiranju lezija su: okolno tkivo, oblik, kontura ruba, granica lezije i posteriorne akustičke značajke [4].</w:t>
       </w:r>
     </w:p>
@@ -473,13 +565,17 @@
       <w:pPr>
         <w:pStyle w:val="BodyText"/>
         <w:keepNext/>
+        <w:rPr>
+          <w:lang w:val="hr-HR"/>
+        </w:rPr>
       </w:pPr>
       <w:r>
         <w:rPr>
           <w:noProof/>
+          <w:lang w:val="hr-HR"/>
         </w:rPr>
         <w:drawing>
-          <wp:inline distT="0" distB="0" distL="0" distR="0" wp14:anchorId="7FB9EBF8" wp14:editId="53BD6891">
+          <wp:inline distT="0" distB="0" distL="0" distR="0" wp14:anchorId="7FB9EBF8" wp14:editId="68DF58EF">
             <wp:extent cx="3089910" cy="2246630"/>
             <wp:effectExtent l="0" t="0" r="0" b="1270"/>
             <wp:docPr id="1016865219" name="Picture 2" descr="A screenshot of a medical chart&#10;&#10;Description automatically generated"/>
@@ -679,9 +775,10 @@
       <w:r>
         <w:rPr>
           <w:noProof/>
+          <w:lang w:val="hr-HR"/>
         </w:rPr>
         <w:drawing>
-          <wp:anchor distT="0" distB="0" distL="114300" distR="114300" simplePos="0" relativeHeight="251659776" behindDoc="0" locked="0" layoutInCell="1" allowOverlap="1" wp14:anchorId="736B4D69" wp14:editId="1838BD28">
+          <wp:anchor distT="0" distB="0" distL="114300" distR="114300" simplePos="0" relativeHeight="251659776" behindDoc="0" locked="0" layoutInCell="1" allowOverlap="1" wp14:anchorId="736B4D69" wp14:editId="1B5D6459">
             <wp:simplePos x="0" y="0"/>
             <wp:positionH relativeFrom="column">
               <wp:posOffset>3213100</wp:posOffset>
@@ -746,37 +843,7 @@
         <w:rPr>
           <w:lang w:val="hr-HR"/>
         </w:rPr>
-        <w:t>like (</w:t>
-      </w:r>
-      <w:r>
-        <w:rPr>
-          <w:lang w:val="en-US"/>
-        </w:rPr>
-        <w:t>k</w:t>
-      </w:r>
-      <w:r>
-        <w:rPr>
-          <w:lang w:val="en-US"/>
-        </w:rPr>
-        <w:t>raniokaudalna</w:t>
-      </w:r>
-      <w:r>
-        <w:rPr>
-          <w:lang w:val="en-US"/>
-        </w:rPr>
-        <w:t xml:space="preserve"> ili m</w:t>
-      </w:r>
-      <w:r>
-        <w:rPr>
-          <w:lang w:val="en-US"/>
-        </w:rPr>
-        <w:t>edijalno-lateralna kosa projekcija</w:t>
-      </w:r>
-      <w:r>
-        <w:rPr>
-          <w:lang w:val="hr-HR"/>
-        </w:rPr>
-        <w:t xml:space="preserve">) i nama najbitniji podatak; patologija. Ta nam kategorija, odnosno stupac govori je li na specifičnoj slici prisutno </w:t>
+        <w:t xml:space="preserve">like (kraniokaudalna ili medijalno-lateralna kosa projekcija) i nama najbitniji podatak; patologija. Ta nam kategorija, odnosno stupac govori je li na specifičnoj slici prisutno </w:t>
       </w:r>
       <w:r>
         <w:rPr>
@@ -830,19 +897,7 @@
         <w:rPr>
           <w:lang w:val="hr-HR"/>
         </w:rPr>
-        <w:t xml:space="preserve">. Ove su tri kategorije u podacima označene kao MALIGNANT, BENIGN i </w:t>
-      </w:r>
-      <w:r>
-        <w:rPr>
-          <w:lang w:val="hr-HR"/>
-        </w:rPr>
-        <w:t>BENIGN_WITHOUT_CALLBACK</w:t>
-      </w:r>
-      <w:r>
-        <w:rPr>
-          <w:lang w:val="hr-HR"/>
-        </w:rPr>
-        <w:t xml:space="preserve">. U „jpeg“ direktoriju nalazilo se 6774 direktorija od kojih su neki sadržavali originalnu sliku rendgenske snimke s mamografije koja je velikih dimenzija, a neki direktoriji su sadržavali po dvije slike od kojih je jedna bila izrezani manji dio originalne slike, a druga ROI maska koja prikazuje fokusirano područje originalne slike. Jedna originalna rendgenska slika može biti povezana s više </w:t>
+        <w:t xml:space="preserve">. Ove su tri kategorije u podacima označene kao MALIGNANT, BENIGN i BENIGN_WITHOUT_CALLBACK. U „jpeg“ direktoriju nalazilo se 6774 direktorija od kojih su neki sadržavali originalnu sliku rendgenske snimke s mamografije koja je velikih dimenzija, a neki direktoriji su sadržavali po dvije slike od kojih je jedna bila izrezani manji dio originalne slike, a druga ROI maska koja prikazuje fokusirano područje originalne slike. Jedna originalna rendgenska slika može biti povezana s više </w:t>
       </w:r>
       <w:r>
         <w:rPr>
@@ -862,6 +917,7 @@
         <w:pStyle w:val="BodyText"/>
         <w:rPr>
           <w:noProof/>
+          <w:lang w:val="hr-HR"/>
         </w:rPr>
       </w:pPr>
       <w:r>
@@ -870,7 +926,7 @@
           <w:lang w:val="hr-HR"/>
         </w:rPr>
         <w:drawing>
-          <wp:anchor distT="0" distB="0" distL="114300" distR="114300" simplePos="0" relativeHeight="251660800" behindDoc="0" locked="0" layoutInCell="1" allowOverlap="1" wp14:anchorId="49758A6F" wp14:editId="3D0F8A48">
+          <wp:anchor distT="0" distB="0" distL="114300" distR="114300" simplePos="0" relativeHeight="251660800" behindDoc="0" locked="0" layoutInCell="1" allowOverlap="1" wp14:anchorId="49758A6F" wp14:editId="42F064F2">
             <wp:simplePos x="0" y="0"/>
             <wp:positionH relativeFrom="column">
               <wp:posOffset>3538855</wp:posOffset>
@@ -931,7 +987,7 @@
           <w:lang w:val="hr-HR"/>
         </w:rPr>
         <w:drawing>
-          <wp:anchor distT="0" distB="0" distL="114300" distR="114300" simplePos="0" relativeHeight="251658752" behindDoc="0" locked="0" layoutInCell="1" allowOverlap="1" wp14:anchorId="00A0AC88" wp14:editId="58BBF0BE">
+          <wp:anchor distT="0" distB="0" distL="114300" distR="114300" simplePos="0" relativeHeight="251658752" behindDoc="0" locked="0" layoutInCell="1" allowOverlap="1" wp14:anchorId="00A0AC88" wp14:editId="021D8E80">
             <wp:simplePos x="0" y="0"/>
             <wp:positionH relativeFrom="column">
               <wp:align>right</wp:align>
@@ -1025,6 +1081,7 @@
       <w:r>
         <w:rPr>
           <w:noProof/>
+          <w:lang w:val="hr-HR"/>
         </w:rPr>
         <w:t xml:space="preserve"> </w:t>
       </w:r>
@@ -1032,34 +1089,19 @@
     <w:p>
       <w:pPr>
         <w:pStyle w:val="Caption"/>
-        <w:rPr>
-          <w:lang w:val="hr-HR"/>
-        </w:rPr>
-      </w:pPr>
-      <w:r>
-        <w:rPr>
-          <w:lang w:val="hr-HR"/>
-        </w:rPr>
+      </w:pPr>
+      <w:r>
         <w:t>Slika 2. Usporedba dimenzija ROI maski i izrezanih slika u skupu za testiranje</w:t>
       </w:r>
     </w:p>
     <w:p>
       <w:pPr>
         <w:pStyle w:val="Caption"/>
-        <w:rPr>
-          <w:lang w:val="hr-HR"/>
-        </w:rPr>
-      </w:pPr>
-      <w:r>
-        <w:rPr>
-          <w:lang w:val="hr-HR"/>
-        </w:rPr>
+      </w:pPr>
+      <w:r>
         <w:t xml:space="preserve">Slika 3. Usporedba dimenzija ROI maski i izrezanih slika u skupu za </w:t>
       </w:r>
       <w:r>
-        <w:rPr>
-          <w:lang w:val="hr-HR"/>
-        </w:rPr>
         <w:t>treniranje</w:t>
       </w:r>
     </w:p>
@@ -1068,34 +1110,27 @@
         <w:jc w:val="start"/>
         <w:rPr>
           <w:spacing w:val="-1"/>
-          <w:lang w:val="hr-HR" w:eastAsia="x-none"/>
+          <w:lang w:eastAsia="x-none"/>
         </w:rPr>
       </w:pPr>
       <w:r>
         <w:rPr>
           <w:spacing w:val="-1"/>
-          <w:lang w:val="hr-HR" w:eastAsia="x-none"/>
-        </w:rPr>
-        <w:t xml:space="preserve">Na skupu za testiranje, koji sadrži 326 različitih </w:t>
+          <w:lang w:eastAsia="x-none"/>
+        </w:rPr>
+        <w:t xml:space="preserve">Na skupu za testiranje, koji sadrži 326 različitih izrezanih slika i ROI maski, vrlo je jasno vidljiva </w:t>
       </w:r>
       <w:r>
         <w:rPr>
           <w:spacing w:val="-1"/>
-          <w:lang w:val="hr-HR" w:eastAsia="x-none"/>
-        </w:rPr>
-        <w:t xml:space="preserve">izrezanih slika i ROI maski, vrlo je jasno vidljiva </w:t>
+          <w:lang w:eastAsia="x-none"/>
+        </w:rPr>
+        <w:t xml:space="preserve">razlika između izrezanih slika koje imaju manje dimenzije i ROI maski koje su znatno većih dimenzija. </w:t>
       </w:r>
       <w:r>
         <w:rPr>
           <w:spacing w:val="-1"/>
-          <w:lang w:val="hr-HR" w:eastAsia="x-none"/>
-        </w:rPr>
-        <w:t xml:space="preserve">razlika između izrezanih slika koje imaju manje dimenzije i ROI maski koje su znatno većih dimenzija. </w:t>
-      </w:r>
-      <w:r>
-        <w:rPr>
-          <w:spacing w:val="-1"/>
-          <w:lang w:val="hr-HR" w:eastAsia="x-none"/>
+          <w:lang w:eastAsia="x-none"/>
         </w:rPr>
         <w:t xml:space="preserve">Na skupu za treniranje koji ima po 1546 izrezanih slika i ROI maski, vidimo par </w:t>
       </w:r>
@@ -1104,14 +1139,14 @@
           <w:i/>
           <w:iCs/>
           <w:spacing w:val="-1"/>
-          <w:lang w:val="hr-HR" w:eastAsia="x-none"/>
+          <w:lang w:eastAsia="x-none"/>
         </w:rPr>
         <w:t xml:space="preserve">outliera, </w:t>
       </w:r>
       <w:r>
         <w:rPr>
           <w:spacing w:val="-1"/>
-          <w:lang w:val="hr-HR" w:eastAsia="x-none"/>
+          <w:lang w:eastAsia="x-none"/>
         </w:rPr>
         <w:t>odnosno izrezanih slika (označene plavim točkama na grafu) koje su nešto većih dimenzija, što je za očekivati s obzirom na puno veći podatkovni skup. Bitno je da su te velike izrezane slike i dalje veće površine od ROI maske s kojom su u direktoriju, jer je to uvjet po kojem odvajamo izrezane slike. Budući da je uvjet zadovoljen, uspješno smo izolirali izrezane slike koje ćemo koristiti za testiranje i treniranje modela.</w:t>
       </w:r>
@@ -1119,17 +1154,13 @@
     <w:p>
       <w:pPr>
         <w:pStyle w:val="Caption"/>
-        <w:rPr>
-          <w:lang w:val="hr-HR"/>
-        </w:rPr>
       </w:pPr>
       <w:r>
         <w:rPr>
           <w:noProof/>
-          <w:lang w:val="hr-HR"/>
         </w:rPr>
         <w:drawing>
-          <wp:anchor distT="0" distB="0" distL="114300" distR="114300" simplePos="0" relativeHeight="251661824" behindDoc="0" locked="0" layoutInCell="1" allowOverlap="1" wp14:anchorId="10400D5B" wp14:editId="4771183F">
+          <wp:anchor distT="0" distB="0" distL="114300" distR="114300" simplePos="0" relativeHeight="251661824" behindDoc="0" locked="0" layoutInCell="1" allowOverlap="1" wp14:anchorId="10400D5B" wp14:editId="63D8756C">
             <wp:simplePos x="0" y="0"/>
             <wp:positionH relativeFrom="column">
               <wp:posOffset>221615</wp:posOffset>
@@ -1185,93 +1216,33 @@
         </w:drawing>
       </w:r>
       <w:r>
-        <w:rPr>
-          <w:lang w:val="hr-HR"/>
-        </w:rPr>
-        <w:t xml:space="preserve">Slika </w:t>
-      </w:r>
-      <w:r>
-        <w:rPr>
-          <w:lang w:val="hr-HR"/>
-        </w:rPr>
-        <w:t>4</w:t>
-      </w:r>
-      <w:r>
-        <w:rPr>
-          <w:lang w:val="hr-HR"/>
-        </w:rPr>
-        <w:t xml:space="preserve">. </w:t>
-      </w:r>
-      <w:r>
-        <w:rPr>
-          <w:lang w:val="hr-HR"/>
-        </w:rPr>
+        <w:t xml:space="preserve">Slika 4. </w:t>
+      </w:r>
+      <w:r>
         <w:t>Razdioba vrijednosti značajke Pathology na skupu za treniranje</w:t>
       </w:r>
     </w:p>
     <w:p>
       <w:pPr>
         <w:pStyle w:val="Caption"/>
-        <w:rPr>
-          <w:lang w:val="hr-HR"/>
-        </w:rPr>
-      </w:pPr>
-      <w:r>
-        <w:rPr>
-          <w:lang w:val="hr-HR"/>
-        </w:rPr>
-        <w:t>S</w:t>
-      </w:r>
-      <w:r>
-        <w:rPr>
-          <w:lang w:val="hr-HR"/>
-        </w:rPr>
-        <w:t xml:space="preserve">lika </w:t>
-      </w:r>
-      <w:r>
-        <w:rPr>
-          <w:lang w:val="hr-HR"/>
-        </w:rPr>
-        <w:t>5</w:t>
-      </w:r>
-      <w:r>
-        <w:rPr>
-          <w:lang w:val="hr-HR"/>
-        </w:rPr>
-        <w:t xml:space="preserve">. </w:t>
-      </w:r>
-      <w:r>
-        <w:rPr>
-          <w:lang w:val="hr-HR"/>
-        </w:rPr>
-        <w:t>Razdioba vrijednosti značajke Pathology na testnom skupu</w:t>
+      </w:pPr>
+      <w:r>
+        <w:t>Slika 5. Razdioba vrijednosti značajke Pathology na testnom skupu</w:t>
       </w:r>
     </w:p>
     <w:p>
       <w:pPr>
         <w:jc w:val="start"/>
-        <w:rPr>
-          <w:lang w:val="hr-HR"/>
-        </w:rPr>
-      </w:pPr>
-      <w:r>
-        <w:rPr>
-          <w:lang w:val="hr-HR"/>
-        </w:rPr>
+      </w:pPr>
+      <w:r>
         <w:br w:type="page"/>
       </w:r>
     </w:p>
     <w:p>
       <w:pPr>
-        <w:jc w:val="start"/>
-        <w:rPr>
-          <w:lang w:val="hr-HR"/>
-        </w:rPr>
-      </w:pPr>
-      <w:r>
-        <w:rPr>
-          <w:lang w:val="hr-HR"/>
-        </w:rPr>
+        <w:jc w:val="both"/>
+      </w:pPr>
+      <w:r>
         <w:lastRenderedPageBreak/>
         <w:t>Sa Slike 4. je vidljivo da je frekvencija mogućih vrijednosti stručnih dijagnoza (</w:t>
       </w:r>
@@ -1279,750 +1250,506 @@
         <w:rPr>
           <w:i/>
           <w:iCs/>
-          <w:lang w:val="hr-HR"/>
         </w:rPr>
         <w:t>Pahtology</w:t>
       </w:r>
       <w:r>
-        <w:rPr>
-          <w:lang w:val="hr-HR"/>
-        </w:rPr>
         <w:t xml:space="preserve">) za tkiva prikazana na izrezanim slikama podjednaka za sve tri vrijednosti na skupu za treniranje. Slika 5. prikazuje da situacija nije ista na skupu za testiranje gdje je ipak broj slika s oznakom BENIGN_WITHOUT_CALLBACK skoro duplo manji od broja oznaka BENIGN i MALIGNANT. </w:t>
       </w:r>
       <w:r>
-        <w:rPr>
-          <w:lang w:val="hr-HR"/>
-        </w:rPr>
         <w:t xml:space="preserve">Zbog toga će biti potrebno da osim same preciznosti, kod evaluacije modela koristimo i druge metrike za performanse kao što su odziv, F1 </w:t>
       </w:r>
       <w:r>
-        <w:rPr>
-          <w:lang w:val="hr-HR"/>
-        </w:rPr>
         <w:t>score</w:t>
       </w:r>
       <w:r>
-        <w:rPr>
-          <w:lang w:val="hr-HR"/>
-        </w:rPr>
-        <w:t xml:space="preserve"> i </w:t>
-      </w:r>
-      <w:r>
-        <w:t>ROC-AUC</w:t>
-      </w:r>
-      <w:r>
-        <w:t xml:space="preserve"> krivulje.</w:t>
-      </w:r>
-      <w:r>
-        <w:rPr>
-          <w:lang w:val="hr-HR"/>
-        </w:rPr>
-        <w:t xml:space="preserve"> </w:t>
-      </w:r>
-      <w:r>
-        <w:rPr>
-          <w:lang w:val="hr-HR"/>
-        </w:rPr>
+        <w:t xml:space="preserve"> i ROC-AUC krivulje. </w:t>
+      </w:r>
+      <w:r>
         <w:t>Osobe koje su napravile i objavile ovaj podatkovni skup te ga odvojile na skup za testiranje i treniranje su vjerojatno pazil</w:t>
       </w:r>
       <w:r>
-        <w:rPr>
-          <w:lang w:val="hr-HR"/>
-        </w:rPr>
         <w:t>e</w:t>
       </w:r>
       <w:r>
-        <w:rPr>
-          <w:lang w:val="hr-HR"/>
-        </w:rPr>
         <w:t xml:space="preserve"> na to da su podaci u skupu za treniranje balansirani s obzirom na značajku </w:t>
       </w:r>
       <w:r>
         <w:rPr>
           <w:i/>
           <w:iCs/>
-          <w:lang w:val="hr-HR"/>
         </w:rPr>
         <w:t>Pathology</w:t>
       </w:r>
       <w:r>
-        <w:rPr>
-          <w:lang w:val="hr-HR"/>
-        </w:rPr>
         <w:t xml:space="preserve"> kako bi modeli bili jednako pouzdani za klasifikaciju sve tri značajke. Analizom kompletnog podatkovnog skupa je također utvrđeno da se slike svakog pojedinog pacijenta nalaze ili u skupu za treniranje ili u skupu za testiranje, dakle niti jednom pacijentu različite izrezane verzije slika nisu završile u oba podatkovna skupa. Time je osigurana konzistentnost i sprječavanje da se model prenauči jer je poanta da model može dobro predviđati za nove pacijente na čijim slikama nije već treniran.</w:t>
       </w:r>
     </w:p>
     <w:p>
       <w:pPr>
         <w:jc w:val="start"/>
-        <w:rPr>
-          <w:lang w:val="hr-HR"/>
-        </w:rPr>
       </w:pPr>
     </w:p>
     <w:p>
       <w:pPr>
         <w:pStyle w:val="Heading1"/>
-        <w:rPr>
-          <w:lang w:val="hr-HR"/>
-        </w:rPr>
-      </w:pPr>
-      <w:r>
-        <w:rPr>
-          <w:lang w:val="hr-HR"/>
-        </w:rPr>
+      </w:pPr>
+      <w:r>
         <w:t>Opis i analiza implementacije neuronske mreže</w:t>
+      </w:r>
+    </w:p>
+    <w:p>
+      <w:pPr>
+        <w:ind w:firstLine="36pt"/>
+        <w:jc w:val="both"/>
+      </w:pPr>
+      <w:r>
+        <w:t xml:space="preserve">Za implementaciju neuronskih mreža, korištena je biblioteka PyTorch </w:t>
+      </w:r>
+      <w:r>
+        <w:t xml:space="preserve">zato </w:t>
+      </w:r>
+      <w:r>
+        <w:t>što omogućuje jednostavnu implementaciju prilagođenih modela, kao i integraciju unaprijed istreniranih modela. Osim toga, ova biblioteka sadrži alate za augmentaciju i normalizaciju slika te olakšava prijenos modela i podataka između CPU-a i GPU-a čime ubrzavamo trening.</w:t>
+      </w:r>
+    </w:p>
+    <w:p>
+      <w:pPr>
+        <w:ind w:firstLine="36pt"/>
+        <w:jc w:val="both"/>
+      </w:pPr>
+      <w:r>
+        <w:t>Učitavanje podataka odrađeno je pomoću prilagođene klase BreastCancerDataset koja nam omogućuje učitavanje i transformaciju slike te povezivanje s pripadajućom klasifikacijom. Podaci su učitani iz CSV datoteka 'train_data' i 'test_data'</w:t>
+      </w:r>
+      <w:r>
+        <w:t xml:space="preserve"> pomoću biblioteke pandas, a klasifikacija je ručno tranformirana u brojčane vrijednosti unutar klase.</w:t>
+      </w:r>
+    </w:p>
+    <w:p>
+      <w:pPr>
+        <w:ind w:firstLine="36pt"/>
+        <w:jc w:val="both"/>
+      </w:pPr>
+      <w:r>
+        <w:t xml:space="preserve">Cilj istraživanja bio je usporediti dva pristupa: treniranje modela od nule i korištenje unaprijed istreniranih modela, poput ResNet-a, istreniranih na skupu podataka ImageNet. </w:t>
+      </w:r>
+      <w:r>
+        <w:t xml:space="preserve">Klasa CNN definira model kojeg ćemo trenirati od nule. Model je definiran pomoću biblioteke 'torch.nn', a sastoji se od </w:t>
+      </w:r>
+      <w:r>
+        <w:t xml:space="preserve">dva bloka konvolucijskih slojeva. </w:t>
+      </w:r>
+      <w:r>
+        <w:t xml:space="preserve">Blokovi se sastoje od dva konvolucijska sloja </w:t>
+      </w:r>
+      <w:r>
+        <w:t>te dva sloja za normalizaciju</w:t>
+      </w:r>
+      <w:r>
+        <w:t>.</w:t>
+      </w:r>
+      <w:r>
+        <w:t xml:space="preserve"> Kao aktivacijska funkcija za sve slojeve korištena je 'ReLu' aktivacijska funkcija. </w:t>
+      </w:r>
+      <w:r>
+        <w:t>Na</w:t>
+      </w:r>
+      <w:r>
+        <w:t xml:space="preserve"> kraju</w:t>
+      </w:r>
+      <w:r>
+        <w:t xml:space="preserve"> svakog bloka, implementirani su </w:t>
+      </w:r>
+      <w:r>
+        <w:t>slojev</w:t>
+      </w:r>
+      <w:r>
+        <w:t>i</w:t>
+      </w:r>
+      <w:r>
+        <w:t xml:space="preserve"> za smanjenje dimenzionalnosti</w:t>
+      </w:r>
+      <w:r>
+        <w:t xml:space="preserve"> ('MaxPool') dimenzija 2x2</w:t>
+      </w:r>
+      <w:r>
+        <w:t>, kao i sloj 'Dropout' za regularizaciju modela</w:t>
+      </w:r>
+      <w:r>
+        <w:t xml:space="preserve">. </w:t>
+      </w:r>
+      <w:r>
+        <w:t xml:space="preserve">Kako bismo omogućili mapiranje na izlazne klase, izlazi iz konvolucijskih slojeva su </w:t>
+      </w:r>
+      <w:r>
+        <w:t>izravnati u jednodimenzionalni tenzor te proslijeđeni kroz dva potpuno povezana sloja</w:t>
+      </w:r>
+      <w:r>
+        <w:t>, čiji konačni izlaz odgovara broju klasa (u našem slučaju tri)</w:t>
+      </w:r>
+      <w:r>
+        <w:t>.</w:t>
+      </w:r>
+      <w:r>
+        <w:t xml:space="preserve"> Osim ovog modela, napravljen je i jednostavniji model 'SimpleCNN', kako bismo pokušali spriječiti prenaučenost modela. </w:t>
+      </w:r>
+      <w:r>
+        <w:t>Ovaj jednostavniji model je</w:t>
+      </w:r>
+      <w:r>
+        <w:t xml:space="preserve"> građen od 4 konvolucijska sloja, a</w:t>
+      </w:r>
+      <w:r>
+        <w:t xml:space="preserve"> kao ulaz prima slike dimenzija 32x32</w:t>
+      </w:r>
+      <w:r>
+        <w:t>.</w:t>
+      </w:r>
+      <w:r>
+        <w:t xml:space="preserve"> </w:t>
+      </w:r>
+      <w:r>
+        <w:t>Optimizacija modela obavljala se pomoću algoritma `Adam`, uz definiranu stopu učenja i regularizaciju</w:t>
+      </w:r>
+      <w:r>
+        <w:t xml:space="preserve">. Uz to, kompleksniji model koristi </w:t>
+      </w:r>
+      <w:r>
+        <w:t xml:space="preserve">funkciju ReduceLROnPlateau kako bi se izbjegla stagnacija tijekom </w:t>
+      </w:r>
+      <w:r>
+        <w:t>treniranja modela</w:t>
+      </w:r>
+      <w:r>
+        <w:t xml:space="preserve">. Gubitak </w:t>
+      </w:r>
+      <w:r>
+        <w:t xml:space="preserve">se računao </w:t>
+      </w:r>
+      <w:r>
+        <w:t>korištenjem funkcije `CrossEntropyLoss`</w:t>
+      </w:r>
+      <w:r>
+        <w:t xml:space="preserve">, dok </w:t>
+      </w:r>
+      <w:r>
+        <w:t>je</w:t>
+      </w:r>
+      <w:r>
+        <w:t xml:space="preserve"> za procjen</w:t>
+      </w:r>
+      <w:r>
+        <w:t>u</w:t>
+      </w:r>
+      <w:r>
+        <w:t xml:space="preserve"> uspješnosti modela prilikom treninga i validacije korišten</w:t>
+      </w:r>
+      <w:r>
+        <w:t xml:space="preserve">a funkcija </w:t>
+      </w:r>
+      <w:bookmarkStart w:id="0" w:name="_Hlk187833879"/>
+      <w:r>
+        <w:t>'accuracy</w:t>
+      </w:r>
+      <w:bookmarkStart w:id="1" w:name="_Hlk187833837"/>
+      <w:r>
+        <w:t>_</w:t>
+      </w:r>
+      <w:bookmarkEnd w:id="1"/>
+      <w:r>
+        <w:t>score'</w:t>
+      </w:r>
+      <w:bookmarkEnd w:id="0"/>
+      <w:r>
+        <w:t>.</w:t>
+      </w:r>
+    </w:p>
+    <w:p>
+      <w:pPr>
+        <w:jc w:val="both"/>
+      </w:pPr>
+      <w:r>
+        <w:t xml:space="preserve">Drugi pristup se oslanjao na korištenje </w:t>
+      </w:r>
+      <w:r>
+        <w:t>prethodno treniranih</w:t>
+      </w:r>
+      <w:commentRangeStart w:id="2"/>
+      <w:commentRangeEnd w:id="2"/>
+      <w:r>
+        <w:rPr>
+          <w:rStyle w:val="CommentReference"/>
+        </w:rPr>
+        <w:commentReference w:id="2"/>
+      </w:r>
+      <w:r>
+        <w:t xml:space="preserve"> </w:t>
+      </w:r>
+      <w:r>
+        <w:t xml:space="preserve">modela. Odlučili smo implementirati model 'ResNet' koji je dostupan unutar biblioteke PyTorch. Model je treniran na skupu slika ImageNet, što osigurava da model ima sposobnost prepoznavanja složenih značajki u slikama. </w:t>
+      </w:r>
+      <w:r>
+        <w:t xml:space="preserve">RezNet kao ulaz prima RGB slike dimenzija 224x224, u skladu s čime smo prilagodili dimenzije našeg skupa podataka te normalizirali transformaciju. Osim toga, promijenili smo dimenzionalnost ulaznog sloja kako bismo mogli raditi sa slikama u sivim tonovima. </w:t>
+      </w:r>
+      <w:r>
+        <w:t>ResNet modeli tipično imaju između 18 i 152 sloja, a mi smo odabrali onaj sa 18 slojeva. S obzirom</w:t>
+      </w:r>
+      <w:r>
+        <w:t xml:space="preserve"> na to</w:t>
+      </w:r>
+      <w:r>
+        <w:t xml:space="preserve"> da model </w:t>
+      </w:r>
+      <w:r>
+        <w:t>želimo</w:t>
+      </w:r>
+      <w:r>
+        <w:t xml:space="preserve"> samo prilagoditi našim podacima, </w:t>
+      </w:r>
+      <w:r>
+        <w:t xml:space="preserve">nije potrebno mijenjati sve parametre, već samo prilagoditi potpuno povezani sloj. </w:t>
+      </w:r>
+      <w:r>
+        <w:t>Kao i za prethodna dva modela, optimizacija modela je odrađena pomoću algoritma 'Adam', a uspješnost klasifikacije funkcijom 'accuracy_score'.</w:t>
+      </w:r>
+      <w:r>
+        <w:t xml:space="preserve"> Ovaj model treniran je kroz 10 epoha, za razliku od drugih modela koji su trenirani kroz 20 epoha, stoga što su težine za veći dio modela unaprijed određene, te nije potrebno puno vremena da on konvergira.</w:t>
+      </w:r>
+    </w:p>
+    <w:p>
+      <w:pPr>
+        <w:jc w:val="start"/>
+      </w:pPr>
+    </w:p>
+    <w:p>
+      <w:pPr>
+        <w:pStyle w:val="Heading1"/>
+      </w:pPr>
+      <w:r>
+        <w:t>Opis eksperimentalnih rezultata</w:t>
+      </w:r>
+    </w:p>
+    <w:p>
+      <w:pPr>
+        <w:ind w:firstLine="36pt"/>
+        <w:jc w:val="both"/>
+      </w:pPr>
+      <w:r>
+        <w:t xml:space="preserve">Podaci za učenje su sadržavali oko 80% podataka iz korištenog skupa, a preostalih 20% je bilo korišteno za provjeru. </w:t>
+      </w:r>
+    </w:p>
+    <w:p>
+      <w:pPr>
+        <w:ind w:firstLine="36pt"/>
+        <w:jc w:val="both"/>
+      </w:pPr>
+      <w:r>
+        <w:t xml:space="preserve">Prvi korišteni model je bio konvolucijska neuronska mreža, tj. CNN koju smo samostalni definirali u svome kodu. </w:t>
+      </w:r>
+      <w:r>
+        <w:t>Kroz 20 epoha treniranja, model je neznatno smanjio gubitak i povećao točnost na skupu za treniranje, dok je trend gubitka i točnosti na neviđenim podacima bio obrnut. Nakon treniranja modela, uslijedila je evaluacija pomoću ponderiranog prosječnog F1 score-a te matrice zabune. Ponderirani prosječni F1 score smo koristili zbog njegove otpornosti na manjak ravnoteže među klasama u našem skupu podataka. Njegova vrijednost od 0.58 nam ukazuje na to da model nije loš, ali da nije posebno učinkovit zbog čega možemo pretpostaviti da postoji pro</w:t>
+      </w:r>
+      <w:r>
+        <w:t>s</w:t>
+      </w:r>
+      <w:r>
+        <w:t>tor za poboljšanja</w:t>
+      </w:r>
+      <w:r>
+        <w:t>. Kod prikaza matrice zabune</w:t>
+      </w:r>
+      <w:commentRangeStart w:id="3"/>
+      <w:r>
+        <w:t xml:space="preserve"> </w:t>
+      </w:r>
+      <w:commentRangeEnd w:id="3"/>
+      <w:r>
+        <w:rPr>
+          <w:rStyle w:val="CommentReference"/>
+        </w:rPr>
+        <w:commentReference w:id="3"/>
+      </w:r>
+      <w:r>
+        <w:t>je vidljivo kako model ima neželjenu pogrešku kod klasificiranja jer ima tendenciju klasificirati maligne uzorke kao benigne što je puno opasnije od obrnutog slučaja gdje nešto benigno klasificiramo kao maligno.</w:t>
+      </w:r>
+    </w:p>
+    <w:p>
+      <w:pPr>
+        <w:ind w:firstLine="36pt"/>
+        <w:jc w:val="both"/>
+      </w:pPr>
+      <w:r>
+        <w:rPr>
+          <w:noProof/>
+        </w:rPr>
+        <w:drawing>
+          <wp:anchor distT="0" distB="0" distL="114300" distR="114300" simplePos="0" relativeHeight="251662848" behindDoc="1" locked="0" layoutInCell="1" allowOverlap="1" wp14:anchorId="228D5C6D" wp14:editId="1772012C">
+            <wp:simplePos x="0" y="0"/>
+            <wp:positionH relativeFrom="margin">
+              <wp:posOffset>3515947</wp:posOffset>
+            </wp:positionH>
+            <wp:positionV relativeFrom="paragraph">
+              <wp:posOffset>153500</wp:posOffset>
+            </wp:positionV>
+            <wp:extent cx="2571115" cy="2211705"/>
+            <wp:effectExtent l="0" t="0" r="635" b="0"/>
+            <wp:wrapTight wrapText="bothSides">
+              <wp:wrapPolygon edited="0">
+                <wp:start x="0" y="0"/>
+                <wp:lineTo x="0" y="21395"/>
+                <wp:lineTo x="21445" y="21395"/>
+                <wp:lineTo x="21445" y="0"/>
+                <wp:lineTo x="0" y="0"/>
+              </wp:wrapPolygon>
+            </wp:wrapTight>
+            <wp:docPr id="176804077" name="Picture 1" descr="A diagram of a confusion matrix&#10;&#10;Description automatically generated"/>
+            <wp:cNvGraphicFramePr>
+              <a:graphicFrameLocks xmlns:a="http://purl.oclc.org/ooxml/drawingml/main" noChangeAspect="1"/>
+            </wp:cNvGraphicFramePr>
+            <a:graphic xmlns:a="http://purl.oclc.org/ooxml/drawingml/main">
+              <a:graphicData uri="http://purl.oclc.org/ooxml/drawingml/picture">
+                <pic:pic xmlns:pic="http://purl.oclc.org/ooxml/drawingml/picture">
+                  <pic:nvPicPr>
+                    <pic:cNvPr id="176804077" name="Picture 1" descr="A diagram of a confusion matrix&#10;&#10;Description automatically generated"/>
+                    <pic:cNvPicPr>
+                      <a:picLocks noChangeAspect="1" noChangeArrowheads="1"/>
+                    </pic:cNvPicPr>
+                  </pic:nvPicPr>
+                  <pic:blipFill>
+                    <a:blip r:embed="rId18" cstate="print">
+                      <a:extLst>
+                        <a:ext uri="{28A0092B-C50C-407E-A947-70E740481C1C}">
+                          <a14:useLocalDpi xmlns:a14="http://schemas.microsoft.com/office/drawing/2010/main" val="0"/>
+                        </a:ext>
+                      </a:extLst>
+                    </a:blip>
+                    <a:srcRect/>
+                    <a:stretch>
+                      <a:fillRect/>
+                    </a:stretch>
+                  </pic:blipFill>
+                  <pic:spPr bwMode="auto">
+                    <a:xfrm>
+                      <a:off x="0" y="0"/>
+                      <a:ext cx="2571115" cy="2211705"/>
+                    </a:xfrm>
+                    <a:prstGeom prst="rect">
+                      <a:avLst/>
+                    </a:prstGeom>
+                    <a:noFill/>
+                    <a:ln>
+                      <a:noFill/>
+                    </a:ln>
+                  </pic:spPr>
+                </pic:pic>
+              </a:graphicData>
+            </a:graphic>
+            <wp14:sizeRelH relativeFrom="margin">
+              <wp14:pctWidth>0%</wp14:pctWidth>
+            </wp14:sizeRelH>
+            <wp14:sizeRelV relativeFrom="margin">
+              <wp14:pctHeight>0%</wp14:pctHeight>
+            </wp14:sizeRelV>
+          </wp:anchor>
+        </w:drawing>
+      </w:r>
+    </w:p>
+    <w:p>
+      <w:pPr>
+        <w:ind w:firstLine="36pt"/>
+        <w:jc w:val="both"/>
+      </w:pPr>
+      <w:r>
+        <w:lastRenderedPageBreak/>
+        <w:t>U idućem koraku smo odlučili koristiti prethodno trenirane modele, točnije ResNet. S tim smo modelom pokušali poboljšati točnost i generalne performanse. Model je imao 10 epoha treniranja, kroz koje mu točnost klasifikacije nije prelazila 50%</w:t>
+      </w:r>
+      <w:r>
+        <w:t>, a gubitak je konstano bio veći od 90%</w:t>
+      </w:r>
+      <w:r>
+        <w:t>.  Kako se radi o modelu koji je robustan, logična pretpostavka je da</w:t>
+      </w:r>
+      <w:r>
+        <w:t xml:space="preserve"> je</w:t>
+      </w:r>
+      <w:r>
+        <w:t xml:space="preserve"> </w:t>
+      </w:r>
+      <w:r>
+        <w:t>kvaliteta klasifikacije u ovom slučaju narušena ne nužno zbog modela, već zbog skupa podataka ili njihove pripreme.</w:t>
+      </w:r>
+      <w:r>
+        <w:t xml:space="preserve"> S obzirom da je priroda problema nejednoznačno određena, skup podataka s kojim raspolažemo nije dostatan za adekvatno treniranje neuronskih mreža.</w:t>
+      </w:r>
+      <w:r>
+        <w:t xml:space="preserve"> </w:t>
+      </w:r>
+    </w:p>
+    <w:p>
+      <w:pPr>
+        <w:ind w:firstLine="36pt"/>
+        <w:jc w:val="both"/>
+      </w:pPr>
+      <w:r>
+        <w:t>Krajnja ideja je bila probati stvoriti jednostavniji model kako bismo smanjili mogućnost prenaučenosti. Ovaj model smo samostalno definirali kao i prvi spomenuti model u ovom poglavlju. Također smo ga trenirali kroz 20 epoha, no bez obzira na manju složenost modela, nismo uspjeli dobiti točnost veću od 60% i gubitak manji od 80%.</w:t>
+      </w:r>
+    </w:p>
+    <w:p>
+      <w:pPr>
+        <w:jc w:val="start"/>
+      </w:pPr>
+    </w:p>
+    <w:p>
+      <w:pPr>
+        <w:pStyle w:val="Heading1"/>
+      </w:pPr>
+      <w:r>
+        <w:t>USporedba eksperimentalnih rezultata s rezultatima prethodnih radova</w:t>
       </w:r>
     </w:p>
     <w:p>
       <w:pPr>
         <w:ind w:firstLine="36pt"/>
         <w:jc w:val="start"/>
-        <w:rPr>
-          <w:lang w:val="hr-HR"/>
-        </w:rPr>
-      </w:pPr>
-      <w:r>
-        <w:rPr>
-          <w:lang w:val="hr-HR"/>
-        </w:rPr>
-        <w:t xml:space="preserve">Za implementaciju neuronskih mreža, korištena je biblioteka PyTorch </w:t>
-      </w:r>
-      <w:r>
-        <w:rPr>
-          <w:lang w:val="hr-HR"/>
-        </w:rPr>
-        <w:t xml:space="preserve">zato </w:t>
-      </w:r>
-      <w:r>
-        <w:rPr>
-          <w:lang w:val="hr-HR"/>
-        </w:rPr>
-        <w:t>što omogućuje jednostavnu implementaciju prilagođenih modela, kao i integraciju unaprijed istreniranih modela. Osim toga, ova biblioteka sadrži alate za augmentaciju i normalizaciju slika te olakšava prijenos modela i podataka između CPU-a i GPU-a čime ubrzavamo trening.</w:t>
+      </w:pPr>
+      <w:r>
+        <w:t xml:space="preserve">Ovaj dataset je bio korišten u nekoliko ranijih radova. Rad s </w:t>
+      </w:r>
+      <w:r>
+        <w:t xml:space="preserve">jednom od boljih </w:t>
+      </w:r>
+      <w:r>
+        <w:t xml:space="preserve"> klasifikacij</w:t>
+      </w:r>
+      <w:r>
+        <w:t>a</w:t>
+      </w:r>
+      <w:r>
+        <w:t xml:space="preserve"> je na ovom skupu podataka uspio postići točnost od 85,13% AUC od 0,9344 koristeći 5-fold cross validation, s točnošću od 85,13% na točki jednakih pogrešaka ROC krivulje.</w:t>
+      </w:r>
+      <w:r>
+        <w:t xml:space="preserve"> [6]</w:t>
       </w:r>
     </w:p>
     <w:p>
       <w:pPr>
         <w:ind w:firstLine="36pt"/>
         <w:jc w:val="start"/>
-        <w:rPr>
-          <w:lang w:val="hr-HR"/>
-        </w:rPr>
-      </w:pPr>
-      <w:r>
-        <w:rPr>
-          <w:lang w:val="hr-HR"/>
-        </w:rPr>
-        <w:t>Učitavanje podataka odrađeno je pomoću prilagođene klase BreastCancerDataset koja nam omogućuje učitavanje i transformaciju slike te povezivanje s pripadajućom klasifikacijom. Podaci su učitani iz CSV datoteka 'train_data' i 'test_data'</w:t>
-      </w:r>
-      <w:r>
-        <w:rPr>
-          <w:lang w:val="hr-HR"/>
-        </w:rPr>
-        <w:t xml:space="preserve"> pomoću biblioteke pandas, a klasifikacija je ručno tranformirana u brojčane vrijednosti unutar klase.</w:t>
-      </w:r>
-    </w:p>
-    <w:p>
-      <w:pPr>
-        <w:ind w:firstLine="36pt"/>
+      </w:pPr>
+      <w:r>
+        <w:t>Drugi rad s odličnim rezultatima je postigao točnost od 91,5%. [7]</w:t>
+      </w:r>
+    </w:p>
+    <w:p>
+      <w:pPr>
         <w:jc w:val="start"/>
-        <w:rPr>
-          <w:lang w:val="hr-HR"/>
-        </w:rPr>
-      </w:pPr>
-      <w:r>
-        <w:rPr>
-          <w:lang w:val="hr-HR"/>
-        </w:rPr>
-        <w:t>Cilj istraživanja bio je usporediti dva pristupa: treniranje modela od nule i korištenje unaprijed istreniranih modela, poput ResNet-a, istreniranih na skupu podataka ImageNet.</w:t>
-      </w:r>
-      <w:r>
-        <w:rPr>
-          <w:lang w:val="hr-HR"/>
-        </w:rPr>
-        <w:t xml:space="preserve"> </w:t>
-      </w:r>
-      <w:r>
-        <w:rPr>
-          <w:lang w:val="hr-HR"/>
-        </w:rPr>
-        <w:t xml:space="preserve">Klasa CNN definira model kojeg ćemo trenirati od nule. Model je definiran pomoću biblioteke 'torch.nn', a </w:t>
-      </w:r>
-      <w:r>
-        <w:rPr>
-          <w:lang w:val="hr-HR"/>
-        </w:rPr>
-        <w:t xml:space="preserve">sastoji se od </w:t>
-      </w:r>
-      <w:r>
-        <w:rPr>
-          <w:lang w:val="hr-HR"/>
-        </w:rPr>
-        <w:t xml:space="preserve">dva bloka konvolucijskih slojeva. </w:t>
-      </w:r>
-      <w:r>
-        <w:rPr>
-          <w:lang w:val="hr-HR"/>
-        </w:rPr>
-        <w:t xml:space="preserve">Blokovi se sastoje od dva konvolucijska sloja </w:t>
-      </w:r>
-      <w:r>
-        <w:rPr>
-          <w:lang w:val="hr-HR"/>
-        </w:rPr>
-        <w:t>te dva sloja za normalizaciju</w:t>
-      </w:r>
-      <w:r>
-        <w:rPr>
-          <w:lang w:val="hr-HR"/>
-        </w:rPr>
-        <w:t>.</w:t>
-      </w:r>
-      <w:r>
-        <w:rPr>
-          <w:lang w:val="hr-HR"/>
-        </w:rPr>
-        <w:t xml:space="preserve"> Kao aktivacijska funkcija za sve slojeve korištena je 'LeakyReLu' aktivacijska funkcija. </w:t>
-      </w:r>
-      <w:r>
-        <w:rPr>
-          <w:lang w:val="hr-HR"/>
-        </w:rPr>
-        <w:t xml:space="preserve">Nakon svakog bloka, implementirani su </w:t>
-      </w:r>
-      <w:r>
-        <w:rPr>
-          <w:lang w:val="hr-HR"/>
-        </w:rPr>
-        <w:t>slojev</w:t>
-      </w:r>
-      <w:r>
-        <w:rPr>
-          <w:lang w:val="hr-HR"/>
-        </w:rPr>
-        <w:t>i</w:t>
-      </w:r>
-      <w:r>
-        <w:rPr>
-          <w:lang w:val="hr-HR"/>
-        </w:rPr>
-        <w:t xml:space="preserve"> za smanjenje dimenzionalnosti</w:t>
-      </w:r>
-      <w:r>
-        <w:rPr>
-          <w:lang w:val="hr-HR"/>
-        </w:rPr>
-        <w:t xml:space="preserve"> ('MaxPool') dimenzija 2x2</w:t>
-      </w:r>
-      <w:r>
-        <w:rPr>
-          <w:lang w:val="hr-HR"/>
-        </w:rPr>
-        <w:t>, kao i slojevi 'Dropout' za regularizaciju modela</w:t>
-      </w:r>
-      <w:r>
-        <w:rPr>
-          <w:lang w:val="hr-HR"/>
-        </w:rPr>
-        <w:t>.</w:t>
-      </w:r>
-      <w:r>
-        <w:rPr>
-          <w:lang w:val="hr-HR"/>
-        </w:rPr>
-        <w:t xml:space="preserve"> </w:t>
-      </w:r>
-      <w:r>
-        <w:rPr>
-          <w:lang w:val="hr-HR"/>
-        </w:rPr>
-        <w:t xml:space="preserve">Kako bismo omogućili mapiranje na izlazne klase, izlazi iz konvolucijskih slojeva su </w:t>
-      </w:r>
-      <w:r>
-        <w:rPr>
-          <w:lang w:val="hr-HR"/>
-        </w:rPr>
-        <w:t>izravnati u jednodimenzionalni tenzor te proslijeđeni kroz dva potpuno povezana sloja</w:t>
-      </w:r>
-      <w:r>
-        <w:rPr>
-          <w:lang w:val="hr-HR"/>
-        </w:rPr>
-        <w:t>, čiji konačni izlaz odgovara broju klasa (u našem slučaju tri)</w:t>
-      </w:r>
-      <w:r>
-        <w:rPr>
-          <w:lang w:val="hr-HR"/>
-        </w:rPr>
-        <w:t>.</w:t>
-      </w:r>
-      <w:r>
-        <w:rPr>
-          <w:lang w:val="hr-HR"/>
-        </w:rPr>
-        <w:t xml:space="preserve"> Osim ovog modela, napravljen je i jednostavniji model 'SimpleCNN', kako bismo pokušali spriječiti prenaučenost modela. </w:t>
-      </w:r>
-      <w:r>
-        <w:rPr>
-          <w:lang w:val="hr-HR"/>
-        </w:rPr>
-        <w:t>Ovaj jednostavniji model je</w:t>
-      </w:r>
-      <w:r>
-        <w:rPr>
-          <w:lang w:val="hr-HR"/>
-        </w:rPr>
-        <w:t xml:space="preserve"> građen od 4 konvolucijska sloja, a</w:t>
-      </w:r>
-      <w:r>
-        <w:rPr>
-          <w:lang w:val="hr-HR"/>
-        </w:rPr>
-        <w:t xml:space="preserve"> kao ulaz prima slike dimenzija 32x32</w:t>
-      </w:r>
-      <w:r>
-        <w:rPr>
-          <w:lang w:val="hr-HR"/>
-        </w:rPr>
-        <w:t>.</w:t>
-      </w:r>
-      <w:r>
-        <w:rPr>
-          <w:lang w:val="hr-HR"/>
-        </w:rPr>
-        <w:t xml:space="preserve"> </w:t>
-      </w:r>
-      <w:r>
-        <w:rPr>
-          <w:lang w:val="hr-HR"/>
-        </w:rPr>
-        <w:t>Optimizacija modela obavljala se pomoću algoritma `Adam`, uz definiranu stopu učenja i regularizaciju</w:t>
-      </w:r>
-      <w:r>
-        <w:rPr>
-          <w:lang w:val="hr-HR"/>
-        </w:rPr>
-        <w:t xml:space="preserve">. Uz to, kompleksniji model koristi </w:t>
-      </w:r>
-      <w:r>
-        <w:rPr>
-          <w:lang w:val="hr-HR"/>
-        </w:rPr>
-        <w:t xml:space="preserve">funkciju ReduceLROnPlateau kako bi se izbjegla stagnacija </w:t>
-      </w:r>
-      <w:r>
-        <w:rPr>
-          <w:lang w:val="hr-HR"/>
-        </w:rPr>
-        <w:t>tijekom treniranja modela</w:t>
-      </w:r>
-      <w:r>
-        <w:rPr>
-          <w:lang w:val="hr-HR"/>
-        </w:rPr>
-        <w:t xml:space="preserve">. Gubitak </w:t>
-      </w:r>
-      <w:r>
-        <w:rPr>
-          <w:lang w:val="hr-HR"/>
-        </w:rPr>
-        <w:t xml:space="preserve">se računao </w:t>
-      </w:r>
-      <w:r>
-        <w:rPr>
-          <w:lang w:val="hr-HR"/>
-        </w:rPr>
-        <w:t>korištenjem funkcije `CrossEntropyLoss`</w:t>
-      </w:r>
-      <w:r>
-        <w:rPr>
-          <w:lang w:val="hr-HR"/>
-        </w:rPr>
-        <w:t xml:space="preserve">, dok </w:t>
-      </w:r>
-      <w:r>
-        <w:rPr>
-          <w:lang w:val="hr-HR"/>
-        </w:rPr>
-        <w:t>je</w:t>
-      </w:r>
-      <w:r>
-        <w:rPr>
-          <w:lang w:val="hr-HR"/>
-        </w:rPr>
-        <w:t xml:space="preserve"> za procjen</w:t>
-      </w:r>
-      <w:r>
-        <w:rPr>
-          <w:lang w:val="hr-HR"/>
-        </w:rPr>
-        <w:t>u</w:t>
-      </w:r>
-      <w:r>
-        <w:rPr>
-          <w:lang w:val="hr-HR"/>
-        </w:rPr>
-        <w:t xml:space="preserve"> uspješnosti modela prilikom treninga i validacije korišten</w:t>
-      </w:r>
-      <w:r>
-        <w:rPr>
-          <w:lang w:val="hr-HR"/>
-        </w:rPr>
-        <w:t xml:space="preserve">a funkcija </w:t>
-      </w:r>
-      <w:bookmarkStart w:id="0" w:name="_Hlk187833879"/>
-      <w:r>
-        <w:rPr>
-          <w:lang w:val="hr-HR"/>
-        </w:rPr>
-        <w:t>'accuracy</w:t>
-      </w:r>
-      <w:bookmarkStart w:id="1" w:name="_Hlk187833837"/>
-      <w:r>
-        <w:rPr>
-          <w:lang w:val="hr-HR"/>
-        </w:rPr>
-        <w:t>_</w:t>
-      </w:r>
-      <w:bookmarkEnd w:id="1"/>
-      <w:r>
-        <w:rPr>
-          <w:lang w:val="hr-HR"/>
-        </w:rPr>
-        <w:t>score'</w:t>
-      </w:r>
-      <w:bookmarkEnd w:id="0"/>
-      <w:r>
-        <w:rPr>
-          <w:lang w:val="hr-HR"/>
-        </w:rPr>
-        <w:t>.</w:t>
-      </w:r>
-    </w:p>
-    <w:p>
-      <w:pPr>
-        <w:jc w:val="start"/>
-        <w:rPr>
-          <w:lang w:val="hr-HR"/>
-        </w:rPr>
-      </w:pPr>
-      <w:r>
-        <w:rPr>
-          <w:lang w:val="hr-HR"/>
-        </w:rPr>
-        <w:t xml:space="preserve">Drugi pristup se oslanjao na korištenje </w:t>
-      </w:r>
-      <w:commentRangeStart w:id="2"/>
-      <w:r>
-        <w:rPr>
-          <w:lang w:val="hr-HR"/>
-        </w:rPr>
-        <w:t xml:space="preserve">predtreniranih </w:t>
-      </w:r>
-      <w:commentRangeEnd w:id="2"/>
-      <w:r>
-        <w:rPr>
-          <w:rStyle w:val="CommentReference"/>
-        </w:rPr>
-        <w:commentReference w:id="2"/>
-      </w:r>
-      <w:r>
-        <w:rPr>
-          <w:lang w:val="hr-HR"/>
-        </w:rPr>
-        <w:t xml:space="preserve">modela. Odlučili smo implementirati model 'ResNet' koji je dostupan unutar biblioteke PyTorch. Model je treniran na skupu slika ImageNet, što osigurava da model ima sposobnost prepoznavanja složenih značajki u slikama. </w:t>
-      </w:r>
-      <w:r>
-        <w:rPr>
-          <w:lang w:val="hr-HR"/>
-        </w:rPr>
-        <w:t xml:space="preserve">RezNet kao ulaz prima RGB slike dimenzija 224x224, u skladu s čime smo prilagodili dimenzije našeg skupa podataka te normalizirali transformaciju. Osim toga, promijenili smo dimenzionalnost ulaznog sloja kako bismo mogli raditi sa slikama u sivim tonovima. </w:t>
-      </w:r>
-      <w:r>
-        <w:rPr>
-          <w:lang w:val="hr-HR"/>
-        </w:rPr>
-        <w:t>ResNet modeli tipično imaju između 18 i 152 sloja, a mi smo odabrali onaj sa 18 slojeva. S obzirom</w:t>
-      </w:r>
-      <w:r>
-        <w:rPr>
-          <w:lang w:val="hr-HR"/>
-        </w:rPr>
-        <w:t xml:space="preserve"> na to</w:t>
-      </w:r>
-      <w:r>
-        <w:rPr>
-          <w:lang w:val="hr-HR"/>
-        </w:rPr>
-        <w:t xml:space="preserve"> da model </w:t>
-      </w:r>
-      <w:r>
-        <w:rPr>
-          <w:lang w:val="hr-HR"/>
-        </w:rPr>
-        <w:t>želimo</w:t>
-      </w:r>
-      <w:r>
-        <w:rPr>
-          <w:lang w:val="hr-HR"/>
-        </w:rPr>
-        <w:t xml:space="preserve"> samo prilagoditi našim podacima, </w:t>
-      </w:r>
-      <w:r>
-        <w:rPr>
-          <w:lang w:val="hr-HR"/>
-        </w:rPr>
-        <w:t xml:space="preserve">nije potrebno mijenjati sve parametre, već samo prilagoditi potpuno povezani sloj. </w:t>
-      </w:r>
-      <w:r>
-        <w:rPr>
-          <w:lang w:val="hr-HR"/>
-        </w:rPr>
-        <w:t xml:space="preserve">Kao i za prethodna dva modela, optimizacija modela je odrađena pomoću algoritma 'Adam', a uspješnost klasifikacije funkcijom </w:t>
-      </w:r>
-      <w:r>
-        <w:rPr>
-          <w:lang w:val="hr-HR"/>
-        </w:rPr>
-        <w:t>'accuracy_score'</w:t>
-      </w:r>
-      <w:r>
-        <w:rPr>
-          <w:lang w:val="hr-HR"/>
-        </w:rPr>
-        <w:t>.</w:t>
-      </w:r>
-      <w:r>
-        <w:rPr>
-          <w:lang w:val="hr-HR"/>
-        </w:rPr>
-        <w:t xml:space="preserve"> Ovaj model treniran je kroz 10 epoha, za razliku od drugih modela koji su trenirani kroz 20 epoha, stoga što su težine za veći dio modela unaprijed određene, te nije potrebno puno vremena da on konvergira.</w:t>
-      </w:r>
-    </w:p>
-    <w:p>
-      <w:pPr>
-        <w:jc w:val="start"/>
-        <w:rPr>
-          <w:lang w:val="hr-HR"/>
-        </w:rPr>
       </w:pPr>
     </w:p>
     <w:p>
       <w:pPr>
         <w:pStyle w:val="Heading1"/>
-        <w:rPr>
-          <w:lang w:val="hr-HR"/>
-        </w:rPr>
-      </w:pPr>
-      <w:r>
-        <w:rPr>
-          <w:lang w:val="hr-HR"/>
-        </w:rPr>
-        <w:t>Opis eksperimentalnih rezultata</w:t>
-      </w:r>
-    </w:p>
-    <w:p>
-      <w:pPr>
-        <w:ind w:firstLine="36pt"/>
-        <w:jc w:val="start"/>
-        <w:rPr>
-          <w:lang w:val="hr-HR"/>
-        </w:rPr>
-      </w:pPr>
-      <w:r>
-        <w:rPr>
-          <w:lang w:val="hr-HR"/>
-        </w:rPr>
-        <w:t xml:space="preserve">Podaci za učenje su sadržavali oko 80% podataka iz korištenog skupa, a preostalih 20% je bilo korišteno za provjeru. </w:t>
-      </w:r>
-    </w:p>
-    <w:p>
-      <w:pPr>
-        <w:ind w:firstLine="36pt"/>
-        <w:jc w:val="start"/>
-      </w:pPr>
-      <w:r>
-        <w:rPr>
-          <w:lang w:val="hr-HR"/>
-        </w:rPr>
-        <w:t xml:space="preserve">Prvi korišteni model je bio konvolucijska neuronska mreža, tj. CNN koju smo samostalni definirali u svome kodu. </w:t>
-      </w:r>
-      <w:r>
-        <w:rPr>
-          <w:lang w:val="hr-HR"/>
-        </w:rPr>
-        <w:t xml:space="preserve">Kroz 20 epoha treniranja, model je neznatno smanjio gubitak i povećao točnost na skupu za treniranje, dok je trend gubitka i točnosti na neviđenim podacima bio obrnut. Nakon treniranja modela, uslijedila je evaluacija pomoću ponderiranog prosječnog F1 score-a te matrice zabune. Ponderirani prosječni F1 score smo koristili zbog njegove otpornosti na manjak ravnoteže među klasama u našem skupu podataka. Njegova vrijednost od </w:t>
-      </w:r>
-      <w:r>
-        <w:t>0.5</w:t>
-      </w:r>
-      <w:r>
-        <w:t>8 nam ukazuje na to da model nije loš, ali da nije posebno učinkovit zbog čega možemo pretpostaviti da postoji pro</w:t>
-      </w:r>
-      <w:r>
-        <w:t>s</w:t>
-      </w:r>
-      <w:r>
-        <w:t>tor za poboljšanja</w:t>
-      </w:r>
-      <w:r>
-        <w:t>. Kod prikaza matrice zabune</w:t>
-      </w:r>
-      <w:commentRangeStart w:id="3"/>
-      <w:r>
-        <w:t xml:space="preserve"> </w:t>
-      </w:r>
-      <w:commentRangeEnd w:id="3"/>
-      <w:r>
-        <w:rPr>
-          <w:rStyle w:val="CommentReference"/>
-        </w:rPr>
-        <w:commentReference w:id="3"/>
-      </w:r>
-      <w:r>
-        <w:t>je vidljivo kako model ima neželjenu pogrešku kod klasificiranja jer ima tendenciju klasificirati maligne uzorke kao benigne što je puno opasnije od obrnutog slučaja gdje nešto benigno klasificiramo kao maligno.</w:t>
-      </w:r>
-    </w:p>
-    <w:p>
-      <w:pPr>
-        <w:ind w:firstLine="36pt"/>
-        <w:jc w:val="start"/>
-      </w:pPr>
-      <w:r>
-        <w:t>U idućem koraku smo odlučili koristiti prethodno trenirane modele, točnije ResNet. S tim smo modelom pokušali poboljšati točnost i generalne performanse. Model je imao 10 epoha treniranja, kroz koje mu točnost klasifikacije nije prelazila 50%</w:t>
-      </w:r>
-      <w:r>
-        <w:t>, a gubitak je konstano bio veći od 90%</w:t>
-      </w:r>
-      <w:r>
-        <w:t>.  Kako se radi o modelu koji je robustan, logična pretpostavka je da</w:t>
-      </w:r>
-      <w:r>
-        <w:t xml:space="preserve"> je</w:t>
-      </w:r>
-      <w:r>
-        <w:t xml:space="preserve"> </w:t>
-      </w:r>
-      <w:r>
-        <w:t xml:space="preserve">kvaliteta klasifikacije u ovom slučaju narušena ne nužno zbog modela, već zbog skupa podataka ili njihove pripreme. </w:t>
-      </w:r>
-    </w:p>
-    <w:p>
-      <w:pPr>
-        <w:ind w:firstLine="36pt"/>
-        <w:jc w:val="start"/>
-        <w:rPr>
-          <w:lang w:val="hr-HR"/>
-        </w:rPr>
-      </w:pPr>
-      <w:r>
-        <w:t>Krajnja ideja je bila probati stvoriti jednostavniji model kako bismo smanjili mogućnost prenaučenosti. Ovaj model smo samostalno definirali kao i prvi spomenuti model u ovom poglavlju. Također smo ga trenirali kroz 20 epoha, no bez obzira na manju složenost modela, nismo uspjeli dobiti točnost veću od 60% i gubitak manji od 80%.</w:t>
-      </w:r>
-    </w:p>
-    <w:p>
-      <w:pPr>
-        <w:jc w:val="start"/>
-        <w:rPr>
-          <w:lang w:val="hr-HR"/>
-        </w:rPr>
-      </w:pPr>
-    </w:p>
-    <w:p>
-      <w:pPr>
-        <w:pStyle w:val="Heading1"/>
-        <w:rPr>
-          <w:lang w:val="hr-HR"/>
-        </w:rPr>
-      </w:pPr>
-      <w:r>
-        <w:rPr>
-          <w:lang w:val="hr-HR"/>
-        </w:rPr>
-        <w:t>USporedba eksperimentalnih rezultata s rezultatima prethodnih radova</w:t>
-      </w:r>
-    </w:p>
-    <w:p>
-      <w:pPr>
-        <w:ind w:firstLine="36pt"/>
-        <w:jc w:val="start"/>
-        <w:rPr>
-          <w:lang w:val="hr-HR"/>
-        </w:rPr>
-      </w:pPr>
-      <w:r>
-        <w:rPr>
-          <w:lang w:val="hr-HR"/>
-        </w:rPr>
-        <w:t xml:space="preserve">Ovaj dataset je bio korišten u nekoliko ranijih radova. Rad s </w:t>
-      </w:r>
-      <w:r>
-        <w:rPr>
-          <w:lang w:val="hr-HR"/>
-        </w:rPr>
-        <w:t xml:space="preserve">jednom od boljih </w:t>
-      </w:r>
-      <w:r>
-        <w:rPr>
-          <w:lang w:val="hr-HR"/>
-        </w:rPr>
-        <w:t xml:space="preserve"> klasifikacij</w:t>
-      </w:r>
-      <w:r>
-        <w:rPr>
-          <w:lang w:val="hr-HR"/>
-        </w:rPr>
-        <w:t>a</w:t>
-      </w:r>
-      <w:r>
-        <w:rPr>
-          <w:lang w:val="hr-HR"/>
-        </w:rPr>
-        <w:t xml:space="preserve"> je na ovom skupu podataka uspio postići točnost od 85,13% </w:t>
-      </w:r>
-      <w:r>
-        <w:t>AUC od 0,9344 koristeći 5-fold cross validation, s točnošću od 85,13% na točki jednakih pogrešaka ROC krivulje</w:t>
-      </w:r>
-      <w:r>
-        <w:t>.</w:t>
-      </w:r>
-      <w:r>
-        <w:t xml:space="preserve"> [6]</w:t>
-      </w:r>
-    </w:p>
-    <w:p>
-      <w:pPr>
-        <w:ind w:firstLine="36pt"/>
-        <w:jc w:val="start"/>
-        <w:rPr>
-          <w:lang w:val="hr-HR"/>
-        </w:rPr>
-      </w:pPr>
-      <w:r>
-        <w:rPr>
-          <w:lang w:val="hr-HR"/>
-        </w:rPr>
-        <w:t>Drugi rad s odličnim rezultatima je postigao točnost od 91,5%. [7]</w:t>
-      </w:r>
-    </w:p>
-    <w:p>
-      <w:pPr>
-        <w:jc w:val="start"/>
-        <w:rPr>
-          <w:lang w:val="hr-HR"/>
-        </w:rPr>
-      </w:pPr>
-    </w:p>
-    <w:p>
-      <w:pPr>
-        <w:pStyle w:val="Heading1"/>
-        <w:rPr>
-          <w:lang w:val="hr-HR"/>
-        </w:rPr>
-      </w:pPr>
-      <w:r>
-        <w:rPr>
-          <w:lang w:val="hr-HR"/>
-        </w:rPr>
+      </w:pPr>
+      <w:r>
         <w:t>Zaključak</w:t>
       </w:r>
     </w:p>
@@ -2030,24 +1757,9 @@
       <w:pPr>
         <w:ind w:firstLine="40.50pt"/>
         <w:jc w:val="start"/>
-        <w:rPr>
-          <w:lang w:val="hr-HR"/>
-        </w:rPr>
-      </w:pPr>
-      <w:r>
-        <w:rPr>
-          <w:lang w:val="hr-HR"/>
-        </w:rPr>
-        <w:t xml:space="preserve">Modeli koje smo trenirali i testirali na </w:t>
-      </w:r>
-      <w:r>
-        <w:t>CBIS-DDSM: Breast Cancer Image Dataset</w:t>
-      </w:r>
-      <w:r>
-        <w:t xml:space="preserve">u nažalost nisu uspjeli postići željenu točnost pri klasificiranju snimki. </w:t>
-      </w:r>
-      <w:r>
-        <w:t>Naši rezultati se ne mogu mjeriti s rezultatima znanstvenika koji su u ovom području stručni</w:t>
+      </w:pPr>
+      <w:r>
+        <w:t>Modeli koje smo trenirali i testirali na CBIS-DDSM: Breast Cancer Image Datasetu nažalost nisu uspjeli postići željenu točnost pri klasificiranju snimki. Naši rezultati se ne mogu mjeriti s rezultatima znanstvenika koji su u ovom području stručni</w:t>
       </w:r>
       <w:r>
         <w:t xml:space="preserve"> i koriste složenije arhitekture te naprednije tehnike treniranja</w:t>
@@ -2071,9 +1783,6 @@
     <w:p>
       <w:pPr>
         <w:jc w:val="start"/>
-        <w:rPr>
-          <w:lang w:val="hr-HR"/>
-        </w:rPr>
       </w:pPr>
     </w:p>
     <w:p>
@@ -2087,8 +1796,14 @@
     <w:p>
       <w:pPr>
         <w:pStyle w:val="BodyText"/>
-      </w:pPr>
-      <w:r>
+        <w:rPr>
+          <w:lang w:val="hr-HR"/>
+        </w:rPr>
+      </w:pPr>
+      <w:r>
+        <w:rPr>
+          <w:lang w:val="hr-HR"/>
+        </w:rPr>
         <w:t>The equations are an exception to the prescribed specifications of this template. You will need to determine whether or not your equation should be typed using either the Times New Roman or the Symbol font (please no other font). To create multileveled equations, it may be necessary to treat the equation as a graphic and insert it into the text after your paper is styled.</w:t>
       </w:r>
     </w:p>
@@ -2096,15 +1811,18 @@
       <w:pPr>
         <w:pStyle w:val="BodyText"/>
         <w:rPr>
-          <w:lang w:val="en-US"/>
-        </w:rPr>
-      </w:pPr>
-      <w:r>
+          <w:lang w:val="hr-HR"/>
+        </w:rPr>
+      </w:pPr>
+      <w:r>
+        <w:rPr>
+          <w:lang w:val="hr-HR"/>
+        </w:rPr>
         <w:t>Number equations consecutively. Equation numbers, within parentheses, are to position flush right, as in (1), using a right tab stop. To make your equations more compact, you may use the solidus ( / ), the exp function, or appropriate exponents. Italicize Roman symbols for quantities and variables, but not Greek symbols. Use a long dash rather than a hyphen for a minus sign. Punctuate equations with commas or periods when they are part of a sentence, as in</w:t>
       </w:r>
       <w:r>
         <w:rPr>
-          <w:lang w:val="en-US"/>
+          <w:lang w:val="hr-HR"/>
         </w:rPr>
         <w:t>:</w:t>
       </w:r>
@@ -2112,9 +1830,6 @@
     <w:p>
       <w:pPr>
         <w:pStyle w:val="equation"/>
-        <w:rPr>
-          <w:rFonts w:hint="eastAsia"/>
-        </w:rPr>
       </w:pPr>
       <w:r>
         <w:tab/>
@@ -2173,9 +1888,21 @@
     <w:p>
       <w:pPr>
         <w:pStyle w:val="BodyText"/>
-      </w:pPr>
-      <w:r>
-        <w:t>Note that the equation is centered using a center tab stop. Be sure that the symbols in your equation have been defined before or immediately following the equation. Use “(1)”, not “Eq. (1)” or “equation (1)”, except at the beginning of a sentence: “Equation (1) is . . .”</w:t>
+        <w:rPr>
+          <w:lang w:val="hr-HR"/>
+        </w:rPr>
+      </w:pPr>
+      <w:r>
+        <w:rPr>
+          <w:lang w:val="hr-HR"/>
+        </w:rPr>
+        <w:t xml:space="preserve">Note that the equation is centered using a center tab stop. Be sure that the symbols in your equation have been defined </w:t>
+      </w:r>
+      <w:r>
+        <w:rPr>
+          <w:lang w:val="hr-HR"/>
+        </w:rPr>
+        <w:t>before or immediately following the equation. Use “(1)”, not “Eq. (1)” or “equation (1)”, except at the beginning of a sentence: “Equation (1) is . . .”</w:t>
       </w:r>
     </w:p>
     <w:p>
@@ -2189,16 +1916,28 @@
     <w:p>
       <w:pPr>
         <w:pStyle w:val="bulletlist"/>
-      </w:pPr>
-      <w:r>
+        <w:rPr>
+          <w:lang w:val="hr-HR"/>
+        </w:rPr>
+      </w:pPr>
+      <w:r>
+        <w:rPr>
+          <w:lang w:val="hr-HR"/>
+        </w:rPr>
         <w:t>The word “data” is plural, not singular.</w:t>
       </w:r>
     </w:p>
     <w:p>
       <w:pPr>
         <w:pStyle w:val="bulletlist"/>
-      </w:pPr>
-      <w:r>
+        <w:rPr>
+          <w:lang w:val="hr-HR"/>
+        </w:rPr>
+      </w:pPr>
+      <w:r>
+        <w:rPr>
+          <w:lang w:val="hr-HR"/>
+        </w:rPr>
         <w:t xml:space="preserve">The subscript for the permeability of vacuum </w:t>
       </w:r>
       <w:r>
@@ -2207,105 +1946,173 @@
           <w:i/>
           <w:iCs/>
           <w:snapToGrid w:val="0"/>
+          <w:lang w:val="hr-HR"/>
         </w:rPr>
         <w:t></w:t>
       </w:r>
       <w:r>
         <w:rPr>
           <w:vertAlign w:val="subscript"/>
+          <w:lang w:val="hr-HR"/>
         </w:rPr>
         <w:t>0</w:t>
       </w:r>
       <w:r>
+        <w:rPr>
+          <w:lang w:val="hr-HR"/>
+        </w:rPr>
         <w:t>, and other common scientific constants, is zero with subscript formatting, not a lowercase letter “o”.</w:t>
       </w:r>
     </w:p>
     <w:p>
       <w:pPr>
         <w:pStyle w:val="bulletlist"/>
-      </w:pPr>
-      <w:r>
+        <w:rPr>
+          <w:lang w:val="hr-HR"/>
+        </w:rPr>
+      </w:pPr>
+      <w:r>
+        <w:rPr>
+          <w:lang w:val="hr-HR"/>
+        </w:rPr>
         <w:t xml:space="preserve">In American </w:t>
       </w:r>
       <w:r>
+        <w:rPr>
+          <w:lang w:val="hr-HR"/>
+        </w:rPr>
         <w:t>English, commas, semi</w:t>
       </w:r>
       <w:r>
-        <w:t xml:space="preserve">colons, periods, question and exclamation marks are located within quotation marks only when a complete thought or name is cited, such as a title or full quotation. When quotation marks are used, instead of a bold or italic typeface, to highlight a word or phrase, punctuation should appear outside of the quotation marks. A parenthetical phrase or statement at the end of a </w:t>
-      </w:r>
-      <w:r>
-        <w:t>sentence is punctuated outside of the closing parenthesis (like this). (A parenthetical sentence is punctuated within the parentheses.)</w:t>
+        <w:rPr>
+          <w:lang w:val="hr-HR"/>
+        </w:rPr>
+        <w:t>colons, periods, question and exclamation marks are located within quotation marks only when a complete thought or name is cited, such as a title or full quotation. When quotation marks are used, instead of a bold or italic typeface, to highlight a word or phrase, punctuation should appear outside of the quotation marks. A parenthetical phrase or statement at the end of a sentence is punctuated outside of the closing parenthesis (like this). (A parenthetical sentence is punctuated within the parentheses.)</w:t>
       </w:r>
     </w:p>
     <w:p>
       <w:pPr>
         <w:pStyle w:val="bulletlist"/>
-      </w:pPr>
-      <w:r>
+        <w:rPr>
+          <w:lang w:val="hr-HR"/>
+        </w:rPr>
+      </w:pPr>
+      <w:r>
+        <w:rPr>
+          <w:lang w:val="hr-HR"/>
+        </w:rPr>
         <w:t>A graph within a graph is an “inset”, not an “insert”. The word alternatively is preferred to the word “alternately” (unless you really mean something that alternates).</w:t>
       </w:r>
     </w:p>
     <w:p>
       <w:pPr>
         <w:pStyle w:val="bulletlist"/>
-      </w:pPr>
-      <w:r>
+        <w:rPr>
+          <w:lang w:val="hr-HR"/>
+        </w:rPr>
+      </w:pPr>
+      <w:r>
+        <w:rPr>
+          <w:lang w:val="hr-HR"/>
+        </w:rPr>
         <w:t>Do not use the word “essentially” to mean “approximately” or “effectively”.</w:t>
       </w:r>
     </w:p>
     <w:p>
       <w:pPr>
         <w:pStyle w:val="bulletlist"/>
-      </w:pPr>
-      <w:r>
+        <w:rPr>
+          <w:lang w:val="hr-HR"/>
+        </w:rPr>
+      </w:pPr>
+      <w:r>
+        <w:rPr>
+          <w:lang w:val="hr-HR"/>
+        </w:rPr>
         <w:t>In your paper title, if the words “that uses” can accurately replace the word “using”, capitalize the “u”; if not, keep using lower-cased.</w:t>
       </w:r>
     </w:p>
     <w:p>
       <w:pPr>
         <w:pStyle w:val="bulletlist"/>
-      </w:pPr>
-      <w:r>
+        <w:rPr>
+          <w:lang w:val="hr-HR"/>
+        </w:rPr>
+      </w:pPr>
+      <w:r>
+        <w:rPr>
+          <w:lang w:val="hr-HR"/>
+        </w:rPr>
         <w:t>Be aware of the different meanings of the homophones “affect” and “effect”, “complement” and “compliment”, “discreet” and “discrete”, “principal” and “principle”.</w:t>
       </w:r>
     </w:p>
     <w:p>
       <w:pPr>
         <w:pStyle w:val="bulletlist"/>
-      </w:pPr>
-      <w:r>
+        <w:rPr>
+          <w:lang w:val="hr-HR"/>
+        </w:rPr>
+      </w:pPr>
+      <w:r>
+        <w:rPr>
+          <w:lang w:val="hr-HR"/>
+        </w:rPr>
         <w:t>Do not confuse “imply” and “infer”.</w:t>
       </w:r>
     </w:p>
     <w:p>
       <w:pPr>
         <w:pStyle w:val="bulletlist"/>
-      </w:pPr>
-      <w:r>
+        <w:rPr>
+          <w:lang w:val="hr-HR"/>
+        </w:rPr>
+      </w:pPr>
+      <w:r>
+        <w:rPr>
+          <w:lang w:val="hr-HR"/>
+        </w:rPr>
         <w:t>The prefix “non” is not a word; it should be joined to the word it modifies, usually without a hyphen.</w:t>
       </w:r>
     </w:p>
     <w:p>
       <w:pPr>
         <w:pStyle w:val="bulletlist"/>
-      </w:pPr>
-      <w:r>
+        <w:rPr>
+          <w:lang w:val="hr-HR"/>
+        </w:rPr>
+      </w:pPr>
+      <w:r>
+        <w:rPr>
+          <w:lang w:val="hr-HR"/>
+        </w:rPr>
         <w:t>There is no period after the “et” in the Latin abbreviation “et al.”.</w:t>
       </w:r>
     </w:p>
     <w:p>
       <w:pPr>
         <w:pStyle w:val="bulletlist"/>
-      </w:pPr>
-      <w:r>
+        <w:rPr>
+          <w:lang w:val="hr-HR"/>
+        </w:rPr>
+      </w:pPr>
+      <w:r>
+        <w:rPr>
+          <w:lang w:val="hr-HR"/>
+        </w:rPr>
         <w:t>The abbreviation “i.e.” means “that is”, and the abbreviation “e.g.” means “for example”.</w:t>
       </w:r>
     </w:p>
     <w:p>
       <w:pPr>
         <w:pStyle w:val="BodyText"/>
-      </w:pPr>
-      <w:r>
+        <w:rPr>
+          <w:lang w:val="hr-HR"/>
+        </w:rPr>
+      </w:pPr>
+      <w:r>
+        <w:rPr>
+          <w:lang w:val="hr-HR"/>
+        </w:rPr>
         <w:t>An excellent style manual for science writers is [7].</w:t>
       </w:r>
     </w:p>
@@ -2314,17 +2121,20 @@
         <w:pStyle w:val="Heading1"/>
       </w:pPr>
       <w:r>
-        <w:t xml:space="preserve">Using the </w:t>
-      </w:r>
-      <w:r>
-        <w:t>Template</w:t>
+        <w:t>Using the Template</w:t>
       </w:r>
     </w:p>
     <w:p>
       <w:pPr>
         <w:pStyle w:val="BodyText"/>
-      </w:pPr>
-      <w:r>
+        <w:rPr>
+          <w:lang w:val="hr-HR"/>
+        </w:rPr>
+      </w:pPr>
+      <w:r>
+        <w:rPr>
+          <w:lang w:val="hr-HR"/>
+        </w:rPr>
         <w:t>After the text edit has been completed, the paper is ready for the template. Duplicate the template file by using the Save As command, and use the naming convention prescribed by your conference for the name of your paper. In this newly created file, highlight all of the contents and import your prepared text file. You are now ready to style your paper; use the scroll down window on the left of the MS Word Formatting toolbar.</w:t>
       </w:r>
     </w:p>
@@ -2333,97 +2143,107 @@
         <w:pStyle w:val="Heading2"/>
       </w:pPr>
       <w:r>
-        <w:t>Authors</w:t>
-      </w:r>
-      <w:r>
-        <w:t xml:space="preserve"> and Affiliations</w:t>
+        <w:t>Authors and Affiliations</w:t>
       </w:r>
     </w:p>
     <w:p>
       <w:pPr>
         <w:pStyle w:val="BodyText"/>
+        <w:rPr>
+          <w:lang w:val="hr-HR"/>
+        </w:rPr>
       </w:pPr>
       <w:r>
         <w:rPr>
           <w:b/>
+          <w:lang w:val="hr-HR"/>
         </w:rPr>
         <w:t xml:space="preserve">The template is </w:t>
       </w:r>
       <w:r>
         <w:rPr>
           <w:b/>
+          <w:lang w:val="hr-HR"/>
         </w:rPr>
         <w:t>designed</w:t>
       </w:r>
       <w:r>
         <w:rPr>
           <w:b/>
-          <w:lang w:val="en-US"/>
+          <w:lang w:val="hr-HR"/>
         </w:rPr>
         <w:t xml:space="preserve"> for,</w:t>
       </w:r>
       <w:r>
         <w:rPr>
           <w:b/>
+          <w:lang w:val="hr-HR"/>
         </w:rPr>
         <w:t xml:space="preserve"> but not limited to</w:t>
       </w:r>
       <w:r>
         <w:rPr>
           <w:b/>
-          <w:lang w:val="en-US"/>
+          <w:lang w:val="hr-HR"/>
         </w:rPr>
         <w:t>,</w:t>
       </w:r>
       <w:r>
         <w:rPr>
           <w:b/>
-          <w:lang w:val="en-US"/>
+          <w:lang w:val="hr-HR"/>
         </w:rPr>
         <w:t xml:space="preserve"> </w:t>
       </w:r>
       <w:r>
         <w:rPr>
           <w:b/>
-          <w:lang w:val="en-US"/>
+          <w:lang w:val="hr-HR"/>
         </w:rPr>
         <w:t>six</w:t>
       </w:r>
       <w:r>
         <w:rPr>
           <w:b/>
-          <w:lang w:val="en-US"/>
+          <w:lang w:val="hr-HR"/>
         </w:rPr>
         <w:t xml:space="preserve"> authors.</w:t>
       </w:r>
       <w:r>
         <w:rPr>
-          <w:lang w:val="en-US"/>
+          <w:lang w:val="hr-HR"/>
         </w:rPr>
         <w:t xml:space="preserve"> </w:t>
       </w:r>
       <w:r>
         <w:rPr>
-          <w:lang w:val="en-US"/>
+          <w:lang w:val="hr-HR"/>
         </w:rPr>
         <w:t xml:space="preserve">A minimum of one author is required for all conference articles. </w:t>
       </w:r>
       <w:r>
-        <w:t>Author names should be listed starting from left to right and then moving down to the next line. This is the author sequence that will be used in future citations and by indexing services.</w:t>
-      </w:r>
-      <w:r>
+        <w:rPr>
+          <w:lang w:val="hr-HR"/>
+        </w:rPr>
+        <w:t xml:space="preserve">Author names should be listed starting from left to right and then moving down to the next line. This is the author sequence that will be used in future citations and </w:t>
+      </w:r>
+      <w:r>
+        <w:rPr>
+          <w:lang w:val="hr-HR"/>
+        </w:rPr>
+        <w:lastRenderedPageBreak/>
+        <w:t>by indexing services. Names should not be listed in columns nor group by affiliation.</w:t>
+      </w:r>
+      <w:r>
+        <w:rPr>
+          <w:lang w:val="hr-HR"/>
+        </w:rPr>
         <w:t xml:space="preserve"> </w:t>
       </w:r>
       <w:r>
-        <w:t>Names should not be listed in columns nor group by affiliation.</w:t>
-      </w:r>
-      <w:r>
-        <w:rPr>
-          <w:lang w:val="en-US"/>
-        </w:rPr>
-        <w:t xml:space="preserve"> </w:t>
-      </w:r>
-      <w:r>
+        <w:rPr>
+          <w:lang w:val="hr-HR"/>
+        </w:rPr>
         <w:t>Please keep your affiliations as succinct as possible (for example, do not differentiate among departments of the same organization).</w:t>
       </w:r>
     </w:p>
@@ -2472,10 +2292,7 @@
         <w:pStyle w:val="Heading4"/>
       </w:pPr>
       <w:r>
-        <w:t>Selection</w:t>
-      </w:r>
-      <w:r>
-        <w:t xml:space="preserve">: </w:t>
+        <w:t xml:space="preserve">Selection: </w:t>
       </w:r>
       <w:r>
         <w:rPr>
@@ -2489,10 +2306,7 @@
         <w:pStyle w:val="Heading4"/>
       </w:pPr>
       <w:r>
-        <w:t>Change number of columns:</w:t>
-      </w:r>
-      <w:r>
-        <w:t xml:space="preserve"> </w:t>
+        <w:t xml:space="preserve">Change number of columns: </w:t>
       </w:r>
       <w:r>
         <w:rPr>
@@ -2551,34 +2365,48 @@
         <w:pStyle w:val="Heading2"/>
       </w:pPr>
       <w:r>
-        <w:lastRenderedPageBreak/>
-        <w:t>Identify</w:t>
-      </w:r>
-      <w:r>
-        <w:t xml:space="preserve"> the Headings</w:t>
+        <w:t>Identify the Headings</w:t>
       </w:r>
     </w:p>
     <w:p>
       <w:pPr>
         <w:pStyle w:val="BodyText"/>
-      </w:pPr>
-      <w:r>
+        <w:rPr>
+          <w:lang w:val="hr-HR"/>
+        </w:rPr>
+      </w:pPr>
+      <w:r>
+        <w:rPr>
+          <w:lang w:val="hr-HR"/>
+        </w:rPr>
         <w:t>Headings, or heads, are organizational devices that guide the reader through your paper. There are two types: component heads and text heads.</w:t>
       </w:r>
     </w:p>
     <w:p>
       <w:pPr>
         <w:pStyle w:val="BodyText"/>
-      </w:pPr>
-      <w:r>
+        <w:rPr>
+          <w:lang w:val="hr-HR"/>
+        </w:rPr>
+      </w:pPr>
+      <w:r>
+        <w:rPr>
+          <w:lang w:val="hr-HR"/>
+        </w:rPr>
         <w:t>Component heads identify the different components of your paper and are not topically subordinate to each other. Examples include Acknowledgments and References and, for these, the correct style to use is “Heading 5”. Use “figure caption” for your Figure captions, and “table head” for your table title. Run-in heads, such as “Abstract”, will require you to apply a style (in this case, italic) in addition to the style provided by the drop down menu to differentiate the head from the text.</w:t>
       </w:r>
     </w:p>
     <w:p>
       <w:pPr>
         <w:pStyle w:val="BodyText"/>
-      </w:pPr>
-      <w:r>
+        <w:rPr>
+          <w:lang w:val="hr-HR"/>
+        </w:rPr>
+      </w:pPr>
+      <w:r>
+        <w:rPr>
+          <w:lang w:val="hr-HR"/>
+        </w:rPr>
         <w:t>Text heads organize the topics on a relational, hierarchical basis. For example, the paper title is the primary text head because all subsequent material relates and elaborates on this one topic. If there are two or more sub-topics, the next level head (uppercase Roman numerals) should be used and, conversely, if there are not at least two sub-topics, then no subheads should be introduced. Styles named “Heading 1”, “Heading 2”, “Heading 3”, and “Heading 4” are prescribed.</w:t>
       </w:r>
     </w:p>
@@ -2610,8 +2438,14 @@
     <w:p>
       <w:pPr>
         <w:pStyle w:val="tablehead"/>
-      </w:pPr>
-      <w:r>
+        <w:rPr>
+          <w:lang w:val="hr-HR"/>
+        </w:rPr>
+      </w:pPr>
+      <w:r>
+        <w:rPr>
+          <w:lang w:val="hr-HR"/>
+        </w:rPr>
         <w:t>Table Type Styles</w:t>
       </w:r>
     </w:p>
@@ -2754,9 +2588,13 @@
               <w:rPr>
                 <w:sz w:val="8"/>
                 <w:szCs w:val="8"/>
+                <w:lang w:val="hr-HR"/>
               </w:rPr>
             </w:pPr>
             <w:r>
+              <w:rPr>
+                <w:lang w:val="hr-HR"/>
+              </w:rPr>
               <w:t>copy</w:t>
             </w:r>
           </w:p>
@@ -2769,13 +2607,20 @@
           <w:p>
             <w:pPr>
               <w:pStyle w:val="tablecopy"/>
+              <w:rPr>
+                <w:lang w:val="hr-HR"/>
+              </w:rPr>
             </w:pPr>
             <w:r>
+              <w:rPr>
+                <w:lang w:val="hr-HR"/>
+              </w:rPr>
               <w:t>More table copy</w:t>
             </w:r>
             <w:r>
               <w:rPr>
                 <w:vertAlign w:val="superscript"/>
+                <w:lang w:val="hr-HR"/>
               </w:rPr>
               <w:t>a</w:t>
             </w:r>
@@ -2814,57 +2659,47 @@
     <w:p>
       <w:pPr>
         <w:pStyle w:val="tablefootnote"/>
-      </w:pPr>
-      <w:r>
-        <w:t xml:space="preserve">Sample </w:t>
-      </w:r>
-      <w:r>
-        <w:t>of</w:t>
-      </w:r>
-      <w:r>
-        <w:t xml:space="preserve"> a </w:t>
-      </w:r>
-      <w:r>
-        <w:t>Table</w:t>
-      </w:r>
-      <w:r>
-        <w:t xml:space="preserve"> </w:t>
-      </w:r>
-      <w:r>
-        <w:t>footnote</w:t>
-      </w:r>
-      <w:r>
-        <w:t xml:space="preserve">. </w:t>
-      </w:r>
-      <w:r>
-        <w:t>(</w:t>
+        <w:rPr>
+          <w:lang w:val="hr-HR"/>
+        </w:rPr>
+      </w:pPr>
+      <w:r>
+        <w:rPr>
+          <w:lang w:val="hr-HR"/>
+        </w:rPr>
+        <w:t>Sample of a Table footnote. (</w:t>
       </w:r>
       <w:r>
         <w:rPr>
           <w:i/>
+          <w:lang w:val="hr-HR"/>
         </w:rPr>
         <w:t>Table footnote</w:t>
       </w:r>
       <w:r>
+        <w:rPr>
+          <w:lang w:val="hr-HR"/>
+        </w:rPr>
         <w:t>)</w:t>
       </w:r>
     </w:p>
     <w:p>
       <w:pPr>
         <w:pStyle w:val="figurecaption"/>
-      </w:pPr>
-      <w:r>
-        <w:t xml:space="preserve">Example of a figure </w:t>
-      </w:r>
-      <w:r>
-        <w:t>caption</w:t>
-      </w:r>
-      <w:r>
-        <w:t xml:space="preserve">. </w:t>
+        <w:rPr>
+          <w:lang w:val="hr-HR"/>
+        </w:rPr>
+      </w:pPr>
+      <w:r>
+        <w:rPr>
+          <w:lang w:val="hr-HR"/>
+        </w:rPr>
+        <w:t xml:space="preserve">Example of a figure caption. </w:t>
       </w:r>
       <w:r>
         <w:rPr>
           <w:iCs/>
+          <w:lang w:val="hr-HR"/>
         </w:rPr>
         <w:t>(</w:t>
       </w:r>
@@ -2872,12 +2707,14 @@
         <w:rPr>
           <w:i/>
           <w:iCs/>
+          <w:lang w:val="hr-HR"/>
         </w:rPr>
         <w:t>figure caption</w:t>
       </w:r>
       <w:r>
         <w:rPr>
           <w:iCs/>
+          <w:lang w:val="hr-HR"/>
         </w:rPr>
         <w:t>)</w:t>
       </w:r>
@@ -2885,15 +2722,27 @@
     <w:p>
       <w:pPr>
         <w:pStyle w:val="BodyText"/>
-      </w:pPr>
-      <w:r>
-        <w:t>Figure Labels: Use 8 point Times New Roman for Figure labels. Use words rather than symbols or abbreviations when writing Figure axis labels to avoid confusing the reader. As an example, write the quantity “Magnetization”, or “Magnetization, M”, not just “M”. If including units in the label, present them within parentheses. Do not label axes only with units. In the example, write “Magnetization (A/m)” or “Magnetization {A[m(1)]}”, not just “A/m”. Do not label axes</w:t>
-      </w:r>
-      <w:r>
-        <w:t xml:space="preserve"> </w:t>
-      </w:r>
-      <w:r>
-        <w:t>with a ratio of quantities and units. For example, write “Temperature (K)”, not “Temperature/K”.</w:t>
+        <w:rPr>
+          <w:lang w:val="hr-HR"/>
+        </w:rPr>
+      </w:pPr>
+      <w:r>
+        <w:rPr>
+          <w:lang w:val="hr-HR"/>
+        </w:rPr>
+        <w:t xml:space="preserve">Figure Labels: Use 8 point Times New Roman for Figure labels. Use words rather than symbols or abbreviations when writing Figure axis labels to avoid confusing the reader. As an example, write the quantity “Magnetization”, or “Magnetization, M”, not just “M”. If including units in the </w:t>
+      </w:r>
+      <w:r>
+        <w:rPr>
+          <w:lang w:val="hr-HR"/>
+        </w:rPr>
+        <w:t>label, present them within parentheses. Do not label axes only with units. In the example, write “Magnetization (A/m)” or “Magnetization {A[m(1)]}”, not just “A/m”. Do not label axes</w:t>
+      </w:r>
+      <w:r>
+        <w:rPr>
+          <w:lang w:val="hr-HR"/>
+        </w:rPr>
+        <w:t xml:space="preserve"> with a ratio of quantities and units. For example, write “Temperature (K)”, not “Temperature/K”.</w:t>
       </w:r>
     </w:p>
     <w:p>
@@ -2901,10 +2750,7 @@
         <w:pStyle w:val="Heading5"/>
       </w:pPr>
       <w:r>
-        <w:t>Acknowledgment</w:t>
-      </w:r>
-      <w:r>
-        <w:t xml:space="preserve"> </w:t>
+        <w:t xml:space="preserve">Acknowledgment </w:t>
       </w:r>
       <w:r>
         <w:rPr>
@@ -2932,53 +2778,74 @@
     <w:p>
       <w:pPr>
         <w:pStyle w:val="BodyText"/>
-      </w:pPr>
-      <w:r>
+        <w:rPr>
+          <w:lang w:val="hr-HR"/>
+        </w:rPr>
+      </w:pPr>
+      <w:r>
+        <w:rPr>
+          <w:lang w:val="hr-HR"/>
+        </w:rPr>
         <w:t>The preferred spelling of the word “acknowledgment” in America is without an “e” after the “g</w:t>
       </w:r>
       <w:r>
-        <w:t>”. Avoid the stilted expression “</w:t>
-      </w:r>
-      <w:r>
-        <w:rPr>
-          <w:lang w:val="en-US"/>
-        </w:rPr>
-        <w:t>o</w:t>
-      </w:r>
-      <w:r>
+        <w:rPr>
+          <w:lang w:val="hr-HR"/>
+        </w:rPr>
+        <w:t>”. Avoid the stilted expression “o</w:t>
+      </w:r>
+      <w:r>
+        <w:rPr>
+          <w:lang w:val="hr-HR"/>
+        </w:rPr>
         <w:t xml:space="preserve">ne of us (R. B. G.) thanks </w:t>
       </w:r>
       <w:r>
+        <w:rPr>
+          <w:lang w:val="hr-HR"/>
+        </w:rPr>
+        <w:t xml:space="preserve">...”.  </w:t>
+      </w:r>
+      <w:r>
+        <w:rPr>
+          <w:lang w:val="hr-HR"/>
+        </w:rPr>
+        <w:t>Instead, try “R. B. G. thanks</w:t>
+      </w:r>
+      <w:r>
+        <w:rPr>
+          <w:lang w:val="hr-HR"/>
+        </w:rPr>
         <w:t>...</w:t>
       </w:r>
       <w:r>
         <w:rPr>
-          <w:lang w:val="en-US"/>
-        </w:rPr>
-        <w:t xml:space="preserve">”.  </w:t>
-      </w:r>
-      <w:r>
-        <w:t>Instead, try “R. B. G. thanks</w:t>
-      </w:r>
-      <w:r>
-        <w:t>...</w:t>
-      </w:r>
-      <w:r>
+          <w:lang w:val="hr-HR"/>
+        </w:rPr>
         <w:t>”.</w:t>
       </w:r>
       <w:r>
         <w:rPr>
-          <w:lang w:val="en-US"/>
+          <w:lang w:val="hr-HR"/>
         </w:rPr>
         <w:t xml:space="preserve"> </w:t>
       </w:r>
       <w:r>
+        <w:rPr>
+          <w:lang w:val="hr-HR"/>
+        </w:rPr>
         <w:t>Put spons</w:t>
       </w:r>
       <w:r>
+        <w:rPr>
+          <w:lang w:val="hr-HR"/>
+        </w:rPr>
         <w:t>or acknowledgments in the unnum</w:t>
       </w:r>
       <w:r>
+        <w:rPr>
+          <w:lang w:val="hr-HR"/>
+        </w:rPr>
         <w:t>bered footnote on the first page.</w:t>
       </w:r>
     </w:p>
@@ -2987,7 +2854,7 @@
         <w:jc w:val="start"/>
         <w:rPr>
           <w:spacing w:val="-1"/>
-          <w:lang w:val="x-none" w:eastAsia="x-none"/>
+          <w:lang w:eastAsia="x-none"/>
         </w:rPr>
       </w:pPr>
       <w:r>
@@ -3006,57 +2873,78 @@
     <w:p>
       <w:pPr>
         <w:pStyle w:val="BodyText"/>
-      </w:pPr>
-      <w:r>
+        <w:rPr>
+          <w:lang w:val="hr-HR"/>
+        </w:rPr>
+      </w:pPr>
+      <w:r>
+        <w:rPr>
+          <w:lang w:val="hr-HR"/>
+        </w:rPr>
         <w:t>The template will number citations consecutively within brackets [1]. The sentence punctuation follows the bracket [2]. Refer simply to the reference number, as in [3]—do not use “Ref. [3]” or “reference [3]” except at the beginning of a sentence: “Reference [3] was the first</w:t>
       </w:r>
       <w:r>
         <w:rPr>
-          <w:lang w:val="en-US"/>
-        </w:rPr>
-        <w:t xml:space="preserve"> </w:t>
-      </w:r>
-      <w:r>
-        <w:t>...</w:t>
-      </w:r>
-      <w:r>
+          <w:lang w:val="hr-HR"/>
+        </w:rPr>
+        <w:t xml:space="preserve"> ...</w:t>
+      </w:r>
+      <w:r>
+        <w:rPr>
+          <w:lang w:val="hr-HR"/>
+        </w:rPr>
         <w:t>”</w:t>
       </w:r>
     </w:p>
     <w:p>
       <w:pPr>
         <w:pStyle w:val="BodyText"/>
-      </w:pPr>
-      <w:r>
+        <w:rPr>
+          <w:lang w:val="hr-HR"/>
+        </w:rPr>
+      </w:pPr>
+      <w:r>
+        <w:rPr>
+          <w:lang w:val="hr-HR"/>
+        </w:rPr>
         <w:t>Number footnotes separately in superscripts. Place the actual footnote at the bottom of the column in which it was cited. Do not put footnotes in the</w:t>
       </w:r>
       <w:r>
         <w:rPr>
-          <w:lang w:val="en-US"/>
+          <w:lang w:val="hr-HR"/>
         </w:rPr>
         <w:t xml:space="preserve"> abstract or</w:t>
       </w:r>
       <w:r>
+        <w:rPr>
+          <w:lang w:val="hr-HR"/>
+        </w:rPr>
         <w:t xml:space="preserve"> reference list. Use letters for table footnotes.</w:t>
       </w:r>
     </w:p>
     <w:p>
       <w:pPr>
         <w:pStyle w:val="BodyText"/>
-      </w:pPr>
-      <w:r>
+        <w:rPr>
+          <w:lang w:val="hr-HR"/>
+        </w:rPr>
+      </w:pPr>
+      <w:r>
+        <w:rPr>
+          <w:lang w:val="hr-HR"/>
+        </w:rPr>
         <w:t>Unless there are six au</w:t>
       </w:r>
       <w:r>
-        <w:t>thors or more give all authors</w:t>
-      </w:r>
-      <w:r>
-        <w:rPr>
-          <w:lang w:val="en-US"/>
-        </w:rPr>
-        <w:t xml:space="preserve">’ </w:t>
-      </w:r>
-      <w:r>
+        <w:rPr>
+          <w:lang w:val="hr-HR"/>
+        </w:rPr>
+        <w:t xml:space="preserve">thors or more give all authors’ </w:t>
+      </w:r>
+      <w:r>
+        <w:rPr>
+          <w:lang w:val="hr-HR"/>
+        </w:rPr>
         <w:t>names; do not use “et al.”. Papers that have not been published, even if they have been submitted for publication, should be cited as “unpublished” [4]. Papers that have been accepted for publication should be cited as “in press” [5]. Capitalize only the first word in a paper title, except for proper nouns and element symbols.</w:t>
       </w:r>
     </w:p>
@@ -3064,15 +2952,15 @@
       <w:pPr>
         <w:pStyle w:val="BodyText"/>
         <w:ind w:firstLine="0pt"/>
-      </w:pPr>
-      <w:r>
-        <w:t xml:space="preserve">For </w:t>
-      </w:r>
-      <w:r>
-        <w:t>papers</w:t>
-      </w:r>
-      <w:r>
-        <w:t xml:space="preserve"> published in translation journals, please give the English citation first, followed by the original foreign-language citation [6].</w:t>
+        <w:rPr>
+          <w:lang w:val="hr-HR"/>
+        </w:rPr>
+      </w:pPr>
+      <w:r>
+        <w:rPr>
+          <w:lang w:val="hr-HR"/>
+        </w:rPr>
+        <w:t>For papers published in translation journals, please give the English citation first, followed by the original foreign-language citation [6].</w:t>
       </w:r>
     </w:p>
     <w:p/>
@@ -3080,14 +2968,21 @@
       <w:pPr>
         <w:pStyle w:val="references"/>
         <w:ind w:start="17.70pt" w:hanging="17.70pt"/>
-      </w:pPr>
-      <w:r>
+        <w:rPr>
+          <w:lang w:val="hr-HR"/>
+        </w:rPr>
+      </w:pPr>
+      <w:r>
+        <w:rPr>
+          <w:lang w:val="hr-HR"/>
+        </w:rPr>
         <w:t xml:space="preserve">World Health Organisation. Breast cancer. Pristupljeno: 30.10.2024. </w:t>
       </w:r>
-      <w:hyperlink r:id="rId18" w:history="1">
+      <w:hyperlink r:id="rId19" w:history="1">
         <w:r>
           <w:rPr>
             <w:rStyle w:val="Hyperlink"/>
+            <w:lang w:val="hr-HR"/>
           </w:rPr>
           <w:t>https://www.who.int/news-room/fact-sheets/detail/breast-cancer</w:t>
         </w:r>
@@ -3097,14 +2992,21 @@
       <w:pPr>
         <w:pStyle w:val="references"/>
         <w:ind w:start="17.70pt" w:hanging="17.70pt"/>
-      </w:pPr>
-      <w:r>
+        <w:rPr>
+          <w:lang w:val="hr-HR"/>
+        </w:rPr>
+      </w:pPr>
+      <w:r>
+        <w:rPr>
+          <w:lang w:val="hr-HR"/>
+        </w:rPr>
         <w:t xml:space="preserve">Hrvatski zavod za javno zdravstvo. Što trebate znati o raku dojke? Pristupljeno: 30.10.2024. </w:t>
       </w:r>
-      <w:hyperlink r:id="rId19" w:history="1">
+      <w:hyperlink r:id="rId20" w:history="1">
         <w:r>
           <w:rPr>
             <w:rStyle w:val="Hyperlink"/>
+            <w:lang w:val="hr-HR"/>
           </w:rPr>
           <w:t>https://www.hzjz.hr/sluzba-epidemiologija-prevencija-nezaraznih-bolesti/sto-trebate-znati-o-raku-dojke/</w:t>
         </w:r>
@@ -3114,8 +3016,14 @@
       <w:pPr>
         <w:pStyle w:val="references"/>
         <w:ind w:start="17.70pt" w:hanging="17.70pt"/>
-      </w:pPr>
-      <w:r>
+        <w:rPr>
+          <w:lang w:val="hr-HR"/>
+        </w:rPr>
+      </w:pPr>
+      <w:r>
+        <w:rPr>
+          <w:lang w:val="hr-HR"/>
+        </w:rPr>
         <w:t>Prof. dr. sc. Sven Lončarić. Predavanja iz kolegija Analiza slika u biomedicini. Fakultet elektrotehnike i računarstva. Sveučilište u Zagrebu, 2024.</w:t>
       </w:r>
     </w:p>
@@ -3127,25 +3035,34 @@
           <w:rStyle w:val="Hyperlink"/>
           <w:color w:val="auto"/>
           <w:u w:val="none"/>
-        </w:rPr>
-      </w:pPr>
-      <w:r>
+          <w:lang w:val="hr-HR"/>
+        </w:rPr>
+      </w:pPr>
+      <w:r>
+        <w:rPr>
+          <w:lang w:val="hr-HR"/>
+        </w:rPr>
         <w:t xml:space="preserve">Rongrong Guo. Guolan Lu. Baowei Fei. </w:t>
       </w:r>
       <w:r>
         <w:rPr>
           <w:i/>
           <w:iCs/>
+          <w:lang w:val="hr-HR"/>
         </w:rPr>
         <w:t>Ultrasound Imaging Technologies For Breast Cancer Detection and Management. National Library of Medicine.</w:t>
       </w:r>
       <w:r>
+        <w:rPr>
+          <w:lang w:val="hr-HR"/>
+        </w:rPr>
         <w:t xml:space="preserve"> Pristupljeno: 2.11.2024. </w:t>
       </w:r>
-      <w:hyperlink r:id="rId20" w:history="1">
+      <w:hyperlink r:id="rId21" w:history="1">
         <w:r>
           <w:rPr>
             <w:rStyle w:val="Hyperlink"/>
+            <w:lang w:val="hr-HR"/>
           </w:rPr>
           <w:t>https://pmc.ncbi.nlm.nih.gov/articles/PMC6169997/</w:t>
         </w:r>
@@ -3155,22 +3072,35 @@
       <w:pPr>
         <w:pStyle w:val="references"/>
         <w:ind w:start="17.70pt" w:hanging="17.70pt"/>
-      </w:pPr>
-      <w:r>
+        <w:rPr>
+          <w:lang w:val="hr-HR"/>
+        </w:rPr>
+      </w:pPr>
+      <w:r>
+        <w:rPr>
+          <w:lang w:val="hr-HR"/>
+        </w:rPr>
         <w:t>CBIS-DDSM: Breast Cancer Image Dataset</w:t>
       </w:r>
       <w:r>
+        <w:rPr>
+          <w:lang w:val="hr-HR"/>
+        </w:rPr>
         <w:br/>
       </w:r>
-      <w:hyperlink r:id="rId21" w:history="1">
+      <w:hyperlink r:id="rId22" w:history="1">
         <w:r>
           <w:rPr>
             <w:rStyle w:val="Hyperlink"/>
+            <w:lang w:val="hr-HR"/>
           </w:rPr>
           <w:t>https://www.kaggle.com/datasets/awsaf49/cbis-ddsm-breast-cancer-image-dataset?resource=download</w:t>
         </w:r>
       </w:hyperlink>
       <w:r>
+        <w:rPr>
+          <w:lang w:val="hr-HR"/>
+        </w:rPr>
         <w:t xml:space="preserve"> </w:t>
       </w:r>
     </w:p>
@@ -3178,58 +3108,80 @@
       <w:pPr>
         <w:pStyle w:val="references"/>
         <w:ind w:start="17.70pt" w:hanging="17.70pt"/>
-      </w:pPr>
-      <w:r>
-        <w:t>Daniel G.P. Petrini, Carlos Shimizu, Rosimeire A. Roela, Gabriel V. Valente, Maria A.A.K. Folgueira, Hae Yong Kim</w:t>
-      </w:r>
-      <w:r>
-        <w:t xml:space="preserve">. </w:t>
+        <w:rPr>
+          <w:lang w:val="hr-HR"/>
+        </w:rPr>
+      </w:pPr>
+      <w:r>
+        <w:rPr>
+          <w:lang w:val="hr-HR"/>
+        </w:rPr>
+        <w:t xml:space="preserve">Daniel G.P. Petrini, Carlos Shimizu, Rosimeire A. Roela, Gabriel V. Valente, Maria A.A.K. Folgueira, Hae Yong Kim. </w:t>
       </w:r>
       <w:r>
         <w:rPr>
           <w:i/>
           <w:iCs/>
+          <w:lang w:val="hr-HR"/>
         </w:rPr>
         <w:t>Breast Cancer Diagnosis in Two-View Mammography Using End-to-End Trained EfficientNet-Based Convolutional Network</w:t>
       </w:r>
       <w:r>
+        <w:rPr>
+          <w:lang w:val="hr-HR"/>
+        </w:rPr>
         <w:t xml:space="preserve"> </w:t>
       </w:r>
-      <w:hyperlink r:id="rId22" w:history="1">
+      <w:hyperlink r:id="rId23" w:history="1">
         <w:r>
           <w:rPr>
             <w:rStyle w:val="Hyperlink"/>
+            <w:lang w:val="hr-HR"/>
           </w:rPr>
           <w:t>https://ieeexplore.ieee.org/document/9837037</w:t>
         </w:r>
       </w:hyperlink>
       <w:r>
+        <w:rPr>
+          <w:lang w:val="hr-HR"/>
+        </w:rPr>
         <w:t xml:space="preserve"> </w:t>
       </w:r>
     </w:p>
     <w:p>
       <w:pPr>
         <w:pStyle w:val="references"/>
-      </w:pPr>
-      <w:r>
+        <w:rPr>
+          <w:lang w:val="hr-HR"/>
+        </w:rPr>
+      </w:pPr>
+      <w:r>
+        <w:rPr>
+          <w:lang w:val="hr-HR"/>
+        </w:rPr>
         <w:t xml:space="preserve">Unaiza Sajid, Rizwan Ahmed Khan, Shahid Munir Shah, Sheeraz Arif </w:t>
       </w:r>
       <w:r>
         <w:rPr>
           <w:i/>
           <w:iCs/>
+          <w:lang w:val="hr-HR"/>
         </w:rPr>
         <w:t xml:space="preserve">Breast Cancer Classification using Deep Learned Features Boosted with Handcrafted Features </w:t>
       </w:r>
-      <w:hyperlink r:id="rId23" w:history="1">
+      <w:hyperlink r:id="rId24" w:history="1">
         <w:r>
           <w:rPr>
             <w:rStyle w:val="Hyperlink"/>
+            <w:lang w:val="hr-HR"/>
           </w:rPr>
           <w:t>https://arxiv.org/pdf/2206.12815</w:t>
         </w:r>
       </w:hyperlink>
       <w:r>
+        <w:rPr>
+          <w:lang w:val="hr-HR"/>
+        </w:rPr>
         <w:t xml:space="preserve">  </w:t>
       </w:r>
     </w:p>
@@ -3251,7 +3203,7 @@
           <w:spacing w:val="-1"/>
           <w:sz w:val="20"/>
           <w:szCs w:val="20"/>
-          <w:lang w:val="x-none" w:eastAsia="x-none"/>
+          <w:lang w:val="hr-HR" w:eastAsia="x-none"/>
         </w:rPr>
         <w:sectPr>
           <w:type w:val="continuous"/>
@@ -3289,9 +3241,6 @@
         <w:annotationRef/>
       </w:r>
       <w:r>
-        <w:rPr>
-          <w:lang w:val="hr-HR"/>
-        </w:rPr>
         <w:t>prethodno treniranih?</w:t>
       </w:r>
     </w:p>
@@ -3309,9 +3258,6 @@
         <w:annotationRef/>
       </w:r>
       <w:r>
-        <w:rPr>
-          <w:lang w:val="hr-HR"/>
-        </w:rPr>
         <w:t>Na slici x. treba ju dodati na smisleno mjesto</w:t>
       </w:r>
     </w:p>
@@ -3321,7 +3267,7 @@
 
 <file path=word/commentsExtended.xml><?xml version="1.0" encoding="utf-8"?>
 <w15:commentsEx xmlns:cx="http://schemas.microsoft.com/office/drawing/2014/chartex" xmlns:cx1="http://schemas.microsoft.com/office/drawing/2015/9/8/chartex" xmlns:cx2="http://schemas.microsoft.com/office/drawing/2015/10/21/chartex" xmlns:cx3="http://schemas.microsoft.com/office/drawing/2016/5/9/chartex" xmlns:cx4="http://schemas.microsoft.com/office/drawing/2016/5/10/chartex" xmlns:cx5="http://schemas.microsoft.com/office/drawing/2016/5/11/chartex" xmlns:cx6="http://schemas.microsoft.com/office/drawing/2016/5/12/chartex" xmlns:cx7="http://schemas.microsoft.com/office/drawing/2016/5/13/chartex" xmlns:cx8="http://schemas.microsoft.com/office/drawing/2016/5/14/chartex" xmlns:mc="http://schemas.openxmlformats.org/markup-compatibility/2006" xmlns:aink="http://schemas.microsoft.com/office/drawing/2016/ink" xmlns:am3d="http://schemas.microsoft.com/office/drawing/2017/model3d" xmlns:o="urn:schemas-microsoft-com:office:office" xmlns:oel="http://schemas.microsoft.com/office/2019/extlst" xmlns:r="http://purl.oclc.org/ooxml/officeDocument/relationships" xmlns:m="http://purl.oclc.org/ooxml/officeDocument/math" xmlns:v="urn:schemas-microsoft-com:vml" xmlns:wp14="http://schemas.microsoft.com/office/word/2010/wordprocessingDrawing" xmlns:wp="http://purl.oclc.org/ooxml/drawingml/wordprocessingDrawing" xmlns:w10="urn:schemas-microsoft-com:office:word" xmlns:w="http://purl.oclc.org/ooxml/wordprocessingml/main" xmlns:w14="http://schemas.microsoft.com/office/word/2010/wordml" xmlns:w15="http://schemas.microsoft.com/office/word/2012/wordml" xmlns:w16cex="http://schemas.microsoft.com/office/word/2018/wordml/cex" xmlns:w16cid="http://schemas.microsoft.com/office/word/2016/wordml/cid" xmlns:w16="http://schemas.microsoft.com/office/word/2018/wordml" xmlns:w16du="http://schemas.microsoft.com/office/word/2023/wordml/word16du" xmlns:w16sdtdh="http://schemas.microsoft.com/office/word/2020/wordml/sdtdatahash" xmlns:w16sdtfl="http://schemas.microsoft.com/office/word/2024/wordml/sdtformatlock" xmlns:w16se="http://schemas.microsoft.com/office/word/2015/wordml/symex" xmlns:wpi="http://schemas.microsoft.com/office/word/2010/wordprocessingInk" xmlns:wne="http://schemas.microsoft.com/office/word/2006/wordml" mc:Ignorable="w14 w15 w16se w16cid w16 w16cex w16sdtdh w16sdtfl w16du wne wp14">
-  <w15:commentEx w15:paraId="28E378B5" w15:done="0"/>
+  <w15:commentEx w15:paraId="28E378B5" w15:done="1"/>
   <w15:commentEx w15:paraId="5CA33417" w15:done="0"/>
 </w15:commentsEx>
 </file>
@@ -5174,6 +5120,9 @@
     <w:pPr>
       <w:jc w:val="center"/>
     </w:pPr>
+    <w:rPr>
+      <w:lang w:val="hr-HR"/>
+    </w:rPr>
   </w:style>
   <w:style w:type="paragraph" w:styleId="Heading1">
     <w:name w:val="heading 1"/>
@@ -5294,6 +5243,7 @@
   <w:style w:type="character" w:default="1" w:styleId="DefaultParagraphFont">
     <w:name w:val="Default Paragraph Font"/>
     <w:uiPriority w:val="1"/>
+    <w:semiHidden/>
     <w:unhideWhenUsed/>
   </w:style>
   <w:style w:type="table" w:default="1" w:styleId="TableNormal">

</xml_diff>

<commit_message>
dovršena dokumentacija, prepravljena diskusija i zaključak
</commit_message>
<xml_diff>
--- a/Izvjestaj_projekta_-_Radna_verzija.docx
+++ b/Izvjestaj_projekta_-_Radna_verzija.docx
@@ -40,7 +40,6 @@
           <w:lang w:val="hr-HR"/>
         </w:rPr>
         <w:sectPr>
-          <w:footerReference w:type="first" r:id="rId8"/>
           <w:pgSz w:w="595.30pt" w:h="841.90pt" w:code="9"/>
           <w:pgMar w:top="27pt" w:right="44.65pt" w:bottom="72pt" w:left="44.65pt" w:header="36pt" w:footer="36pt" w:gutter="0pt"/>
           <w:cols w:space="36pt"/>
@@ -298,6 +297,7 @@
           <w:lang w:val="hr-HR"/>
         </w:rPr>
       </w:pPr>
+      <w:proofErr w:type="spellStart"/>
       <w:r>
         <w:rPr>
           <w:i/>
@@ -306,6 +306,7 @@
         </w:rPr>
         <w:t>Abstract</w:t>
       </w:r>
+      <w:proofErr w:type="spellEnd"/>
       <w:r>
         <w:rPr>
           <w:lang w:val="hr-HR"/>
@@ -326,18 +327,48 @@
           <w:lang w:val="hr-HR"/>
         </w:rPr>
       </w:pPr>
-      <w:r>
-        <w:rPr>
-          <w:lang w:val="hr-HR"/>
-        </w:rPr>
-        <w:t>Keywords—</w:t>
-      </w:r>
-      <w:r>
-        <w:rPr>
-          <w:lang w:val="hr-HR"/>
-        </w:rPr>
-        <w:t>rak dojke, ultrazvuk, duboko učenje, neuronske mreže, programski jezik Python, Jupyter Notebooks</w:t>
-      </w:r>
+      <w:proofErr w:type="spellStart"/>
+      <w:r>
+        <w:rPr>
+          <w:lang w:val="hr-HR"/>
+        </w:rPr>
+        <w:t>Keywords</w:t>
+      </w:r>
+      <w:proofErr w:type="spellEnd"/>
+      <w:r>
+        <w:rPr>
+          <w:lang w:val="hr-HR"/>
+        </w:rPr>
+        <w:t>—</w:t>
+      </w:r>
+      <w:r>
+        <w:rPr>
+          <w:lang w:val="hr-HR"/>
+        </w:rPr>
+        <w:t xml:space="preserve">rak dojke, ultrazvuk, duboko učenje, neuronske mreže, programski jezik Python, </w:t>
+      </w:r>
+      <w:proofErr w:type="spellStart"/>
+      <w:r>
+        <w:rPr>
+          <w:lang w:val="hr-HR"/>
+        </w:rPr>
+        <w:t>Jupyter</w:t>
+      </w:r>
+      <w:proofErr w:type="spellEnd"/>
+      <w:r>
+        <w:rPr>
+          <w:lang w:val="hr-HR"/>
+        </w:rPr>
+        <w:t xml:space="preserve"> </w:t>
+      </w:r>
+      <w:proofErr w:type="spellStart"/>
+      <w:r>
+        <w:rPr>
+          <w:lang w:val="hr-HR"/>
+        </w:rPr>
+        <w:t>Notebooks</w:t>
+      </w:r>
+      <w:proofErr w:type="spellEnd"/>
     </w:p>
     <w:p>
       <w:pPr>
@@ -476,7 +507,21 @@
         <w:rPr>
           <w:lang w:val="hr-HR"/>
         </w:rPr>
-        <w:t xml:space="preserve">bezbolnu kvržicu na grudima, promjenu oblika ili izgleda dojke, stvaranje udubljenja, crvenila ili drugih promjena na koži, promjene u izgledu bradavice (areole) ili kože oko nje te abnormalni ili krvavi iscjedak iz bradavice [1]. </w:t>
+        <w:t>bezbolnu kvržicu na grudima, promjenu oblika ili izgleda dojke, stvaranje udubljenja, crvenila ili drugih promjena na koži, promjene u izgledu bradavice (</w:t>
+      </w:r>
+      <w:proofErr w:type="spellStart"/>
+      <w:r>
+        <w:rPr>
+          <w:lang w:val="hr-HR"/>
+        </w:rPr>
+        <w:t>areole</w:t>
+      </w:r>
+      <w:proofErr w:type="spellEnd"/>
+      <w:r>
+        <w:rPr>
+          <w:lang w:val="hr-HR"/>
+        </w:rPr>
+        <w:t xml:space="preserve">) ili kože oko nje te abnormalni ili krvavi iscjedak iz bradavice [1]. </w:t>
       </w:r>
     </w:p>
     <w:p>
@@ -558,7 +603,21 @@
         <w:rPr>
           <w:lang w:val="hr-HR"/>
         </w:rPr>
-        <w:t>tablici 1. Među tim značajkama, najbitniji faktori pri klasificiranju lezija su: okolno tkivo, oblik, kontura ruba, granica lezije i posteriorne akustičke značajke [4].</w:t>
+        <w:t xml:space="preserve">tablici 1. Među tim značajkama, najbitniji faktori pri klasificiranju lezija su: okolno tkivo, oblik, kontura ruba, granica lezije i </w:t>
+      </w:r>
+      <w:proofErr w:type="spellStart"/>
+      <w:r>
+        <w:rPr>
+          <w:lang w:val="hr-HR"/>
+        </w:rPr>
+        <w:t>posteriorne</w:t>
+      </w:r>
+      <w:proofErr w:type="spellEnd"/>
+      <w:r>
+        <w:rPr>
+          <w:lang w:val="hr-HR"/>
+        </w:rPr>
+        <w:t xml:space="preserve"> akustičke značajke [4].</w:t>
       </w:r>
     </w:p>
     <w:p>
@@ -575,7 +634,7 @@
           <w:lang w:val="hr-HR"/>
         </w:rPr>
         <w:drawing>
-          <wp:inline distT="0" distB="0" distL="0" distR="0" wp14:anchorId="7FB9EBF8" wp14:editId="68DF58EF">
+          <wp:inline distT="0" distB="0" distL="0" distR="0" wp14:anchorId="7FB9EBF8" wp14:editId="6BE58934">
             <wp:extent cx="3089910" cy="2246630"/>
             <wp:effectExtent l="0" t="0" r="0" b="1270"/>
             <wp:docPr id="1016865219" name="Picture 2" descr="A screenshot of a medical chart&#10;&#10;Description automatically generated"/>
@@ -590,7 +649,7 @@
                     <pic:cNvPicPr/>
                   </pic:nvPicPr>
                   <pic:blipFill>
-                    <a:blip r:embed="rId9" cstate="print">
+                    <a:blip r:embed="rId8" cstate="print">
                       <a:extLst>
                         <a:ext uri="{28A0092B-C50C-407E-A947-70E740481C1C}">
                           <a14:useLocalDpi xmlns:a14="http://schemas.microsoft.com/office/drawing/2010/main" val="0"/>
@@ -689,8 +748,16 @@
         <w:rPr>
           <w:lang w:val="hr-HR"/>
         </w:rPr>
-        <w:t>odabrati podatkovni skup koji će se koristiti za treniranje i testiranje modela. Odlučili smo se za javno dostupan skup podataka koji je dostupan na stranici Kaggle</w:t>
-      </w:r>
+        <w:t xml:space="preserve">odabrati podatkovni skup koji će se koristiti za treniranje i testiranje modela. Odlučili smo se za javno dostupan skup podataka koji je dostupan na stranici </w:t>
+      </w:r>
+      <w:proofErr w:type="spellStart"/>
+      <w:r>
+        <w:rPr>
+          <w:lang w:val="hr-HR"/>
+        </w:rPr>
+        <w:t>Kaggle</w:t>
+      </w:r>
+      <w:proofErr w:type="spellEnd"/>
       <w:r>
         <w:rPr>
           <w:lang w:val="hr-HR"/>
@@ -709,28 +776,86 @@
         </w:rPr>
         <w:t>. U skupu je 1566 pacijenata. Za svakog pacijenta može postojati nekoliko slika s mamografije iz različitih pozicija, a u skupu podataka se također nalaze izrezane slike manjih dimenzija koje fokusiraju određen dio rendgenske slike (</w:t>
       </w:r>
-      <w:r>
-        <w:rPr>
-          <w:i/>
-          <w:iCs/>
-          <w:lang w:val="hr-HR"/>
-        </w:rPr>
-        <w:t>cropped images</w:t>
-      </w:r>
+      <w:proofErr w:type="spellStart"/>
+      <w:r>
+        <w:rPr>
+          <w:i/>
+          <w:iCs/>
+          <w:lang w:val="hr-HR"/>
+        </w:rPr>
+        <w:t>cropped</w:t>
+      </w:r>
+      <w:proofErr w:type="spellEnd"/>
+      <w:r>
+        <w:rPr>
+          <w:i/>
+          <w:iCs/>
+          <w:lang w:val="hr-HR"/>
+        </w:rPr>
+        <w:t xml:space="preserve"> </w:t>
+      </w:r>
+      <w:proofErr w:type="spellStart"/>
+      <w:r>
+        <w:rPr>
+          <w:i/>
+          <w:iCs/>
+          <w:lang w:val="hr-HR"/>
+        </w:rPr>
+        <w:t>images</w:t>
+      </w:r>
+      <w:proofErr w:type="spellEnd"/>
       <w:r>
         <w:rPr>
           <w:lang w:val="hr-HR"/>
         </w:rPr>
         <w:t>) koji možda sadrži oblik raka te ROI (</w:t>
       </w:r>
-      <w:r>
-        <w:rPr>
-          <w:i/>
-          <w:iCs/>
-          <w:lang w:val="hr-HR"/>
-        </w:rPr>
-        <w:t>region of interest</w:t>
-      </w:r>
+      <w:proofErr w:type="spellStart"/>
+      <w:r>
+        <w:rPr>
+          <w:i/>
+          <w:iCs/>
+          <w:lang w:val="hr-HR"/>
+        </w:rPr>
+        <w:t>region</w:t>
+      </w:r>
+      <w:proofErr w:type="spellEnd"/>
+      <w:r>
+        <w:rPr>
+          <w:i/>
+          <w:iCs/>
+          <w:lang w:val="hr-HR"/>
+        </w:rPr>
+        <w:t xml:space="preserve"> </w:t>
+      </w:r>
+      <w:proofErr w:type="spellStart"/>
+      <w:r>
+        <w:rPr>
+          <w:i/>
+          <w:iCs/>
+          <w:lang w:val="hr-HR"/>
+        </w:rPr>
+        <w:t>of</w:t>
+      </w:r>
+      <w:proofErr w:type="spellEnd"/>
+      <w:r>
+        <w:rPr>
+          <w:i/>
+          <w:iCs/>
+          <w:lang w:val="hr-HR"/>
+        </w:rPr>
+        <w:t xml:space="preserve"> </w:t>
+      </w:r>
+      <w:proofErr w:type="spellStart"/>
+      <w:r>
+        <w:rPr>
+          <w:i/>
+          <w:iCs/>
+          <w:lang w:val="hr-HR"/>
+        </w:rPr>
+        <w:t>interest</w:t>
+      </w:r>
+      <w:proofErr w:type="spellEnd"/>
       <w:r>
         <w:rPr>
           <w:lang w:val="hr-HR"/>
@@ -749,7 +874,21 @@
         <w:rPr>
           <w:lang w:val="hr-HR"/>
         </w:rPr>
-        <w:t>Originalni skup podataka je bio podijeljen u 2 direktorija, „csv“</w:t>
+        <w:t>Originalni skup podataka je bio podijeljen u 2 direktorija, „</w:t>
+      </w:r>
+      <w:proofErr w:type="spellStart"/>
+      <w:r>
+        <w:rPr>
+          <w:lang w:val="hr-HR"/>
+        </w:rPr>
+        <w:t>csv</w:t>
+      </w:r>
+      <w:proofErr w:type="spellEnd"/>
+      <w:r>
+        <w:rPr>
+          <w:lang w:val="hr-HR"/>
+        </w:rPr>
+        <w:t>“</w:t>
       </w:r>
       <w:r>
         <w:rPr>
@@ -763,7 +902,49 @@
         <w:rPr>
           <w:lang w:val="hr-HR"/>
         </w:rPr>
-        <w:t xml:space="preserve">i „jpeg“. U „csv“ direktoriju se nalazi nekoliko .csv datoteka koje sadrže informacije kao što su ID pacijenta, </w:t>
+        <w:t>i „</w:t>
+      </w:r>
+      <w:proofErr w:type="spellStart"/>
+      <w:r>
+        <w:rPr>
+          <w:lang w:val="hr-HR"/>
+        </w:rPr>
+        <w:t>jpeg</w:t>
+      </w:r>
+      <w:proofErr w:type="spellEnd"/>
+      <w:r>
+        <w:rPr>
+          <w:lang w:val="hr-HR"/>
+        </w:rPr>
+        <w:t>“. U „</w:t>
+      </w:r>
+      <w:proofErr w:type="spellStart"/>
+      <w:r>
+        <w:rPr>
+          <w:lang w:val="hr-HR"/>
+        </w:rPr>
+        <w:t>csv</w:t>
+      </w:r>
+      <w:proofErr w:type="spellEnd"/>
+      <w:r>
+        <w:rPr>
+          <w:lang w:val="hr-HR"/>
+        </w:rPr>
+        <w:t>“ direktoriju se nalazi nekoliko .</w:t>
+      </w:r>
+      <w:proofErr w:type="spellStart"/>
+      <w:r>
+        <w:rPr>
+          <w:lang w:val="hr-HR"/>
+        </w:rPr>
+        <w:t>csv</w:t>
+      </w:r>
+      <w:proofErr w:type="spellEnd"/>
+      <w:r>
+        <w:rPr>
+          <w:lang w:val="hr-HR"/>
+        </w:rPr>
+        <w:t xml:space="preserve"> datoteka koje sadrže informacije kao što su ID pacijenta, </w:t>
       </w:r>
       <w:r>
         <w:rPr>
@@ -778,7 +959,7 @@
           <w:lang w:val="hr-HR"/>
         </w:rPr>
         <w:drawing>
-          <wp:anchor distT="0" distB="0" distL="114300" distR="114300" simplePos="0" relativeHeight="251659776" behindDoc="0" locked="0" layoutInCell="1" allowOverlap="1" wp14:anchorId="736B4D69" wp14:editId="1B5D6459">
+          <wp:anchor distT="0" distB="0" distL="114300" distR="114300" simplePos="0" relativeHeight="251659776" behindDoc="0" locked="0" layoutInCell="1" allowOverlap="1" wp14:anchorId="736B4D69" wp14:editId="57C2EC06">
             <wp:simplePos x="0" y="0"/>
             <wp:positionH relativeFrom="column">
               <wp:posOffset>3213100</wp:posOffset>
@@ -801,7 +982,7 @@
                     <pic:cNvPicPr/>
                   </pic:nvPicPr>
                   <pic:blipFill>
-                    <a:blip r:embed="rId10" cstate="print">
+                    <a:blip r:embed="rId9" cstate="print">
                       <a:extLst>
                         <a:ext uri="{28A0092B-C50C-407E-A947-70E740481C1C}">
                           <a14:useLocalDpi xmlns:a14="http://schemas.microsoft.com/office/drawing/2010/main" val="0"/>
@@ -843,7 +1024,21 @@
         <w:rPr>
           <w:lang w:val="hr-HR"/>
         </w:rPr>
-        <w:t xml:space="preserve">like (kraniokaudalna ili medijalno-lateralna kosa projekcija) i nama najbitniji podatak; patologija. Ta nam kategorija, odnosno stupac govori je li na specifičnoj slici prisutno </w:t>
+        <w:t>like (</w:t>
+      </w:r>
+      <w:proofErr w:type="spellStart"/>
+      <w:r>
+        <w:rPr>
+          <w:lang w:val="hr-HR"/>
+        </w:rPr>
+        <w:t>kraniokaudalna</w:t>
+      </w:r>
+      <w:proofErr w:type="spellEnd"/>
+      <w:r>
+        <w:rPr>
+          <w:lang w:val="hr-HR"/>
+        </w:rPr>
+        <w:t xml:space="preserve"> ili medijalno-lateralna kosa projekcija) i nama najbitniji podatak; patologija. Ta nam kategorija, odnosno stupac govori je li na specifičnoj slici prisutno </w:t>
       </w:r>
       <w:r>
         <w:rPr>
@@ -897,7 +1092,21 @@
         <w:rPr>
           <w:lang w:val="hr-HR"/>
         </w:rPr>
-        <w:t xml:space="preserve">. Ove su tri kategorije u podacima označene kao MALIGNANT, BENIGN i BENIGN_WITHOUT_CALLBACK. U „jpeg“ direktoriju nalazilo se 6774 direktorija od kojih su neki sadržavali originalnu sliku rendgenske snimke s mamografije koja je velikih dimenzija, a neki direktoriji su sadržavali po dvije slike od kojih je jedna bila izrezani manji dio originalne slike, a druga ROI maska koja prikazuje fokusirano područje originalne slike. Jedna originalna rendgenska slika može biti povezana s više </w:t>
+        <w:t>. Ove su tri kategorije u podacima označene kao MALIGNANT, BENIGN i BENIGN_WITHOUT_CALLBACK. U „</w:t>
+      </w:r>
+      <w:proofErr w:type="spellStart"/>
+      <w:r>
+        <w:rPr>
+          <w:lang w:val="hr-HR"/>
+        </w:rPr>
+        <w:t>jpeg</w:t>
+      </w:r>
+      <w:proofErr w:type="spellEnd"/>
+      <w:r>
+        <w:rPr>
+          <w:lang w:val="hr-HR"/>
+        </w:rPr>
+        <w:t xml:space="preserve">“ direktoriju nalazilo se 6774 direktorija od kojih su neki sadržavali originalnu sliku rendgenske snimke s mamografije koja je velikih dimenzija, a neki direktoriji su sadržavali po dvije slike od kojih je jedna bila izrezani manji dio originalne slike, a druga ROI maska koja prikazuje fokusirano područje originalne slike. Jedna originalna rendgenska slika može biti povezana s više </w:t>
       </w:r>
       <w:r>
         <w:rPr>
@@ -909,7 +1118,21 @@
         <w:rPr>
           <w:lang w:val="hr-HR"/>
         </w:rPr>
-        <w:t xml:space="preserve"> što se da zaključiti analizom .csv datoteka. To ima smisla jer neke dojke mogu imati više područja za koja se sumnja da sadrže maligno tkivo.</w:t>
+        <w:t xml:space="preserve"> što se da zaključiti analizom .</w:t>
+      </w:r>
+      <w:proofErr w:type="spellStart"/>
+      <w:r>
+        <w:rPr>
+          <w:lang w:val="hr-HR"/>
+        </w:rPr>
+        <w:t>csv</w:t>
+      </w:r>
+      <w:proofErr w:type="spellEnd"/>
+      <w:r>
+        <w:rPr>
+          <w:lang w:val="hr-HR"/>
+        </w:rPr>
+        <w:t xml:space="preserve"> datoteka. To ima smisla jer neke dojke mogu imati više područja za koja se sumnja da sadrže maligno tkivo.</w:t>
       </w:r>
     </w:p>
     <w:p>
@@ -926,7 +1149,7 @@
           <w:lang w:val="hr-HR"/>
         </w:rPr>
         <w:drawing>
-          <wp:anchor distT="0" distB="0" distL="114300" distR="114300" simplePos="0" relativeHeight="251660800" behindDoc="0" locked="0" layoutInCell="1" allowOverlap="1" wp14:anchorId="49758A6F" wp14:editId="42F064F2">
+          <wp:anchor distT="0" distB="0" distL="114300" distR="114300" simplePos="0" relativeHeight="251660800" behindDoc="0" locked="0" layoutInCell="1" allowOverlap="1" wp14:anchorId="49758A6F" wp14:editId="25F23408">
             <wp:simplePos x="0" y="0"/>
             <wp:positionH relativeFrom="column">
               <wp:posOffset>3538855</wp:posOffset>
@@ -949,7 +1172,7 @@
                     <pic:cNvPicPr/>
                   </pic:nvPicPr>
                   <pic:blipFill>
-                    <a:blip r:embed="rId11" cstate="print">
+                    <a:blip r:embed="rId10" cstate="print">
                       <a:extLst>
                         <a:ext uri="{28A0092B-C50C-407E-A947-70E740481C1C}">
                           <a14:useLocalDpi xmlns:a14="http://schemas.microsoft.com/office/drawing/2010/main" val="0"/>
@@ -987,7 +1210,7 @@
           <w:lang w:val="hr-HR"/>
         </w:rPr>
         <w:drawing>
-          <wp:anchor distT="0" distB="0" distL="114300" distR="114300" simplePos="0" relativeHeight="251658752" behindDoc="0" locked="0" layoutInCell="1" allowOverlap="1" wp14:anchorId="00A0AC88" wp14:editId="021D8E80">
+          <wp:anchor distT="0" distB="0" distL="114300" distR="114300" simplePos="0" relativeHeight="251658752" behindDoc="0" locked="0" layoutInCell="1" allowOverlap="1" wp14:anchorId="00A0AC88" wp14:editId="65F5E8D6">
             <wp:simplePos x="0" y="0"/>
             <wp:positionH relativeFrom="column">
               <wp:align>right</wp:align>
@@ -1010,7 +1233,7 @@
                     <pic:cNvPicPr/>
                   </pic:nvPicPr>
                   <pic:blipFill>
-                    <a:blip r:embed="rId12" cstate="print">
+                    <a:blip r:embed="rId11" cstate="print">
                       <a:extLst>
                         <a:ext uri="{28A0092B-C50C-407E-A947-70E740481C1C}">
                           <a14:useLocalDpi xmlns:a14="http://schemas.microsoft.com/office/drawing/2010/main" val="0"/>
@@ -1058,7 +1281,21 @@
         <w:rPr>
           <w:lang w:val="hr-HR"/>
         </w:rPr>
-        <w:t>koristiti isključivo izrezane slike manjih dimenzija za model jer su na njima već izdvojena područja interesa i manjih su dimenzija, odnosno veličine što će znatno ubrzati učenje i olakšati izradu modela. Kada bismo koristili originalne rendgenske slike cijeli skup podataka bi imao preko 11 GB, a ovako je sveden na nešto više od 200 MB. ROI maske nam također nisu od interesa jer ne sadrže nikakvu korisnu informaciju o tome je li prikazano tkivo maligno, već samo imaju bijelu točku koja je okružena crnom pozadinom te predstavlja s kojeg je dijela originalne slike uzeta izrezana slika. Budući da se ROI maske i izrezane slike nalaze u istim direktorijima, bilo je potrebno pronaći način za automatizirano razlikovanje i preuzimanje samo izrezanih slika iz više od 3000 direktorija. U imenima .jpg datoteka nije specificirano radi li se o ROI maski ili izrezanoj slici</w:t>
+        <w:t>koristiti isključivo izrezane slike manjih dimenzija za model jer su na njima već izdvojena područja interesa i manjih su dimenzija, odnosno veličine što će znatno ubrzati učenje i olakšati izradu modela. Kada bismo koristili originalne rendgenske slike cijeli skup podataka bi imao preko 11 GB, a ovako je sveden na nešto više od 200 MB. ROI maske nam također nisu od interesa jer ne sadrže nikakvu korisnu informaciju o tome je li prikazano tkivo maligno, već samo imaju bijelu točku koja je okružena crnom pozadinom te predstavlja s kojeg je dijela originalne slike uzeta izrezana slika. Budući da se ROI maske i izrezane slike nalaze u istim direktorijima, bilo je potrebno pronaći način za automatizirano razlikovanje i preuzimanje samo izrezanih slika iz više od 3000 direktorija. U imenima .</w:t>
+      </w:r>
+      <w:proofErr w:type="spellStart"/>
+      <w:r>
+        <w:rPr>
+          <w:lang w:val="hr-HR"/>
+        </w:rPr>
+        <w:t>jpg</w:t>
+      </w:r>
+      <w:proofErr w:type="spellEnd"/>
+      <w:r>
+        <w:rPr>
+          <w:lang w:val="hr-HR"/>
+        </w:rPr>
+        <w:t xml:space="preserve"> datoteka nije specificirano radi li se o ROI maski ili izrezanoj slici</w:t>
       </w:r>
       <w:r>
         <w:rPr>
@@ -1070,7 +1307,21 @@
         <w:rPr>
           <w:lang w:val="hr-HR"/>
         </w:rPr>
-        <w:t>. Također u .csv datotekama isto nije specificirano koja je od dvije datoteke u direktoriju ROI maska, a koja izrezana slika.</w:t>
+        <w:t>. Također u .</w:t>
+      </w:r>
+      <w:proofErr w:type="spellStart"/>
+      <w:r>
+        <w:rPr>
+          <w:lang w:val="hr-HR"/>
+        </w:rPr>
+        <w:t>csv</w:t>
+      </w:r>
+      <w:proofErr w:type="spellEnd"/>
+      <w:r>
+        <w:rPr>
+          <w:lang w:val="hr-HR"/>
+        </w:rPr>
+        <w:t xml:space="preserve"> datotekama isto nije specificirano koja je od dvije datoteke u direktoriju ROI maska, a koja izrezana slika.</w:t>
       </w:r>
       <w:r>
         <w:rPr>
@@ -1134,6 +1385,7 @@
         </w:rPr>
         <w:t xml:space="preserve">Na skupu za treniranje koji ima po 1546 izrezanih slika i ROI maski, vidimo par </w:t>
       </w:r>
+      <w:proofErr w:type="spellStart"/>
       <w:r>
         <w:rPr>
           <w:i/>
@@ -1141,13 +1393,23 @@
           <w:spacing w:val="-1"/>
           <w:lang w:eastAsia="x-none"/>
         </w:rPr>
-        <w:t xml:space="preserve">outliera, </w:t>
-      </w:r>
-      <w:r>
-        <w:rPr>
+        <w:t>outliera</w:t>
+      </w:r>
+      <w:proofErr w:type="spellEnd"/>
+      <w:r>
+        <w:rPr>
+          <w:i/>
+          <w:iCs/>
           <w:spacing w:val="-1"/>
           <w:lang w:eastAsia="x-none"/>
         </w:rPr>
+        <w:t xml:space="preserve">, </w:t>
+      </w:r>
+      <w:r>
+        <w:rPr>
+          <w:spacing w:val="-1"/>
+          <w:lang w:eastAsia="x-none"/>
+        </w:rPr>
         <w:t>odnosno izrezanih slika (označene plavim točkama na grafu) koje su nešto većih dimenzija, što je za očekivati s obzirom na puno veći podatkovni skup. Bitno je da su te velike izrezane slike i dalje veće površine od ROI maske s kojom su u direktoriju, jer je to uvjet po kojem odvajamo izrezane slike. Budući da je uvjet zadovoljen, uspješno smo izolirali izrezane slike koje ćemo koristiti za testiranje i treniranje modela.</w:t>
       </w:r>
     </w:p>
@@ -1160,7 +1422,7 @@
           <w:noProof/>
         </w:rPr>
         <w:drawing>
-          <wp:anchor distT="0" distB="0" distL="114300" distR="114300" simplePos="0" relativeHeight="251661824" behindDoc="0" locked="0" layoutInCell="1" allowOverlap="1" wp14:anchorId="10400D5B" wp14:editId="63D8756C">
+          <wp:anchor distT="0" distB="0" distL="114300" distR="114300" simplePos="0" relativeHeight="251661824" behindDoc="0" locked="0" layoutInCell="1" allowOverlap="1" wp14:anchorId="10400D5B" wp14:editId="09F3B866">
             <wp:simplePos x="0" y="0"/>
             <wp:positionH relativeFrom="column">
               <wp:posOffset>221615</wp:posOffset>
@@ -1183,7 +1445,7 @@
                     <pic:cNvPicPr/>
                   </pic:nvPicPr>
                   <pic:blipFill>
-                    <a:blip r:embed="rId13" cstate="print">
+                    <a:blip r:embed="rId12" cstate="print">
                       <a:extLst>
                         <a:ext uri="{28A0092B-C50C-407E-A947-70E740481C1C}">
                           <a14:useLocalDpi xmlns:a14="http://schemas.microsoft.com/office/drawing/2010/main" val="0"/>
@@ -1219,7 +1481,15 @@
         <w:t xml:space="preserve">Slika 4. </w:t>
       </w:r>
       <w:r>
-        <w:t>Razdioba vrijednosti značajke Pathology na skupu za treniranje</w:t>
+        <w:t xml:space="preserve">Razdioba vrijednosti značajke </w:t>
+      </w:r>
+      <w:proofErr w:type="spellStart"/>
+      <w:r>
+        <w:t>Pathology</w:t>
+      </w:r>
+      <w:proofErr w:type="spellEnd"/>
+      <w:r>
+        <w:t xml:space="preserve"> na skupu za treniranje</w:t>
       </w:r>
     </w:p>
     <w:p>
@@ -1227,7 +1497,15 @@
         <w:pStyle w:val="Caption"/>
       </w:pPr>
       <w:r>
-        <w:t>Slika 5. Razdioba vrijednosti značajke Pathology na testnom skupu</w:t>
+        <w:t xml:space="preserve">Slika 5. Razdioba vrijednosti značajke </w:t>
+      </w:r>
+      <w:proofErr w:type="spellStart"/>
+      <w:r>
+        <w:t>Pathology</w:t>
+      </w:r>
+      <w:proofErr w:type="spellEnd"/>
+      <w:r>
+        <w:t xml:space="preserve"> na testnom skupu</w:t>
       </w:r>
     </w:p>
     <w:p>
@@ -1246,6 +1524,7 @@
         <w:lastRenderedPageBreak/>
         <w:t>Sa Slike 4. je vidljivo da je frekvencija mogućih vrijednosti stručnih dijagnoza (</w:t>
       </w:r>
+      <w:proofErr w:type="spellStart"/>
       <w:r>
         <w:rPr>
           <w:i/>
@@ -1253,15 +1532,18 @@
         </w:rPr>
         <w:t>Pahtology</w:t>
       </w:r>
+      <w:proofErr w:type="spellEnd"/>
       <w:r>
         <w:t xml:space="preserve">) za tkiva prikazana na izrezanim slikama podjednaka za sve tri vrijednosti na skupu za treniranje. Slika 5. prikazuje da situacija nije ista na skupu za testiranje gdje je ipak broj slika s oznakom BENIGN_WITHOUT_CALLBACK skoro duplo manji od broja oznaka BENIGN i MALIGNANT. </w:t>
       </w:r>
       <w:r>
         <w:t xml:space="preserve">Zbog toga će biti potrebno da osim same preciznosti, kod evaluacije modela koristimo i druge metrike za performanse kao što su odziv, F1 </w:t>
       </w:r>
+      <w:proofErr w:type="spellStart"/>
       <w:r>
         <w:t>score</w:t>
       </w:r>
+      <w:proofErr w:type="spellEnd"/>
       <w:r>
         <w:t xml:space="preserve"> i ROC-AUC krivulje. </w:t>
       </w:r>
@@ -1274,6 +1556,7 @@
       <w:r>
         <w:t xml:space="preserve"> na to da su podaci u skupu za treniranje balansirani s obzirom na značajku </w:t>
       </w:r>
+      <w:proofErr w:type="spellStart"/>
       <w:r>
         <w:rPr>
           <w:i/>
@@ -1281,8 +1564,17 @@
         </w:rPr>
         <w:t>Pathology</w:t>
       </w:r>
-      <w:r>
-        <w:t xml:space="preserve"> kako bi modeli bili jednako pouzdani za klasifikaciju sve tri značajke. Analizom kompletnog podatkovnog skupa je također utvrđeno da se slike svakog pojedinog pacijenta nalaze ili u skupu za treniranje ili u skupu za testiranje, dakle niti jednom pacijentu različite izrezane verzije slika nisu završile u oba podatkovna skupa. Time je osigurana konzistentnost i sprječavanje da se model prenauči jer je poanta da model može dobro predviđati za nove pacijente na čijim slikama nije već treniran.</w:t>
+      <w:proofErr w:type="spellEnd"/>
+      <w:r>
+        <w:t xml:space="preserve"> kako bi modeli bili jednako pouzdani za klasifikaciju sve tri značajke. Analizom kompletnog podatkovnog skupa je također utvrđeno da se slike svakog pojedinog pacijenta nalaze ili u skupu za treniranje ili u skupu za testiranje, dakle niti jednom pacijentu različite izrezane verzije slika nisu završile u oba podatkovna skupa. Time je osigurana konzistentnost i sprječavanje da se model </w:t>
+      </w:r>
+      <w:proofErr w:type="spellStart"/>
+      <w:r>
+        <w:t>prenauči</w:t>
+      </w:r>
+      <w:proofErr w:type="spellEnd"/>
+      <w:r>
+        <w:t xml:space="preserve"> jer je poanta da model može dobro predviđati za nove pacijente na čijim slikama nije već treniran.</w:t>
       </w:r>
     </w:p>
     <w:p>
@@ -1304,7 +1596,15 @@
         <w:jc w:val="both"/>
       </w:pPr>
       <w:r>
-        <w:t xml:space="preserve">Za implementaciju neuronskih mreža, korištena je biblioteka PyTorch </w:t>
+        <w:t xml:space="preserve">Za implementaciju neuronskih mreža, korištena je biblioteka </w:t>
+      </w:r>
+      <w:proofErr w:type="spellStart"/>
+      <w:r>
+        <w:t>PyTorch</w:t>
+      </w:r>
+      <w:proofErr w:type="spellEnd"/>
+      <w:r>
+        <w:t xml:space="preserve"> </w:t>
       </w:r>
       <w:r>
         <w:t xml:space="preserve">zato </w:t>
@@ -1319,10 +1619,50 @@
         <w:jc w:val="both"/>
       </w:pPr>
       <w:r>
-        <w:t>Učitavanje podataka odrađeno je pomoću prilagođene klase BreastCancerDataset koja nam omogućuje učitavanje i transformaciju slike te povezivanje s pripadajućom klasifikacijom. Podaci su učitani iz CSV datoteka 'train_data' i 'test_data'</w:t>
-      </w:r>
-      <w:r>
-        <w:t xml:space="preserve"> pomoću biblioteke pandas, a klasifikacija je ručno tranformirana u brojčane vrijednosti unutar klase.</w:t>
+        <w:t xml:space="preserve">Učitavanje podataka odrađeno je pomoću prilagođene klase </w:t>
+      </w:r>
+      <w:proofErr w:type="spellStart"/>
+      <w:r>
+        <w:t>BreastCancerDataset</w:t>
+      </w:r>
+      <w:proofErr w:type="spellEnd"/>
+      <w:r>
+        <w:t xml:space="preserve"> koja nam omogućuje učitavanje i transformaciju slike te povezivanje s pripadajućom klasifikacijom. Podaci su učitani iz CSV datoteka '</w:t>
+      </w:r>
+      <w:proofErr w:type="spellStart"/>
+      <w:r>
+        <w:t>train_data</w:t>
+      </w:r>
+      <w:proofErr w:type="spellEnd"/>
+      <w:r>
+        <w:t>' i '</w:t>
+      </w:r>
+      <w:proofErr w:type="spellStart"/>
+      <w:r>
+        <w:t>test_data</w:t>
+      </w:r>
+      <w:proofErr w:type="spellEnd"/>
+      <w:r>
+        <w:t>'</w:t>
+      </w:r>
+      <w:r>
+        <w:t xml:space="preserve"> pomoću biblioteke </w:t>
+      </w:r>
+      <w:proofErr w:type="spellStart"/>
+      <w:r>
+        <w:t>pandas</w:t>
+      </w:r>
+      <w:proofErr w:type="spellEnd"/>
+      <w:r>
+        <w:t xml:space="preserve">, a klasifikacija je ručno </w:t>
+      </w:r>
+      <w:proofErr w:type="spellStart"/>
+      <w:r>
+        <w:t>tranformirana</w:t>
+      </w:r>
+      <w:proofErr w:type="spellEnd"/>
+      <w:r>
+        <w:t xml:space="preserve"> u brojčane vrijednosti unutar klase.</w:t>
       </w:r>
     </w:p>
     <w:p>
@@ -1331,16 +1671,195 @@
         <w:jc w:val="both"/>
       </w:pPr>
       <w:r>
-        <w:t xml:space="preserve">Cilj istraživanja bio je usporediti dva pristupa: treniranje modela od nule i korištenje unaprijed istreniranih modela, poput ResNet-a, istreniranih na skupu podataka ImageNet. </w:t>
-      </w:r>
-      <w:r>
-        <w:t xml:space="preserve">Klasa CNN definira model kojeg ćemo trenirati od nule. Model je definiran pomoću biblioteke 'torch.nn', a sastoji se od </w:t>
-      </w:r>
-      <w:r>
-        <w:t xml:space="preserve">dva bloka konvolucijskih slojeva. </w:t>
-      </w:r>
-      <w:r>
-        <w:t xml:space="preserve">Blokovi se sastoje od dva konvolucijska sloja </w:t>
+        <w:rPr>
+          <w:noProof/>
+        </w:rPr>
+        <w:drawing>
+          <wp:anchor distT="45720" distB="45720" distL="114300" distR="114300" simplePos="0" relativeHeight="251667968" behindDoc="0" locked="0" layoutInCell="1" allowOverlap="1" wp14:anchorId="2BF1FCE4" wp14:editId="2AC48055">
+            <wp:simplePos x="0" y="0"/>
+            <wp:positionH relativeFrom="column">
+              <wp:posOffset>3562985</wp:posOffset>
+            </wp:positionH>
+            <wp:positionV relativeFrom="paragraph">
+              <wp:posOffset>630555</wp:posOffset>
+            </wp:positionV>
+            <wp:extent cx="2360930" cy="228600"/>
+            <wp:effectExtent l="0" t="0" r="0" b="0"/>
+            <wp:wrapSquare wrapText="bothSides"/>
+            <wp:docPr id="652591795" name="Text Box 2"/>
+            <wp:cNvGraphicFramePr>
+              <a:graphicFrameLocks xmlns:a="http://purl.oclc.org/ooxml/drawingml/main"/>
+            </wp:cNvGraphicFramePr>
+            <a:graphic xmlns:a="http://purl.oclc.org/ooxml/drawingml/main">
+              <a:graphicData uri="http://schemas.microsoft.com/office/word/2010/wordprocessingShape">
+                <wp:wsp>
+                  <wp:cNvSpPr txBox="1">
+                    <a:spLocks noChangeArrowheads="1"/>
+                  </wp:cNvSpPr>
+                  <wp:spPr bwMode="auto">
+                    <a:xfrm>
+                      <a:off x="0" y="0"/>
+                      <a:ext cx="2360930" cy="228600"/>
+                    </a:xfrm>
+                    <a:prstGeom prst="rect">
+                      <a:avLst/>
+                    </a:prstGeom>
+                    <a:noFill/>
+                    <a:ln w="9525">
+                      <a:noFill/>
+                      <a:miter lim="800%"/>
+                      <a:headEnd/>
+                      <a:tailEnd/>
+                    </a:ln>
+                  </wp:spPr>
+                  <wp:txbx>
+                    <wne:txbxContent>
+                      <w:p>
+                        <w:pPr>
+                          <w:pStyle w:val="Caption"/>
+                        </w:pPr>
+                        <w:r>
+                          <w:t xml:space="preserve">Formula 1. Računanje F1 </w:t>
+                        </w:r>
+                        <w:proofErr w:type="spellStart"/>
+                        <w:r>
+                          <w:t>score</w:t>
+                        </w:r>
+                        <w:proofErr w:type="spellEnd"/>
+                        <w:r>
+                          <w:t>-a</w:t>
+                        </w:r>
+                      </w:p>
+                      <w:p/>
+                    </wne:txbxContent>
+                  </wp:txbx>
+                  <wp:bodyPr rot="0" vert="horz" wrap="square" lIns="91440" tIns="45720" rIns="91440" bIns="45720" anchor="t" anchorCtr="0">
+                    <a:noAutofit/>
+                  </wp:bodyPr>
+                </wp:wsp>
+              </a:graphicData>
+            </a:graphic>
+            <wp14:sizeRelH relativeFrom="margin">
+              <wp14:pctWidth>40%</wp14:pctWidth>
+            </wp14:sizeRelH>
+            <wp14:sizeRelV relativeFrom="margin">
+              <wp14:pctHeight>0%</wp14:pctHeight>
+            </wp14:sizeRelV>
+          </wp:anchor>
+        </w:drawing>
+      </w:r>
+      <w:r>
+        <w:rPr>
+          <w:noProof/>
+        </w:rPr>
+        <w:drawing>
+          <wp:anchor distT="0" distB="0" distL="114300" distR="114300" simplePos="0" relativeHeight="251665920" behindDoc="0" locked="0" layoutInCell="1" allowOverlap="1" wp14:anchorId="56570E88" wp14:editId="20BB0026">
+            <wp:simplePos x="0" y="0"/>
+            <wp:positionH relativeFrom="column">
+              <wp:posOffset>3727450</wp:posOffset>
+            </wp:positionH>
+            <wp:positionV relativeFrom="paragraph">
+              <wp:posOffset>153670</wp:posOffset>
+            </wp:positionV>
+            <wp:extent cx="2022763" cy="589869"/>
+            <wp:effectExtent l="0" t="0" r="0" b="1270"/>
+            <wp:wrapTopAndBottom/>
+            <wp:docPr id="1207914058" name="Picture 1" descr="f1 Score Definition | Encord"/>
+            <wp:cNvGraphicFramePr>
+              <a:graphicFrameLocks xmlns:a="http://purl.oclc.org/ooxml/drawingml/main" noChangeAspect="1"/>
+            </wp:cNvGraphicFramePr>
+            <a:graphic xmlns:a="http://purl.oclc.org/ooxml/drawingml/main">
+              <a:graphicData uri="http://purl.oclc.org/ooxml/drawingml/picture">
+                <pic:pic xmlns:pic="http://purl.oclc.org/ooxml/drawingml/picture">
+                  <pic:nvPicPr>
+                    <pic:cNvPr id="0" name="Picture 1" descr="f1 Score Definition | Encord"/>
+                    <pic:cNvPicPr>
+                      <a:picLocks noChangeAspect="1" noChangeArrowheads="1"/>
+                    </pic:cNvPicPr>
+                  </pic:nvPicPr>
+                  <pic:blipFill>
+                    <a:blip r:embed="rId13" cstate="print">
+                      <a:extLst>
+                        <a:ext uri="{28A0092B-C50C-407E-A947-70E740481C1C}">
+                          <a14:useLocalDpi xmlns:a14="http://schemas.microsoft.com/office/drawing/2010/main" val="0"/>
+                        </a:ext>
+                      </a:extLst>
+                    </a:blip>
+                    <a:srcRect/>
+                    <a:stretch>
+                      <a:fillRect/>
+                    </a:stretch>
+                  </pic:blipFill>
+                  <pic:spPr bwMode="auto">
+                    <a:xfrm>
+                      <a:off x="0" y="0"/>
+                      <a:ext cx="2022763" cy="589869"/>
+                    </a:xfrm>
+                    <a:prstGeom prst="rect">
+                      <a:avLst/>
+                    </a:prstGeom>
+                    <a:noFill/>
+                    <a:ln>
+                      <a:noFill/>
+                    </a:ln>
+                  </pic:spPr>
+                </pic:pic>
+              </a:graphicData>
+            </a:graphic>
+          </wp:anchor>
+        </w:drawing>
+      </w:r>
+      <w:r>
+        <w:t xml:space="preserve">Cilj istraživanja bio je usporediti dva pristupa: treniranje modela od nule i korištenje unaprijed istreniranih modela, poput </w:t>
+      </w:r>
+      <w:proofErr w:type="spellStart"/>
+      <w:r>
+        <w:t>ResNet</w:t>
+      </w:r>
+      <w:proofErr w:type="spellEnd"/>
+      <w:r>
+        <w:t xml:space="preserve">-a, istreniranih na skupu podataka </w:t>
+      </w:r>
+      <w:proofErr w:type="spellStart"/>
+      <w:r>
+        <w:t>ImageNet</w:t>
+      </w:r>
+      <w:proofErr w:type="spellEnd"/>
+      <w:r>
+        <w:t xml:space="preserve">. </w:t>
+      </w:r>
+      <w:r>
+        <w:t>Klasa CNN definira model kojeg ćemo trenirati od nule. Model je definiran pomoću biblioteke '</w:t>
+      </w:r>
+      <w:proofErr w:type="spellStart"/>
+      <w:r>
+        <w:t>torch.nn</w:t>
+      </w:r>
+      <w:proofErr w:type="spellEnd"/>
+      <w:r>
+        <w:t xml:space="preserve">', a sastoji se od </w:t>
+      </w:r>
+      <w:r>
+        <w:t xml:space="preserve">dva bloka </w:t>
+      </w:r>
+      <w:proofErr w:type="spellStart"/>
+      <w:r>
+        <w:t>konvolucijskih</w:t>
+      </w:r>
+      <w:proofErr w:type="spellEnd"/>
+      <w:r>
+        <w:t xml:space="preserve"> slojeva. </w:t>
+      </w:r>
+      <w:r>
+        <w:t xml:space="preserve">Blokovi se sastoje od dva </w:t>
+      </w:r>
+      <w:proofErr w:type="spellStart"/>
+      <w:r>
+        <w:t>konvolucijska</w:t>
+      </w:r>
+      <w:proofErr w:type="spellEnd"/>
+      <w:r>
+        <w:t xml:space="preserve"> sloja </w:t>
       </w:r>
       <w:r>
         <w:t>te dva sloja za normalizaciju</w:t>
@@ -1349,7 +1868,15 @@
         <w:t>.</w:t>
       </w:r>
       <w:r>
-        <w:t xml:space="preserve"> Kao aktivacijska funkcija za sve slojeve korištena je 'ReLu' aktivacijska funkcija. </w:t>
+        <w:t xml:space="preserve"> Kao aktivacijska funkcija za sve slojeve korištena je '</w:t>
+      </w:r>
+      <w:proofErr w:type="spellStart"/>
+      <w:r>
+        <w:t>ReLu</w:t>
+      </w:r>
+      <w:proofErr w:type="spellEnd"/>
+      <w:r>
+        <w:t xml:space="preserve">' aktivacijska funkcija. </w:t>
       </w:r>
       <w:r>
         <w:t>Na</w:t>
@@ -1367,19 +1894,56 @@
         <w:t>i</w:t>
       </w:r>
       <w:r>
-        <w:t xml:space="preserve"> za smanjenje dimenzionalnosti</w:t>
-      </w:r>
-      <w:r>
-        <w:t xml:space="preserve"> ('MaxPool') dimenzija 2x2</w:t>
-      </w:r>
-      <w:r>
-        <w:t>, kao i sloj 'Dropout' za regularizaciju modela</w:t>
+        <w:t xml:space="preserve"> za smanjenje </w:t>
+      </w:r>
+      <w:proofErr w:type="spellStart"/>
+      <w:r>
+        <w:t>dimenzionalnosti</w:t>
+      </w:r>
+      <w:proofErr w:type="spellEnd"/>
+      <w:r>
+        <w:t xml:space="preserve"> ('</w:t>
+      </w:r>
+      <w:proofErr w:type="spellStart"/>
+      <w:r>
+        <w:t>MaxPool</w:t>
+      </w:r>
+      <w:proofErr w:type="spellEnd"/>
+      <w:r>
+        <w:t>') dimenzija 2x2</w:t>
+      </w:r>
+      <w:r>
+        <w:t>, kao i sloj '</w:t>
+      </w:r>
+      <w:proofErr w:type="spellStart"/>
+      <w:r>
+        <w:t>Dropout</w:t>
+      </w:r>
+      <w:proofErr w:type="spellEnd"/>
+      <w:r>
+        <w:t xml:space="preserve">' za </w:t>
+      </w:r>
+      <w:proofErr w:type="spellStart"/>
+      <w:r>
+        <w:t>regularizaciju</w:t>
+      </w:r>
+      <w:proofErr w:type="spellEnd"/>
+      <w:r>
+        <w:t xml:space="preserve"> modela</w:t>
       </w:r>
       <w:r>
         <w:t xml:space="preserve">. </w:t>
       </w:r>
       <w:r>
-        <w:t xml:space="preserve">Kako bismo omogućili mapiranje na izlazne klase, izlazi iz konvolucijskih slojeva su </w:t>
+        <w:t xml:space="preserve">Kako bismo omogućili mapiranje na izlazne klase, izlazi iz </w:t>
+      </w:r>
+      <w:proofErr w:type="spellStart"/>
+      <w:r>
+        <w:t>konvolucijskih</w:t>
+      </w:r>
+      <w:proofErr w:type="spellEnd"/>
+      <w:r>
+        <w:t xml:space="preserve"> slojeva su </w:t>
       </w:r>
       <w:r>
         <w:t>izravnati u jednodimenzionalni tenzor te proslijeđeni kroz dva potpuno povezana sloja</w:t>
@@ -1391,13 +1955,37 @@
         <w:t>.</w:t>
       </w:r>
       <w:r>
-        <w:t xml:space="preserve"> Osim ovog modela, napravljen je i jednostavniji model 'SimpleCNN', kako bismo pokušali spriječiti prenaučenost modela. </w:t>
+        <w:t xml:space="preserve"> Osim ovog modela, napravljen je i jednostavniji model '</w:t>
+      </w:r>
+      <w:proofErr w:type="spellStart"/>
+      <w:r>
+        <w:t>SimpleCNN</w:t>
+      </w:r>
+      <w:proofErr w:type="spellEnd"/>
+      <w:r>
+        <w:t xml:space="preserve">', kako bismo pokušali spriječiti </w:t>
+      </w:r>
+      <w:proofErr w:type="spellStart"/>
+      <w:r>
+        <w:t>prenaučenost</w:t>
+      </w:r>
+      <w:proofErr w:type="spellEnd"/>
+      <w:r>
+        <w:t xml:space="preserve"> modela. </w:t>
       </w:r>
       <w:r>
         <w:t>Ovaj jednostavniji model je</w:t>
       </w:r>
       <w:r>
-        <w:t xml:space="preserve"> građen od 4 konvolucijska sloja, a</w:t>
+        <w:t xml:space="preserve"> građen od 4 </w:t>
+      </w:r>
+      <w:proofErr w:type="spellStart"/>
+      <w:r>
+        <w:t>konvolucijska</w:t>
+      </w:r>
+      <w:proofErr w:type="spellEnd"/>
+      <w:r>
+        <w:t xml:space="preserve"> sloja, a</w:t>
       </w:r>
       <w:r>
         <w:t xml:space="preserve"> kao ulaz prima slike dimenzija 32x32</w:t>
@@ -1409,13 +1997,26 @@
         <w:t xml:space="preserve"> </w:t>
       </w:r>
       <w:r>
-        <w:t>Optimizacija modela obavljala se pomoću algoritma `Adam`, uz definiranu stopu učenja i regularizaciju</w:t>
-      </w:r>
+        <w:t xml:space="preserve">Optimizacija modela obavljala se pomoću algoritma `Adam`, uz definiranu stopu učenja i </w:t>
+      </w:r>
+      <w:proofErr w:type="spellStart"/>
+      <w:r>
+        <w:t>regularizaciju</w:t>
+      </w:r>
+      <w:proofErr w:type="spellEnd"/>
       <w:r>
         <w:t xml:space="preserve">. Uz to, kompleksniji model koristi </w:t>
       </w:r>
       <w:r>
-        <w:t xml:space="preserve">funkciju ReduceLROnPlateau kako bi se izbjegla stagnacija tijekom </w:t>
+        <w:t xml:space="preserve">funkciju </w:t>
+      </w:r>
+      <w:proofErr w:type="spellStart"/>
+      <w:r>
+        <w:t>ReduceLROnPlateau</w:t>
+      </w:r>
+      <w:proofErr w:type="spellEnd"/>
+      <w:r>
+        <w:t xml:space="preserve"> kako bi se izbjegla stagnacija tijekom </w:t>
       </w:r>
       <w:r>
         <w:t>treniranja modela</w:t>
@@ -1427,7 +2028,15 @@
         <w:t xml:space="preserve">se računao </w:t>
       </w:r>
       <w:r>
-        <w:t>korištenjem funkcije `CrossEntropyLoss`</w:t>
+        <w:t>korištenjem funkcije `</w:t>
+      </w:r>
+      <w:proofErr w:type="spellStart"/>
+      <w:r>
+        <w:t>CrossEntropyLoss</w:t>
+      </w:r>
+      <w:proofErr w:type="spellEnd"/>
+      <w:r>
+        <w:t>`</w:t>
       </w:r>
       <w:r>
         <w:t xml:space="preserve">, dok </w:t>
@@ -1449,7 +2058,11 @@
       </w:r>
       <w:bookmarkStart w:id="0" w:name="_Hlk187833879"/>
       <w:r>
-        <w:t>'accuracy</w:t>
+        <w:t>'</w:t>
+      </w:r>
+      <w:proofErr w:type="spellStart"/>
+      <w:r>
+        <w:t>accuracy</w:t>
       </w:r>
       <w:bookmarkStart w:id="1" w:name="_Hlk187833837"/>
       <w:r>
@@ -1457,7 +2070,11 @@
       </w:r>
       <w:bookmarkEnd w:id="1"/>
       <w:r>
-        <w:t>score'</w:t>
+        <w:t>score</w:t>
+      </w:r>
+      <w:proofErr w:type="spellEnd"/>
+      <w:r>
+        <w:t>'</w:t>
       </w:r>
       <w:bookmarkEnd w:id="0"/>
       <w:r>
@@ -1486,13 +2103,55 @@
         <w:t xml:space="preserve"> </w:t>
       </w:r>
       <w:r>
-        <w:t xml:space="preserve">modela. Odlučili smo implementirati model 'ResNet' koji je dostupan unutar biblioteke PyTorch. Model je treniran na skupu slika ImageNet, što osigurava da model ima sposobnost prepoznavanja složenih značajki u slikama. </w:t>
-      </w:r>
-      <w:r>
-        <w:t xml:space="preserve">RezNet kao ulaz prima RGB slike dimenzija 224x224, u skladu s čime smo prilagodili dimenzije našeg skupa podataka te normalizirali transformaciju. Osim toga, promijenili smo dimenzionalnost ulaznog sloja kako bismo mogli raditi sa slikama u sivim tonovima. </w:t>
-      </w:r>
-      <w:r>
-        <w:t>ResNet modeli tipično imaju između 18 i 152 sloja, a mi smo odabrali onaj sa 18 slojeva. S obzirom</w:t>
+        <w:t>modela. Odlučili smo implementirati model '</w:t>
+      </w:r>
+      <w:proofErr w:type="spellStart"/>
+      <w:r>
+        <w:t>ResNet</w:t>
+      </w:r>
+      <w:proofErr w:type="spellEnd"/>
+      <w:r>
+        <w:t xml:space="preserve">' koji je dostupan unutar biblioteke </w:t>
+      </w:r>
+      <w:proofErr w:type="spellStart"/>
+      <w:r>
+        <w:t>PyTorch</w:t>
+      </w:r>
+      <w:proofErr w:type="spellEnd"/>
+      <w:r>
+        <w:t xml:space="preserve">. Model je treniran na skupu slika </w:t>
+      </w:r>
+      <w:proofErr w:type="spellStart"/>
+      <w:r>
+        <w:t>ImageNet</w:t>
+      </w:r>
+      <w:proofErr w:type="spellEnd"/>
+      <w:r>
+        <w:t xml:space="preserve">, što osigurava da model ima sposobnost prepoznavanja složenih značajki u slikama. </w:t>
+      </w:r>
+      <w:proofErr w:type="spellStart"/>
+      <w:r>
+        <w:t>RezNet</w:t>
+      </w:r>
+      <w:proofErr w:type="spellEnd"/>
+      <w:r>
+        <w:t xml:space="preserve"> kao ulaz prima RGB slike dimenzija 224x224, u skladu s čime smo prilagodili dimenzije našeg skupa podataka te normalizirali transformaciju. Osim toga, promijenili smo </w:t>
+      </w:r>
+      <w:proofErr w:type="spellStart"/>
+      <w:r>
+        <w:t>dimenzionalnost</w:t>
+      </w:r>
+      <w:proofErr w:type="spellEnd"/>
+      <w:r>
+        <w:t xml:space="preserve"> ulaznog sloja kako bismo mogli raditi sa slikama u sivim tonovima. </w:t>
+      </w:r>
+      <w:proofErr w:type="spellStart"/>
+      <w:r>
+        <w:t>ResNet</w:t>
+      </w:r>
+      <w:proofErr w:type="spellEnd"/>
+      <w:r>
+        <w:t xml:space="preserve"> modeli tipično imaju između 18 i 152 sloja, a mi smo odabrali onaj sa 18 slojeva. S obzirom</w:t>
       </w:r>
       <w:r>
         <w:t xml:space="preserve"> na to</w:t>
@@ -1510,7 +2169,15 @@
         <w:t xml:space="preserve">nije potrebno mijenjati sve parametre, već samo prilagoditi potpuno povezani sloj. </w:t>
       </w:r>
       <w:r>
-        <w:t>Kao i za prethodna dva modela, optimizacija modela je odrađena pomoću algoritma 'Adam', a uspješnost klasifikacije funkcijom 'accuracy_score'.</w:t>
+        <w:t>Kao i za prethodna dva modela, optimizacija modela je odrađena pomoću algoritma 'Adam', a uspješnost klasifikacije funkcijom '</w:t>
+      </w:r>
+      <w:proofErr w:type="spellStart"/>
+      <w:r>
+        <w:t>accuracy_score</w:t>
+      </w:r>
+      <w:proofErr w:type="spellEnd"/>
+      <w:r>
+        <w:t>'.</w:t>
       </w:r>
       <w:r>
         <w:t xml:space="preserve"> Ovaj model treniran je kroz 10 epoha, za razliku od drugih modela koji su trenirani kroz 20 epoha, stoga što su težine za veći dio modela unaprijed određene, te nije potrebno puno vremena da on konvergira.</w:t>
@@ -1544,52 +2211,197 @@
         <w:jc w:val="both"/>
       </w:pPr>
       <w:r>
-        <w:t xml:space="preserve">Prvi korišteni model je bio konvolucijska neuronska mreža, tj. CNN koju smo samostalni definirali u svome kodu. </w:t>
-      </w:r>
-      <w:r>
-        <w:t>Kroz 20 epoha treniranja, model je neznatno smanjio gubitak i povećao točnost na skupu za treniranje, dok je trend gubitka i točnosti na neviđenim podacima bio obrnut. Nakon treniranja modela, uslijedila je evaluacija pomoću ponderiranog prosječnog F1 score-a te matrice zabune. Ponderirani prosječni F1 score smo koristili zbog njegove otpornosti na manjak ravnoteže među klasama u našem skupu podataka. Njegova vrijednost od 0.58 nam ukazuje na to da model nije loš, ali da nije posebno učinkovit zbog čega možemo pretpostaviti da postoji pro</w:t>
-      </w:r>
-      <w:r>
-        <w:t>s</w:t>
-      </w:r>
-      <w:r>
-        <w:t>tor za poboljšanja</w:t>
-      </w:r>
-      <w:r>
-        <w:t>. Kod prikaza matrice zabune</w:t>
-      </w:r>
-      <w:commentRangeStart w:id="3"/>
-      <w:r>
-        <w:t xml:space="preserve"> </w:t>
-      </w:r>
-      <w:commentRangeEnd w:id="3"/>
-      <w:r>
-        <w:rPr>
-          <w:rStyle w:val="CommentReference"/>
-        </w:rPr>
-        <w:commentReference w:id="3"/>
-      </w:r>
-      <w:r>
-        <w:t>je vidljivo kako model ima neželjenu pogrešku kod klasificiranja jer ima tendenciju klasificirati maligne uzorke kao benigne što je puno opasnije od obrnutog slučaja gdje nešto benigno klasificiramo kao maligno.</w:t>
-      </w:r>
-    </w:p>
-    <w:p>
-      <w:pPr>
-        <w:ind w:firstLine="36pt"/>
+        <w:t xml:space="preserve">Prvi korišteni model je bio </w:t>
+      </w:r>
+      <w:proofErr w:type="spellStart"/>
+      <w:r>
+        <w:t>konvolucijska</w:t>
+      </w:r>
+      <w:proofErr w:type="spellEnd"/>
+      <w:r>
+        <w:t xml:space="preserve"> neuronska mreža, tj. CNN koju smo samostalni definirali u svome kodu. </w:t>
+      </w:r>
+      <w:r>
+        <w:t xml:space="preserve">Kroz 20 epoha treniranja, model je neznatno smanjio gubitak i povećao točnost na skupu za treniranje, dok </w:t>
+      </w:r>
+      <w:r>
+        <w:t>isti trend nije bio jasno uočljiv na</w:t>
+      </w:r>
+      <w:r>
+        <w:t xml:space="preserve"> neviđenim podacima </w:t>
+      </w:r>
+      <w:r>
+        <w:t>za testiranje</w:t>
+      </w:r>
+      <w:r>
+        <w:t xml:space="preserve">. Nakon treniranja modela, uslijedila je evaluacija pomoću ponderiranog prosječnog F1 </w:t>
+      </w:r>
+      <w:proofErr w:type="spellStart"/>
+      <w:r>
+        <w:t>score</w:t>
+      </w:r>
+      <w:proofErr w:type="spellEnd"/>
+      <w:r>
+        <w:t xml:space="preserve">-a te matrice zabune. Ponderirani prosječni F1 </w:t>
+      </w:r>
+      <w:proofErr w:type="spellStart"/>
+      <w:r>
+        <w:t>score</w:t>
+      </w:r>
+      <w:proofErr w:type="spellEnd"/>
+      <w:r>
+        <w:t xml:space="preserve"> smo koristili zbog njegove otpornosti na manjak ravnoteže među klasama u našem skupu podataka.</w:t>
+      </w:r>
+      <w:r>
+        <w:t xml:space="preserve"> F1 </w:t>
+      </w:r>
+      <w:proofErr w:type="spellStart"/>
+      <w:r>
+        <w:t>score</w:t>
+      </w:r>
+      <w:proofErr w:type="spellEnd"/>
+      <w:r>
+        <w:t xml:space="preserve"> izračunava se pomoću sljedeće formule:</w:t>
+      </w:r>
+    </w:p>
+    <w:p>
+      <w:pPr>
         <w:jc w:val="both"/>
       </w:pPr>
       <w:r>
+        <w:t xml:space="preserve">Dobiveni </w:t>
+      </w:r>
+      <w:r>
+        <w:t xml:space="preserve">F1 </w:t>
+      </w:r>
+      <w:proofErr w:type="spellStart"/>
+      <w:r>
+        <w:t>score</w:t>
+      </w:r>
+      <w:proofErr w:type="spellEnd"/>
+      <w:r>
+        <w:t xml:space="preserve"> od 0.58 ukazuje da naš CNN model postiže umjerene rezultate u balansiranju preciznosti i odziva, koji su ključni za procjenu performansi klasifikacijskog modela. </w:t>
+      </w:r>
+      <w:r>
+        <w:t>M</w:t>
+      </w:r>
+      <w:r>
+        <w:t>odel prepoznaje dio pozitivnih primjera, ali i dalje  propušta stvarne pozitivne primjere (nizak odziv) ili pogrešno označava negativne primjere kao pozitivne (ni</w:t>
+      </w:r>
+      <w:r>
+        <w:t>ska</w:t>
+      </w:r>
+      <w:r>
+        <w:t xml:space="preserve"> preciznost)</w:t>
+      </w:r>
+      <w:r>
+        <w:t>.</w:t>
+      </w:r>
+    </w:p>
+    <w:p>
+      <w:pPr>
+        <w:jc w:val="start"/>
+      </w:pPr>
+      <w:r>
+        <w:br w:type="page"/>
+      </w:r>
+    </w:p>
+    <w:p>
+      <w:pPr>
+        <w:jc w:val="both"/>
+      </w:pPr>
+      <w:r>
         <w:rPr>
           <w:noProof/>
         </w:rPr>
+        <w:lastRenderedPageBreak/>
         <w:drawing>
-          <wp:anchor distT="0" distB="0" distL="114300" distR="114300" simplePos="0" relativeHeight="251662848" behindDoc="1" locked="0" layoutInCell="1" allowOverlap="1" wp14:anchorId="228D5C6D" wp14:editId="1772012C">
+          <wp:anchor distT="45720" distB="45720" distL="114300" distR="114300" simplePos="0" relativeHeight="251664896" behindDoc="0" locked="0" layoutInCell="1" allowOverlap="1" wp14:anchorId="6003249E" wp14:editId="019D1E33">
+            <wp:simplePos x="0" y="0"/>
+            <wp:positionH relativeFrom="column">
+              <wp:posOffset>258445</wp:posOffset>
+            </wp:positionH>
+            <wp:positionV relativeFrom="paragraph">
+              <wp:posOffset>3019425</wp:posOffset>
+            </wp:positionV>
+            <wp:extent cx="2360930" cy="228600"/>
+            <wp:effectExtent l="0" t="0" r="0" b="0"/>
+            <wp:wrapSquare wrapText="bothSides"/>
+            <wp:docPr id="217" name="Text Box 2"/>
+            <wp:cNvGraphicFramePr>
+              <a:graphicFrameLocks xmlns:a="http://purl.oclc.org/ooxml/drawingml/main"/>
+            </wp:cNvGraphicFramePr>
+            <a:graphic xmlns:a="http://purl.oclc.org/ooxml/drawingml/main">
+              <a:graphicData uri="http://schemas.microsoft.com/office/word/2010/wordprocessingShape">
+                <wp:wsp>
+                  <wp:cNvSpPr txBox="1">
+                    <a:spLocks noChangeArrowheads="1"/>
+                  </wp:cNvSpPr>
+                  <wp:spPr bwMode="auto">
+                    <a:xfrm>
+                      <a:off x="0" y="0"/>
+                      <a:ext cx="2360930" cy="228600"/>
+                    </a:xfrm>
+                    <a:prstGeom prst="rect">
+                      <a:avLst/>
+                    </a:prstGeom>
+                    <a:noFill/>
+                    <a:ln w="9525">
+                      <a:noFill/>
+                      <a:miter lim="800%"/>
+                      <a:headEnd/>
+                      <a:tailEnd/>
+                    </a:ln>
+                  </wp:spPr>
+                  <wp:txbx>
+                    <wne:txbxContent>
+                      <w:p>
+                        <w:pPr>
+                          <w:pStyle w:val="Caption"/>
+                        </w:pPr>
+                        <w:r>
+                          <w:t xml:space="preserve">Slika </w:t>
+                        </w:r>
+                        <w:r>
+                          <w:t>6</w:t>
+                        </w:r>
+                        <w:r>
+                          <w:t>.</w:t>
+                        </w:r>
+                        <w:r>
+                          <w:t xml:space="preserve"> Prikaz konfuzijske matrice</w:t>
+                        </w:r>
+                      </w:p>
+                      <w:p/>
+                    </wne:txbxContent>
+                  </wp:txbx>
+                  <wp:bodyPr rot="0" vert="horz" wrap="square" lIns="91440" tIns="45720" rIns="91440" bIns="45720" anchor="t" anchorCtr="0">
+                    <a:noAutofit/>
+                  </wp:bodyPr>
+                </wp:wsp>
+              </a:graphicData>
+            </a:graphic>
+            <wp14:sizeRelH relativeFrom="margin">
+              <wp14:pctWidth>40%</wp14:pctWidth>
+            </wp14:sizeRelH>
+            <wp14:sizeRelV relativeFrom="margin">
+              <wp14:pctHeight>0%</wp14:pctHeight>
+            </wp14:sizeRelV>
+          </wp:anchor>
+        </w:drawing>
+      </w:r>
+      <w:r>
+        <w:rPr>
+          <w:noProof/>
+        </w:rPr>
+        <w:drawing>
+          <wp:anchor distT="0" distB="0" distL="114300" distR="114300" simplePos="0" relativeHeight="251662848" behindDoc="1" locked="0" layoutInCell="1" allowOverlap="1" wp14:anchorId="228D5C6D" wp14:editId="33393081">
             <wp:simplePos x="0" y="0"/>
             <wp:positionH relativeFrom="margin">
-              <wp:posOffset>3515947</wp:posOffset>
+              <wp:posOffset>246380</wp:posOffset>
             </wp:positionH>
             <wp:positionV relativeFrom="paragraph">
-              <wp:posOffset>153500</wp:posOffset>
+              <wp:posOffset>890270</wp:posOffset>
             </wp:positionV>
             <wp:extent cx="2571115" cy="2211705"/>
             <wp:effectExtent l="0" t="0" r="635" b="0"/>
@@ -1653,37 +2465,75 @@
           </wp:anchor>
         </w:drawing>
       </w:r>
+      <w:r>
+        <w:t>Sama p</w:t>
+      </w:r>
+      <w:r>
+        <w:t>reciznost</w:t>
+      </w:r>
+      <w:r>
+        <w:t xml:space="preserve"> </w:t>
+      </w:r>
+      <w:r>
+        <w:t>klasifikacije</w:t>
+      </w:r>
+      <w:r>
+        <w:t xml:space="preserve"> implementiranog CNN-a</w:t>
+      </w:r>
+      <w:r>
+        <w:t xml:space="preserve"> </w:t>
+      </w:r>
+      <w:r>
+        <w:t>je</w:t>
+      </w:r>
+      <w:r>
+        <w:t xml:space="preserve"> između</w:t>
+      </w:r>
+      <w:r>
+        <w:t xml:space="preserve"> </w:t>
+      </w:r>
+      <w:r>
+        <w:t>58%</w:t>
+      </w:r>
+      <w:r>
+        <w:t xml:space="preserve"> i 62%</w:t>
+      </w:r>
+      <w:r>
+        <w:t xml:space="preserve">. To </w:t>
+      </w:r>
+      <w:r>
+        <w:t>ukazuje da model nije loš, ali postoji pro</w:t>
+      </w:r>
+      <w:r>
+        <w:t>s</w:t>
+      </w:r>
+      <w:r>
+        <w:t>tor za poboljšanja</w:t>
+      </w:r>
+      <w:r>
+        <w:t xml:space="preserve">. Kod prikaza matrice zabune je vidljivo kako model ima neželjenu </w:t>
+      </w:r>
+      <w:r>
+        <w:t>tendenciju</w:t>
+      </w:r>
+      <w:r>
+        <w:t xml:space="preserve"> kod klasificiranja jer </w:t>
+      </w:r>
+      <w:r>
+        <w:t xml:space="preserve">uglavnom </w:t>
+      </w:r>
+      <w:r>
+        <w:t>klasificira maligne uzorke kao benigne</w:t>
+      </w:r>
+      <w:r>
+        <w:t xml:space="preserve">. </w:t>
+      </w:r>
     </w:p>
     <w:p>
       <w:pPr>
         <w:ind w:firstLine="36pt"/>
         <w:jc w:val="both"/>
       </w:pPr>
-      <w:r>
-        <w:lastRenderedPageBreak/>
-        <w:t>U idućem koraku smo odlučili koristiti prethodno trenirane modele, točnije ResNet. S tim smo modelom pokušali poboljšati točnost i generalne performanse. Model je imao 10 epoha treniranja, kroz koje mu točnost klasifikacije nije prelazila 50%</w:t>
-      </w:r>
-      <w:r>
-        <w:t>, a gubitak je konstano bio veći od 90%</w:t>
-      </w:r>
-      <w:r>
-        <w:t>.  Kako se radi o modelu koji je robustan, logična pretpostavka je da</w:t>
-      </w:r>
-      <w:r>
-        <w:t xml:space="preserve"> je</w:t>
-      </w:r>
-      <w:r>
-        <w:t xml:space="preserve"> </w:t>
-      </w:r>
-      <w:r>
-        <w:t>kvaliteta klasifikacije u ovom slučaju narušena ne nužno zbog modela, već zbog skupa podataka ili njihove pripreme.</w:t>
-      </w:r>
-      <w:r>
-        <w:t xml:space="preserve"> S obzirom da je priroda problema nejednoznačno određena, skup podataka s kojim raspolažemo nije dostatan za adekvatno treniranje neuronskih mreža.</w:t>
-      </w:r>
-      <w:r>
-        <w:t xml:space="preserve"> </w:t>
-      </w:r>
     </w:p>
     <w:p>
       <w:pPr>
@@ -1691,7 +2541,340 @@
         <w:jc w:val="both"/>
       </w:pPr>
       <w:r>
-        <w:t>Krajnja ideja je bila probati stvoriti jednostavniji model kako bismo smanjili mogućnost prenaučenosti. Ovaj model smo samostalno definirali kao i prvi spomenuti model u ovom poglavlju. Također smo ga trenirali kroz 20 epoha, no bez obzira na manju složenost modela, nismo uspjeli dobiti točnost veću od 60% i gubitak manji od 80%.</w:t>
+        <w:t>U idućem koraku smo odlučili koristiti model</w:t>
+      </w:r>
+      <w:r>
+        <w:t xml:space="preserve"> </w:t>
+      </w:r>
+      <w:proofErr w:type="spellStart"/>
+      <w:r>
+        <w:t>ResNet</w:t>
+      </w:r>
+      <w:proofErr w:type="spellEnd"/>
+      <w:r>
+        <w:t xml:space="preserve"> koji je već treniran na skupu podataka </w:t>
+      </w:r>
+      <w:proofErr w:type="spellStart"/>
+      <w:r>
+        <w:t>ImageNet</w:t>
+      </w:r>
+      <w:proofErr w:type="spellEnd"/>
+      <w:r>
+        <w:t>. S tim smo modelom pokušali poboljšati točnost i generalne performanse.</w:t>
+      </w:r>
+      <w:r>
+        <w:t xml:space="preserve"> To trebalo postići </w:t>
+      </w:r>
+      <w:r>
+        <w:rPr>
+          <w:i/>
+          <w:iCs/>
+        </w:rPr>
+        <w:t xml:space="preserve">fine </w:t>
+      </w:r>
+      <w:proofErr w:type="spellStart"/>
+      <w:r>
+        <w:rPr>
+          <w:i/>
+          <w:iCs/>
+        </w:rPr>
+        <w:t>tuningom</w:t>
+      </w:r>
+      <w:proofErr w:type="spellEnd"/>
+      <w:r>
+        <w:t xml:space="preserve">, odnosno dodatno treniranje određenog skupa parametara (težina) </w:t>
+      </w:r>
+      <w:proofErr w:type="spellStart"/>
+      <w:r>
+        <w:t>RestNeta</w:t>
+      </w:r>
+      <w:proofErr w:type="spellEnd"/>
+      <w:r>
+        <w:t xml:space="preserve"> na našem skupu podataka za treniranje, koji je koristila i vlastita implementacija CNN-a.</w:t>
+      </w:r>
+      <w:r>
+        <w:t xml:space="preserve"> </w:t>
+      </w:r>
+      <w:proofErr w:type="spellStart"/>
+      <w:r>
+        <w:t>RestNet</w:t>
+      </w:r>
+      <w:proofErr w:type="spellEnd"/>
+      <w:r>
+        <w:t xml:space="preserve"> m</w:t>
+      </w:r>
+      <w:r>
+        <w:t>odel je imao 10 epoha treniranja, kroz koje mu točnost klasifikacije nije prelazila 50%</w:t>
+      </w:r>
+      <w:r>
+        <w:t xml:space="preserve">, a gubitak je </w:t>
+      </w:r>
+      <w:proofErr w:type="spellStart"/>
+      <w:r>
+        <w:t>konstano</w:t>
+      </w:r>
+      <w:proofErr w:type="spellEnd"/>
+      <w:r>
+        <w:t xml:space="preserve"> bio veći od 90%</w:t>
+      </w:r>
+      <w:r>
+        <w:t>.  Kako se radi o modelu koji je robustan, logična pretpostavka je da</w:t>
+      </w:r>
+      <w:r>
+        <w:t xml:space="preserve"> je</w:t>
+      </w:r>
+      <w:r>
+        <w:t xml:space="preserve"> </w:t>
+      </w:r>
+      <w:r>
+        <w:t>kvaliteta klasifikacije u ovom slučaju narušena ne nužno zbog modela, već zbog skupa podataka ili njihove pripreme.</w:t>
+      </w:r>
+      <w:r>
+        <w:t xml:space="preserve"> S obzirom da </w:t>
+      </w:r>
+      <w:r>
+        <w:t>je svaki tumor prilično jedinstven, kao i prikazi tih tumora na slikama ultrazvuka</w:t>
+      </w:r>
+      <w:r>
+        <w:t xml:space="preserve">, </w:t>
+      </w:r>
+      <w:r>
+        <w:t xml:space="preserve">postoji vjerojatnost da </w:t>
+      </w:r>
+      <w:r>
+        <w:t xml:space="preserve">skup podataka s kojim raspolažemo nije </w:t>
+      </w:r>
+      <w:r>
+        <w:t>dovoljno konzistentan</w:t>
+      </w:r>
+      <w:r>
+        <w:t xml:space="preserve"> za adekvatno treniranje neuronski</w:t>
+      </w:r>
+      <w:r>
+        <w:t>m</w:t>
+      </w:r>
+      <w:r>
+        <w:t xml:space="preserve"> mreža</w:t>
+      </w:r>
+      <w:r>
+        <w:t>ma</w:t>
+      </w:r>
+      <w:r>
+        <w:t>.</w:t>
+      </w:r>
+      <w:r>
+        <w:t xml:space="preserve"> </w:t>
+      </w:r>
+      <w:r>
+        <w:t>Također, p</w:t>
+      </w:r>
+      <w:r>
+        <w:t xml:space="preserve">rilikom transformacije slika na dimenzije koje su uvijek iste (128x128 piksela) sigurno dolazi do gubitka određenih detalja koji su bitni za diferenciranje slika malignih i benignih tumora. Izrezane slike koje su korištene za modeliranje i testiranje </w:t>
+      </w:r>
+      <w:r>
+        <w:t>uglavnom</w:t>
+      </w:r>
+      <w:r>
+        <w:t xml:space="preserve"> su znatno većih dimenzija od 128x128. </w:t>
+      </w:r>
+      <w:r>
+        <w:t xml:space="preserve">Opisani problemi dakako objašnjavaju i zašto implementacija CNN-a nema veću uspješnost od 58%. Ono što se da primijetiti iz ove usporedbe </w:t>
+      </w:r>
+      <w:proofErr w:type="spellStart"/>
+      <w:r>
+        <w:t>neuralnih</w:t>
+      </w:r>
+      <w:proofErr w:type="spellEnd"/>
+      <w:r>
+        <w:t xml:space="preserve"> mreža jest da naša (jednostavnija i manje robusna) implementacija CNN-a bolje klasificira od robusnijeg i naprednijeg </w:t>
+      </w:r>
+      <w:proofErr w:type="spellStart"/>
+      <w:r>
+        <w:t>RestNeta</w:t>
+      </w:r>
+      <w:proofErr w:type="spellEnd"/>
+      <w:r>
+        <w:t>.</w:t>
+      </w:r>
+    </w:p>
+    <w:p>
+      <w:pPr>
+        <w:ind w:firstLine="36pt"/>
+        <w:jc w:val="both"/>
+      </w:pPr>
+      <w:r>
+        <w:t xml:space="preserve">Slijedeći ovu logiku, u poglavlju </w:t>
+      </w:r>
+      <w:r>
+        <w:rPr>
+          <w:b/>
+          <w:bCs/>
+          <w:i/>
+          <w:iCs/>
+        </w:rPr>
+        <w:t xml:space="preserve">3.6 </w:t>
+      </w:r>
+      <w:proofErr w:type="spellStart"/>
+      <w:r>
+        <w:rPr>
+          <w:b/>
+          <w:bCs/>
+          <w:i/>
+          <w:iCs/>
+        </w:rPr>
+        <w:t>And</w:t>
+      </w:r>
+      <w:proofErr w:type="spellEnd"/>
+      <w:r>
+        <w:rPr>
+          <w:b/>
+          <w:bCs/>
+          <w:i/>
+          <w:iCs/>
+        </w:rPr>
+        <w:t xml:space="preserve"> on </w:t>
+      </w:r>
+      <w:proofErr w:type="spellStart"/>
+      <w:r>
+        <w:rPr>
+          <w:b/>
+          <w:bCs/>
+          <w:i/>
+          <w:iCs/>
+        </w:rPr>
+        <w:t>the</w:t>
+      </w:r>
+      <w:proofErr w:type="spellEnd"/>
+      <w:r>
+        <w:rPr>
+          <w:b/>
+          <w:bCs/>
+          <w:i/>
+          <w:iCs/>
+        </w:rPr>
+        <w:t xml:space="preserve"> </w:t>
+      </w:r>
+      <w:proofErr w:type="spellStart"/>
+      <w:r>
+        <w:rPr>
+          <w:b/>
+          <w:bCs/>
+          <w:i/>
+          <w:iCs/>
+        </w:rPr>
+        <w:t>Seventh</w:t>
+      </w:r>
+      <w:proofErr w:type="spellEnd"/>
+      <w:r>
+        <w:rPr>
+          <w:b/>
+          <w:bCs/>
+          <w:i/>
+          <w:iCs/>
+        </w:rPr>
+        <w:t xml:space="preserve"> Day, a </w:t>
+      </w:r>
+      <w:proofErr w:type="spellStart"/>
+      <w:r>
+        <w:rPr>
+          <w:b/>
+          <w:bCs/>
+          <w:i/>
+          <w:iCs/>
+        </w:rPr>
+        <w:t>Simple</w:t>
+      </w:r>
+      <w:proofErr w:type="spellEnd"/>
+      <w:r>
+        <w:rPr>
+          <w:b/>
+          <w:bCs/>
+          <w:i/>
+          <w:iCs/>
+        </w:rPr>
+        <w:t xml:space="preserve"> CNN Model </w:t>
+      </w:r>
+      <w:proofErr w:type="spellStart"/>
+      <w:r>
+        <w:rPr>
+          <w:b/>
+          <w:bCs/>
+          <w:i/>
+          <w:iCs/>
+        </w:rPr>
+        <w:t>Was</w:t>
+      </w:r>
+      <w:proofErr w:type="spellEnd"/>
+      <w:r>
+        <w:rPr>
+          <w:b/>
+          <w:bCs/>
+          <w:i/>
+          <w:iCs/>
+        </w:rPr>
+        <w:t xml:space="preserve"> </w:t>
+      </w:r>
+      <w:proofErr w:type="spellStart"/>
+      <w:r>
+        <w:rPr>
+          <w:b/>
+          <w:bCs/>
+          <w:i/>
+          <w:iCs/>
+        </w:rPr>
+        <w:t>Created</w:t>
+      </w:r>
+      <w:proofErr w:type="spellEnd"/>
+      <w:r>
+        <w:rPr>
+          <w:i/>
+          <w:iCs/>
+        </w:rPr>
+        <w:t xml:space="preserve"> </w:t>
+      </w:r>
+      <w:r>
+        <w:t xml:space="preserve">u </w:t>
+      </w:r>
+      <w:proofErr w:type="spellStart"/>
+      <w:r>
+        <w:t>Jupyter</w:t>
+      </w:r>
+      <w:proofErr w:type="spellEnd"/>
+      <w:r>
+        <w:t xml:space="preserve"> bilježnici pokušali smo napraviti još jednostavniju implementaciju CNN-a kako bi testirali hoćemo li dobiti precizniju klasifikaciju. Taj se model sastojao od 4 </w:t>
+      </w:r>
+      <w:proofErr w:type="spellStart"/>
+      <w:r>
+        <w:t>konvolucijska</w:t>
+      </w:r>
+      <w:proofErr w:type="spellEnd"/>
+      <w:r>
+        <w:t xml:space="preserve"> sloja i kao ulazne podatke je uzimao slike dimenzija 32x32. Nakon izvršavanja 20 epoha, pokazalo se da ovaj jednostavniji model ima jednako dobru sposobnost klasifikacije kao i znatno kompliciraniji </w:t>
+      </w:r>
+      <w:proofErr w:type="spellStart"/>
+      <w:r>
+        <w:t>RestNet</w:t>
+      </w:r>
+      <w:proofErr w:type="spellEnd"/>
+      <w:r>
+        <w:t xml:space="preserve">, odnosno uspješnost mu je oko 54%. Od sva tri CNN-a najbolje klasificira naša robusnija implementacija CNN-a, čija je </w:t>
+      </w:r>
+      <w:r>
+        <w:t xml:space="preserve">maksimalna uspješnost 62% na skupu za testiranje. </w:t>
+      </w:r>
+      <w:r>
+        <w:t xml:space="preserve">Što se tiče sposobnosti generalizacije najuspješnijeg modela, zaključujemo da nije vrlo dobra jer se naučeni model više prilagođava i bolje klasificira skup podataka za treniranje od skupa podataka za testiranje. </w:t>
+      </w:r>
+      <w:r>
+        <w:t xml:space="preserve">Time zaključujemo da je model relativno sklon </w:t>
+      </w:r>
+      <w:proofErr w:type="spellStart"/>
+      <w:r>
+        <w:t>prenaučenosti</w:t>
+      </w:r>
+      <w:proofErr w:type="spellEnd"/>
+      <w:r>
+        <w:t xml:space="preserve">. </w:t>
       </w:r>
     </w:p>
     <w:p>
@@ -1713,7 +2896,15 @@
         <w:jc w:val="start"/>
       </w:pPr>
       <w:r>
-        <w:t xml:space="preserve">Ovaj dataset je bio korišten u nekoliko ranijih radova. Rad s </w:t>
+        <w:t xml:space="preserve">Ovaj </w:t>
+      </w:r>
+      <w:proofErr w:type="spellStart"/>
+      <w:r>
+        <w:t>dataset</w:t>
+      </w:r>
+      <w:proofErr w:type="spellEnd"/>
+      <w:r>
+        <w:t xml:space="preserve"> je bio korišten u nekoliko ranijih radova. Rad s </w:t>
       </w:r>
       <w:r>
         <w:t xml:space="preserve">jednom od boljih </w:t>
@@ -1725,10 +2916,324 @@
         <w:t>a</w:t>
       </w:r>
       <w:r>
-        <w:t xml:space="preserve"> je na ovom skupu podataka uspio postići točnost od 85,13% AUC od 0,9344 koristeći 5-fold cross validation, s točnošću od 85,13% na točki jednakih pogrešaka ROC krivulje.</w:t>
-      </w:r>
-      <w:r>
-        <w:t xml:space="preserve"> [6]</w:t>
+        <w:t xml:space="preserve"> na ovom skupu</w:t>
+      </w:r>
+      <w:r>
+        <w:t xml:space="preserve"> podataka, </w:t>
+      </w:r>
+      <w:proofErr w:type="spellStart"/>
+      <w:r>
+        <w:rPr>
+          <w:i/>
+          <w:iCs/>
+        </w:rPr>
+        <w:t>Diagnosis</w:t>
+      </w:r>
+      <w:proofErr w:type="spellEnd"/>
+      <w:r>
+        <w:rPr>
+          <w:i/>
+          <w:iCs/>
+        </w:rPr>
+        <w:t xml:space="preserve"> </w:t>
+      </w:r>
+      <w:proofErr w:type="spellStart"/>
+      <w:r>
+        <w:rPr>
+          <w:i/>
+          <w:iCs/>
+        </w:rPr>
+        <w:t>in</w:t>
+      </w:r>
+      <w:proofErr w:type="spellEnd"/>
+      <w:r>
+        <w:rPr>
+          <w:i/>
+          <w:iCs/>
+        </w:rPr>
+        <w:t xml:space="preserve"> </w:t>
+      </w:r>
+      <w:proofErr w:type="spellStart"/>
+      <w:r>
+        <w:rPr>
+          <w:i/>
+          <w:iCs/>
+        </w:rPr>
+        <w:t>Two-View</w:t>
+      </w:r>
+      <w:proofErr w:type="spellEnd"/>
+      <w:r>
+        <w:rPr>
+          <w:i/>
+          <w:iCs/>
+        </w:rPr>
+        <w:t xml:space="preserve"> </w:t>
+      </w:r>
+      <w:proofErr w:type="spellStart"/>
+      <w:r>
+        <w:rPr>
+          <w:i/>
+          <w:iCs/>
+        </w:rPr>
+        <w:t>Mammography</w:t>
+      </w:r>
+      <w:proofErr w:type="spellEnd"/>
+      <w:r>
+        <w:rPr>
+          <w:i/>
+          <w:iCs/>
+        </w:rPr>
+        <w:t xml:space="preserve"> </w:t>
+      </w:r>
+      <w:proofErr w:type="spellStart"/>
+      <w:r>
+        <w:rPr>
+          <w:i/>
+          <w:iCs/>
+        </w:rPr>
+        <w:t>Using</w:t>
+      </w:r>
+      <w:proofErr w:type="spellEnd"/>
+      <w:r>
+        <w:rPr>
+          <w:i/>
+          <w:iCs/>
+        </w:rPr>
+        <w:t xml:space="preserve"> </w:t>
+      </w:r>
+      <w:proofErr w:type="spellStart"/>
+      <w:r>
+        <w:rPr>
+          <w:i/>
+          <w:iCs/>
+        </w:rPr>
+        <w:t>End</w:t>
+      </w:r>
+      <w:proofErr w:type="spellEnd"/>
+      <w:r>
+        <w:rPr>
+          <w:i/>
+          <w:iCs/>
+        </w:rPr>
+        <w:t>-to-</w:t>
+      </w:r>
+      <w:proofErr w:type="spellStart"/>
+      <w:r>
+        <w:rPr>
+          <w:i/>
+          <w:iCs/>
+        </w:rPr>
+        <w:t>End</w:t>
+      </w:r>
+      <w:proofErr w:type="spellEnd"/>
+      <w:r>
+        <w:rPr>
+          <w:i/>
+          <w:iCs/>
+        </w:rPr>
+        <w:t xml:space="preserve"> </w:t>
+      </w:r>
+      <w:proofErr w:type="spellStart"/>
+      <w:r>
+        <w:rPr>
+          <w:i/>
+          <w:iCs/>
+        </w:rPr>
+        <w:t>Trained</w:t>
+      </w:r>
+      <w:proofErr w:type="spellEnd"/>
+      <w:r>
+        <w:rPr>
+          <w:i/>
+          <w:iCs/>
+        </w:rPr>
+        <w:t xml:space="preserve"> </w:t>
+      </w:r>
+      <w:proofErr w:type="spellStart"/>
+      <w:r>
+        <w:rPr>
+          <w:i/>
+          <w:iCs/>
+        </w:rPr>
+        <w:t>EfficientNet-Based</w:t>
+      </w:r>
+      <w:proofErr w:type="spellEnd"/>
+      <w:r>
+        <w:t xml:space="preserve"> </w:t>
+      </w:r>
+      <w:r>
+        <w:rPr>
+          <w:i/>
+          <w:iCs/>
+        </w:rPr>
+        <w:t xml:space="preserve">CNN </w:t>
+      </w:r>
+      <w:r>
+        <w:t>[6]</w:t>
+      </w:r>
+      <w:r>
+        <w:rPr>
+          <w:i/>
+          <w:iCs/>
+        </w:rPr>
+        <w:t xml:space="preserve">, </w:t>
+      </w:r>
+      <w:r>
+        <w:t xml:space="preserve">uspio </w:t>
+      </w:r>
+      <w:r>
+        <w:t xml:space="preserve">je </w:t>
+      </w:r>
+      <w:r>
+        <w:t xml:space="preserve">postići točnost </w:t>
+      </w:r>
+      <w:r>
+        <w:t xml:space="preserve">klasifikacije </w:t>
+      </w:r>
+      <w:r>
+        <w:t xml:space="preserve">od 85,13% koristeći 5-fold </w:t>
+      </w:r>
+      <w:proofErr w:type="spellStart"/>
+      <w:r>
+        <w:t>cross</w:t>
+      </w:r>
+      <w:proofErr w:type="spellEnd"/>
+      <w:r>
+        <w:t xml:space="preserve"> </w:t>
+      </w:r>
+      <w:proofErr w:type="spellStart"/>
+      <w:r>
+        <w:t>validation</w:t>
+      </w:r>
+      <w:proofErr w:type="spellEnd"/>
+      <w:r>
+        <w:t xml:space="preserve"> i </w:t>
+      </w:r>
+      <w:proofErr w:type="spellStart"/>
+      <w:r>
+        <w:t>EfficientNet</w:t>
+      </w:r>
+      <w:proofErr w:type="spellEnd"/>
+      <w:r>
+        <w:t xml:space="preserve"> model</w:t>
+      </w:r>
+      <w:r>
+        <w:t>. Učitavane slike su bile puno većih dimenzija (bolje su se sačuvali detalji), što si mi nismo mogli priuštiti zbog predugog vremena izvođenja.</w:t>
+      </w:r>
+      <w:r>
+        <w:t xml:space="preserve"> </w:t>
+      </w:r>
+      <w:proofErr w:type="spellStart"/>
+      <w:r>
+        <w:t>EfficientNet</w:t>
+      </w:r>
+      <w:proofErr w:type="spellEnd"/>
+      <w:r>
+        <w:t xml:space="preserve"> </w:t>
+      </w:r>
+      <w:r>
+        <w:t xml:space="preserve">model je jedan od trenutno najboljih dostupnih modela za klasifikaciju po robusnosti, arhitekturi i mogućnosti generalizacije. Mi smo također pokušali koristiti ovaj model kako bi provjerili je li problem u samom modelu koji koristimo, međutim količina </w:t>
+      </w:r>
+      <w:r>
+        <w:t xml:space="preserve">i trajanje </w:t>
+      </w:r>
+      <w:r>
+        <w:t>računskih operacij</w:t>
+      </w:r>
+      <w:r>
+        <w:t>a</w:t>
+      </w:r>
+      <w:r>
+        <w:t xml:space="preserve"> koj</w:t>
+      </w:r>
+      <w:r>
+        <w:t xml:space="preserve">e </w:t>
+      </w:r>
+      <w:proofErr w:type="spellStart"/>
+      <w:r>
+        <w:t>EfficientNet</w:t>
+      </w:r>
+      <w:proofErr w:type="spellEnd"/>
+      <w:r>
+        <w:t xml:space="preserve"> koristi za učenje i postavljanje težina bila je previše za najbolji laptop koji nam je bio dostupan. </w:t>
+      </w:r>
+      <w:r>
+        <w:t>Doduše,</w:t>
+      </w:r>
+      <w:r>
+        <w:t xml:space="preserve"> smatramo da se uspješnosti  našeg i spomenutog rada primarno razlikuju zbog toga što su u drugom radu</w:t>
+      </w:r>
+      <w:r>
+        <w:t xml:space="preserve"> </w:t>
+      </w:r>
+      <w:r>
+        <w:t>autori radili binarnu</w:t>
+      </w:r>
+      <w:r>
+        <w:t xml:space="preserve"> klasifikacij</w:t>
+      </w:r>
+      <w:r>
+        <w:t>u, odnosno samo su pokušali klasificirati je li riječ o malignom ili benignom tumoru</w:t>
+      </w:r>
+      <w:r>
+        <w:t xml:space="preserve">. Testirali su dvije verzije skupova podataka, </w:t>
+      </w:r>
+      <w:r>
+        <w:t xml:space="preserve"> </w:t>
+      </w:r>
+      <w:r>
+        <w:t xml:space="preserve">jednu u kojoj su </w:t>
+      </w:r>
+      <w:r>
+        <w:t xml:space="preserve">izbacili </w:t>
+      </w:r>
+      <w:r>
+        <w:t xml:space="preserve">iz skupa </w:t>
+      </w:r>
+      <w:r>
+        <w:t>sve slike ultrazvuka koje su klasificirane kao BENIGN_WITHOUT_CALLBACK</w:t>
+      </w:r>
+      <w:r>
+        <w:t>, te drugu u kojoj su takvim slikama jednostavno promijenili klasifikaciju u BENIGN.</w:t>
+      </w:r>
+      <w:r>
+        <w:t xml:space="preserve"> </w:t>
+      </w:r>
+      <w:r>
+        <w:t>Oba su podatkovna skupa dala jednaku uspješnost klasifikacije od 85%. V</w:t>
+      </w:r>
+      <w:r>
+        <w:t>izualnom analizom</w:t>
+      </w:r>
+      <w:r>
+        <w:t xml:space="preserve"> podataka</w:t>
+      </w:r>
+      <w:r>
+        <w:t xml:space="preserve"> golim okom jasno je vidljivo da su razlike na slikama koje su klasificirane kao  BENIGN i </w:t>
+      </w:r>
+      <w:r>
+        <w:t>BENIGN_WITHOUT_CALLBACK</w:t>
+      </w:r>
+      <w:r>
+        <w:t xml:space="preserve"> puno manje očite od</w:t>
+      </w:r>
+      <w:r>
+        <w:t xml:space="preserve"> </w:t>
+      </w:r>
+      <w:r>
+        <w:t>razlik</w:t>
+      </w:r>
+      <w:r>
+        <w:t xml:space="preserve">a </w:t>
+      </w:r>
+      <w:r>
+        <w:t>na tumorima koji su BENIGN i MALIGNANT.</w:t>
+      </w:r>
+      <w:r>
+        <w:t xml:space="preserve"> Žao nam je što ranije nismo naišli na ovaj članak te isprobali kako naša implementacija CNN-a uči i klasificira podatke koji su </w:t>
+      </w:r>
+      <w:r>
+        <w:t>binarno označeni sa MALIGNANT i BENIGN.</w:t>
       </w:r>
     </w:p>
     <w:p>
@@ -1736,20 +3241,175 @@
         <w:ind w:firstLine="36pt"/>
         <w:jc w:val="start"/>
       </w:pPr>
-      <w:r>
-        <w:t>Drugi rad s odličnim rezultatima je postigao točnost od 91,5%. [7]</w:t>
-      </w:r>
-    </w:p>
-    <w:p>
-      <w:pPr>
+    </w:p>
+    <w:p>
+      <w:pPr>
+        <w:ind w:firstLine="36pt"/>
         <w:jc w:val="start"/>
       </w:pPr>
+      <w:r>
+        <w:t>Tražeći</w:t>
+      </w:r>
+      <w:r>
+        <w:t xml:space="preserve"> ostale radove</w:t>
+      </w:r>
+      <w:r>
+        <w:t xml:space="preserve"> koji koriste naš podatkovni skup, na </w:t>
+      </w:r>
+      <w:proofErr w:type="spellStart"/>
+      <w:r>
+        <w:t>Kaggleu</w:t>
+      </w:r>
+      <w:proofErr w:type="spellEnd"/>
+      <w:r>
+        <w:t xml:space="preserve"> smo naišli na poveznice za još dva kvalitetna rada s visokom uspješnosti klasifikacije, oko 90% [7], [8]. Međutim pomnijim promatranjem zaključili smo da je u tim radovima naš podatkovni skup (</w:t>
+      </w:r>
+      <w:r>
+        <w:rPr>
+          <w:i/>
+          <w:iCs/>
+        </w:rPr>
+        <w:t xml:space="preserve">CBIS-DDSM: </w:t>
+      </w:r>
+      <w:proofErr w:type="spellStart"/>
+      <w:r>
+        <w:rPr>
+          <w:i/>
+          <w:iCs/>
+        </w:rPr>
+        <w:t>Breast</w:t>
+      </w:r>
+      <w:proofErr w:type="spellEnd"/>
+      <w:r>
+        <w:rPr>
+          <w:i/>
+          <w:iCs/>
+        </w:rPr>
+        <w:t xml:space="preserve"> </w:t>
+      </w:r>
+      <w:proofErr w:type="spellStart"/>
+      <w:r>
+        <w:rPr>
+          <w:i/>
+          <w:iCs/>
+        </w:rPr>
+        <w:t>Cancer</w:t>
+      </w:r>
+      <w:proofErr w:type="spellEnd"/>
+      <w:r>
+        <w:rPr>
+          <w:i/>
+          <w:iCs/>
+        </w:rPr>
+        <w:t xml:space="preserve"> </w:t>
+      </w:r>
+      <w:proofErr w:type="spellStart"/>
+      <w:r>
+        <w:rPr>
+          <w:i/>
+          <w:iCs/>
+        </w:rPr>
+        <w:t>Image</w:t>
+      </w:r>
+      <w:proofErr w:type="spellEnd"/>
+      <w:r>
+        <w:rPr>
+          <w:i/>
+          <w:iCs/>
+        </w:rPr>
+        <w:t xml:space="preserve"> </w:t>
+      </w:r>
+      <w:proofErr w:type="spellStart"/>
+      <w:r>
+        <w:rPr>
+          <w:i/>
+          <w:iCs/>
+        </w:rPr>
+        <w:t>Dataset</w:t>
+      </w:r>
+      <w:proofErr w:type="spellEnd"/>
+      <w:r>
+        <w:t xml:space="preserve">) korišten samo za demonstraciju funkcioniranja ROI maski i prikazivanja kako </w:t>
+      </w:r>
+      <w:proofErr w:type="spellStart"/>
+      <w:r>
+        <w:t>neuralna</w:t>
+      </w:r>
+      <w:proofErr w:type="spellEnd"/>
+      <w:r>
+        <w:t xml:space="preserve"> mreža analizira vizualne podatke. Za samo </w:t>
+      </w:r>
+      <w:r>
+        <w:t xml:space="preserve">treniranje CNN-a i </w:t>
+      </w:r>
+      <w:r>
+        <w:t>testiranje</w:t>
+      </w:r>
+      <w:r>
+        <w:t xml:space="preserve"> uspješnosti klasifikacije</w:t>
+      </w:r>
+      <w:r>
+        <w:t xml:space="preserve"> je </w:t>
+      </w:r>
+      <w:r>
+        <w:t>korišten potpuno dugi skup podataka (</w:t>
+      </w:r>
+      <w:proofErr w:type="spellStart"/>
+      <w:r>
+        <w:rPr>
+          <w:i/>
+          <w:iCs/>
+        </w:rPr>
+        <w:t>Breast</w:t>
+      </w:r>
+      <w:proofErr w:type="spellEnd"/>
+      <w:r>
+        <w:rPr>
+          <w:i/>
+          <w:iCs/>
+        </w:rPr>
+        <w:t xml:space="preserve"> </w:t>
+      </w:r>
+      <w:proofErr w:type="spellStart"/>
+      <w:r>
+        <w:rPr>
+          <w:i/>
+          <w:iCs/>
+        </w:rPr>
+        <w:t>Histopathology</w:t>
+      </w:r>
+      <w:proofErr w:type="spellEnd"/>
+      <w:r>
+        <w:rPr>
+          <w:i/>
+          <w:iCs/>
+        </w:rPr>
+        <w:t xml:space="preserve"> </w:t>
+      </w:r>
+      <w:proofErr w:type="spellStart"/>
+      <w:r>
+        <w:rPr>
+          <w:i/>
+          <w:iCs/>
+        </w:rPr>
+        <w:t>Images</w:t>
+      </w:r>
+      <w:proofErr w:type="spellEnd"/>
+      <w:r>
+        <w:t xml:space="preserve"> [9]). Zbog toga ne možemo uspoređivati kvalitetu klasifikacije modela, ali za ubuduće bi bilo interesantno testirati koliko naš najbolji model dobro predviđa malignost za ovaj skup podataka. </w:t>
+      </w:r>
+    </w:p>
+    <w:p>
+      <w:pPr>
+        <w:jc w:val="start"/>
+      </w:pPr>
     </w:p>
     <w:p>
       <w:pPr>
         <w:pStyle w:val="Heading1"/>
       </w:pPr>
       <w:r>
+        <w:lastRenderedPageBreak/>
         <w:t>Zaključak</w:t>
       </w:r>
     </w:p>
@@ -1757,1107 +3417,127 @@
       <w:pPr>
         <w:ind w:firstLine="40.50pt"/>
         <w:jc w:val="start"/>
-      </w:pPr>
-      <w:r>
-        <w:t>Modeli koje smo trenirali i testirali na CBIS-DDSM: Breast Cancer Image Datasetu nažalost nisu uspjeli postići željenu točnost pri klasificiranju snimki. Naši rezultati se ne mogu mjeriti s rezultatima znanstvenika koji su u ovom području stručni</w:t>
-      </w:r>
-      <w:r>
-        <w:t xml:space="preserve"> i koriste složenije arhitekture te naprednije tehnike treniranja</w:t>
-      </w:r>
-      <w:r>
-        <w:t xml:space="preserve">. Postoji puno prostora za </w:t>
-      </w:r>
-      <w:r>
-        <w:t>napredak</w:t>
-      </w:r>
-      <w:r>
-        <w:t xml:space="preserve"> što </w:t>
-      </w:r>
-      <w:r>
-        <w:t>će biti moguće uz opsežnije znanje neuronskih mreža i dubokog učenja.</w:t>
-      </w:r>
-      <w:r>
-        <w:t xml:space="preserve"> </w:t>
-      </w:r>
-    </w:p>
-    <w:p>
-      <w:pPr>
-        <w:jc w:val="start"/>
-      </w:pPr>
-    </w:p>
-    <w:p>
-      <w:pPr>
-        <w:pStyle w:val="Heading2"/>
-      </w:pPr>
-      <w:r>
-        <w:t>Equations</w:t>
-      </w:r>
-    </w:p>
-    <w:p>
-      <w:pPr>
-        <w:pStyle w:val="BodyText"/>
-        <w:rPr>
-          <w:lang w:val="hr-HR"/>
-        </w:rPr>
-      </w:pPr>
-      <w:r>
-        <w:rPr>
-          <w:lang w:val="hr-HR"/>
-        </w:rPr>
-        <w:t>The equations are an exception to the prescribed specifications of this template. You will need to determine whether or not your equation should be typed using either the Times New Roman or the Symbol font (please no other font). To create multileveled equations, it may be necessary to treat the equation as a graphic and insert it into the text after your paper is styled.</w:t>
-      </w:r>
-    </w:p>
-    <w:p>
-      <w:pPr>
-        <w:pStyle w:val="BodyText"/>
-        <w:rPr>
-          <w:lang w:val="hr-HR"/>
-        </w:rPr>
-      </w:pPr>
-      <w:r>
-        <w:rPr>
-          <w:lang w:val="hr-HR"/>
-        </w:rPr>
-        <w:t>Number equations consecutively. Equation numbers, within parentheses, are to position flush right, as in (1), using a right tab stop. To make your equations more compact, you may use the solidus ( / ), the exp function, or appropriate exponents. Italicize Roman symbols for quantities and variables, but not Greek symbols. Use a long dash rather than a hyphen for a minus sign. Punctuate equations with commas or periods when they are part of a sentence, as in</w:t>
-      </w:r>
-      <w:r>
-        <w:rPr>
-          <w:lang w:val="hr-HR"/>
-        </w:rPr>
-        <w:t>:</w:t>
-      </w:r>
-    </w:p>
-    <w:p>
-      <w:pPr>
-        <w:pStyle w:val="equation"/>
-      </w:pPr>
-      <w:r>
-        <w:tab/>
-      </w:r>
-      <w:r>
-        <w:rPr>
-          <w:rFonts w:ascii="Times New Roman" w:hAnsi="Times New Roman" w:cs="Times New Roman"/>
-          <w:i/>
-        </w:rPr>
-        <w:t>a</w:t>
-      </w:r>
-      <w:r>
-        <w:t></w:t>
-      </w:r>
-      <w:r>
-        <w:t></w:t>
-      </w:r>
-      <w:r>
-        <w:t></w:t>
-      </w:r>
-      <w:r>
-        <w:rPr>
-          <w:rFonts w:ascii="Times New Roman" w:hAnsi="Times New Roman" w:cs="Times New Roman"/>
-          <w:i/>
-        </w:rPr>
-        <w:t>b</w:t>
-      </w:r>
-      <w:r>
-        <w:t></w:t>
-      </w:r>
-      <w:r>
-        <w:t></w:t>
-      </w:r>
-      <w:r>
-        <w:t></w:t>
-      </w:r>
-      <w:r>
-        <w:t></w:t>
-      </w:r>
-      <w:r>
-        <w:t></w:t>
-      </w:r>
-      <w:r>
-        <w:tab/>
-      </w:r>
-      <w:r>
-        <w:t></w:t>
-      </w:r>
-      <w:r>
-        <w:t></w:t>
-      </w:r>
-      <w:r>
-        <w:t></w:t>
-      </w:r>
-    </w:p>
-    <w:p>
-      <w:pPr>
-        <w:pStyle w:val="BodyText"/>
-        <w:rPr>
-          <w:lang w:val="hr-HR"/>
-        </w:rPr>
-      </w:pPr>
-      <w:r>
-        <w:rPr>
-          <w:lang w:val="hr-HR"/>
-        </w:rPr>
-        <w:t xml:space="preserve">Note that the equation is centered using a center tab stop. Be sure that the symbols in your equation have been defined </w:t>
-      </w:r>
-      <w:r>
-        <w:rPr>
-          <w:lang w:val="hr-HR"/>
-        </w:rPr>
-        <w:t>before or immediately following the equation. Use “(1)”, not “Eq. (1)” or “equation (1)”, except at the beginning of a sentence: “Equation (1) is . . .”</w:t>
-      </w:r>
-    </w:p>
-    <w:p>
-      <w:pPr>
-        <w:pStyle w:val="Heading2"/>
-      </w:pPr>
-      <w:r>
-        <w:t>Some Common Mistakes</w:t>
-      </w:r>
-    </w:p>
-    <w:p>
-      <w:pPr>
-        <w:pStyle w:val="bulletlist"/>
-        <w:rPr>
-          <w:lang w:val="hr-HR"/>
-        </w:rPr>
-      </w:pPr>
-      <w:r>
-        <w:rPr>
-          <w:lang w:val="hr-HR"/>
-        </w:rPr>
-        <w:t>The word “data” is plural, not singular.</w:t>
-      </w:r>
-    </w:p>
-    <w:p>
-      <w:pPr>
-        <w:pStyle w:val="bulletlist"/>
-        <w:rPr>
-          <w:lang w:val="hr-HR"/>
-        </w:rPr>
-      </w:pPr>
-      <w:r>
-        <w:rPr>
-          <w:lang w:val="hr-HR"/>
-        </w:rPr>
-        <w:t xml:space="preserve">The subscript for the permeability of vacuum </w:t>
-      </w:r>
-      <w:r>
-        <w:rPr>
-          <w:rFonts w:ascii="Symbol" w:hAnsi="Symbol" w:cs="Symbol"/>
-          <w:i/>
-          <w:iCs/>
-          <w:snapToGrid w:val="0"/>
-          <w:lang w:val="hr-HR"/>
-        </w:rPr>
-        <w:t></w:t>
-      </w:r>
-      <w:r>
-        <w:rPr>
-          <w:vertAlign w:val="subscript"/>
-          <w:lang w:val="hr-HR"/>
-        </w:rPr>
-        <w:t>0</w:t>
-      </w:r>
-      <w:r>
-        <w:rPr>
-          <w:lang w:val="hr-HR"/>
-        </w:rPr>
-        <w:t>, and other common scientific constants, is zero with subscript formatting, not a lowercase letter “o”.</w:t>
-      </w:r>
-    </w:p>
-    <w:p>
-      <w:pPr>
-        <w:pStyle w:val="bulletlist"/>
-        <w:rPr>
-          <w:lang w:val="hr-HR"/>
-        </w:rPr>
-      </w:pPr>
-      <w:r>
-        <w:rPr>
-          <w:lang w:val="hr-HR"/>
-        </w:rPr>
-        <w:t xml:space="preserve">In American </w:t>
-      </w:r>
-      <w:r>
-        <w:rPr>
-          <w:lang w:val="hr-HR"/>
-        </w:rPr>
-        <w:t>English, commas, semi</w:t>
-      </w:r>
-      <w:r>
-        <w:rPr>
-          <w:lang w:val="hr-HR"/>
-        </w:rPr>
-        <w:t>colons, periods, question and exclamation marks are located within quotation marks only when a complete thought or name is cited, such as a title or full quotation. When quotation marks are used, instead of a bold or italic typeface, to highlight a word or phrase, punctuation should appear outside of the quotation marks. A parenthetical phrase or statement at the end of a sentence is punctuated outside of the closing parenthesis (like this). (A parenthetical sentence is punctuated within the parentheses.)</w:t>
-      </w:r>
-    </w:p>
-    <w:p>
-      <w:pPr>
-        <w:pStyle w:val="bulletlist"/>
-        <w:rPr>
-          <w:lang w:val="hr-HR"/>
-        </w:rPr>
-      </w:pPr>
-      <w:r>
-        <w:rPr>
-          <w:lang w:val="hr-HR"/>
-        </w:rPr>
-        <w:t>A graph within a graph is an “inset”, not an “insert”. The word alternatively is preferred to the word “alternately” (unless you really mean something that alternates).</w:t>
-      </w:r>
-    </w:p>
-    <w:p>
-      <w:pPr>
-        <w:pStyle w:val="bulletlist"/>
-        <w:rPr>
-          <w:lang w:val="hr-HR"/>
-        </w:rPr>
-      </w:pPr>
-      <w:r>
-        <w:rPr>
-          <w:lang w:val="hr-HR"/>
-        </w:rPr>
-        <w:t>Do not use the word “essentially” to mean “approximately” or “effectively”.</w:t>
-      </w:r>
-    </w:p>
-    <w:p>
-      <w:pPr>
-        <w:pStyle w:val="bulletlist"/>
-        <w:rPr>
-          <w:lang w:val="hr-HR"/>
-        </w:rPr>
-      </w:pPr>
-      <w:r>
-        <w:rPr>
-          <w:lang w:val="hr-HR"/>
-        </w:rPr>
-        <w:t>In your paper title, if the words “that uses” can accurately replace the word “using”, capitalize the “u”; if not, keep using lower-cased.</w:t>
-      </w:r>
-    </w:p>
-    <w:p>
-      <w:pPr>
-        <w:pStyle w:val="bulletlist"/>
-        <w:rPr>
-          <w:lang w:val="hr-HR"/>
-        </w:rPr>
-      </w:pPr>
-      <w:r>
-        <w:rPr>
-          <w:lang w:val="hr-HR"/>
-        </w:rPr>
-        <w:t>Be aware of the different meanings of the homophones “affect” and “effect”, “complement” and “compliment”, “discreet” and “discrete”, “principal” and “principle”.</w:t>
-      </w:r>
-    </w:p>
-    <w:p>
-      <w:pPr>
-        <w:pStyle w:val="bulletlist"/>
-        <w:rPr>
-          <w:lang w:val="hr-HR"/>
-        </w:rPr>
-      </w:pPr>
-      <w:r>
-        <w:rPr>
-          <w:lang w:val="hr-HR"/>
-        </w:rPr>
-        <w:t>Do not confuse “imply” and “infer”.</w:t>
-      </w:r>
-    </w:p>
-    <w:p>
-      <w:pPr>
-        <w:pStyle w:val="bulletlist"/>
-        <w:rPr>
-          <w:lang w:val="hr-HR"/>
-        </w:rPr>
-      </w:pPr>
-      <w:r>
-        <w:rPr>
-          <w:lang w:val="hr-HR"/>
-        </w:rPr>
-        <w:t>The prefix “non” is not a word; it should be joined to the word it modifies, usually without a hyphen.</w:t>
-      </w:r>
-    </w:p>
-    <w:p>
-      <w:pPr>
-        <w:pStyle w:val="bulletlist"/>
-        <w:rPr>
-          <w:lang w:val="hr-HR"/>
-        </w:rPr>
-      </w:pPr>
-      <w:r>
-        <w:rPr>
-          <w:lang w:val="hr-HR"/>
-        </w:rPr>
-        <w:t>There is no period after the “et” in the Latin abbreviation “et al.”.</w:t>
-      </w:r>
-    </w:p>
-    <w:p>
-      <w:pPr>
-        <w:pStyle w:val="bulletlist"/>
-        <w:rPr>
-          <w:lang w:val="hr-HR"/>
-        </w:rPr>
-      </w:pPr>
-      <w:r>
-        <w:rPr>
-          <w:lang w:val="hr-HR"/>
-        </w:rPr>
-        <w:t>The abbreviation “i.e.” means “that is”, and the abbreviation “e.g.” means “for example”.</w:t>
-      </w:r>
-    </w:p>
-    <w:p>
-      <w:pPr>
-        <w:pStyle w:val="BodyText"/>
-        <w:rPr>
-          <w:lang w:val="hr-HR"/>
-        </w:rPr>
-      </w:pPr>
-      <w:r>
-        <w:rPr>
-          <w:lang w:val="hr-HR"/>
-        </w:rPr>
-        <w:t>An excellent style manual for science writers is [7].</w:t>
-      </w:r>
-    </w:p>
-    <w:p>
-      <w:pPr>
-        <w:pStyle w:val="Heading1"/>
-      </w:pPr>
-      <w:r>
-        <w:t>Using the Template</w:t>
-      </w:r>
-    </w:p>
-    <w:p>
-      <w:pPr>
-        <w:pStyle w:val="BodyText"/>
-        <w:rPr>
-          <w:lang w:val="hr-HR"/>
-        </w:rPr>
-      </w:pPr>
-      <w:r>
-        <w:rPr>
-          <w:lang w:val="hr-HR"/>
-        </w:rPr>
-        <w:t>After the text edit has been completed, the paper is ready for the template. Duplicate the template file by using the Save As command, and use the naming convention prescribed by your conference for the name of your paper. In this newly created file, highlight all of the contents and import your prepared text file. You are now ready to style your paper; use the scroll down window on the left of the MS Word Formatting toolbar.</w:t>
-      </w:r>
-    </w:p>
-    <w:p>
-      <w:pPr>
-        <w:pStyle w:val="Heading2"/>
-      </w:pPr>
-      <w:r>
-        <w:t>Authors and Affiliations</w:t>
-      </w:r>
-    </w:p>
-    <w:p>
-      <w:pPr>
-        <w:pStyle w:val="BodyText"/>
-        <w:rPr>
-          <w:lang w:val="hr-HR"/>
-        </w:rPr>
-      </w:pPr>
-      <w:r>
-        <w:rPr>
-          <w:b/>
-          <w:lang w:val="hr-HR"/>
-        </w:rPr>
-        <w:t xml:space="preserve">The template is </w:t>
-      </w:r>
-      <w:r>
-        <w:rPr>
-          <w:b/>
-          <w:lang w:val="hr-HR"/>
-        </w:rPr>
-        <w:t>designed</w:t>
-      </w:r>
-      <w:r>
-        <w:rPr>
-          <w:b/>
-          <w:lang w:val="hr-HR"/>
-        </w:rPr>
-        <w:t xml:space="preserve"> for,</w:t>
-      </w:r>
-      <w:r>
-        <w:rPr>
-          <w:b/>
-          <w:lang w:val="hr-HR"/>
-        </w:rPr>
-        <w:t xml:space="preserve"> but not limited to</w:t>
-      </w:r>
-      <w:r>
-        <w:rPr>
-          <w:b/>
-          <w:lang w:val="hr-HR"/>
-        </w:rPr>
-        <w:t>,</w:t>
-      </w:r>
-      <w:r>
-        <w:rPr>
-          <w:b/>
-          <w:lang w:val="hr-HR"/>
-        </w:rPr>
-        <w:t xml:space="preserve"> </w:t>
-      </w:r>
-      <w:r>
-        <w:rPr>
-          <w:b/>
-          <w:lang w:val="hr-HR"/>
-        </w:rPr>
-        <w:t>six</w:t>
-      </w:r>
-      <w:r>
-        <w:rPr>
-          <w:b/>
-          <w:lang w:val="hr-HR"/>
-        </w:rPr>
-        <w:t xml:space="preserve"> authors.</w:t>
-      </w:r>
-      <w:r>
-        <w:rPr>
-          <w:lang w:val="hr-HR"/>
-        </w:rPr>
-        <w:t xml:space="preserve"> </w:t>
-      </w:r>
-      <w:r>
-        <w:rPr>
-          <w:lang w:val="hr-HR"/>
-        </w:rPr>
-        <w:t xml:space="preserve">A minimum of one author is required for all conference articles. </w:t>
-      </w:r>
-      <w:r>
-        <w:rPr>
-          <w:lang w:val="hr-HR"/>
-        </w:rPr>
-        <w:t xml:space="preserve">Author names should be listed starting from left to right and then moving down to the next line. This is the author sequence that will be used in future citations and </w:t>
-      </w:r>
-      <w:r>
-        <w:rPr>
-          <w:lang w:val="hr-HR"/>
-        </w:rPr>
-        <w:lastRenderedPageBreak/>
-        <w:t>by indexing services. Names should not be listed in columns nor group by affiliation.</w:t>
-      </w:r>
-      <w:r>
-        <w:rPr>
-          <w:lang w:val="hr-HR"/>
-        </w:rPr>
-        <w:t xml:space="preserve"> </w:t>
-      </w:r>
-      <w:r>
-        <w:rPr>
-          <w:lang w:val="hr-HR"/>
-        </w:rPr>
-        <w:t>Please keep your affiliations as succinct as possible (for example, do not differentiate among departments of the same organization).</w:t>
-      </w:r>
-    </w:p>
-    <w:p>
-      <w:pPr>
-        <w:pStyle w:val="Heading3"/>
-      </w:pPr>
-      <w:r>
-        <w:t xml:space="preserve">For papers with more than six authors: </w:t>
-      </w:r>
-      <w:r>
-        <w:rPr>
-          <w:i w:val="0"/>
-        </w:rPr>
-        <w:t>Add author names horizontally, moving to a third row if needed for more than 8 authors.</w:t>
-      </w:r>
-    </w:p>
-    <w:p>
-      <w:pPr>
-        <w:pStyle w:val="Heading3"/>
-      </w:pPr>
-      <w:r>
-        <w:t xml:space="preserve">For </w:t>
-      </w:r>
-      <w:r>
-        <w:t xml:space="preserve">papers with less than </w:t>
-      </w:r>
-      <w:r>
-        <w:t>six</w:t>
-      </w:r>
-      <w:r>
-        <w:t xml:space="preserve"> authors</w:t>
-      </w:r>
-      <w:r>
-        <w:t xml:space="preserve">: </w:t>
-      </w:r>
-      <w:r>
-        <w:rPr>
-          <w:i w:val="0"/>
-        </w:rPr>
-        <w:t>To change the default, adjust the template as follows.</w:t>
-      </w:r>
-    </w:p>
-    <w:p>
-      <w:pPr>
-        <w:pStyle w:val="Heading4"/>
-      </w:pPr>
-      <w:r>
-        <w:t xml:space="preserve">Selection: </w:t>
-      </w:r>
-      <w:r>
-        <w:rPr>
-          <w:i w:val="0"/>
-        </w:rPr>
-        <w:t>Highlight all author and affiliation lines.</w:t>
-      </w:r>
-    </w:p>
-    <w:p>
-      <w:pPr>
-        <w:pStyle w:val="Heading4"/>
-      </w:pPr>
-      <w:r>
-        <w:t xml:space="preserve">Change number of columns: </w:t>
-      </w:r>
-      <w:r>
-        <w:rPr>
-          <w:i w:val="0"/>
-        </w:rPr>
-        <w:t xml:space="preserve">Select the Columns icon from the MS Word Standard toolbar and then select </w:t>
-      </w:r>
-      <w:r>
-        <w:rPr>
-          <w:i w:val="0"/>
-        </w:rPr>
-        <w:t>the correct number of columns</w:t>
-      </w:r>
-      <w:r>
-        <w:rPr>
-          <w:i w:val="0"/>
-        </w:rPr>
-        <w:t xml:space="preserve"> from the selection palette.</w:t>
-      </w:r>
-    </w:p>
-    <w:p>
-      <w:pPr>
-        <w:pStyle w:val="Heading4"/>
-        <w:rPr>
-          <w:i w:val="0"/>
-        </w:rPr>
-      </w:pPr>
-      <w:r>
-        <w:t xml:space="preserve">Deletion: </w:t>
-      </w:r>
-      <w:r>
-        <w:rPr>
-          <w:i w:val="0"/>
-        </w:rPr>
-        <w:t xml:space="preserve">Delete the author and affiliation lines for the </w:t>
-      </w:r>
-      <w:r>
-        <w:rPr>
-          <w:i w:val="0"/>
-        </w:rPr>
-        <w:t>extra authors.</w:t>
-      </w:r>
-    </w:p>
-    <w:p>
-      <w:pPr>
-        <w:jc w:val="start"/>
-        <w:rPr>
-          <w:i/>
-          <w:iCs/>
-          <w:noProof/>
-        </w:rPr>
-      </w:pPr>
-    </w:p>
-    <w:p>
-      <w:pPr>
-        <w:pStyle w:val="Heading2"/>
-      </w:pPr>
-      <w:r>
-        <w:t>Identify the Headings</w:t>
-      </w:r>
-    </w:p>
-    <w:p>
-      <w:pPr>
-        <w:pStyle w:val="BodyText"/>
-        <w:rPr>
-          <w:lang w:val="hr-HR"/>
-        </w:rPr>
-      </w:pPr>
-      <w:r>
-        <w:rPr>
-          <w:lang w:val="hr-HR"/>
-        </w:rPr>
-        <w:t>Headings, or heads, are organizational devices that guide the reader through your paper. There are two types: component heads and text heads.</w:t>
-      </w:r>
-    </w:p>
-    <w:p>
-      <w:pPr>
-        <w:pStyle w:val="BodyText"/>
-        <w:rPr>
-          <w:lang w:val="hr-HR"/>
-        </w:rPr>
-      </w:pPr>
-      <w:r>
-        <w:rPr>
-          <w:lang w:val="hr-HR"/>
-        </w:rPr>
-        <w:t>Component heads identify the different components of your paper and are not topically subordinate to each other. Examples include Acknowledgments and References and, for these, the correct style to use is “Heading 5”. Use “figure caption” for your Figure captions, and “table head” for your table title. Run-in heads, such as “Abstract”, will require you to apply a style (in this case, italic) in addition to the style provided by the drop down menu to differentiate the head from the text.</w:t>
-      </w:r>
-    </w:p>
-    <w:p>
-      <w:pPr>
-        <w:pStyle w:val="BodyText"/>
-        <w:rPr>
-          <w:lang w:val="hr-HR"/>
-        </w:rPr>
-      </w:pPr>
-      <w:r>
-        <w:rPr>
-          <w:lang w:val="hr-HR"/>
-        </w:rPr>
-        <w:t>Text heads organize the topics on a relational, hierarchical basis. For example, the paper title is the primary text head because all subsequent material relates and elaborates on this one topic. If there are two or more sub-topics, the next level head (uppercase Roman numerals) should be used and, conversely, if there are not at least two sub-topics, then no subheads should be introduced. Styles named “Heading 1”, “Heading 2”, “Heading 3”, and “Heading 4” are prescribed.</w:t>
-      </w:r>
-    </w:p>
-    <w:p>
-      <w:pPr>
-        <w:pStyle w:val="Heading2"/>
-      </w:pPr>
-      <w:r>
-        <w:t>Figures and Tables</w:t>
-      </w:r>
-    </w:p>
-    <w:p>
-      <w:pPr>
-        <w:pStyle w:val="Heading4"/>
-      </w:pPr>
-      <w:r>
-        <w:t xml:space="preserve"> </w:t>
-      </w:r>
-      <w:r>
-        <w:t xml:space="preserve">Positioning Figures and Tables: </w:t>
-      </w:r>
-      <w:r>
-        <w:rPr>
-          <w:i w:val="0"/>
-        </w:rPr>
-        <w:t>Place figures and tables at the top and bottom of columns. Avoid placing them in the middle of columns. Large figures and tables may span across both columns. Figure captions should be below the figures; table heads should appear above the tables. Insert figures and tables after they are cited in the text. Use the abbreviation “Fig. 1”, even at the beginning of a sentence.</w:t>
-      </w:r>
-    </w:p>
-    <w:p>
-      <w:pPr>
-        <w:pStyle w:val="tablehead"/>
-        <w:rPr>
-          <w:lang w:val="hr-HR"/>
-        </w:rPr>
-      </w:pPr>
-      <w:r>
-        <w:rPr>
-          <w:lang w:val="hr-HR"/>
-        </w:rPr>
-        <w:t>Table Type Styles</w:t>
-      </w:r>
-    </w:p>
-    <w:tbl>
-      <w:tblPr>
-        <w:tblW w:w="0pt" w:type="dxa"/>
-        <w:jc w:val="center"/>
-        <w:tblBorders>
-          <w:top w:val="single" w:sz="2" w:space="0" w:color="auto"/>
-          <w:start w:val="single" w:sz="2" w:space="0" w:color="auto"/>
-          <w:bottom w:val="single" w:sz="2" w:space="0" w:color="auto"/>
-          <w:end w:val="single" w:sz="2" w:space="0" w:color="auto"/>
-          <w:insideH w:val="single" w:sz="2" w:space="0" w:color="auto"/>
-          <w:insideV w:val="single" w:sz="2" w:space="0" w:color="auto"/>
-        </w:tblBorders>
-        <w:tblLayout w:type="fixed"/>
-        <w:tblLook w:firstRow="0" w:lastRow="0" w:firstColumn="0" w:lastColumn="0" w:noHBand="0" w:noVBand="0"/>
-      </w:tblPr>
-      <w:tblGrid>
-        <w:gridCol w:w="720"/>
-        <w:gridCol w:w="2340"/>
-        <w:gridCol w:w="900"/>
-        <w:gridCol w:w="900"/>
-      </w:tblGrid>
-      <w:tr>
-        <w:trPr>
-          <w:cantSplit/>
-          <w:trHeight w:val="240"/>
-          <w:tblHeader/>
-          <w:jc w:val="center"/>
-        </w:trPr>
-        <w:tc>
-          <w:tcPr>
-            <w:tcW w:w="36pt" w:type="dxa"/>
-            <w:vMerge w:val="restart"/>
-            <w:vAlign w:val="center"/>
-          </w:tcPr>
-          <w:p>
-            <w:pPr>
-              <w:pStyle w:val="tablecolhead"/>
-            </w:pPr>
-            <w:r>
-              <w:t>Table Head</w:t>
-            </w:r>
-          </w:p>
-        </w:tc>
-        <w:tc>
-          <w:tcPr>
-            <w:tcW w:w="207pt" w:type="dxa"/>
-            <w:gridSpan w:val="3"/>
-            <w:vAlign w:val="center"/>
-          </w:tcPr>
-          <w:p>
-            <w:pPr>
-              <w:pStyle w:val="tablecolhead"/>
-            </w:pPr>
-            <w:r>
-              <w:t>Table Column Head</w:t>
-            </w:r>
-          </w:p>
-        </w:tc>
-      </w:tr>
-      <w:tr>
-        <w:trPr>
-          <w:cantSplit/>
-          <w:trHeight w:val="240"/>
-          <w:tblHeader/>
-          <w:jc w:val="center"/>
-        </w:trPr>
-        <w:tc>
-          <w:tcPr>
-            <w:tcW w:w="36pt" w:type="dxa"/>
-            <w:vMerge/>
-          </w:tcPr>
-          <w:p>
-            <w:pPr>
-              <w:rPr>
-                <w:sz w:val="16"/>
-                <w:szCs w:val="16"/>
-              </w:rPr>
-            </w:pPr>
-          </w:p>
-        </w:tc>
-        <w:tc>
-          <w:tcPr>
-            <w:tcW w:w="117pt" w:type="dxa"/>
-            <w:vAlign w:val="center"/>
-          </w:tcPr>
-          <w:p>
-            <w:pPr>
-              <w:pStyle w:val="tablecolsubhead"/>
-            </w:pPr>
-            <w:r>
-              <w:t>Table column subhead</w:t>
-            </w:r>
-          </w:p>
-        </w:tc>
-        <w:tc>
-          <w:tcPr>
-            <w:tcW w:w="45pt" w:type="dxa"/>
-            <w:vAlign w:val="center"/>
-          </w:tcPr>
-          <w:p>
-            <w:pPr>
-              <w:pStyle w:val="tablecolsubhead"/>
-            </w:pPr>
-            <w:r>
-              <w:t>Subhead</w:t>
-            </w:r>
-          </w:p>
-        </w:tc>
-        <w:tc>
-          <w:tcPr>
-            <w:tcW w:w="45pt" w:type="dxa"/>
-            <w:vAlign w:val="center"/>
-          </w:tcPr>
-          <w:p>
-            <w:pPr>
-              <w:pStyle w:val="tablecolsubhead"/>
-            </w:pPr>
-            <w:r>
-              <w:t>Subhead</w:t>
-            </w:r>
-          </w:p>
-        </w:tc>
-      </w:tr>
-      <w:tr>
-        <w:trPr>
-          <w:trHeight w:val="320"/>
-          <w:jc w:val="center"/>
-        </w:trPr>
-        <w:tc>
-          <w:tcPr>
-            <w:tcW w:w="36pt" w:type="dxa"/>
-            <w:vAlign w:val="center"/>
-          </w:tcPr>
-          <w:p>
-            <w:pPr>
-              <w:pStyle w:val="tablecopy"/>
-              <w:rPr>
-                <w:sz w:val="8"/>
-                <w:szCs w:val="8"/>
-                <w:lang w:val="hr-HR"/>
-              </w:rPr>
-            </w:pPr>
-            <w:r>
-              <w:rPr>
-                <w:lang w:val="hr-HR"/>
-              </w:rPr>
-              <w:t>copy</w:t>
-            </w:r>
-          </w:p>
-        </w:tc>
-        <w:tc>
-          <w:tcPr>
-            <w:tcW w:w="117pt" w:type="dxa"/>
-            <w:vAlign w:val="center"/>
-          </w:tcPr>
-          <w:p>
-            <w:pPr>
-              <w:pStyle w:val="tablecopy"/>
-              <w:rPr>
-                <w:lang w:val="hr-HR"/>
-              </w:rPr>
-            </w:pPr>
-            <w:r>
-              <w:rPr>
-                <w:lang w:val="hr-HR"/>
-              </w:rPr>
-              <w:t>More table copy</w:t>
-            </w:r>
-            <w:r>
-              <w:rPr>
-                <w:vertAlign w:val="superscript"/>
-                <w:lang w:val="hr-HR"/>
-              </w:rPr>
-              <w:t>a</w:t>
-            </w:r>
-          </w:p>
-        </w:tc>
-        <w:tc>
-          <w:tcPr>
-            <w:tcW w:w="45pt" w:type="dxa"/>
-            <w:vAlign w:val="center"/>
-          </w:tcPr>
-          <w:p>
-            <w:pPr>
-              <w:rPr>
-                <w:sz w:val="16"/>
-                <w:szCs w:val="16"/>
-              </w:rPr>
-            </w:pPr>
-          </w:p>
-        </w:tc>
-        <w:tc>
-          <w:tcPr>
-            <w:tcW w:w="45pt" w:type="dxa"/>
-            <w:vAlign w:val="center"/>
-          </w:tcPr>
-          <w:p>
-            <w:pPr>
-              <w:rPr>
-                <w:sz w:val="16"/>
-                <w:szCs w:val="16"/>
-              </w:rPr>
-            </w:pPr>
-          </w:p>
-        </w:tc>
-      </w:tr>
-    </w:tbl>
-    <w:p>
-      <w:pPr>
-        <w:pStyle w:val="tablefootnote"/>
-        <w:rPr>
-          <w:lang w:val="hr-HR"/>
-        </w:rPr>
-      </w:pPr>
-      <w:r>
-        <w:rPr>
-          <w:lang w:val="hr-HR"/>
-        </w:rPr>
-        <w:t>Sample of a Table footnote. (</w:t>
-      </w:r>
-      <w:r>
-        <w:rPr>
-          <w:i/>
-          <w:lang w:val="hr-HR"/>
-        </w:rPr>
-        <w:t>Table footnote</w:t>
-      </w:r>
-      <w:r>
-        <w:rPr>
-          <w:lang w:val="hr-HR"/>
-        </w:rPr>
-        <w:t>)</w:t>
-      </w:r>
-    </w:p>
-    <w:p>
-      <w:pPr>
-        <w:pStyle w:val="figurecaption"/>
-        <w:rPr>
-          <w:lang w:val="hr-HR"/>
-        </w:rPr>
-      </w:pPr>
-      <w:r>
-        <w:rPr>
-          <w:lang w:val="hr-HR"/>
-        </w:rPr>
-        <w:t xml:space="preserve">Example of a figure caption. </w:t>
-      </w:r>
-      <w:r>
-        <w:rPr>
-          <w:iCs/>
-          <w:lang w:val="hr-HR"/>
-        </w:rPr>
-        <w:t>(</w:t>
-      </w:r>
-      <w:r>
-        <w:rPr>
-          <w:i/>
-          <w:iCs/>
-          <w:lang w:val="hr-HR"/>
-        </w:rPr>
-        <w:t>figure caption</w:t>
-      </w:r>
-      <w:r>
-        <w:rPr>
-          <w:iCs/>
-          <w:lang w:val="hr-HR"/>
-        </w:rPr>
-        <w:t>)</w:t>
-      </w:r>
-    </w:p>
-    <w:p>
-      <w:pPr>
-        <w:pStyle w:val="BodyText"/>
-        <w:rPr>
-          <w:lang w:val="hr-HR"/>
-        </w:rPr>
-      </w:pPr>
-      <w:r>
-        <w:rPr>
-          <w:lang w:val="hr-HR"/>
-        </w:rPr>
-        <w:t xml:space="preserve">Figure Labels: Use 8 point Times New Roman for Figure labels. Use words rather than symbols or abbreviations when writing Figure axis labels to avoid confusing the reader. As an example, write the quantity “Magnetization”, or “Magnetization, M”, not just “M”. If including units in the </w:t>
-      </w:r>
-      <w:r>
-        <w:rPr>
-          <w:lang w:val="hr-HR"/>
-        </w:rPr>
-        <w:t>label, present them within parentheses. Do not label axes only with units. In the example, write “Magnetization (A/m)” or “Magnetization {A[m(1)]}”, not just “A/m”. Do not label axes</w:t>
-      </w:r>
-      <w:r>
-        <w:rPr>
-          <w:lang w:val="hr-HR"/>
-        </w:rPr>
-        <w:t xml:space="preserve"> with a ratio of quantities and units. For example, write “Temperature (K)”, not “Temperature/K”.</w:t>
-      </w:r>
-    </w:p>
-    <w:p>
-      <w:pPr>
-        <w:pStyle w:val="Heading5"/>
-      </w:pPr>
-      <w:r>
-        <w:t xml:space="preserve">Acknowledgment </w:t>
-      </w:r>
-      <w:r>
-        <w:rPr>
-          <w:i/>
-          <w:iCs/>
-        </w:rPr>
-        <w:t>(</w:t>
-      </w:r>
-      <w:r>
-        <w:rPr>
-          <w:i/>
-          <w:iCs/>
-          <w:smallCaps w:val="0"/>
-        </w:rPr>
-        <w:t>Heading 5</w:t>
-      </w:r>
-      <w:r>
-        <w:rPr>
-          <w:i/>
-          <w:iCs/>
-        </w:rPr>
-        <w:t>)</w:t>
-      </w:r>
-    </w:p>
-    <w:p>
-      <w:pPr>
-        <w:pStyle w:val="BodyText"/>
-        <w:rPr>
-          <w:lang w:val="hr-HR"/>
-        </w:rPr>
-      </w:pPr>
-      <w:r>
-        <w:rPr>
-          <w:lang w:val="hr-HR"/>
-        </w:rPr>
-        <w:t>The preferred spelling of the word “acknowledgment” in America is without an “e” after the “g</w:t>
-      </w:r>
-      <w:r>
-        <w:rPr>
-          <w:lang w:val="hr-HR"/>
-        </w:rPr>
-        <w:t>”. Avoid the stilted expression “o</w:t>
-      </w:r>
-      <w:r>
-        <w:rPr>
-          <w:lang w:val="hr-HR"/>
-        </w:rPr>
-        <w:t xml:space="preserve">ne of us (R. B. G.) thanks </w:t>
-      </w:r>
-      <w:r>
-        <w:rPr>
-          <w:lang w:val="hr-HR"/>
-        </w:rPr>
-        <w:t xml:space="preserve">...”.  </w:t>
-      </w:r>
-      <w:r>
-        <w:rPr>
-          <w:lang w:val="hr-HR"/>
-        </w:rPr>
-        <w:t>Instead, try “R. B. G. thanks</w:t>
-      </w:r>
-      <w:r>
-        <w:rPr>
-          <w:lang w:val="hr-HR"/>
-        </w:rPr>
-        <w:t>...</w:t>
-      </w:r>
-      <w:r>
-        <w:rPr>
-          <w:lang w:val="hr-HR"/>
-        </w:rPr>
-        <w:t>”.</w:t>
-      </w:r>
-      <w:r>
-        <w:rPr>
-          <w:lang w:val="hr-HR"/>
-        </w:rPr>
-        <w:t xml:space="preserve"> </w:t>
-      </w:r>
-      <w:r>
-        <w:rPr>
-          <w:lang w:val="hr-HR"/>
-        </w:rPr>
-        <w:t>Put spons</w:t>
-      </w:r>
-      <w:r>
-        <w:rPr>
-          <w:lang w:val="hr-HR"/>
-        </w:rPr>
-        <w:t>or acknowledgments in the unnum</w:t>
-      </w:r>
-      <w:r>
-        <w:rPr>
-          <w:lang w:val="hr-HR"/>
-        </w:rPr>
-        <w:t>bered footnote on the first page.</w:t>
-      </w:r>
-    </w:p>
-    <w:p>
-      <w:pPr>
-        <w:jc w:val="start"/>
         <w:rPr>
           <w:spacing w:val="-1"/>
           <w:lang w:eastAsia="x-none"/>
         </w:rPr>
       </w:pPr>
       <w:r>
+        <w:t xml:space="preserve">U ovom smo radu korištenjem nekoliko različitih implementacija CNN-a i podatkovni skup </w:t>
+      </w:r>
+      <w:r>
+        <w:rPr>
+          <w:i/>
+          <w:iCs/>
+        </w:rPr>
+        <w:t xml:space="preserve">CBIS-DDSM: </w:t>
+      </w:r>
+      <w:proofErr w:type="spellStart"/>
+      <w:r>
+        <w:rPr>
+          <w:i/>
+          <w:iCs/>
+        </w:rPr>
+        <w:t>Breast</w:t>
+      </w:r>
+      <w:proofErr w:type="spellEnd"/>
+      <w:r>
+        <w:rPr>
+          <w:i/>
+          <w:iCs/>
+        </w:rPr>
+        <w:t xml:space="preserve"> </w:t>
+      </w:r>
+      <w:proofErr w:type="spellStart"/>
+      <w:r>
+        <w:rPr>
+          <w:i/>
+          <w:iCs/>
+        </w:rPr>
+        <w:t>Cancer</w:t>
+      </w:r>
+      <w:proofErr w:type="spellEnd"/>
+      <w:r>
+        <w:rPr>
+          <w:i/>
+          <w:iCs/>
+        </w:rPr>
+        <w:t xml:space="preserve"> </w:t>
+      </w:r>
+      <w:proofErr w:type="spellStart"/>
+      <w:r>
+        <w:rPr>
+          <w:i/>
+          <w:iCs/>
+        </w:rPr>
+        <w:t>Image</w:t>
+      </w:r>
+      <w:proofErr w:type="spellEnd"/>
+      <w:r>
+        <w:t xml:space="preserve"> pošali postići preciznu klasifikaciju slika ultrazvuka dojki na slike koje prikazuju maligne i benigne promjene te koje slike uopće ne</w:t>
+      </w:r>
+      <w:r>
+        <w:t xml:space="preserve"> prikazuju tumor vrijedan daljnjeg praćenja</w:t>
+      </w:r>
+      <w:r>
+        <w:t>.</w:t>
+      </w:r>
+      <w:r>
+        <w:t xml:space="preserve"> Modeli CNN-a koje smo koristili bili su različitih kompleksnosti, a zaključujemo da najsofisticiraniji i najjednostavniji model imaju podjednaku sposobnost klasifikacije (oko 54%), dok najbolje klasificira srednje komplicirana instanca CNN-a sa uspješnošću između 58% i 62%</w:t>
+      </w:r>
+      <w:r>
+        <w:t xml:space="preserve">. </w:t>
+      </w:r>
+      <w:r>
+        <w:t xml:space="preserve">Prilikom rada na projektu zbog ograničenih mogućnosti korištene tehnologije nismo mogli testirati bi li robusniji algoritmi dubokog učenja kao </w:t>
+      </w:r>
+      <w:proofErr w:type="spellStart"/>
+      <w:r>
+        <w:t>EfficientNet</w:t>
+      </w:r>
+      <w:proofErr w:type="spellEnd"/>
+      <w:r>
+        <w:t xml:space="preserve"> </w:t>
+      </w:r>
+      <w:r>
+        <w:t>pridonijeli boljoj klasifikaciji. Proučavajući ostale radove zaključili smo da bi nam preciznost modela vrlo vjerojatno poboljšalo da smo korišteni skup podataka binarno klasificirali na BENIGN i MALIGNANT slike</w:t>
+      </w:r>
+      <w:r>
+        <w:t xml:space="preserve">, umjesto da ga nismo mijenjali pokušavajući raditi trostruku klasifikaciju. </w:t>
+      </w:r>
+      <w:r>
+        <w:t xml:space="preserve">Također smo pronašli radove koji koriste alternativan skup podataka sa </w:t>
+      </w:r>
+      <w:proofErr w:type="spellStart"/>
+      <w:r>
+        <w:t>h</w:t>
+      </w:r>
+      <w:r>
+        <w:t>istopatološk</w:t>
+      </w:r>
+      <w:r>
+        <w:t>im</w:t>
+      </w:r>
+      <w:proofErr w:type="spellEnd"/>
+      <w:r>
+        <w:t xml:space="preserve"> slik</w:t>
+      </w:r>
+      <w:r>
+        <w:t>ama</w:t>
+      </w:r>
+      <w:r>
+        <w:t xml:space="preserve"> </w:t>
+      </w:r>
+      <w:r>
+        <w:t xml:space="preserve">uzoraka </w:t>
+      </w:r>
+      <w:r>
+        <w:t xml:space="preserve">tkiva </w:t>
+      </w:r>
+      <w:r>
+        <w:t xml:space="preserve">dojke. Bilo bi zanimljivo vidjeti klasificiraju li naše implementacije CNN-a slike iz ovog skupa podataka imalo preciznije. </w:t>
+      </w:r>
+      <w:r>
         <w:br w:type="page"/>
       </w:r>
     </w:p>
@@ -2867,103 +3547,9 @@
       </w:pPr>
       <w:r>
         <w:lastRenderedPageBreak/>
-        <w:t>References</w:t>
-      </w:r>
-    </w:p>
-    <w:p>
-      <w:pPr>
-        <w:pStyle w:val="BodyText"/>
-        <w:rPr>
-          <w:lang w:val="hr-HR"/>
-        </w:rPr>
-      </w:pPr>
-      <w:r>
-        <w:rPr>
-          <w:lang w:val="hr-HR"/>
-        </w:rPr>
-        <w:t>The template will number citations consecutively within brackets [1]. The sentence punctuation follows the bracket [2]. Refer simply to the reference number, as in [3]—do not use “Ref. [3]” or “reference [3]” except at the beginning of a sentence: “Reference [3] was the first</w:t>
-      </w:r>
-      <w:r>
-        <w:rPr>
-          <w:lang w:val="hr-HR"/>
-        </w:rPr>
-        <w:t xml:space="preserve"> ...</w:t>
-      </w:r>
-      <w:r>
-        <w:rPr>
-          <w:lang w:val="hr-HR"/>
-        </w:rPr>
-        <w:t>”</w:t>
-      </w:r>
-    </w:p>
-    <w:p>
-      <w:pPr>
-        <w:pStyle w:val="BodyText"/>
-        <w:rPr>
-          <w:lang w:val="hr-HR"/>
-        </w:rPr>
-      </w:pPr>
-      <w:r>
-        <w:rPr>
-          <w:lang w:val="hr-HR"/>
-        </w:rPr>
-        <w:t>Number footnotes separately in superscripts. Place the actual footnote at the bottom of the column in which it was cited. Do not put footnotes in the</w:t>
-      </w:r>
-      <w:r>
-        <w:rPr>
-          <w:lang w:val="hr-HR"/>
-        </w:rPr>
-        <w:t xml:space="preserve"> abstract or</w:t>
-      </w:r>
-      <w:r>
-        <w:rPr>
-          <w:lang w:val="hr-HR"/>
-        </w:rPr>
-        <w:t xml:space="preserve"> reference list. Use letters for table footnotes.</w:t>
-      </w:r>
-    </w:p>
-    <w:p>
-      <w:pPr>
-        <w:pStyle w:val="BodyText"/>
-        <w:rPr>
-          <w:lang w:val="hr-HR"/>
-        </w:rPr>
-      </w:pPr>
-      <w:r>
-        <w:rPr>
-          <w:lang w:val="hr-HR"/>
-        </w:rPr>
-        <w:t>Unless there are six au</w:t>
-      </w:r>
-      <w:r>
-        <w:rPr>
-          <w:lang w:val="hr-HR"/>
-        </w:rPr>
-        <w:t xml:space="preserve">thors or more give all authors’ </w:t>
-      </w:r>
-      <w:r>
-        <w:rPr>
-          <w:lang w:val="hr-HR"/>
-        </w:rPr>
-        <w:t>names; do not use “et al.”. Papers that have not been published, even if they have been submitted for publication, should be cited as “unpublished” [4]. Papers that have been accepted for publication should be cited as “in press” [5]. Capitalize only the first word in a paper title, except for proper nouns and element symbols.</w:t>
-      </w:r>
-    </w:p>
-    <w:p>
-      <w:pPr>
-        <w:pStyle w:val="BodyText"/>
-        <w:ind w:firstLine="0pt"/>
-        <w:rPr>
-          <w:lang w:val="hr-HR"/>
-        </w:rPr>
-      </w:pPr>
-      <w:r>
-        <w:rPr>
-          <w:lang w:val="hr-HR"/>
-        </w:rPr>
-        <w:t>For papers published in translation journals, please give the English citation first, followed by the original foreign-language citation [6].</w:t>
-      </w:r>
-    </w:p>
-    <w:p/>
+        <w:t>Literatura</w:t>
+      </w:r>
+    </w:p>
     <w:p>
       <w:pPr>
         <w:pStyle w:val="references"/>
@@ -3151,38 +3737,73 @@
     <w:p>
       <w:pPr>
         <w:pStyle w:val="references"/>
-        <w:rPr>
-          <w:lang w:val="hr-HR"/>
-        </w:rPr>
-      </w:pPr>
-      <w:r>
-        <w:rPr>
-          <w:lang w:val="hr-HR"/>
-        </w:rPr>
-        <w:t xml:space="preserve">Unaiza Sajid, Rizwan Ahmed Khan, Shahid Munir Shah, Sheeraz Arif </w:t>
-      </w:r>
-      <w:r>
-        <w:rPr>
-          <w:i/>
-          <w:iCs/>
-          <w:lang w:val="hr-HR"/>
-        </w:rPr>
-        <w:t xml:space="preserve">Breast Cancer Classification using Deep Learned Features Boosted with Handcrafted Features </w:t>
-      </w:r>
+        <w:ind w:start="17.70pt" w:hanging="17.70pt"/>
+        <w:rPr>
+          <w:lang w:val="hr-HR"/>
+        </w:rPr>
+      </w:pPr>
       <w:hyperlink r:id="rId24" w:history="1">
         <w:r>
           <w:rPr>
             <w:rStyle w:val="Hyperlink"/>
             <w:lang w:val="hr-HR"/>
           </w:rPr>
-          <w:t>https://arxiv.org/pdf/2206.12815</w:t>
+          <w:t>https://www.kaggle.com/code/osamam0/breast-cancer-detection-using-cnn</w:t>
         </w:r>
       </w:hyperlink>
       <w:r>
         <w:rPr>
           <w:lang w:val="hr-HR"/>
         </w:rPr>
-        <w:t xml:space="preserve">  </w:t>
+        <w:t xml:space="preserve"> </w:t>
+      </w:r>
+    </w:p>
+    <w:p>
+      <w:pPr>
+        <w:pStyle w:val="references"/>
+        <w:ind w:start="17.70pt" w:hanging="17.70pt"/>
+        <w:rPr>
+          <w:lang w:val="hr-HR"/>
+        </w:rPr>
+      </w:pPr>
+      <w:hyperlink r:id="rId25" w:history="1">
+        <w:r>
+          <w:rPr>
+            <w:rStyle w:val="Hyperlink"/>
+            <w:lang w:val="hr-HR"/>
+          </w:rPr>
+          <w:t>https://www.kaggle.com/code/baselanaya/breast-cancer-detection-using-cnn</w:t>
+        </w:r>
+      </w:hyperlink>
+      <w:r>
+        <w:rPr>
+          <w:lang w:val="hr-HR"/>
+        </w:rPr>
+        <w:t xml:space="preserve"> </w:t>
+      </w:r>
+    </w:p>
+    <w:p>
+      <w:pPr>
+        <w:pStyle w:val="references"/>
+        <w:ind w:start="17.70pt" w:hanging="17.70pt"/>
+        <w:rPr>
+          <w:lang w:val="hr-HR"/>
+        </w:rPr>
+      </w:pPr>
+      <w:hyperlink r:id="rId26" w:history="1">
+        <w:r>
+          <w:rPr>
+            <w:rStyle w:val="Hyperlink"/>
+            <w:lang w:val="hr-HR"/>
+          </w:rPr>
+          <w:t>https://www.kaggle.com/datasets/paultimothymooney/breast-histopathology-images</w:t>
+        </w:r>
+      </w:hyperlink>
+      <w:r>
+        <w:rPr>
+          <w:lang w:val="hr-HR"/>
+        </w:rPr>
+        <w:t xml:space="preserve"> </w:t>
       </w:r>
     </w:p>
     <w:p>
@@ -3193,8 +3814,26 @@
           <w:numId w:val="0"/>
         </w:numPr>
         <w:spacing w:line="12pt" w:lineRule="auto"/>
-        <w:ind w:start="18pt" w:hanging="18pt"/>
-        <w:jc w:val="center"/>
+        <w:rPr>
+          <w:rFonts w:eastAsia="SimSun"/>
+          <w:b/>
+          <w:noProof w:val="0"/>
+          <w:color w:val="FF0000"/>
+          <w:spacing w:val="-1"/>
+          <w:sz w:val="20"/>
+          <w:szCs w:val="20"/>
+          <w:lang w:val="hr-HR" w:eastAsia="x-none"/>
+        </w:rPr>
+      </w:pPr>
+    </w:p>
+    <w:p>
+      <w:pPr>
+        <w:pStyle w:val="references"/>
+        <w:numPr>
+          <w:ilvl w:val="0"/>
+          <w:numId w:val="0"/>
+        </w:numPr>
+        <w:spacing w:line="12pt" w:lineRule="auto"/>
         <w:rPr>
           <w:rFonts w:eastAsia="SimSun"/>
           <w:b/>
@@ -3245,44 +3884,24 @@
       </w:r>
     </w:p>
   </w:comment>
-  <w:comment w:id="3" w:author="Martina Šola" w:date="2025-01-18T02:14:00Z" w:initials="MŠ">
-    <w:p>
-      <w:pPr>
-        <w:pStyle w:val="CommentText"/>
-        <w:jc w:val="start"/>
-      </w:pPr>
-      <w:r>
-        <w:rPr>
-          <w:rStyle w:val="CommentReference"/>
-        </w:rPr>
-        <w:annotationRef/>
-      </w:r>
-      <w:r>
-        <w:t>Na slici x. treba ju dodati na smisleno mjesto</w:t>
-      </w:r>
-    </w:p>
-  </w:comment>
 </w:comments>
 </file>
 
 <file path=word/commentsExtended.xml><?xml version="1.0" encoding="utf-8"?>
 <w15:commentsEx xmlns:cx="http://schemas.microsoft.com/office/drawing/2014/chartex" xmlns:cx1="http://schemas.microsoft.com/office/drawing/2015/9/8/chartex" xmlns:cx2="http://schemas.microsoft.com/office/drawing/2015/10/21/chartex" xmlns:cx3="http://schemas.microsoft.com/office/drawing/2016/5/9/chartex" xmlns:cx4="http://schemas.microsoft.com/office/drawing/2016/5/10/chartex" xmlns:cx5="http://schemas.microsoft.com/office/drawing/2016/5/11/chartex" xmlns:cx6="http://schemas.microsoft.com/office/drawing/2016/5/12/chartex" xmlns:cx7="http://schemas.microsoft.com/office/drawing/2016/5/13/chartex" xmlns:cx8="http://schemas.microsoft.com/office/drawing/2016/5/14/chartex" xmlns:mc="http://schemas.openxmlformats.org/markup-compatibility/2006" xmlns:aink="http://schemas.microsoft.com/office/drawing/2016/ink" xmlns:am3d="http://schemas.microsoft.com/office/drawing/2017/model3d" xmlns:o="urn:schemas-microsoft-com:office:office" xmlns:oel="http://schemas.microsoft.com/office/2019/extlst" xmlns:r="http://purl.oclc.org/ooxml/officeDocument/relationships" xmlns:m="http://purl.oclc.org/ooxml/officeDocument/math" xmlns:v="urn:schemas-microsoft-com:vml" xmlns:wp14="http://schemas.microsoft.com/office/word/2010/wordprocessingDrawing" xmlns:wp="http://purl.oclc.org/ooxml/drawingml/wordprocessingDrawing" xmlns:w10="urn:schemas-microsoft-com:office:word" xmlns:w="http://purl.oclc.org/ooxml/wordprocessingml/main" xmlns:w14="http://schemas.microsoft.com/office/word/2010/wordml" xmlns:w15="http://schemas.microsoft.com/office/word/2012/wordml" xmlns:w16cex="http://schemas.microsoft.com/office/word/2018/wordml/cex" xmlns:w16cid="http://schemas.microsoft.com/office/word/2016/wordml/cid" xmlns:w16="http://schemas.microsoft.com/office/word/2018/wordml" xmlns:w16du="http://schemas.microsoft.com/office/word/2023/wordml/word16du" xmlns:w16sdtdh="http://schemas.microsoft.com/office/word/2020/wordml/sdtdatahash" xmlns:w16sdtfl="http://schemas.microsoft.com/office/word/2024/wordml/sdtformatlock" xmlns:w16se="http://schemas.microsoft.com/office/word/2015/wordml/symex" xmlns:wpi="http://schemas.microsoft.com/office/word/2010/wordprocessingInk" xmlns:wne="http://schemas.microsoft.com/office/word/2006/wordml" mc:Ignorable="w14 w15 w16se w16cid w16 w16cex w16sdtdh w16sdtfl w16du wne wp14">
   <w15:commentEx w15:paraId="28E378B5" w15:done="1"/>
-  <w15:commentEx w15:paraId="5CA33417" w15:done="0"/>
 </w15:commentsEx>
 </file>
 
 <file path=word/commentsExtensible.xml><?xml version="1.0" encoding="utf-8"?>
 <w16cex:commentsExtensible xmlns:cx="http://schemas.microsoft.com/office/drawing/2014/chartex" xmlns:cx1="http://schemas.microsoft.com/office/drawing/2015/9/8/chartex" xmlns:cx2="http://schemas.microsoft.com/office/drawing/2015/10/21/chartex" xmlns:cx3="http://schemas.microsoft.com/office/drawing/2016/5/9/chartex" xmlns:cx4="http://schemas.microsoft.com/office/drawing/2016/5/10/chartex" xmlns:cx5="http://schemas.microsoft.com/office/drawing/2016/5/11/chartex" xmlns:cx6="http://schemas.microsoft.com/office/drawing/2016/5/12/chartex" xmlns:cx7="http://schemas.microsoft.com/office/drawing/2016/5/13/chartex" xmlns:cx8="http://schemas.microsoft.com/office/drawing/2016/5/14/chartex" xmlns:cr="http://schemas.microsoft.com/office/comments/2020/reactions" xmlns:mc="http://schemas.openxmlformats.org/markup-compatibility/2006" xmlns:aink="http://schemas.microsoft.com/office/drawing/2016/ink" xmlns:am3d="http://schemas.microsoft.com/office/drawing/2017/model3d" xmlns:o="urn:schemas-microsoft-com:office:office" xmlns:oel="http://schemas.microsoft.com/office/2019/extlst" xmlns:r="http://purl.oclc.org/ooxml/officeDocument/relationships" xmlns:m="http://purl.oclc.org/ooxml/officeDocument/math" xmlns:v="urn:schemas-microsoft-com:vml" xmlns:wp14="http://schemas.microsoft.com/office/word/2010/wordprocessingDrawing" xmlns:wp="http://purl.oclc.org/ooxml/drawingml/wordprocessingDrawing" xmlns:w10="urn:schemas-microsoft-com:office:word" xmlns:w="http://purl.oclc.org/ooxml/wordprocessingml/main" xmlns:w14="http://schemas.microsoft.com/office/word/2010/wordml" xmlns:w15="http://schemas.microsoft.com/office/word/2012/wordml" xmlns:w16cex="http://schemas.microsoft.com/office/word/2018/wordml/cex" xmlns:w16cid="http://schemas.microsoft.com/office/word/2016/wordml/cid" xmlns:w16="http://schemas.microsoft.com/office/word/2018/wordml" xmlns:w16du="http://schemas.microsoft.com/office/word/2023/wordml/word16du" xmlns:w16sdtdh="http://schemas.microsoft.com/office/word/2020/wordml/sdtdatahash" xmlns:w16sdtfl="http://schemas.microsoft.com/office/word/2024/wordml/sdtformatlock" xmlns:w16se="http://schemas.microsoft.com/office/word/2015/wordml/symex" xmlns:wpi="http://schemas.microsoft.com/office/word/2010/wordprocessingInk" xmlns:wne="http://schemas.microsoft.com/office/word/2006/wordml" mc:Ignorable="w14 w15 w16se w16cid w16 w16cex w16sdtdh w16sdtfl cr w16du wne wp14">
   <w16cex:commentExtensible w16cex:durableId="79D4058B" w16cex:dateUtc="2025-01-17T23:49:00Z"/>
-  <w16cex:commentExtensible w16cex:durableId="64E35173" w16cex:dateUtc="2025-01-18T01:14:00Z"/>
 </w16cex:commentsExtensible>
 </file>
 
 <file path=word/commentsIds.xml><?xml version="1.0" encoding="utf-8"?>
 <w16cid:commentsIds xmlns:cx="http://schemas.microsoft.com/office/drawing/2014/chartex" xmlns:cx1="http://schemas.microsoft.com/office/drawing/2015/9/8/chartex" xmlns:cx2="http://schemas.microsoft.com/office/drawing/2015/10/21/chartex" xmlns:cx3="http://schemas.microsoft.com/office/drawing/2016/5/9/chartex" xmlns:cx4="http://schemas.microsoft.com/office/drawing/2016/5/10/chartex" xmlns:cx5="http://schemas.microsoft.com/office/drawing/2016/5/11/chartex" xmlns:cx6="http://schemas.microsoft.com/office/drawing/2016/5/12/chartex" xmlns:cx7="http://schemas.microsoft.com/office/drawing/2016/5/13/chartex" xmlns:cx8="http://schemas.microsoft.com/office/drawing/2016/5/14/chartex" xmlns:mc="http://schemas.openxmlformats.org/markup-compatibility/2006" xmlns:aink="http://schemas.microsoft.com/office/drawing/2016/ink" xmlns:am3d="http://schemas.microsoft.com/office/drawing/2017/model3d" xmlns:o="urn:schemas-microsoft-com:office:office" xmlns:oel="http://schemas.microsoft.com/office/2019/extlst" xmlns:r="http://purl.oclc.org/ooxml/officeDocument/relationships" xmlns:m="http://purl.oclc.org/ooxml/officeDocument/math" xmlns:v="urn:schemas-microsoft-com:vml" xmlns:wp14="http://schemas.microsoft.com/office/word/2010/wordprocessingDrawing" xmlns:wp="http://purl.oclc.org/ooxml/drawingml/wordprocessingDrawing" xmlns:w10="urn:schemas-microsoft-com:office:word" xmlns:w="http://purl.oclc.org/ooxml/wordprocessingml/main" xmlns:w14="http://schemas.microsoft.com/office/word/2010/wordml" xmlns:w15="http://schemas.microsoft.com/office/word/2012/wordml" xmlns:w16cex="http://schemas.microsoft.com/office/word/2018/wordml/cex" xmlns:w16cid="http://schemas.microsoft.com/office/word/2016/wordml/cid" xmlns:w16="http://schemas.microsoft.com/office/word/2018/wordml" xmlns:w16du="http://schemas.microsoft.com/office/word/2023/wordml/word16du" xmlns:w16sdtdh="http://schemas.microsoft.com/office/word/2020/wordml/sdtdatahash" xmlns:w16sdtfl="http://schemas.microsoft.com/office/word/2024/wordml/sdtformatlock" xmlns:w16se="http://schemas.microsoft.com/office/word/2015/wordml/symex" xmlns:wpi="http://schemas.microsoft.com/office/word/2010/wordprocessingInk" xmlns:wne="http://schemas.microsoft.com/office/word/2006/wordml" mc:Ignorable="w14 w15 w16se w16cid w16 w16cex w16sdtdh w16sdtfl w16du wne wp14">
   <w16cid:commentId w16cid:paraId="28E378B5" w16cid:durableId="79D4058B"/>
-  <w16cid:commentId w16cid:paraId="5CA33417" w16cid:durableId="64E35173"/>
 </w16cid:commentsIds>
 </file>
 
@@ -3303,28 +3922,6 @@
     </w:p>
   </w:endnote>
 </w:endnotes>
-</file>
-
-<file path=word/footer1.xml><?xml version="1.0" encoding="utf-8"?>
-<w:ftr xmlns:cx="http://schemas.microsoft.com/office/drawing/2014/chartex" xmlns:cx1="http://schemas.microsoft.com/office/drawing/2015/9/8/chartex" xmlns:cx2="http://schemas.microsoft.com/office/drawing/2015/10/21/chartex" xmlns:cx3="http://schemas.microsoft.com/office/drawing/2016/5/9/chartex" xmlns:cx4="http://schemas.microsoft.com/office/drawing/2016/5/10/chartex" xmlns:cx5="http://schemas.microsoft.com/office/drawing/2016/5/11/chartex" xmlns:cx6="http://schemas.microsoft.com/office/drawing/2016/5/12/chartex" xmlns:cx7="http://schemas.microsoft.com/office/drawing/2016/5/13/chartex" xmlns:cx8="http://schemas.microsoft.com/office/drawing/2016/5/14/chartex" xmlns:mc="http://schemas.openxmlformats.org/markup-compatibility/2006" xmlns:aink="http://schemas.microsoft.com/office/drawing/2016/ink" xmlns:am3d="http://schemas.microsoft.com/office/drawing/2017/model3d" xmlns:o="urn:schemas-microsoft-com:office:office" xmlns:oel="http://schemas.microsoft.com/office/2019/extlst" xmlns:r="http://purl.oclc.org/ooxml/officeDocument/relationships" xmlns:m="http://purl.oclc.org/ooxml/officeDocument/math" xmlns:v="urn:schemas-microsoft-com:vml" xmlns:wp14="http://schemas.microsoft.com/office/word/2010/wordprocessingDrawing" xmlns:wp="http://purl.oclc.org/ooxml/drawingml/wordprocessingDrawing" xmlns:w10="urn:schemas-microsoft-com:office:word" xmlns:w="http://purl.oclc.org/ooxml/wordprocessingml/main" xmlns:w14="http://schemas.microsoft.com/office/word/2010/wordml" xmlns:w15="http://schemas.microsoft.com/office/word/2012/wordml" xmlns:w16cex="http://schemas.microsoft.com/office/word/2018/wordml/cex" xmlns:w16cid="http://schemas.microsoft.com/office/word/2016/wordml/cid" xmlns:w16="http://schemas.microsoft.com/office/word/2018/wordml" xmlns:w16du="http://schemas.microsoft.com/office/word/2023/wordml/word16du" xmlns:w16sdtdh="http://schemas.microsoft.com/office/word/2020/wordml/sdtdatahash" xmlns:w16sdtfl="http://schemas.microsoft.com/office/word/2024/wordml/sdtformatlock" xmlns:w16se="http://schemas.microsoft.com/office/word/2015/wordml/symex" xmlns:wpi="http://schemas.microsoft.com/office/word/2010/wordprocessingInk" xmlns:wne="http://schemas.microsoft.com/office/word/2006/wordml" mc:Ignorable="w14 w15 w16se w16cid w16 w16cex w16sdtdh w16sdtfl w16du wne wp14">
-  <w:p>
-    <w:pPr>
-      <w:pStyle w:val="Footer"/>
-      <w:jc w:val="start"/>
-      <w:rPr>
-        <w:sz w:val="16"/>
-        <w:szCs w:val="16"/>
-      </w:rPr>
-    </w:pPr>
-    <w:r>
-      <w:rPr>
-        <w:sz w:val="16"/>
-        <w:szCs w:val="16"/>
-      </w:rPr>
-      <w:t>XXX-X-XXXX-XXXX-X/XX/$XX.00 ©20XX IEEE</w:t>
-    </w:r>
-  </w:p>
-</w:ftr>
 </file>
 
 <file path=word/footnotes.xml><?xml version="1.0" encoding="utf-8"?>
@@ -4267,9 +4864,9 @@
       <w:lvlJc w:val="start"/>
       <w:pPr>
         <w:tabs>
-          <w:tab w:val="num" w:pos="18pt"/>
+          <w:tab w:val="num" w:pos="46.35pt"/>
         </w:tabs>
-        <w:ind w:start="14.40pt" w:hanging="14.40pt"/>
+        <w:ind w:start="42.75pt" w:hanging="14.40pt"/>
       </w:pPr>
       <w:rPr>
         <w:rFonts w:ascii="Times New Roman" w:hAnsi="Times New Roman" w:cs="Times New Roman" w:hint="default"/>
@@ -5162,10 +5759,11 @@
         <w:numId w:val="4"/>
       </w:numPr>
       <w:tabs>
-        <w:tab w:val="clear" w:pos="18pt"/>
+        <w:tab w:val="clear" w:pos="46.35pt"/>
         <w:tab w:val="num" w:pos="14.40pt"/>
       </w:tabs>
       <w:spacing w:before="6pt" w:after="3pt"/>
+      <w:ind w:start="14.40pt"/>
       <w:jc w:val="start"/>
       <w:outlineLvl w:val="1"/>
     </w:pPr>
@@ -5243,7 +5841,6 @@
   <w:style w:type="character" w:default="1" w:styleId="DefaultParagraphFont">
     <w:name w:val="Default Paragraph Font"/>
     <w:uiPriority w:val="1"/>
-    <w:semiHidden/>
     <w:unhideWhenUsed/>
   </w:style>
   <w:style w:type="table" w:default="1" w:styleId="TableNormal">

</xml_diff>

<commit_message>
ispravljeni detalji u izvještaju
</commit_message>
<xml_diff>
--- a/Izvjestaj_projekta_-_Radna_verzija.docx
+++ b/Izvjestaj_projekta_-_Radna_verzija.docx
@@ -297,6 +297,7 @@
           <w:lang w:val="hr-HR"/>
         </w:rPr>
       </w:pPr>
+      <w:proofErr w:type="spellStart"/>
       <w:r>
         <w:rPr>
           <w:i/>
@@ -305,6 +306,7 @@
         </w:rPr>
         <w:t>Abstract</w:t>
       </w:r>
+      <w:proofErr w:type="spellEnd"/>
       <w:r>
         <w:rPr>
           <w:lang w:val="hr-HR"/>
@@ -325,18 +327,48 @@
           <w:lang w:val="hr-HR"/>
         </w:rPr>
       </w:pPr>
-      <w:r>
-        <w:rPr>
-          <w:lang w:val="hr-HR"/>
-        </w:rPr>
-        <w:t>Keywords—</w:t>
-      </w:r>
-      <w:r>
-        <w:rPr>
-          <w:lang w:val="hr-HR"/>
-        </w:rPr>
-        <w:t>rak dojke, ultrazvuk, duboko učenje, neuronske mreže, programski jezik Python, Jupyter Notebooks</w:t>
-      </w:r>
+      <w:proofErr w:type="spellStart"/>
+      <w:r>
+        <w:rPr>
+          <w:lang w:val="hr-HR"/>
+        </w:rPr>
+        <w:t>Keywords</w:t>
+      </w:r>
+      <w:proofErr w:type="spellEnd"/>
+      <w:r>
+        <w:rPr>
+          <w:lang w:val="hr-HR"/>
+        </w:rPr>
+        <w:t>—</w:t>
+      </w:r>
+      <w:r>
+        <w:rPr>
+          <w:lang w:val="hr-HR"/>
+        </w:rPr>
+        <w:t xml:space="preserve">rak dojke, ultrazvuk, duboko učenje, neuronske mreže, programski jezik Python, </w:t>
+      </w:r>
+      <w:proofErr w:type="spellStart"/>
+      <w:r>
+        <w:rPr>
+          <w:lang w:val="hr-HR"/>
+        </w:rPr>
+        <w:t>Jupyter</w:t>
+      </w:r>
+      <w:proofErr w:type="spellEnd"/>
+      <w:r>
+        <w:rPr>
+          <w:lang w:val="hr-HR"/>
+        </w:rPr>
+        <w:t xml:space="preserve"> </w:t>
+      </w:r>
+      <w:proofErr w:type="spellStart"/>
+      <w:r>
+        <w:rPr>
+          <w:lang w:val="hr-HR"/>
+        </w:rPr>
+        <w:t>Notebooks</w:t>
+      </w:r>
+      <w:proofErr w:type="spellEnd"/>
     </w:p>
     <w:p>
       <w:pPr>
@@ -475,7 +507,21 @@
         <w:rPr>
           <w:lang w:val="hr-HR"/>
         </w:rPr>
-        <w:t xml:space="preserve">bezbolnu kvržicu na grudima, promjenu oblika ili izgleda dojke, stvaranje udubljenja, crvenila ili drugih promjena na koži, promjene u izgledu bradavice (areole) ili kože oko nje te abnormalni ili krvavi iscjedak iz bradavice [1]. </w:t>
+        <w:t>bezbolnu kvržicu na grudima, promjenu oblika ili izgleda dojke, stvaranje udubljenja, crvenila ili drugih promjena na koži, promjene u izgledu bradavice (</w:t>
+      </w:r>
+      <w:proofErr w:type="spellStart"/>
+      <w:r>
+        <w:rPr>
+          <w:lang w:val="hr-HR"/>
+        </w:rPr>
+        <w:t>areole</w:t>
+      </w:r>
+      <w:proofErr w:type="spellEnd"/>
+      <w:r>
+        <w:rPr>
+          <w:lang w:val="hr-HR"/>
+        </w:rPr>
+        <w:t xml:space="preserve">) ili kože oko nje te abnormalni ili krvavi iscjedak iz bradavice [1]. </w:t>
       </w:r>
     </w:p>
     <w:p>
@@ -557,7 +603,21 @@
         <w:rPr>
           <w:lang w:val="hr-HR"/>
         </w:rPr>
-        <w:t>tablici 1. Među tim značajkama, najbitniji faktori pri klasificiranju lezija su: okolno tkivo, oblik, kontura ruba, granica lezije i posteriorne akustičke značajke [4].</w:t>
+        <w:t xml:space="preserve">tablici 1. Među tim značajkama, najbitniji faktori pri klasificiranju lezija su: okolno tkivo, oblik, kontura ruba, granica lezije i </w:t>
+      </w:r>
+      <w:proofErr w:type="spellStart"/>
+      <w:r>
+        <w:rPr>
+          <w:lang w:val="hr-HR"/>
+        </w:rPr>
+        <w:t>posteriorne</w:t>
+      </w:r>
+      <w:proofErr w:type="spellEnd"/>
+      <w:r>
+        <w:rPr>
+          <w:lang w:val="hr-HR"/>
+        </w:rPr>
+        <w:t xml:space="preserve"> akustičke značajke [4].</w:t>
       </w:r>
     </w:p>
     <w:p>
@@ -574,7 +634,7 @@
           <w:lang w:val="hr-HR"/>
         </w:rPr>
         <w:drawing>
-          <wp:inline distT="0" distB="0" distL="0" distR="0" wp14:anchorId="7FB9EBF8" wp14:editId="5ACDCB22">
+          <wp:inline distT="0" distB="0" distL="0" distR="0" wp14:anchorId="7FB9EBF8" wp14:editId="6F39CE39">
             <wp:extent cx="3089910" cy="2246630"/>
             <wp:effectExtent l="0" t="0" r="0" b="1270"/>
             <wp:docPr id="1016865219" name="Picture 2" descr="A screenshot of a medical chart&#10;&#10;Description automatically generated"/>
@@ -732,12 +792,14 @@
         </w:rPr>
         <w:t>'</w:t>
       </w:r>
+      <w:proofErr w:type="spellStart"/>
       <w:r>
         <w:rPr>
           <w:lang w:val="hr-HR"/>
         </w:rPr>
         <w:t>Kaggle</w:t>
       </w:r>
+      <w:proofErr w:type="spellEnd"/>
       <w:r>
         <w:rPr>
           <w:lang w:val="hr-HR"/>
@@ -762,28 +824,86 @@
         </w:rPr>
         <w:t>. U skupu je 1566 pacijenata. Za svakog pacijenta može postojati nekoliko slika s mamografije iz različitih pozicija, a u skupu podataka se također nalaze izrezane slike manjih dimenzija koje fokusiraju određen dio rendgenske slike (</w:t>
       </w:r>
-      <w:r>
-        <w:rPr>
-          <w:i/>
-          <w:iCs/>
-          <w:lang w:val="hr-HR"/>
-        </w:rPr>
-        <w:t>cropped images</w:t>
-      </w:r>
+      <w:proofErr w:type="spellStart"/>
+      <w:r>
+        <w:rPr>
+          <w:i/>
+          <w:iCs/>
+          <w:lang w:val="hr-HR"/>
+        </w:rPr>
+        <w:t>cropped</w:t>
+      </w:r>
+      <w:proofErr w:type="spellEnd"/>
+      <w:r>
+        <w:rPr>
+          <w:i/>
+          <w:iCs/>
+          <w:lang w:val="hr-HR"/>
+        </w:rPr>
+        <w:t xml:space="preserve"> </w:t>
+      </w:r>
+      <w:proofErr w:type="spellStart"/>
+      <w:r>
+        <w:rPr>
+          <w:i/>
+          <w:iCs/>
+          <w:lang w:val="hr-HR"/>
+        </w:rPr>
+        <w:t>images</w:t>
+      </w:r>
+      <w:proofErr w:type="spellEnd"/>
       <w:r>
         <w:rPr>
           <w:lang w:val="hr-HR"/>
         </w:rPr>
         <w:t>) koji možda sadrži oblik raka te ROI (</w:t>
       </w:r>
-      <w:r>
-        <w:rPr>
-          <w:i/>
-          <w:iCs/>
-          <w:lang w:val="hr-HR"/>
-        </w:rPr>
-        <w:t>region of interest</w:t>
-      </w:r>
+      <w:proofErr w:type="spellStart"/>
+      <w:r>
+        <w:rPr>
+          <w:i/>
+          <w:iCs/>
+          <w:lang w:val="hr-HR"/>
+        </w:rPr>
+        <w:t>region</w:t>
+      </w:r>
+      <w:proofErr w:type="spellEnd"/>
+      <w:r>
+        <w:rPr>
+          <w:i/>
+          <w:iCs/>
+          <w:lang w:val="hr-HR"/>
+        </w:rPr>
+        <w:t xml:space="preserve"> </w:t>
+      </w:r>
+      <w:proofErr w:type="spellStart"/>
+      <w:r>
+        <w:rPr>
+          <w:i/>
+          <w:iCs/>
+          <w:lang w:val="hr-HR"/>
+        </w:rPr>
+        <w:t>of</w:t>
+      </w:r>
+      <w:proofErr w:type="spellEnd"/>
+      <w:r>
+        <w:rPr>
+          <w:i/>
+          <w:iCs/>
+          <w:lang w:val="hr-HR"/>
+        </w:rPr>
+        <w:t xml:space="preserve"> </w:t>
+      </w:r>
+      <w:proofErr w:type="spellStart"/>
+      <w:r>
+        <w:rPr>
+          <w:i/>
+          <w:iCs/>
+          <w:lang w:val="hr-HR"/>
+        </w:rPr>
+        <w:t>interest</w:t>
+      </w:r>
+      <w:proofErr w:type="spellEnd"/>
       <w:r>
         <w:rPr>
           <w:lang w:val="hr-HR"/>
@@ -802,7 +922,21 @@
         <w:rPr>
           <w:lang w:val="hr-HR"/>
         </w:rPr>
-        <w:t>Originalni skup podataka je bio podijeljen u 2 direktorija, „csv“</w:t>
+        <w:t>Originalni skup podataka je bio podijeljen u 2 direktorija, „</w:t>
+      </w:r>
+      <w:proofErr w:type="spellStart"/>
+      <w:r>
+        <w:rPr>
+          <w:lang w:val="hr-HR"/>
+        </w:rPr>
+        <w:t>csv</w:t>
+      </w:r>
+      <w:proofErr w:type="spellEnd"/>
+      <w:r>
+        <w:rPr>
+          <w:lang w:val="hr-HR"/>
+        </w:rPr>
+        <w:t>“</w:t>
       </w:r>
       <w:r>
         <w:rPr>
@@ -816,7 +950,49 @@
         <w:rPr>
           <w:lang w:val="hr-HR"/>
         </w:rPr>
-        <w:t xml:space="preserve">i „jpeg“. U „csv“ direktoriju se nalazi nekoliko .csv datoteka koje sadrže informacije kao što su ID pacijenta, </w:t>
+        <w:t>i „</w:t>
+      </w:r>
+      <w:proofErr w:type="spellStart"/>
+      <w:r>
+        <w:rPr>
+          <w:lang w:val="hr-HR"/>
+        </w:rPr>
+        <w:t>jpeg</w:t>
+      </w:r>
+      <w:proofErr w:type="spellEnd"/>
+      <w:r>
+        <w:rPr>
+          <w:lang w:val="hr-HR"/>
+        </w:rPr>
+        <w:t>“. U „</w:t>
+      </w:r>
+      <w:proofErr w:type="spellStart"/>
+      <w:r>
+        <w:rPr>
+          <w:lang w:val="hr-HR"/>
+        </w:rPr>
+        <w:t>csv</w:t>
+      </w:r>
+      <w:proofErr w:type="spellEnd"/>
+      <w:r>
+        <w:rPr>
+          <w:lang w:val="hr-HR"/>
+        </w:rPr>
+        <w:t>“ direktoriju se nalazi nekoliko .</w:t>
+      </w:r>
+      <w:proofErr w:type="spellStart"/>
+      <w:r>
+        <w:rPr>
+          <w:lang w:val="hr-HR"/>
+        </w:rPr>
+        <w:t>csv</w:t>
+      </w:r>
+      <w:proofErr w:type="spellEnd"/>
+      <w:r>
+        <w:rPr>
+          <w:lang w:val="hr-HR"/>
+        </w:rPr>
+        <w:t xml:space="preserve"> datoteka koje sadrže informacije kao što su ID pacijenta, </w:t>
       </w:r>
       <w:r>
         <w:rPr>
@@ -831,7 +1007,7 @@
           <w:lang w:val="hr-HR"/>
         </w:rPr>
         <w:drawing>
-          <wp:anchor distT="0" distB="0" distL="114300" distR="114300" simplePos="0" relativeHeight="251659776" behindDoc="0" locked="0" layoutInCell="1" allowOverlap="1" wp14:anchorId="736B4D69" wp14:editId="2E49A864">
+          <wp:anchor distT="0" distB="0" distL="114300" distR="114300" simplePos="0" relativeHeight="251659776" behindDoc="0" locked="0" layoutInCell="1" allowOverlap="1" wp14:anchorId="736B4D69" wp14:editId="17FA0FB8">
             <wp:simplePos x="0" y="0"/>
             <wp:positionH relativeFrom="column">
               <wp:posOffset>3213100</wp:posOffset>
@@ -896,7 +1072,21 @@
         <w:rPr>
           <w:lang w:val="hr-HR"/>
         </w:rPr>
-        <w:t>like (kraniokaudalna ili medijalno-lateralna kosa projekcija) i nama najbitniji podatak; patologija. Ta kategorija, odnosno stupac</w:t>
+        <w:t>like (</w:t>
+      </w:r>
+      <w:proofErr w:type="spellStart"/>
+      <w:r>
+        <w:rPr>
+          <w:lang w:val="hr-HR"/>
+        </w:rPr>
+        <w:t>kraniokaudalna</w:t>
+      </w:r>
+      <w:proofErr w:type="spellEnd"/>
+      <w:r>
+        <w:rPr>
+          <w:lang w:val="hr-HR"/>
+        </w:rPr>
+        <w:t xml:space="preserve"> ili medijalno-lateralna kosa projekcija) i nama najbitniji podatak; patologija. Ta kategorija, odnosno stupac</w:t>
       </w:r>
       <w:r>
         <w:rPr>
@@ -962,7 +1152,21 @@
         <w:rPr>
           <w:lang w:val="hr-HR"/>
         </w:rPr>
-        <w:t xml:space="preserve">. Ove su tri kategorije u podacima označene kao MALIGNANT, BENIGN i BENIGN_WITHOUT_CALLBACK. U „jpeg“ direktoriju nalazilo se 6774 direktorija od kojih su neki sadržavali originalnu sliku rendgenske snimke s mamografije koja je velikih dimenzija, a neki direktoriji su sadržavali po dvije slike od kojih je jedna bila izrezani manji dio originalne slike, a druga ROI maska koja prikazuje fokusirano područje originalne slike. Jedna originalna rendgenska slika može biti povezana s više </w:t>
+        <w:t>. Ove su tri kategorije u podacima označene kao MALIGNANT, BENIGN i BENIGN_WITHOUT_CALLBACK. U „</w:t>
+      </w:r>
+      <w:proofErr w:type="spellStart"/>
+      <w:r>
+        <w:rPr>
+          <w:lang w:val="hr-HR"/>
+        </w:rPr>
+        <w:t>jpeg</w:t>
+      </w:r>
+      <w:proofErr w:type="spellEnd"/>
+      <w:r>
+        <w:rPr>
+          <w:lang w:val="hr-HR"/>
+        </w:rPr>
+        <w:t xml:space="preserve">“ direktoriju nalazilo se 6774 direktorija od kojih su neki sadržavali originalnu sliku rendgenske snimke s mamografije koja je velikih dimenzija, a neki direktoriji su sadržavali po dvije slike od kojih je jedna bila izrezani manji dio originalne slike, a druga ROI maska koja prikazuje fokusirano područje originalne slike. Jedna originalna rendgenska slika može biti povezana s više </w:t>
       </w:r>
       <w:r>
         <w:rPr>
@@ -974,7 +1178,21 @@
         <w:rPr>
           <w:lang w:val="hr-HR"/>
         </w:rPr>
-        <w:t xml:space="preserve"> što se da zaključiti analizom .csv datoteka. To ima smisla jer neke dojke mogu imati više područja za koja se sumnja da sadrže maligno tkivo.</w:t>
+        <w:t xml:space="preserve"> što se da zaključiti analizom .</w:t>
+      </w:r>
+      <w:proofErr w:type="spellStart"/>
+      <w:r>
+        <w:rPr>
+          <w:lang w:val="hr-HR"/>
+        </w:rPr>
+        <w:t>csv</w:t>
+      </w:r>
+      <w:proofErr w:type="spellEnd"/>
+      <w:r>
+        <w:rPr>
+          <w:lang w:val="hr-HR"/>
+        </w:rPr>
+        <w:t xml:space="preserve"> datoteka. To ima smisla jer neke dojke mogu imati više područja za koja se sumnja da sadrže maligno tkivo.</w:t>
       </w:r>
     </w:p>
     <w:p>
@@ -991,7 +1209,7 @@
           <w:lang w:val="hr-HR"/>
         </w:rPr>
         <w:drawing>
-          <wp:anchor distT="0" distB="0" distL="114300" distR="114300" simplePos="0" relativeHeight="251660800" behindDoc="0" locked="0" layoutInCell="1" allowOverlap="1" wp14:anchorId="49758A6F" wp14:editId="29EB2E9D">
+          <wp:anchor distT="0" distB="0" distL="114300" distR="114300" simplePos="0" relativeHeight="251660800" behindDoc="0" locked="0" layoutInCell="1" allowOverlap="1" wp14:anchorId="49758A6F" wp14:editId="1BF81994">
             <wp:simplePos x="0" y="0"/>
             <wp:positionH relativeFrom="column">
               <wp:posOffset>3538855</wp:posOffset>
@@ -1052,7 +1270,7 @@
           <w:lang w:val="hr-HR"/>
         </w:rPr>
         <w:drawing>
-          <wp:anchor distT="0" distB="0" distL="114300" distR="114300" simplePos="0" relativeHeight="251658752" behindDoc="0" locked="0" layoutInCell="1" allowOverlap="1" wp14:anchorId="00A0AC88" wp14:editId="70E92762">
+          <wp:anchor distT="0" distB="0" distL="114300" distR="114300" simplePos="0" relativeHeight="251658752" behindDoc="0" locked="0" layoutInCell="1" allowOverlap="1" wp14:anchorId="00A0AC88" wp14:editId="1BF4DE12">
             <wp:simplePos x="0" y="0"/>
             <wp:positionH relativeFrom="column">
               <wp:align>right</wp:align>
@@ -1171,7 +1389,21 @@
         <w:rPr>
           <w:lang w:val="hr-HR"/>
         </w:rPr>
-        <w:t xml:space="preserve"> jer ne sadrže nikakvu korisnu informaciju o tome je li prikazano tkivo maligno, već samo imaju bijelu točku koja je okružena crnom pozadinom te predstavlja s kojeg je dijela originalne slike uzeta izrezana slika. Budući da se ROI maske i izrezane slike nalaze u istim direktorijima, bilo je potrebno pronaći način za automatizirano razlikovanje i preuzimanje samo izrezanih slika iz više od 3000 direktorija. U imenima .jpg datoteka nije specificirano radi li se o ROI maski ili izrezanoj slici</w:t>
+        <w:t xml:space="preserve"> jer ne sadrže nikakvu korisnu informaciju o tome je li prikazano tkivo maligno, već samo imaju bijelu točku koja je okružena crnom pozadinom te predstavlja s kojeg je dijela originalne slike uzeta izrezana slika. Budući da se ROI maske i izrezane slike nalaze u istim direktorijima, bilo je potrebno pronaći način za automatizirano razlikovanje i preuzimanje samo izrezanih slika iz više od 3000 direktorija. U imenima .</w:t>
+      </w:r>
+      <w:proofErr w:type="spellStart"/>
+      <w:r>
+        <w:rPr>
+          <w:lang w:val="hr-HR"/>
+        </w:rPr>
+        <w:t>jpg</w:t>
+      </w:r>
+      <w:proofErr w:type="spellEnd"/>
+      <w:r>
+        <w:rPr>
+          <w:lang w:val="hr-HR"/>
+        </w:rPr>
+        <w:t xml:space="preserve"> datoteka nije specificirano radi li se o ROI maski ili izrezanoj slici</w:t>
       </w:r>
       <w:r>
         <w:rPr>
@@ -1183,7 +1415,21 @@
         <w:rPr>
           <w:lang w:val="hr-HR"/>
         </w:rPr>
-        <w:t>. Također u .csv datotekama isto nije specificirano koja je od dvije datoteke u direktoriju ROI maska, a koja izrezana slika.</w:t>
+        <w:t>. Također u .</w:t>
+      </w:r>
+      <w:proofErr w:type="spellStart"/>
+      <w:r>
+        <w:rPr>
+          <w:lang w:val="hr-HR"/>
+        </w:rPr>
+        <w:t>csv</w:t>
+      </w:r>
+      <w:proofErr w:type="spellEnd"/>
+      <w:r>
+        <w:rPr>
+          <w:lang w:val="hr-HR"/>
+        </w:rPr>
+        <w:t xml:space="preserve"> datotekama isto nije specificirano koja je od dvije datoteke u direktoriju ROI maska, a koja izrezana slika.</w:t>
       </w:r>
       <w:r>
         <w:rPr>
@@ -1358,6 +1604,7 @@
         </w:rPr>
         <w:t xml:space="preserve"> par </w:t>
       </w:r>
+      <w:proofErr w:type="spellStart"/>
       <w:r>
         <w:rPr>
           <w:i/>
@@ -1365,97 +1612,107 @@
           <w:spacing w:val="-1"/>
           <w:lang w:eastAsia="x-none"/>
         </w:rPr>
-        <w:t xml:space="preserve">outliera, </w:t>
-      </w:r>
-      <w:r>
-        <w:rPr>
+        <w:t>outliera</w:t>
+      </w:r>
+      <w:proofErr w:type="spellEnd"/>
+      <w:r>
+        <w:rPr>
+          <w:i/>
+          <w:iCs/>
           <w:spacing w:val="-1"/>
           <w:lang w:eastAsia="x-none"/>
         </w:rPr>
-        <w:t>odnosno izrezanih slika (označene plavim točkama na grafu) koje su nešto većih dimenzija, što je očekiva</w:t>
+        <w:t xml:space="preserve">, </w:t>
       </w:r>
       <w:r>
         <w:rPr>
           <w:spacing w:val="-1"/>
           <w:lang w:eastAsia="x-none"/>
         </w:rPr>
-        <w:t xml:space="preserve">no </w:t>
+        <w:t>odnosno izrezanih slika (označene plavim točkama na grafu) koje su nešto većih dimenzija, što je očekiva</w:t>
       </w:r>
       <w:r>
         <w:rPr>
           <w:spacing w:val="-1"/>
           <w:lang w:eastAsia="x-none"/>
         </w:rPr>
-        <w:t>s obzirom na puno veći podatkovni skup. Bitno je da su te velike izrezane slike i dalje veće površine od ROI maske s kojom su u direktoriju, jer je to uvjet po kojem</w:t>
+        <w:t xml:space="preserve">no </w:t>
       </w:r>
       <w:r>
         <w:rPr>
           <w:spacing w:val="-1"/>
           <w:lang w:eastAsia="x-none"/>
         </w:rPr>
-        <w:t xml:space="preserve"> se</w:t>
+        <w:t>s obzirom na puno veći podatkovni skup. Bitno je da su te velike izrezane slike i dalje veće površine od ROI maske s kojom su u direktoriju, jer je to uvjet po kojem</w:t>
       </w:r>
       <w:r>
         <w:rPr>
           <w:spacing w:val="-1"/>
           <w:lang w:eastAsia="x-none"/>
         </w:rPr>
-        <w:t xml:space="preserve"> odvaja</w:t>
+        <w:t xml:space="preserve"> se</w:t>
       </w:r>
       <w:r>
         <w:rPr>
           <w:spacing w:val="-1"/>
           <w:lang w:eastAsia="x-none"/>
         </w:rPr>
-        <w:t>ju</w:t>
+        <w:t xml:space="preserve"> odvaja</w:t>
       </w:r>
       <w:r>
         <w:rPr>
           <w:spacing w:val="-1"/>
           <w:lang w:eastAsia="x-none"/>
         </w:rPr>
-        <w:t xml:space="preserve"> izrezane slike. Budući da je uvjet zadovoljen, uspješno </w:t>
+        <w:t>ju</w:t>
       </w:r>
       <w:r>
         <w:rPr>
           <w:spacing w:val="-1"/>
           <w:lang w:eastAsia="x-none"/>
         </w:rPr>
-        <w:t>su</w:t>
+        <w:t xml:space="preserve"> izrezane slike. Budući da je uvjet zadovoljen, uspješno </w:t>
       </w:r>
       <w:r>
         <w:rPr>
           <w:spacing w:val="-1"/>
           <w:lang w:eastAsia="x-none"/>
         </w:rPr>
-        <w:t xml:space="preserve"> izolira</w:t>
+        <w:t>su</w:t>
       </w:r>
       <w:r>
         <w:rPr>
           <w:spacing w:val="-1"/>
           <w:lang w:eastAsia="x-none"/>
         </w:rPr>
-        <w:t>ne</w:t>
+        <w:t xml:space="preserve"> izolira</w:t>
       </w:r>
       <w:r>
         <w:rPr>
           <w:spacing w:val="-1"/>
           <w:lang w:eastAsia="x-none"/>
         </w:rPr>
-        <w:t xml:space="preserve"> izrezane slike koje će</w:t>
+        <w:t>ne</w:t>
       </w:r>
       <w:r>
         <w:rPr>
           <w:spacing w:val="-1"/>
           <w:lang w:eastAsia="x-none"/>
         </w:rPr>
-        <w:t xml:space="preserve"> se</w:t>
+        <w:t xml:space="preserve"> izrezane slike koje će</w:t>
       </w:r>
       <w:r>
         <w:rPr>
           <w:spacing w:val="-1"/>
           <w:lang w:eastAsia="x-none"/>
         </w:rPr>
+        <w:t xml:space="preserve"> se</w:t>
+      </w:r>
+      <w:r>
+        <w:rPr>
+          <w:spacing w:val="-1"/>
+          <w:lang w:eastAsia="x-none"/>
+        </w:rPr>
         <w:t xml:space="preserve"> koristiti za testiranje i treniranje modela.</w:t>
       </w:r>
     </w:p>
@@ -1468,7 +1725,7 @@
           <w:noProof/>
         </w:rPr>
         <w:drawing>
-          <wp:anchor distT="0" distB="0" distL="114300" distR="114300" simplePos="0" relativeHeight="251661824" behindDoc="0" locked="0" layoutInCell="1" allowOverlap="1" wp14:anchorId="10400D5B" wp14:editId="7C589FD9">
+          <wp:anchor distT="0" distB="0" distL="114300" distR="114300" simplePos="0" relativeHeight="251661824" behindDoc="0" locked="0" layoutInCell="1" allowOverlap="1" wp14:anchorId="10400D5B" wp14:editId="042F0C3B">
             <wp:simplePos x="0" y="0"/>
             <wp:positionH relativeFrom="column">
               <wp:posOffset>221615</wp:posOffset>
@@ -1527,7 +1784,15 @@
         <w:t xml:space="preserve">Slika 4. </w:t>
       </w:r>
       <w:r>
-        <w:t>Razdioba vrijednosti značajke Pathology na skupu za treniranje</w:t>
+        <w:t xml:space="preserve">Razdioba vrijednosti značajke </w:t>
+      </w:r>
+      <w:proofErr w:type="spellStart"/>
+      <w:r>
+        <w:t>Pathology</w:t>
+      </w:r>
+      <w:proofErr w:type="spellEnd"/>
+      <w:r>
+        <w:t xml:space="preserve"> na skupu za treniranje</w:t>
       </w:r>
     </w:p>
     <w:p>
@@ -1535,7 +1800,15 @@
         <w:pStyle w:val="Caption"/>
       </w:pPr>
       <w:r>
-        <w:t>Slika 5. Razdioba vrijednosti značajke Pathology na testnom skupu</w:t>
+        <w:t xml:space="preserve">Slika 5. Razdioba vrijednosti značajke </w:t>
+      </w:r>
+      <w:proofErr w:type="spellStart"/>
+      <w:r>
+        <w:t>Pathology</w:t>
+      </w:r>
+      <w:proofErr w:type="spellEnd"/>
+      <w:r>
+        <w:t xml:space="preserve"> na testnom skupu</w:t>
       </w:r>
     </w:p>
     <w:p>
@@ -1554,6 +1827,7 @@
         <w:lastRenderedPageBreak/>
         <w:t>Sa Slike 4. je vidljivo da je frekvencija mogućih vrijednosti stručnih dijagnoza (</w:t>
       </w:r>
+      <w:proofErr w:type="spellStart"/>
       <w:r>
         <w:rPr>
           <w:i/>
@@ -1561,6 +1835,7 @@
         </w:rPr>
         <w:t>Pahtology</w:t>
       </w:r>
+      <w:proofErr w:type="spellEnd"/>
       <w:r>
         <w:t xml:space="preserve">) za tkiva prikazana na izrezanim slikama podjednaka za sve tri vrijednosti na skupu za treniranje. Slika 5. prikazuje da situacija nije ista na skupu za testiranje gdje je ipak broj slika s oznakom BENIGN_WITHOUT_CALLBACK skoro duplo manji od broja oznaka BENIGN i MALIGNANT. </w:t>
       </w:r>
@@ -1579,6 +1854,7 @@
       <w:r>
         <w:t xml:space="preserve"> i druge metrike za performanse kao što su odziv, F1 </w:t>
       </w:r>
+      <w:proofErr w:type="spellStart"/>
       <w:r>
         <w:rPr>
           <w:i/>
@@ -1586,6 +1862,7 @@
         </w:rPr>
         <w:t>score</w:t>
       </w:r>
+      <w:proofErr w:type="spellEnd"/>
       <w:r>
         <w:t xml:space="preserve"> i ROC-AUC krivulje. </w:t>
       </w:r>
@@ -1598,6 +1875,7 @@
       <w:r>
         <w:t xml:space="preserve"> na to da su podaci u skupu za treniranje balansirani s obzirom na značajku </w:t>
       </w:r>
+      <w:proofErr w:type="spellStart"/>
       <w:r>
         <w:rPr>
           <w:i/>
@@ -1605,8 +1883,17 @@
         </w:rPr>
         <w:t>Pathology</w:t>
       </w:r>
-      <w:r>
-        <w:t xml:space="preserve"> kako bi modeli bili jednako pouzdani za klasifikaciju sve tri značajke. Analizom kompletnog podatkovnog skupa je također utvrđeno da se slike svakog pojedinog pacijenta nalaze ili u skupu za treniranje ili u skupu za testiranje, dakle niti jednom pacijentu različite izrezane verzije slika nisu završile u oba podatkovna skupa. Time je osigurana konzistentnost i sprječavanje da se model prenauči jer je poanta da model može dobro predviđati za nove pacijente na čijim slikama nije već treniran.</w:t>
+      <w:proofErr w:type="spellEnd"/>
+      <w:r>
+        <w:t xml:space="preserve"> kako bi modeli bili jednako pouzdani za klasifikaciju sve tri značajke. Analizom kompletnog podatkovnog skupa je također utvrđeno da se slike svakog pojedinog pacijenta nalaze ili u skupu za treniranje ili u skupu za testiranje, dakle niti jednom pacijentu različite izrezane verzije slika nisu završile u oba podatkovna skupa. Time je osigurana konzistentnost i sprječavanje da se model </w:t>
+      </w:r>
+      <w:proofErr w:type="spellStart"/>
+      <w:r>
+        <w:t>prenauči</w:t>
+      </w:r>
+      <w:proofErr w:type="spellEnd"/>
+      <w:r>
+        <w:t xml:space="preserve"> jer je poanta da model može dobro predviđati za nove pacijente na čijim slikama nije već treniran.</w:t>
       </w:r>
     </w:p>
     <w:p>
@@ -1633,9 +1920,11 @@
       <w:r>
         <w:t>'</w:t>
       </w:r>
+      <w:proofErr w:type="spellStart"/>
       <w:r>
         <w:t>PyTorch</w:t>
       </w:r>
+      <w:proofErr w:type="spellEnd"/>
       <w:r>
         <w:t>'</w:t>
       </w:r>
@@ -1660,14 +1949,32 @@
       <w:r>
         <w:t>'</w:t>
       </w:r>
+      <w:proofErr w:type="spellStart"/>
       <w:r>
         <w:t>BreastCancerDataset</w:t>
       </w:r>
+      <w:proofErr w:type="spellEnd"/>
       <w:r>
         <w:t>'</w:t>
       </w:r>
       <w:r>
-        <w:t xml:space="preserve"> koja nam omogućuje učitavanje i transformaciju slike te povezivanje s pripadajućom klasifikacijom. Podaci su učitani iz CSV datoteka 'train_data' i 'test_data'</w:t>
+        <w:t xml:space="preserve"> koja nam omogućuje učitavanje i transformaciju slike te povezivanje s pripadajućom klasifikacijom. Podaci su učitani iz CSV datoteka '</w:t>
+      </w:r>
+      <w:proofErr w:type="spellStart"/>
+      <w:r>
+        <w:t>train_data</w:t>
+      </w:r>
+      <w:proofErr w:type="spellEnd"/>
+      <w:r>
+        <w:t>' i '</w:t>
+      </w:r>
+      <w:proofErr w:type="spellStart"/>
+      <w:r>
+        <w:t>test_data</w:t>
+      </w:r>
+      <w:proofErr w:type="spellEnd"/>
+      <w:r>
+        <w:t>'</w:t>
       </w:r>
       <w:r>
         <w:t xml:space="preserve"> pomoću biblioteke </w:t>
@@ -1675,9 +1982,11 @@
       <w:r>
         <w:t>'</w:t>
       </w:r>
+      <w:proofErr w:type="spellStart"/>
       <w:r>
         <w:t>pandas</w:t>
       </w:r>
+      <w:proofErr w:type="spellEnd"/>
       <w:r>
         <w:t>'</w:t>
       </w:r>
@@ -1745,7 +2054,15 @@
                           <w:pStyle w:val="Caption"/>
                         </w:pPr>
                         <w:r>
-                          <w:t>Formula 1. Računanje F1 score-a</w:t>
+                          <w:t xml:space="preserve">Formula 1. Računanje F1 </w:t>
+                        </w:r>
+                        <w:proofErr w:type="spellStart"/>
+                        <w:r>
+                          <w:t>score</w:t>
+                        </w:r>
+                        <w:proofErr w:type="spellEnd"/>
+                        <w:r>
+                          <w:t>-a</w:t>
                         </w:r>
                       </w:p>
                       <w:p/>
@@ -1771,7 +2088,7 @@
           <w:noProof/>
         </w:rPr>
         <w:drawing>
-          <wp:anchor distT="0" distB="0" distL="114300" distR="114300" simplePos="0" relativeHeight="251665920" behindDoc="0" locked="0" layoutInCell="1" allowOverlap="1" wp14:anchorId="56570E88" wp14:editId="10A2A165">
+          <wp:anchor distT="0" distB="0" distL="114300" distR="114300" simplePos="0" relativeHeight="251665920" behindDoc="0" locked="0" layoutInCell="1" allowOverlap="1" wp14:anchorId="56570E88" wp14:editId="48C33758">
             <wp:simplePos x="0" y="0"/>
             <wp:positionH relativeFrom="column">
               <wp:posOffset>3765550</wp:posOffset>
@@ -1833,9 +2150,11 @@
       <w:r>
         <w:t>'</w:t>
       </w:r>
+      <w:proofErr w:type="spellStart"/>
       <w:r>
         <w:t>ResNet</w:t>
       </w:r>
+      <w:proofErr w:type="spellEnd"/>
       <w:r>
         <w:t>'</w:t>
       </w:r>
@@ -1845,9 +2164,11 @@
       <w:r>
         <w:t>'</w:t>
       </w:r>
+      <w:proofErr w:type="spellStart"/>
       <w:r>
         <w:t>ImageNet</w:t>
       </w:r>
+      <w:proofErr w:type="spellEnd"/>
       <w:r>
         <w:t>'</w:t>
       </w:r>
@@ -1855,13 +2176,37 @@
         <w:t xml:space="preserve">. </w:t>
       </w:r>
       <w:r>
-        <w:t xml:space="preserve">Klasa CNN definira model kojeg ćemo trenirati od nule. Model je definiran pomoću biblioteke 'torch.nn', a sastoji se od </w:t>
-      </w:r>
-      <w:r>
-        <w:t xml:space="preserve">dva bloka konvolucijskih slojeva. </w:t>
-      </w:r>
-      <w:r>
-        <w:t xml:space="preserve">Blokovi se sastoje od dva konvolucijska sloja </w:t>
+        <w:t>Klasa CNN definira model kojeg ćemo trenirati od nule. Model je definiran pomoću biblioteke '</w:t>
+      </w:r>
+      <w:proofErr w:type="spellStart"/>
+      <w:r>
+        <w:t>torch.nn</w:t>
+      </w:r>
+      <w:proofErr w:type="spellEnd"/>
+      <w:r>
+        <w:t xml:space="preserve">', a sastoji se od </w:t>
+      </w:r>
+      <w:r>
+        <w:t xml:space="preserve">dva bloka </w:t>
+      </w:r>
+      <w:proofErr w:type="spellStart"/>
+      <w:r>
+        <w:t>konvolucijskih</w:t>
+      </w:r>
+      <w:proofErr w:type="spellEnd"/>
+      <w:r>
+        <w:t xml:space="preserve"> slojeva. </w:t>
+      </w:r>
+      <w:r>
+        <w:t xml:space="preserve">Blokovi se sastoje od dva </w:t>
+      </w:r>
+      <w:proofErr w:type="spellStart"/>
+      <w:r>
+        <w:t>konvolucijska</w:t>
+      </w:r>
+      <w:proofErr w:type="spellEnd"/>
+      <w:r>
+        <w:t xml:space="preserve"> sloja </w:t>
       </w:r>
       <w:r>
         <w:t>te dva sloja za normalizaciju</w:t>
@@ -1870,7 +2215,15 @@
         <w:t>.</w:t>
       </w:r>
       <w:r>
-        <w:t xml:space="preserve"> Kao aktivacijska funkcija za sve slojeve korištena je 'ReLu' aktivacijska funkcija. </w:t>
+        <w:t xml:space="preserve"> Kao aktivacijska funkcija za sve slojeve korištena je '</w:t>
+      </w:r>
+      <w:proofErr w:type="spellStart"/>
+      <w:r>
+        <w:t>ReLu</w:t>
+      </w:r>
+      <w:proofErr w:type="spellEnd"/>
+      <w:r>
+        <w:t xml:space="preserve">' aktivacijska funkcija. </w:t>
       </w:r>
       <w:r>
         <w:t>Na</w:t>
@@ -1888,13 +2241,42 @@
         <w:t>i</w:t>
       </w:r>
       <w:r>
-        <w:t xml:space="preserve"> za smanjenje dimenzionalnosti</w:t>
-      </w:r>
-      <w:r>
-        <w:t xml:space="preserve"> ('MaxPool') dimenzija 2x2</w:t>
-      </w:r>
-      <w:r>
-        <w:t>, kao i sloj 'Dropout' za regularizaciju modela</w:t>
+        <w:t xml:space="preserve"> za smanjenje </w:t>
+      </w:r>
+      <w:proofErr w:type="spellStart"/>
+      <w:r>
+        <w:t>dimenzionalnosti</w:t>
+      </w:r>
+      <w:proofErr w:type="spellEnd"/>
+      <w:r>
+        <w:t xml:space="preserve"> ('</w:t>
+      </w:r>
+      <w:proofErr w:type="spellStart"/>
+      <w:r>
+        <w:t>MaxPool</w:t>
+      </w:r>
+      <w:proofErr w:type="spellEnd"/>
+      <w:r>
+        <w:t>') dimenzija 2x2</w:t>
+      </w:r>
+      <w:r>
+        <w:t>, kao i sloj '</w:t>
+      </w:r>
+      <w:proofErr w:type="spellStart"/>
+      <w:r>
+        <w:t>Dropout</w:t>
+      </w:r>
+      <w:proofErr w:type="spellEnd"/>
+      <w:r>
+        <w:t xml:space="preserve">' za </w:t>
+      </w:r>
+      <w:proofErr w:type="spellStart"/>
+      <w:r>
+        <w:t>regularizaciju</w:t>
+      </w:r>
+      <w:proofErr w:type="spellEnd"/>
+      <w:r>
+        <w:t xml:space="preserve"> modela</w:t>
       </w:r>
       <w:r>
         <w:t xml:space="preserve">. </w:t>
@@ -1912,7 +2294,15 @@
         <w:t>o</w:t>
       </w:r>
       <w:r>
-        <w:t xml:space="preserve"> mapiranje na izlazne klase, izlazi iz konvolucijskih slojeva su </w:t>
+        <w:t xml:space="preserve"> mapiranje na izlazne klase, izlazi iz </w:t>
+      </w:r>
+      <w:proofErr w:type="spellStart"/>
+      <w:r>
+        <w:t>konvolucijskih</w:t>
+      </w:r>
+      <w:proofErr w:type="spellEnd"/>
+      <w:r>
+        <w:t xml:space="preserve"> slojeva su </w:t>
       </w:r>
       <w:r>
         <w:t>izravnati u jednodimenzionalni tenzor te proslijeđeni kroz dva potpuno povezana sloja</w:t>
@@ -1924,13 +2314,37 @@
         <w:t>.</w:t>
       </w:r>
       <w:r>
-        <w:t xml:space="preserve"> Osim ovog modela, napravljen je i jednostavniji model 'SimpleCNN', kako bismo pokušali spriječiti prenaučenost modela. </w:t>
+        <w:t xml:space="preserve"> Osim ovog modela, napravljen je i jednostavniji model '</w:t>
+      </w:r>
+      <w:proofErr w:type="spellStart"/>
+      <w:r>
+        <w:t>SimpleCNN</w:t>
+      </w:r>
+      <w:proofErr w:type="spellEnd"/>
+      <w:r>
+        <w:t xml:space="preserve">', kako bismo pokušali spriječiti </w:t>
+      </w:r>
+      <w:proofErr w:type="spellStart"/>
+      <w:r>
+        <w:t>prenaučenost</w:t>
+      </w:r>
+      <w:proofErr w:type="spellEnd"/>
+      <w:r>
+        <w:t xml:space="preserve"> modela. </w:t>
       </w:r>
       <w:r>
         <w:t>Ovaj jednostavniji model je</w:t>
       </w:r>
       <w:r>
-        <w:t xml:space="preserve"> građen od 4 konvolucijska sloja, a</w:t>
+        <w:t xml:space="preserve"> građen od 4 </w:t>
+      </w:r>
+      <w:proofErr w:type="spellStart"/>
+      <w:r>
+        <w:t>konvolucijska</w:t>
+      </w:r>
+      <w:proofErr w:type="spellEnd"/>
+      <w:r>
+        <w:t xml:space="preserve"> sloja, a</w:t>
       </w:r>
       <w:r>
         <w:t xml:space="preserve"> kao ulaz prima slike dimenzija 32x32</w:t>
@@ -1942,8 +2356,13 @@
         <w:t xml:space="preserve"> </w:t>
       </w:r>
       <w:r>
-        <w:t>Optimizacija modela obavljala se pomoću algoritma `Adam`, uz definiranu stopu učenja i regularizaciju</w:t>
-      </w:r>
+        <w:t xml:space="preserve">Optimizacija modela obavljala se pomoću algoritma `Adam`, uz definiranu stopu učenja i </w:t>
+      </w:r>
+      <w:proofErr w:type="spellStart"/>
+      <w:r>
+        <w:t>regularizaciju</w:t>
+      </w:r>
+      <w:proofErr w:type="spellEnd"/>
       <w:r>
         <w:t xml:space="preserve">. Uz to, kompleksniji model koristi </w:t>
       </w:r>
@@ -1953,9 +2372,11 @@
       <w:r>
         <w:t>'</w:t>
       </w:r>
+      <w:proofErr w:type="spellStart"/>
       <w:r>
         <w:t>ReduceLROnPlateau</w:t>
       </w:r>
+      <w:proofErr w:type="spellEnd"/>
       <w:r>
         <w:t>'</w:t>
       </w:r>
@@ -1972,7 +2393,15 @@
         <w:t xml:space="preserve">se računao </w:t>
       </w:r>
       <w:r>
-        <w:t>korištenjem funkcije `CrossEntropyLoss`</w:t>
+        <w:t>korištenjem funkcije `</w:t>
+      </w:r>
+      <w:proofErr w:type="spellStart"/>
+      <w:r>
+        <w:t>CrossEntropyLoss</w:t>
+      </w:r>
+      <w:proofErr w:type="spellEnd"/>
+      <w:r>
+        <w:t>`</w:t>
       </w:r>
       <w:r>
         <w:t xml:space="preserve">, dok </w:t>
@@ -1994,7 +2423,11 @@
       </w:r>
       <w:bookmarkStart w:id="0" w:name="_Hlk187833879"/>
       <w:r>
-        <w:t>'accuracy</w:t>
+        <w:t>'</w:t>
+      </w:r>
+      <w:proofErr w:type="spellStart"/>
+      <w:r>
+        <w:t>accuracy</w:t>
       </w:r>
       <w:bookmarkStart w:id="1" w:name="_Hlk187833837"/>
       <w:r>
@@ -2002,7 +2435,11 @@
       </w:r>
       <w:bookmarkEnd w:id="1"/>
       <w:r>
-        <w:t>score'</w:t>
+        <w:t>score</w:t>
+      </w:r>
+      <w:proofErr w:type="spellEnd"/>
+      <w:r>
+        <w:t>'</w:t>
       </w:r>
       <w:bookmarkEnd w:id="0"/>
       <w:r>
@@ -2032,14 +2469,24 @@
         <w:t xml:space="preserve"> </w:t>
       </w:r>
       <w:r>
-        <w:t xml:space="preserve">modela. Odlučili smo implementirati model 'ResNet' koji je dostupan unutar biblioteke </w:t>
+        <w:t>modela. Odlučili smo implementirati model '</w:t>
+      </w:r>
+      <w:proofErr w:type="spellStart"/>
+      <w:r>
+        <w:t>ResNet</w:t>
+      </w:r>
+      <w:proofErr w:type="spellEnd"/>
+      <w:r>
+        <w:t xml:space="preserve">' koji je dostupan unutar biblioteke </w:t>
       </w:r>
       <w:r>
         <w:t>'</w:t>
       </w:r>
+      <w:proofErr w:type="spellStart"/>
       <w:r>
         <w:t>PyTorch</w:t>
       </w:r>
+      <w:proofErr w:type="spellEnd"/>
       <w:r>
         <w:t>'</w:t>
       </w:r>
@@ -2049,9 +2496,11 @@
       <w:r>
         <w:t>'</w:t>
       </w:r>
+      <w:proofErr w:type="spellStart"/>
       <w:r>
         <w:t>ImageNet</w:t>
       </w:r>
+      <w:proofErr w:type="spellEnd"/>
       <w:r>
         <w:t>'</w:t>
       </w:r>
@@ -2061,9 +2510,11 @@
       <w:r>
         <w:t>'</w:t>
       </w:r>
+      <w:proofErr w:type="spellStart"/>
       <w:r>
         <w:t>RezNet</w:t>
       </w:r>
+      <w:proofErr w:type="spellEnd"/>
       <w:r>
         <w:t>'</w:t>
       </w:r>
@@ -2104,7 +2555,15 @@
         <w:t>jena je</w:t>
       </w:r>
       <w:r>
-        <w:t xml:space="preserve"> dimenzionalnost ulaznog sloja kako bi</w:t>
+        <w:t xml:space="preserve"> </w:t>
+      </w:r>
+      <w:proofErr w:type="spellStart"/>
+      <w:r>
+        <w:t>dimenzionalnost</w:t>
+      </w:r>
+      <w:proofErr w:type="spellEnd"/>
+      <w:r>
+        <w:t xml:space="preserve"> ulaznog sloja kako bi</w:t>
       </w:r>
       <w:r>
         <w:t xml:space="preserve"> se</w:t>
@@ -2121,9 +2580,11 @@
       <w:r>
         <w:t>'</w:t>
       </w:r>
+      <w:proofErr w:type="spellStart"/>
       <w:r>
         <w:t>ResNet</w:t>
       </w:r>
+      <w:proofErr w:type="spellEnd"/>
       <w:r>
         <w:t>'</w:t>
       </w:r>
@@ -2167,7 +2628,15 @@
         <w:t xml:space="preserve">potrebno mijenjati sve parametre, već samo prilagoditi potpuno povezani sloj. </w:t>
       </w:r>
       <w:r>
-        <w:t>Kao i za prethodna dva modela, optimizacija modela je odrađena pomoću algoritma 'Adam', a uspješnost klasifikacije funkcijom 'accuracy_score'.</w:t>
+        <w:t>Kao i za prethodna dva modela, optimizacija modela je odrađena pomoću algoritma 'Adam', a uspješnost klasifikacije funkcijom '</w:t>
+      </w:r>
+      <w:proofErr w:type="spellStart"/>
+      <w:r>
+        <w:t>accuracy_score</w:t>
+      </w:r>
+      <w:proofErr w:type="spellEnd"/>
+      <w:r>
+        <w:t>'.</w:t>
       </w:r>
       <w:r>
         <w:t xml:space="preserve"> Ovaj model treniran je kroz 10 epoha, za razliku od drugih modela koji su trenirani kroz 20 epoha, stoga što su težine za veći dio modela unaprijed određene te nije potrebno puno vremena da on konvergira.</w:t>
@@ -2201,7 +2670,15 @@
         <w:jc w:val="both"/>
       </w:pPr>
       <w:r>
-        <w:t>Prvi korišteni model je bio konvolucijska neuronska mreža, tj. CNN koj</w:t>
+        <w:t xml:space="preserve">Prvi korišteni model je bio </w:t>
+      </w:r>
+      <w:proofErr w:type="spellStart"/>
+      <w:r>
+        <w:t>konvolucijska</w:t>
+      </w:r>
+      <w:proofErr w:type="spellEnd"/>
+      <w:r>
+        <w:t xml:space="preserve"> neuronska mreža, tj. CNN koj</w:t>
       </w:r>
       <w:r>
         <w:t>a je</w:t>
@@ -2242,6 +2719,7 @@
       <w:r>
         <w:t xml:space="preserve">. Nakon treniranja modela, uslijedila je evaluacija pomoću ponderiranog prosječnog F1 </w:t>
       </w:r>
+      <w:proofErr w:type="spellStart"/>
       <w:r>
         <w:rPr>
           <w:i/>
@@ -2249,9 +2727,11 @@
         </w:rPr>
         <w:t>score</w:t>
       </w:r>
+      <w:proofErr w:type="spellEnd"/>
       <w:r>
         <w:t xml:space="preserve">-a te matrice zabune. Ponderirani prosječni F1 </w:t>
       </w:r>
+      <w:proofErr w:type="spellStart"/>
       <w:r>
         <w:rPr>
           <w:i/>
@@ -2259,6 +2739,7 @@
         </w:rPr>
         <w:t>score</w:t>
       </w:r>
+      <w:proofErr w:type="spellEnd"/>
       <w:r>
         <w:t xml:space="preserve"> </w:t>
       </w:r>
@@ -2283,6 +2764,7 @@
       <w:r>
         <w:t xml:space="preserve"> F1 </w:t>
       </w:r>
+      <w:proofErr w:type="spellStart"/>
       <w:r>
         <w:rPr>
           <w:i/>
@@ -2290,6 +2772,7 @@
         </w:rPr>
         <w:t>score</w:t>
       </w:r>
+      <w:proofErr w:type="spellEnd"/>
       <w:r>
         <w:t xml:space="preserve"> izračunava se pomoću sljedeće formule:</w:t>
       </w:r>
@@ -2305,6 +2788,7 @@
       <w:r>
         <w:t xml:space="preserve">F1 </w:t>
       </w:r>
+      <w:proofErr w:type="spellStart"/>
       <w:r>
         <w:rPr>
           <w:i/>
@@ -2312,6 +2796,7 @@
         </w:rPr>
         <w:t>score</w:t>
       </w:r>
+      <w:proofErr w:type="spellEnd"/>
       <w:r>
         <w:t xml:space="preserve"> od 0.58 ukazuje da </w:t>
       </w:r>
@@ -2435,7 +2920,7 @@
           <w:noProof/>
         </w:rPr>
         <w:drawing>
-          <wp:anchor distT="0" distB="0" distL="114300" distR="114300" simplePos="0" relativeHeight="251662848" behindDoc="1" locked="0" layoutInCell="1" allowOverlap="1" wp14:anchorId="228D5C6D" wp14:editId="54AEB0F3">
+          <wp:anchor distT="0" distB="0" distL="114300" distR="114300" simplePos="0" relativeHeight="251662848" behindDoc="1" locked="0" layoutInCell="1" allowOverlap="1" wp14:anchorId="228D5C6D" wp14:editId="41B49BA1">
             <wp:simplePos x="0" y="0"/>
             <wp:positionH relativeFrom="margin">
               <wp:posOffset>246380</wp:posOffset>
@@ -2589,9 +3074,11 @@
       <w:r>
         <w:t>'</w:t>
       </w:r>
+      <w:proofErr w:type="spellStart"/>
       <w:r>
         <w:t>ResNet</w:t>
       </w:r>
+      <w:proofErr w:type="spellEnd"/>
       <w:r>
         <w:t>'</w:t>
       </w:r>
@@ -2601,9 +3088,11 @@
       <w:r>
         <w:t>'</w:t>
       </w:r>
+      <w:proofErr w:type="spellStart"/>
       <w:r>
         <w:t>ImageNet</w:t>
       </w:r>
+      <w:proofErr w:type="spellEnd"/>
       <w:r>
         <w:t>'</w:t>
       </w:r>
@@ -2630,8 +3119,17 @@
           <w:i/>
           <w:iCs/>
         </w:rPr>
-        <w:t>fine tuningom</w:t>
-      </w:r>
+        <w:t xml:space="preserve">fine </w:t>
+      </w:r>
+      <w:proofErr w:type="spellStart"/>
+      <w:r>
+        <w:rPr>
+          <w:i/>
+          <w:iCs/>
+        </w:rPr>
+        <w:t>tuningom</w:t>
+      </w:r>
+      <w:proofErr w:type="spellEnd"/>
       <w:r>
         <w:t>, odnosno dodatn</w:t>
       </w:r>
@@ -2650,9 +3148,11 @@
       <w:r>
         <w:t>'</w:t>
       </w:r>
+      <w:proofErr w:type="spellStart"/>
       <w:r>
         <w:t>RestNeta</w:t>
       </w:r>
+      <w:proofErr w:type="spellEnd"/>
       <w:r>
         <w:t>'</w:t>
       </w:r>
@@ -2665,9 +3165,11 @@
       <w:r>
         <w:t>'</w:t>
       </w:r>
+      <w:proofErr w:type="spellStart"/>
       <w:r>
         <w:t>RestNet</w:t>
       </w:r>
+      <w:proofErr w:type="spellEnd"/>
       <w:r>
         <w:t>'</w:t>
       </w:r>
@@ -2767,9 +3269,11 @@
       <w:r>
         <w:t>'</w:t>
       </w:r>
+      <w:proofErr w:type="spellStart"/>
       <w:r>
         <w:t>RestNeta</w:t>
       </w:r>
+      <w:proofErr w:type="spellEnd"/>
       <w:r>
         <w:t>'</w:t>
       </w:r>
@@ -2795,17 +3299,136 @@
           <w:i/>
           <w:iCs/>
         </w:rPr>
-        <w:t>3.6 And on the Seventh Day, a Simple CNN Model Was Created</w:t>
-      </w:r>
-      <w:r>
-        <w:rPr>
+        <w:t xml:space="preserve">3.6 </w:t>
+      </w:r>
+      <w:proofErr w:type="spellStart"/>
+      <w:r>
+        <w:rPr>
+          <w:b/>
+          <w:bCs/>
+          <w:i/>
+          <w:iCs/>
+        </w:rPr>
+        <w:t>And</w:t>
+      </w:r>
+      <w:proofErr w:type="spellEnd"/>
+      <w:r>
+        <w:rPr>
+          <w:b/>
+          <w:bCs/>
+          <w:i/>
+          <w:iCs/>
+        </w:rPr>
+        <w:t xml:space="preserve"> on </w:t>
+      </w:r>
+      <w:proofErr w:type="spellStart"/>
+      <w:r>
+        <w:rPr>
+          <w:b/>
+          <w:bCs/>
+          <w:i/>
+          <w:iCs/>
+        </w:rPr>
+        <w:t>the</w:t>
+      </w:r>
+      <w:proofErr w:type="spellEnd"/>
+      <w:r>
+        <w:rPr>
+          <w:b/>
+          <w:bCs/>
           <w:i/>
           <w:iCs/>
         </w:rPr>
         <w:t xml:space="preserve"> </w:t>
       </w:r>
-      <w:r>
-        <w:t xml:space="preserve">u Jupyter bilježnici </w:t>
+      <w:proofErr w:type="spellStart"/>
+      <w:r>
+        <w:rPr>
+          <w:b/>
+          <w:bCs/>
+          <w:i/>
+          <w:iCs/>
+        </w:rPr>
+        <w:t>Seventh</w:t>
+      </w:r>
+      <w:proofErr w:type="spellEnd"/>
+      <w:r>
+        <w:rPr>
+          <w:b/>
+          <w:bCs/>
+          <w:i/>
+          <w:iCs/>
+        </w:rPr>
+        <w:t xml:space="preserve"> Day, a </w:t>
+      </w:r>
+      <w:proofErr w:type="spellStart"/>
+      <w:r>
+        <w:rPr>
+          <w:b/>
+          <w:bCs/>
+          <w:i/>
+          <w:iCs/>
+        </w:rPr>
+        <w:t>Simple</w:t>
+      </w:r>
+      <w:proofErr w:type="spellEnd"/>
+      <w:r>
+        <w:rPr>
+          <w:b/>
+          <w:bCs/>
+          <w:i/>
+          <w:iCs/>
+        </w:rPr>
+        <w:t xml:space="preserve"> CNN Model </w:t>
+      </w:r>
+      <w:proofErr w:type="spellStart"/>
+      <w:r>
+        <w:rPr>
+          <w:b/>
+          <w:bCs/>
+          <w:i/>
+          <w:iCs/>
+        </w:rPr>
+        <w:t>Was</w:t>
+      </w:r>
+      <w:proofErr w:type="spellEnd"/>
+      <w:r>
+        <w:rPr>
+          <w:b/>
+          <w:bCs/>
+          <w:i/>
+          <w:iCs/>
+        </w:rPr>
+        <w:t xml:space="preserve"> </w:t>
+      </w:r>
+      <w:proofErr w:type="spellStart"/>
+      <w:r>
+        <w:rPr>
+          <w:b/>
+          <w:bCs/>
+          <w:i/>
+          <w:iCs/>
+        </w:rPr>
+        <w:t>Created</w:t>
+      </w:r>
+      <w:proofErr w:type="spellEnd"/>
+      <w:r>
+        <w:rPr>
+          <w:i/>
+          <w:iCs/>
+        </w:rPr>
+        <w:t xml:space="preserve"> </w:t>
+      </w:r>
+      <w:r>
+        <w:t xml:space="preserve">u </w:t>
+      </w:r>
+      <w:proofErr w:type="spellStart"/>
+      <w:r>
+        <w:t>Jupyter</w:t>
+      </w:r>
+      <w:proofErr w:type="spellEnd"/>
+      <w:r>
+        <w:t xml:space="preserve"> bilježnici </w:t>
       </w:r>
       <w:r>
         <w:t>bio je cilj napraviti</w:t>
@@ -2835,14 +3458,24 @@
         <w:t>a</w:t>
       </w:r>
       <w:r>
-        <w:t xml:space="preserve">. Taj se model sastojao od 4 konvolucijska sloja i kao ulazne podatke je uzimao slike dimenzija 32x32. Nakon izvršavanja 20 epoha, pokazalo se da ovaj jednostavniji model ima jednako dobru sposobnost klasifikacije kao i znatno kompliciraniji </w:t>
+        <w:t xml:space="preserve">. Taj se model sastojao od 4 </w:t>
+      </w:r>
+      <w:proofErr w:type="spellStart"/>
+      <w:r>
+        <w:t>konvolucijska</w:t>
+      </w:r>
+      <w:proofErr w:type="spellEnd"/>
+      <w:r>
+        <w:t xml:space="preserve"> sloja i kao ulazne podatke je uzimao slike dimenzija 32x32. Nakon izvršavanja 20 epoha, pokazalo se da ovaj jednostavniji model ima jednako dobru sposobnost klasifikacije kao i znatno kompliciraniji </w:t>
       </w:r>
       <w:r>
         <w:t>'</w:t>
       </w:r>
+      <w:proofErr w:type="spellStart"/>
       <w:r>
         <w:t>RestNet</w:t>
       </w:r>
+      <w:proofErr w:type="spellEnd"/>
       <w:r>
         <w:t>'</w:t>
       </w:r>
@@ -2871,7 +3504,15 @@
         <w:t>, što znači</w:t>
       </w:r>
       <w:r>
-        <w:t xml:space="preserve"> da je model relativno sklon prenaučenosti. </w:t>
+        <w:t xml:space="preserve"> da je model relativno sklon </w:t>
+      </w:r>
+      <w:proofErr w:type="spellStart"/>
+      <w:r>
+        <w:t>prenaučenosti</w:t>
+      </w:r>
+      <w:proofErr w:type="spellEnd"/>
+      <w:r>
+        <w:t xml:space="preserve">. </w:t>
       </w:r>
     </w:p>
     <w:p>
@@ -2931,16 +3572,146 @@
       <w:r>
         <w:t xml:space="preserve"> podataka, </w:t>
       </w:r>
-      <w:r>
-        <w:rPr>
-          <w:i/>
-          <w:iCs/>
-        </w:rPr>
-        <w:t>Diagnosis in Two-View Mammography Using End-to-End Trained EfficientNet-Based</w:t>
-      </w:r>
-      <w:r>
+      <w:proofErr w:type="spellStart"/>
+      <w:r>
+        <w:rPr>
+          <w:i/>
+          <w:iCs/>
+        </w:rPr>
+        <w:t>Diagnosis</w:t>
+      </w:r>
+      <w:proofErr w:type="spellEnd"/>
+      <w:r>
+        <w:rPr>
+          <w:i/>
+          <w:iCs/>
+        </w:rPr>
         <w:t xml:space="preserve"> </w:t>
       </w:r>
+      <w:proofErr w:type="spellStart"/>
+      <w:r>
+        <w:rPr>
+          <w:i/>
+          <w:iCs/>
+        </w:rPr>
+        <w:t>in</w:t>
+      </w:r>
+      <w:proofErr w:type="spellEnd"/>
+      <w:r>
+        <w:rPr>
+          <w:i/>
+          <w:iCs/>
+        </w:rPr>
+        <w:t xml:space="preserve"> </w:t>
+      </w:r>
+      <w:proofErr w:type="spellStart"/>
+      <w:r>
+        <w:rPr>
+          <w:i/>
+          <w:iCs/>
+        </w:rPr>
+        <w:t>Two-View</w:t>
+      </w:r>
+      <w:proofErr w:type="spellEnd"/>
+      <w:r>
+        <w:rPr>
+          <w:i/>
+          <w:iCs/>
+        </w:rPr>
+        <w:t xml:space="preserve"> </w:t>
+      </w:r>
+      <w:proofErr w:type="spellStart"/>
+      <w:r>
+        <w:rPr>
+          <w:i/>
+          <w:iCs/>
+        </w:rPr>
+        <w:t>Mammography</w:t>
+      </w:r>
+      <w:proofErr w:type="spellEnd"/>
+      <w:r>
+        <w:rPr>
+          <w:i/>
+          <w:iCs/>
+        </w:rPr>
+        <w:t xml:space="preserve"> </w:t>
+      </w:r>
+      <w:proofErr w:type="spellStart"/>
+      <w:r>
+        <w:rPr>
+          <w:i/>
+          <w:iCs/>
+        </w:rPr>
+        <w:t>Using</w:t>
+      </w:r>
+      <w:proofErr w:type="spellEnd"/>
+      <w:r>
+        <w:rPr>
+          <w:i/>
+          <w:iCs/>
+        </w:rPr>
+        <w:t xml:space="preserve"> </w:t>
+      </w:r>
+      <w:proofErr w:type="spellStart"/>
+      <w:r>
+        <w:rPr>
+          <w:i/>
+          <w:iCs/>
+        </w:rPr>
+        <w:t>End</w:t>
+      </w:r>
+      <w:proofErr w:type="spellEnd"/>
+      <w:r>
+        <w:rPr>
+          <w:i/>
+          <w:iCs/>
+        </w:rPr>
+        <w:t>-to-</w:t>
+      </w:r>
+      <w:proofErr w:type="spellStart"/>
+      <w:r>
+        <w:rPr>
+          <w:i/>
+          <w:iCs/>
+        </w:rPr>
+        <w:t>End</w:t>
+      </w:r>
+      <w:proofErr w:type="spellEnd"/>
+      <w:r>
+        <w:rPr>
+          <w:i/>
+          <w:iCs/>
+        </w:rPr>
+        <w:t xml:space="preserve"> </w:t>
+      </w:r>
+      <w:proofErr w:type="spellStart"/>
+      <w:r>
+        <w:rPr>
+          <w:i/>
+          <w:iCs/>
+        </w:rPr>
+        <w:t>Trained</w:t>
+      </w:r>
+      <w:proofErr w:type="spellEnd"/>
+      <w:r>
+        <w:rPr>
+          <w:i/>
+          <w:iCs/>
+        </w:rPr>
+        <w:t xml:space="preserve"> </w:t>
+      </w:r>
+      <w:proofErr w:type="spellStart"/>
+      <w:r>
+        <w:rPr>
+          <w:i/>
+          <w:iCs/>
+        </w:rPr>
+        <w:t>EfficientNet-Based</w:t>
+      </w:r>
+      <w:proofErr w:type="spellEnd"/>
+      <w:r>
+        <w:t xml:space="preserve"> </w:t>
+      </w:r>
       <w:r>
         <w:rPr>
           <w:i/>
@@ -2978,17 +3749,44 @@
           <w:i/>
           <w:iCs/>
         </w:rPr>
-        <w:t>fold cross validation</w:t>
-      </w:r>
+        <w:t xml:space="preserve">fold </w:t>
+      </w:r>
+      <w:proofErr w:type="spellStart"/>
+      <w:r>
+        <w:rPr>
+          <w:i/>
+          <w:iCs/>
+        </w:rPr>
+        <w:t>cross</w:t>
+      </w:r>
+      <w:proofErr w:type="spellEnd"/>
+      <w:r>
+        <w:rPr>
+          <w:i/>
+          <w:iCs/>
+        </w:rPr>
+        <w:t xml:space="preserve"> </w:t>
+      </w:r>
+      <w:proofErr w:type="spellStart"/>
+      <w:r>
+        <w:rPr>
+          <w:i/>
+          <w:iCs/>
+        </w:rPr>
+        <w:t>validation</w:t>
+      </w:r>
+      <w:proofErr w:type="spellEnd"/>
       <w:r>
         <w:t xml:space="preserve"> i </w:t>
       </w:r>
       <w:r>
         <w:t>'</w:t>
       </w:r>
+      <w:proofErr w:type="spellStart"/>
       <w:r>
         <w:t>EfficientNet</w:t>
       </w:r>
+      <w:proofErr w:type="spellEnd"/>
       <w:r>
         <w:t>'</w:t>
       </w:r>
@@ -3010,9 +3808,11 @@
       <w:r>
         <w:t>'</w:t>
       </w:r>
+      <w:proofErr w:type="spellStart"/>
       <w:r>
         <w:t>EfficientNet</w:t>
       </w:r>
+      <w:proofErr w:type="spellEnd"/>
       <w:r>
         <w:t>'</w:t>
       </w:r>
@@ -3070,9 +3870,11 @@
       <w:r>
         <w:t>'</w:t>
       </w:r>
+      <w:proofErr w:type="spellStart"/>
       <w:r>
         <w:t>EfficientNet</w:t>
       </w:r>
+      <w:proofErr w:type="spellEnd"/>
       <w:r>
         <w:t>'</w:t>
       </w:r>
@@ -3262,9 +4064,11 @@
       <w:r>
         <w:t>'</w:t>
       </w:r>
+      <w:proofErr w:type="spellStart"/>
       <w:r>
         <w:t>Kaggleu</w:t>
       </w:r>
+      <w:proofErr w:type="spellEnd"/>
       <w:r>
         <w:t>'</w:t>
       </w:r>
@@ -3284,7 +4088,7 @@
         <w:t xml:space="preserve"> pomnijim promatranjem </w:t>
       </w:r>
       <w:r>
-        <w:t>uviđeno je</w:t>
+        <w:t>primijetili smo</w:t>
       </w:r>
       <w:r>
         <w:t xml:space="preserve"> </w:t>
@@ -3300,8 +4104,65 @@
           <w:i/>
           <w:iCs/>
         </w:rPr>
-        <w:t>CBIS-DDSM: Breast Cancer Image Dataset</w:t>
-      </w:r>
+        <w:t xml:space="preserve">CBIS-DDSM: </w:t>
+      </w:r>
+      <w:proofErr w:type="spellStart"/>
+      <w:r>
+        <w:rPr>
+          <w:i/>
+          <w:iCs/>
+        </w:rPr>
+        <w:t>Breast</w:t>
+      </w:r>
+      <w:proofErr w:type="spellEnd"/>
+      <w:r>
+        <w:rPr>
+          <w:i/>
+          <w:iCs/>
+        </w:rPr>
+        <w:t xml:space="preserve"> </w:t>
+      </w:r>
+      <w:proofErr w:type="spellStart"/>
+      <w:r>
+        <w:rPr>
+          <w:i/>
+          <w:iCs/>
+        </w:rPr>
+        <w:t>Cancer</w:t>
+      </w:r>
+      <w:proofErr w:type="spellEnd"/>
+      <w:r>
+        <w:rPr>
+          <w:i/>
+          <w:iCs/>
+        </w:rPr>
+        <w:t xml:space="preserve"> </w:t>
+      </w:r>
+      <w:proofErr w:type="spellStart"/>
+      <w:r>
+        <w:rPr>
+          <w:i/>
+          <w:iCs/>
+        </w:rPr>
+        <w:t>Image</w:t>
+      </w:r>
+      <w:proofErr w:type="spellEnd"/>
+      <w:r>
+        <w:rPr>
+          <w:i/>
+          <w:iCs/>
+        </w:rPr>
+        <w:t xml:space="preserve"> </w:t>
+      </w:r>
+      <w:proofErr w:type="spellStart"/>
+      <w:r>
+        <w:rPr>
+          <w:i/>
+          <w:iCs/>
+        </w:rPr>
+        <w:t>Dataset</w:t>
+      </w:r>
+      <w:proofErr w:type="spellEnd"/>
       <w:r>
         <w:t xml:space="preserve"> korišten samo za demonstraciju funkcioniranja ROI maski i prikazivanja kako neur</w:t>
       </w:r>
@@ -3324,15 +4185,55 @@
         <w:t xml:space="preserve"> je </w:t>
       </w:r>
       <w:r>
-        <w:t>korišten potpuno dugi skup podataka (</w:t>
-      </w:r>
-      <w:r>
-        <w:rPr>
-          <w:i/>
-          <w:iCs/>
-        </w:rPr>
-        <w:t>Breast Histopathology Images</w:t>
-      </w:r>
+        <w:t>korišten potpuno d</w:t>
+      </w:r>
+      <w:r>
+        <w:t>r</w:t>
+      </w:r>
+      <w:r>
+        <w:t>ugi skup podataka (</w:t>
+      </w:r>
+      <w:proofErr w:type="spellStart"/>
+      <w:r>
+        <w:rPr>
+          <w:i/>
+          <w:iCs/>
+        </w:rPr>
+        <w:t>Breast</w:t>
+      </w:r>
+      <w:proofErr w:type="spellEnd"/>
+      <w:r>
+        <w:rPr>
+          <w:i/>
+          <w:iCs/>
+        </w:rPr>
+        <w:t xml:space="preserve"> </w:t>
+      </w:r>
+      <w:proofErr w:type="spellStart"/>
+      <w:r>
+        <w:rPr>
+          <w:i/>
+          <w:iCs/>
+        </w:rPr>
+        <w:t>Histopathology</w:t>
+      </w:r>
+      <w:proofErr w:type="spellEnd"/>
+      <w:r>
+        <w:rPr>
+          <w:i/>
+          <w:iCs/>
+        </w:rPr>
+        <w:t xml:space="preserve"> </w:t>
+      </w:r>
+      <w:proofErr w:type="spellStart"/>
+      <w:r>
+        <w:rPr>
+          <w:i/>
+          <w:iCs/>
+        </w:rPr>
+        <w:t>Images</w:t>
+      </w:r>
+      <w:proofErr w:type="spellEnd"/>
       <w:r>
         <w:t xml:space="preserve"> [9]). Zbog toga n</w:t>
       </w:r>
@@ -3403,22 +4304,78 @@
         <w:t>U ovom radu</w:t>
       </w:r>
       <w:r>
-        <w:t xml:space="preserve"> je</w:t>
-      </w:r>
-      <w:r>
-        <w:t xml:space="preserve"> korištenjem nekoliko različitih implementacija CNN-a i podatkovni skup </w:t>
-      </w:r>
-      <w:r>
-        <w:rPr>
-          <w:i/>
-          <w:iCs/>
-        </w:rPr>
-        <w:t>CBIS-DDSM: Breast Cancer Image</w:t>
-      </w:r>
-      <w:r>
         <w:t xml:space="preserve"> </w:t>
       </w:r>
       <w:r>
+        <w:t xml:space="preserve">je </w:t>
+      </w:r>
+      <w:r>
+        <w:t>korištenjem nekoliko različitih implementacija CNN-a i podatkovn</w:t>
+      </w:r>
+      <w:r>
+        <w:t xml:space="preserve">og </w:t>
+      </w:r>
+      <w:r>
+        <w:t>skup</w:t>
+      </w:r>
+      <w:r>
+        <w:t>a</w:t>
+      </w:r>
+      <w:r>
+        <w:t xml:space="preserve"> </w:t>
+      </w:r>
+      <w:r>
+        <w:rPr>
+          <w:i/>
+          <w:iCs/>
+        </w:rPr>
+        <w:t xml:space="preserve">CBIS-DDSM: </w:t>
+      </w:r>
+      <w:proofErr w:type="spellStart"/>
+      <w:r>
+        <w:rPr>
+          <w:i/>
+          <w:iCs/>
+        </w:rPr>
+        <w:t>Breast</w:t>
+      </w:r>
+      <w:proofErr w:type="spellEnd"/>
+      <w:r>
+        <w:rPr>
+          <w:i/>
+          <w:iCs/>
+        </w:rPr>
+        <w:t xml:space="preserve"> </w:t>
+      </w:r>
+      <w:proofErr w:type="spellStart"/>
+      <w:r>
+        <w:rPr>
+          <w:i/>
+          <w:iCs/>
+        </w:rPr>
+        <w:t>Cancer</w:t>
+      </w:r>
+      <w:proofErr w:type="spellEnd"/>
+      <w:r>
+        <w:rPr>
+          <w:i/>
+          <w:iCs/>
+        </w:rPr>
+        <w:t xml:space="preserve"> </w:t>
+      </w:r>
+      <w:proofErr w:type="spellStart"/>
+      <w:r>
+        <w:rPr>
+          <w:i/>
+          <w:iCs/>
+        </w:rPr>
+        <w:t>Image</w:t>
+      </w:r>
+      <w:proofErr w:type="spellEnd"/>
+      <w:r>
+        <w:t xml:space="preserve"> </w:t>
+      </w:r>
+      <w:r>
         <w:t>bio cilj</w:t>
       </w:r>
       <w:r>
@@ -3497,13 +4454,7 @@
         <w:t>,</w:t>
       </w:r>
       <w:r>
-        <w:t xml:space="preserve"> zbog ograničenih mogućnosti</w:t>
-      </w:r>
-      <w:r>
-        <w:t>,</w:t>
-      </w:r>
-      <w:r>
-        <w:t xml:space="preserve"> ni</w:t>
+        <w:t xml:space="preserve"> zbog ograničenih mogućnosti ni</w:t>
       </w:r>
       <w:r>
         <w:t>je bilo moguće</w:t>
@@ -3520,9 +4471,11 @@
       <w:r>
         <w:t>poput '</w:t>
       </w:r>
+      <w:proofErr w:type="spellStart"/>
       <w:r>
         <w:t>EfficientNet</w:t>
       </w:r>
+      <w:proofErr w:type="spellEnd"/>
       <w:r>
         <w:t>'</w:t>
       </w:r>
@@ -3599,35 +4552,62 @@
         <w:t>e</w:t>
       </w:r>
       <w:r>
-        <w:t xml:space="preserve">. Naravno, to ovisi i o tome je li bitnija diferencijacija sva tri od spomenutih slučaja i daljnje motrenje razvoja tumora, ili je bitno samo klasificirati je li neki tumor u trenutku provođenja ultrazvuka zloćudan. </w:t>
-      </w:r>
-      <w:r>
-        <w:t>Također s</w:t>
-      </w:r>
-      <w:r>
-        <w:t>u</w:t>
-      </w:r>
-      <w:r>
-        <w:t xml:space="preserve"> prona</w:t>
+        <w:t xml:space="preserve">. Naravno, </w:t>
+      </w:r>
+      <w:r>
+        <w:t xml:space="preserve">time se gubi </w:t>
+      </w:r>
+      <w:proofErr w:type="spellStart"/>
+      <w:r>
+        <w:t>prediktivna</w:t>
+      </w:r>
+      <w:proofErr w:type="spellEnd"/>
+      <w:r>
+        <w:t xml:space="preserve"> moć modela jer je impresivnije da </w:t>
+      </w:r>
+      <w:proofErr w:type="spellStart"/>
+      <w:r>
+        <w:t>neuralna</w:t>
+      </w:r>
+      <w:proofErr w:type="spellEnd"/>
+      <w:r>
+        <w:t xml:space="preserve"> mreža također može razlikovati između slika koje prikazuju benigne tumore i slika na kojima tumor ne postoji ili je toliko malen da nije vrijedan redovitog praćenja</w:t>
+      </w:r>
+      <w:r>
+        <w:t xml:space="preserve">. </w:t>
+      </w:r>
+      <w:r>
+        <w:t xml:space="preserve">Nakon dovršavanja projekta </w:t>
+      </w:r>
+      <w:r>
+        <w:t>prona</w:t>
       </w:r>
       <w:r>
         <w:t>đeni</w:t>
       </w:r>
       <w:r>
-        <w:t xml:space="preserve"> radov</w:t>
+        <w:t xml:space="preserve"> </w:t>
+      </w:r>
+      <w:r>
+        <w:t xml:space="preserve">su </w:t>
+      </w:r>
+      <w:r>
+        <w:t>radov</w:t>
       </w:r>
       <w:r>
         <w:t>i</w:t>
       </w:r>
       <w:r>
-        <w:t xml:space="preserve"> koji koriste alternativan skup podataka sa h</w:t>
-      </w:r>
+        <w:t xml:space="preserve"> koji koriste alternativan skup podataka s h</w:t>
+      </w:r>
+      <w:proofErr w:type="spellStart"/>
       <w:r>
         <w:t>istopatološk</w:t>
       </w:r>
       <w:r>
         <w:t>im</w:t>
       </w:r>
+      <w:proofErr w:type="spellEnd"/>
       <w:r>
         <w:t xml:space="preserve"> slik</w:t>
       </w:r>
@@ -3647,25 +4627,52 @@
         <w:t>dojke</w:t>
       </w:r>
       <w:r>
-        <w:t xml:space="preserve">, na kojem bi bilo </w:t>
+        <w:t xml:space="preserve">. </w:t>
+      </w:r>
+      <w:r>
+        <w:t xml:space="preserve">U </w:t>
+      </w:r>
+      <w:r>
+        <w:t xml:space="preserve"> </w:t>
+      </w:r>
+      <w:r>
+        <w:t xml:space="preserve">eventualnom </w:t>
+      </w:r>
+      <w:r>
+        <w:t>nastav</w:t>
+      </w:r>
+      <w:r>
+        <w:t>ku</w:t>
+      </w:r>
+      <w:r>
+        <w:t xml:space="preserve"> istraživanja</w:t>
+      </w:r>
+      <w:r>
+        <w:t xml:space="preserve"> bilo </w:t>
+      </w:r>
+      <w:r>
+        <w:t xml:space="preserve">bi </w:t>
       </w:r>
       <w:r>
         <w:t>zanimljivo vidjeti</w:t>
       </w:r>
       <w:r>
-        <w:t xml:space="preserve"> kako bi</w:t>
-      </w:r>
-      <w:r>
-        <w:t xml:space="preserve"> </w:t>
-      </w:r>
-      <w:r>
-        <w:t>vlastite</w:t>
+        <w:t xml:space="preserve"> kako</w:t>
+      </w:r>
+      <w:r>
+        <w:t xml:space="preserve"> naše</w:t>
       </w:r>
       <w:r>
         <w:t xml:space="preserve"> implementacije CNN-a </w:t>
       </w:r>
       <w:r>
-        <w:t>klasificirale spomenute slike.</w:t>
+        <w:t>klasificira</w:t>
+      </w:r>
+      <w:r>
+        <w:t>ju</w:t>
+      </w:r>
+      <w:r>
+        <w:t xml:space="preserve"> spomenute slike.</w:t>
       </w:r>
       <w:r>
         <w:br w:type="page"/>

</xml_diff>

<commit_message>
ispravak da se radi o slikama mamografije
</commit_message>
<xml_diff>
--- a/Izvjestaj_projekta_-_Radna_verzija.docx
+++ b/Izvjestaj_projekta_-_Radna_verzija.docx
@@ -16,7 +16,14 @@
           <w:kern w:val="48"/>
           <w:lang w:val="hr-HR"/>
         </w:rPr>
-        <w:t>Identifikacija raka dojke na slikama ultrazvuka</w:t>
+        <w:t xml:space="preserve">Identifikacija raka dojke na slikama </w:t>
+      </w:r>
+      <w:r>
+        <w:rPr>
+          <w:kern w:val="48"/>
+          <w:lang w:val="hr-HR"/>
+        </w:rPr>
+        <w:t>mamografije</w:t>
       </w:r>
     </w:p>
     <w:p>
@@ -317,7 +324,31 @@
         <w:rPr>
           <w:lang w:val="hr-HR"/>
         </w:rPr>
-        <w:t>Rak dojke je bolest koja se manifestira u prekomjernom rastu abnormalnih stanica dojke. Značajna dijagnostička metoda za rak dojke je ultrazvuk, što je neinvazivna medicinska pretraga koja snima ljudsko tijelo pomoću zvučnih valova visoke frekvencije.</w:t>
+        <w:t xml:space="preserve">Rak dojke je bolest koja se manifestira u prekomjernom rastu abnormalnih stanica dojke. Značajna dijagnostička metoda za rak dojke je </w:t>
+      </w:r>
+      <w:r>
+        <w:rPr>
+          <w:lang w:val="hr-HR"/>
+        </w:rPr>
+        <w:t>mamografija</w:t>
+      </w:r>
+      <w:r>
+        <w:rPr>
+          <w:lang w:val="hr-HR"/>
+        </w:rPr>
+        <w:t xml:space="preserve">, što je </w:t>
+      </w:r>
+      <w:r>
+        <w:rPr>
+          <w:lang w:val="hr-HR"/>
+        </w:rPr>
+        <w:t>radiološka pretraga koja koristi male doze ionizirajućeg zračenja za prikaz tkiva dojki</w:t>
+      </w:r>
+      <w:r>
+        <w:rPr>
+          <w:lang w:val="hr-HR"/>
+        </w:rPr>
+        <w:t>.</w:t>
       </w:r>
     </w:p>
     <w:p>
@@ -634,7 +665,7 @@
           <w:lang w:val="hr-HR"/>
         </w:rPr>
         <w:drawing>
-          <wp:inline distT="0" distB="0" distL="0" distR="0" wp14:anchorId="7FB9EBF8" wp14:editId="6F39CE39">
+          <wp:inline distT="0" distB="0" distL="0" distR="0" wp14:anchorId="7FB9EBF8" wp14:editId="6420D2E8">
             <wp:extent cx="3089910" cy="2246630"/>
             <wp:effectExtent l="0" t="0" r="0" b="1270"/>
             <wp:docPr id="1016865219" name="Picture 2" descr="A screenshot of a medical chart&#10;&#10;Description automatically generated"/>
@@ -1007,7 +1038,7 @@
           <w:lang w:val="hr-HR"/>
         </w:rPr>
         <w:drawing>
-          <wp:anchor distT="0" distB="0" distL="114300" distR="114300" simplePos="0" relativeHeight="251659776" behindDoc="0" locked="0" layoutInCell="1" allowOverlap="1" wp14:anchorId="736B4D69" wp14:editId="17FA0FB8">
+          <wp:anchor distT="0" distB="0" distL="114300" distR="114300" simplePos="0" relativeHeight="251659776" behindDoc="0" locked="0" layoutInCell="1" allowOverlap="1" wp14:anchorId="736B4D69" wp14:editId="0D96900C">
             <wp:simplePos x="0" y="0"/>
             <wp:positionH relativeFrom="column">
               <wp:posOffset>3213100</wp:posOffset>
@@ -1209,13 +1240,13 @@
           <w:lang w:val="hr-HR"/>
         </w:rPr>
         <w:drawing>
-          <wp:anchor distT="0" distB="0" distL="114300" distR="114300" simplePos="0" relativeHeight="251660800" behindDoc="0" locked="0" layoutInCell="1" allowOverlap="1" wp14:anchorId="49758A6F" wp14:editId="1BF81994">
+          <wp:anchor distT="0" distB="0" distL="114300" distR="114300" simplePos="0" relativeHeight="251660800" behindDoc="0" locked="0" layoutInCell="1" allowOverlap="1" wp14:anchorId="49758A6F" wp14:editId="49863127">
             <wp:simplePos x="0" y="0"/>
             <wp:positionH relativeFrom="column">
               <wp:posOffset>3538855</wp:posOffset>
             </wp:positionH>
             <wp:positionV relativeFrom="paragraph">
-              <wp:posOffset>1550670</wp:posOffset>
+              <wp:posOffset>1654187</wp:posOffset>
             </wp:positionV>
             <wp:extent cx="2604135" cy="1943100"/>
             <wp:effectExtent l="0" t="0" r="5715" b="0"/>
@@ -1270,7 +1301,7 @@
           <w:lang w:val="hr-HR"/>
         </w:rPr>
         <w:drawing>
-          <wp:anchor distT="0" distB="0" distL="114300" distR="114300" simplePos="0" relativeHeight="251658752" behindDoc="0" locked="0" layoutInCell="1" allowOverlap="1" wp14:anchorId="00A0AC88" wp14:editId="1BF4DE12">
+          <wp:anchor distT="0" distB="0" distL="114300" distR="114300" simplePos="0" relativeHeight="251658752" behindDoc="0" locked="0" layoutInCell="1" allowOverlap="1" wp14:anchorId="00A0AC88" wp14:editId="213571DA">
             <wp:simplePos x="0" y="0"/>
             <wp:positionH relativeFrom="column">
               <wp:align>right</wp:align>
@@ -1725,7 +1756,7 @@
           <w:noProof/>
         </w:rPr>
         <w:drawing>
-          <wp:anchor distT="0" distB="0" distL="114300" distR="114300" simplePos="0" relativeHeight="251661824" behindDoc="0" locked="0" layoutInCell="1" allowOverlap="1" wp14:anchorId="10400D5B" wp14:editId="042F0C3B">
+          <wp:anchor distT="0" distB="0" distL="114300" distR="114300" simplePos="0" relativeHeight="251661824" behindDoc="0" locked="0" layoutInCell="1" allowOverlap="1" wp14:anchorId="10400D5B" wp14:editId="36B38D03">
             <wp:simplePos x="0" y="0"/>
             <wp:positionH relativeFrom="column">
               <wp:posOffset>221615</wp:posOffset>
@@ -2088,7 +2119,7 @@
           <w:noProof/>
         </w:rPr>
         <w:drawing>
-          <wp:anchor distT="0" distB="0" distL="114300" distR="114300" simplePos="0" relativeHeight="251665920" behindDoc="0" locked="0" layoutInCell="1" allowOverlap="1" wp14:anchorId="56570E88" wp14:editId="48C33758">
+          <wp:anchor distT="0" distB="0" distL="114300" distR="114300" simplePos="0" relativeHeight="251665920" behindDoc="0" locked="0" layoutInCell="1" allowOverlap="1" wp14:anchorId="56570E88" wp14:editId="7F81EED0">
             <wp:simplePos x="0" y="0"/>
             <wp:positionH relativeFrom="column">
               <wp:posOffset>3765550</wp:posOffset>
@@ -2512,7 +2543,13 @@
       </w:r>
       <w:proofErr w:type="spellStart"/>
       <w:r>
-        <w:t>RezNet</w:t>
+        <w:t>Re</w:t>
+      </w:r>
+      <w:r>
+        <w:t>s</w:t>
+      </w:r>
+      <w:r>
+        <w:t>Net</w:t>
       </w:r>
       <w:proofErr w:type="spellEnd"/>
       <w:r>
@@ -2920,7 +2957,7 @@
           <w:noProof/>
         </w:rPr>
         <w:drawing>
-          <wp:anchor distT="0" distB="0" distL="114300" distR="114300" simplePos="0" relativeHeight="251662848" behindDoc="1" locked="0" layoutInCell="1" allowOverlap="1" wp14:anchorId="228D5C6D" wp14:editId="41B49BA1">
+          <wp:anchor distT="0" distB="0" distL="114300" distR="114300" simplePos="0" relativeHeight="251662848" behindDoc="1" locked="0" layoutInCell="1" allowOverlap="1" wp14:anchorId="228D5C6D" wp14:editId="215CC86E">
             <wp:simplePos x="0" y="0"/>
             <wp:positionH relativeFrom="margin">
               <wp:posOffset>246380</wp:posOffset>
@@ -3204,7 +3241,10 @@
         <w:t xml:space="preserve"> S obzirom da </w:t>
       </w:r>
       <w:r>
-        <w:t>je svaki tumor prilično jedinstven, kao i prikazi tih tumora na slikama ultrazvuka</w:t>
+        <w:t xml:space="preserve">je svaki tumor prilično jedinstven, kao i prikazi tih tumora na </w:t>
+      </w:r>
+      <w:r>
+        <w:t>mamografskim snimkama</w:t>
       </w:r>
       <w:r>
         <w:t xml:space="preserve">, </w:t>
@@ -3489,13 +3529,13 @@
         <w:t xml:space="preserve"> robusnija implementacija CNN-a, čija je maksimalna uspješnost 62% na skupu za testiranje. </w:t>
       </w:r>
       <w:r>
-        <w:t>Što se tiče sposobnosti generalizacije najuspješnijeg modela, zaključ</w:t>
-      </w:r>
-      <w:r>
-        <w:t xml:space="preserve">eno </w:t>
-      </w:r>
-      <w:r>
-        <w:t>je</w:t>
+        <w:t xml:space="preserve">Što se tiče </w:t>
+      </w:r>
+      <w:r>
+        <w:t>sposobnosti generalizacije najuspješnijeg modela, zaključ</w:t>
+      </w:r>
+      <w:r>
+        <w:t>eno je</w:t>
       </w:r>
       <w:r>
         <w:t xml:space="preserve"> da nije vrlo dobra jer se naučeni model više prilagođava i bolje klasificira skup podataka za treniranje od skupa podataka za testiranje</w:t>
@@ -3939,7 +3979,13 @@
         <w:t xml:space="preserve">iz skupa </w:t>
       </w:r>
       <w:r>
-        <w:t>sve slike ultrazvuka koje su klasificirane kao BENIGN_WITHOUT_CALLBACK</w:t>
+        <w:t xml:space="preserve">sve </w:t>
+      </w:r>
+      <w:r>
+        <w:t>mamografske snimke</w:t>
+      </w:r>
+      <w:r>
+        <w:t xml:space="preserve"> koje su klasificirane kao BENIGN_WITHOUT_CALLBACK</w:t>
       </w:r>
       <w:r>
         <w:t>, te drugu u kojoj su takvim slikama jednostavno promijenili klasifikaciju u BENIGN.</w:t>
@@ -4241,13 +4287,16 @@
         <w:t>ije moguće</w:t>
       </w:r>
       <w:r>
-        <w:t xml:space="preserve"> uspoređivati kvalitetu klasifikacije modela, ali za ubuduće bi bilo interesantno testirati koliko </w:t>
+        <w:t xml:space="preserve"> uspoređivati kvalitetu klasifikacije modela, </w:t>
+      </w:r>
+      <w:r>
+        <w:lastRenderedPageBreak/>
+        <w:t xml:space="preserve">ali za ubuduće bi bilo interesantno testirati koliko </w:t>
       </w:r>
       <w:r>
         <w:t xml:space="preserve">dobro </w:t>
       </w:r>
       <w:r>
-        <w:lastRenderedPageBreak/>
         <w:t>najbolji model</w:t>
       </w:r>
       <w:r>
@@ -4379,7 +4428,13 @@
         <w:t>bio cilj</w:t>
       </w:r>
       <w:r>
-        <w:t xml:space="preserve"> postići preciznu klasifikaciju slika ultrazvuka dojki koje prikazuju maligne</w:t>
+        <w:t xml:space="preserve"> postići preciznu klasifikaciju slika </w:t>
+      </w:r>
+      <w:r>
+        <w:t>mamografskih snimki</w:t>
+      </w:r>
+      <w:r>
+        <w:t xml:space="preserve"> dojki koje prikazuju maligne</w:t>
       </w:r>
       <w:r>
         <w:t xml:space="preserve"> promjene, </w:t>
@@ -4598,9 +4653,12 @@
         <w:t>i</w:t>
       </w:r>
       <w:r>
-        <w:t xml:space="preserve"> koji koriste alternativan skup podataka s h</w:t>
-      </w:r>
-      <w:proofErr w:type="spellStart"/>
+        <w:t xml:space="preserve"> koji koriste alternativan skup podataka s </w:t>
+      </w:r>
+      <w:proofErr w:type="spellStart"/>
+      <w:r>
+        <w:t>h</w:t>
+      </w:r>
       <w:r>
         <w:t>istopatološk</w:t>
       </w:r>
@@ -4885,7 +4943,21 @@
             <w:rStyle w:val="Hyperlink"/>
             <w:lang w:val="hr-HR"/>
           </w:rPr>
-          <w:t>https://www.kaggle.com/code/osamam0/breast-cancer-detection-using-cnn</w:t>
+          <w:t>https://www.kaggle.com/code/osamam0/breast-cancer-detection-using</w:t>
+        </w:r>
+        <w:r>
+          <w:rPr>
+            <w:rStyle w:val="Hyperlink"/>
+            <w:lang w:val="hr-HR"/>
+          </w:rPr>
+          <w:t>-</w:t>
+        </w:r>
+        <w:r>
+          <w:rPr>
+            <w:rStyle w:val="Hyperlink"/>
+            <w:lang w:val="hr-HR"/>
+          </w:rPr>
+          <w:t>cnn</w:t>
         </w:r>
       </w:hyperlink>
       <w:r>
@@ -4909,7 +4981,21 @@
             <w:rStyle w:val="Hyperlink"/>
             <w:lang w:val="hr-HR"/>
           </w:rPr>
-          <w:t>https://www.kaggle.com/code/baselanaya/breast-cancer-detection-using-cnn</w:t>
+          <w:t>http</w:t>
+        </w:r>
+        <w:r>
+          <w:rPr>
+            <w:rStyle w:val="Hyperlink"/>
+            <w:lang w:val="hr-HR"/>
+          </w:rPr>
+          <w:t>s</w:t>
+        </w:r>
+        <w:r>
+          <w:rPr>
+            <w:rStyle w:val="Hyperlink"/>
+            <w:lang w:val="hr-HR"/>
+          </w:rPr>
+          <w:t>://www.kaggle.com/code/baselanaya/breast-cancer-detection-using-cnn</w:t>
         </w:r>
       </w:hyperlink>
       <w:r>

</xml_diff>